<commit_message>
Add the draft CleantechHUB privacy policy for LinkedIn review.
The page is Spanish first, then English, and it is not deployed. The LinkedIn pack now points at the future /politica-de-privacidad/ URL.

Co-authored-by: gideonblaauw-creator <gideonblaauw-creator@users.noreply.github.com>
</commit_message>
<xml_diff>
--- a/artifacts/linkedin-cm-api-application.docx
+++ b/artifacts/linkedin-cm-api-application.docx
@@ -508,7 +508,7 @@
           <w:color w:val="1B4332"/>
           <w:sz w:val="22"/>
         </w:rPr>
-        <w:t xml:space="preserve">Publish a public page on cleantechhub.net first. It must open without a login. Then replace </w:t>
+        <w:t xml:space="preserve">A draft public page is ready in </w:t>
       </w:r>
       <w:r>
         <w:rPr>
@@ -517,6 +517,60 @@
           <w:color w:val="1B4332"/>
           <w:sz w:val="22"/>
         </w:rPr>
+        <w:t>artifacts/cleantechhub-privacy-policy.html</w:t>
+      </w:r>
+      <w:r>
+        <w:rPr>
+          <w:rFonts w:ascii="Calibri" w:hAnsi="Calibri"/>
+          <w:b w:val="0"/>
+          <w:color w:val="1B4332"/>
+          <w:sz w:val="22"/>
+        </w:rPr>
+        <w:t xml:space="preserve">. It is not on the site. Publish it at </w:t>
+      </w:r>
+      <w:r>
+        <w:rPr>
+          <w:rFonts w:ascii="Consolas" w:hAnsi="Consolas"/>
+          <w:b w:val="0"/>
+          <w:color w:val="1B4332"/>
+          <w:sz w:val="22"/>
+        </w:rPr>
+        <w:t>https://cleantechhub.net/politica-de-privacidad/</w:t>
+      </w:r>
+      <w:r>
+        <w:rPr>
+          <w:rFonts w:ascii="Calibri" w:hAnsi="Calibri"/>
+          <w:b w:val="0"/>
+          <w:color w:val="1B4332"/>
+          <w:sz w:val="22"/>
+        </w:rPr>
+        <w:t xml:space="preserve"> and redirect </w:t>
+      </w:r>
+      <w:r>
+        <w:rPr>
+          <w:rFonts w:ascii="Consolas" w:hAnsi="Consolas"/>
+          <w:b w:val="0"/>
+          <w:color w:val="1B4332"/>
+          <w:sz w:val="22"/>
+        </w:rPr>
+        <w:t>/privacy</w:t>
+      </w:r>
+      <w:r>
+        <w:rPr>
+          <w:rFonts w:ascii="Calibri" w:hAnsi="Calibri"/>
+          <w:b w:val="0"/>
+          <w:color w:val="1B4332"/>
+          <w:sz w:val="22"/>
+        </w:rPr>
+        <w:t xml:space="preserve"> there. The page must open without a login. Then paste that URL. Until the live URL returns 200, the field stays </w:t>
+      </w:r>
+      <w:r>
+        <w:rPr>
+          <w:rFonts w:ascii="Consolas" w:hAnsi="Consolas"/>
+          <w:b w:val="0"/>
+          <w:color w:val="1B4332"/>
+          <w:sz w:val="22"/>
+        </w:rPr>
         <w:t>[GIDEON TO FILL]</w:t>
       </w:r>
       <w:r>
@@ -526,7 +580,7 @@
           <w:color w:val="1B4332"/>
           <w:sz w:val="22"/>
         </w:rPr>
-        <w:t xml:space="preserve"> in the privacy field with that URL.</w:t>
+        <w:t>.</w:t>
       </w:r>
     </w:p>
     <w:p>
@@ -1098,7 +1152,7 @@
           <w:color w:val="1B4332"/>
           <w:sz w:val="22"/>
         </w:rPr>
-        <w:t>Paste today:</w:t>
+        <w:t>Paste only after the live page returns 200:</w:t>
       </w:r>
     </w:p>
     <w:p>
@@ -1109,18 +1163,58 @@
           <w:color w:val="1B4332"/>
           <w:sz w:val="22"/>
         </w:rPr>
-        <w:t>[GIDEON TO FILL]</w:t>
+        <w:t>https://cleantechhub.net/politica-de-privacidad/</w:t>
       </w:r>
     </w:p>
     <w:p>
       <w:r>
         <w:rPr>
           <w:rFonts w:ascii="Calibri" w:hAnsi="Calibri"/>
-          <w:b w:val="0"/>
-          <w:color w:val="1B4332"/>
-          <w:sz w:val="22"/>
-        </w:rPr>
-        <w:t>Do not submit this field until a public cleantechhub.net URL exists. See “Stop before you submit” above.</w:t>
+          <w:b/>
+          <w:color w:val="1B4332"/>
+          <w:sz w:val="22"/>
+        </w:rPr>
+        <w:t>Until that page is public, paste:</w:t>
+      </w:r>
+    </w:p>
+    <w:p>
+      <w:r>
+        <w:rPr>
+          <w:rFonts w:ascii="Calibri" w:hAnsi="Calibri"/>
+          <w:b w:val="0"/>
+          <w:color w:val="1B4332"/>
+          <w:sz w:val="22"/>
+        </w:rPr>
+        <w:t>[GIDEON TO FILL]</w:t>
+      </w:r>
+    </w:p>
+    <w:p>
+      <w:r>
+        <w:rPr>
+          <w:rFonts w:ascii="Calibri" w:hAnsi="Calibri"/>
+          <w:b w:val="0"/>
+          <w:color w:val="1B4332"/>
+          <w:sz w:val="22"/>
+        </w:rPr>
+        <w:t xml:space="preserve">The draft is </w:t>
+      </w:r>
+      <w:r>
+        <w:rPr>
+          <w:rFonts w:ascii="Consolas" w:hAnsi="Consolas"/>
+          <w:b w:val="0"/>
+          <w:color w:val="1B4332"/>
+          <w:sz w:val="22"/>
+        </w:rPr>
+        <w:t>artifacts/cleantechhub-privacy-policy.html</w:t>
+      </w:r>
+      <w:r>
+        <w:rPr>
+          <w:rFonts w:ascii="Calibri" w:hAnsi="Calibri"/>
+          <w:b w:val="0"/>
+          <w:color w:val="1B4332"/>
+          <w:sz w:val="22"/>
+        </w:rPr>
+        <w:t>. It is bilingual, Spanish first. It is not deployed. See “Stop before you submit” above.</w:t>
       </w:r>
     </w:p>
     <w:p>
@@ -4458,7 +4552,25 @@
           <w:color w:val="1B4332"/>
           <w:sz w:val="22"/>
         </w:rPr>
-        <w:t>Privacy-policy URL on cleantechhub.net. Missing until he publishes one.</w:t>
+        <w:t xml:space="preserve">Privacy-policy URL on cleantechhub.net. The draft exists. The live URL is still missing until he publishes </w:t>
+      </w:r>
+      <w:r>
+        <w:rPr>
+          <w:rFonts w:ascii="Consolas" w:hAnsi="Consolas"/>
+          <w:b w:val="0"/>
+          <w:color w:val="1B4332"/>
+          <w:sz w:val="22"/>
+        </w:rPr>
+        <w:t>https://cleantechhub.net/politica-de-privacidad/</w:t>
+      </w:r>
+      <w:r>
+        <w:rPr>
+          <w:rFonts w:ascii="Calibri" w:hAnsi="Calibri"/>
+          <w:b w:val="0"/>
+          <w:color w:val="1B4332"/>
+          <w:sz w:val="22"/>
+        </w:rPr>
+        <w:t>.</w:t>
       </w:r>
     </w:p>
     <w:p>

</xml_diff>

<commit_message>
Fill the public privacy policy with the confirmed legal identity.
Replace the draft tokens with the non-profit name, contact channel, OVH Germany hosting, and retention periods, and keep the token list in the repo README.

Co-authored-by: gideonblaauw-creator <gideonblaauw-creator@users.noreply.github.com>
</commit_message>
<xml_diff>
--- a/artifacts/linkedin-cm-api-application.docx
+++ b/artifacts/linkedin-cm-api-application.docx
@@ -5,7 +5,7 @@
     <w:p>
       <w:r>
         <w:rPr>
-          <w:rFonts w:ascii="Calibri" w:hAnsi="Calibri"/>
+          <w:rFonts w:ascii="Calibri" w:hAnsi="Calibri" w:eastAsia="Calibri"/>
           <w:b/>
           <w:color w:val="2D6A4F"/>
           <w:sz w:val="40"/>
@@ -16,18 +16,36 @@
     <w:p>
       <w:r>
         <w:rPr>
-          <w:rFonts w:ascii="Calibri" w:hAnsi="Calibri"/>
-          <w:b w:val="0"/>
-          <w:color w:val="1B4332"/>
-          <w:sz w:val="22"/>
-        </w:rPr>
-        <w:t>Prepared 22 October 2026 for Gideon Blaauw. He submits this himself, from his own device, at developer.linkedin.com (https://developer.linkedin.com). This pack does not log in to LinkedIn, and it does not click any LinkedIn screen.</w:t>
+          <w:rFonts w:ascii="Calibri" w:hAnsi="Calibri" w:eastAsia="Calibri"/>
+          <w:b w:val="0"/>
+          <w:color w:val="1B4332"/>
+          <w:sz w:val="22"/>
+        </w:rPr>
+        <w:t xml:space="preserve">Prepared 22 October 2026 for Gideon Blaauw. He submits this himself, from his own device, at </w:t>
+      </w:r>
+      <w:r>
+        <w:rPr>
+          <w:rFonts w:ascii="Calibri" w:hAnsi="Calibri" w:eastAsia="Calibri"/>
+          <w:b w:val="0"/>
+          <w:color w:val="1B4332"/>
+          <w:sz w:val="22"/>
+        </w:rPr>
+        <w:t>developer.linkedin.com (https://developer.linkedin.com)</w:t>
+      </w:r>
+      <w:r>
+        <w:rPr>
+          <w:rFonts w:ascii="Calibri" w:hAnsi="Calibri" w:eastAsia="Calibri"/>
+          <w:b w:val="0"/>
+          <w:color w:val="1B4332"/>
+          <w:sz w:val="22"/>
+        </w:rPr>
+        <w:t>. This pack does not log in to LinkedIn, and it does not click any LinkedIn screen.</w:t>
       </w:r>
     </w:p>
     <w:p>
       <w:r>
         <w:rPr>
-          <w:rFonts w:ascii="Calibri" w:hAnsi="Calibri"/>
+          <w:rFonts w:ascii="Calibri" w:hAnsi="Calibri" w:eastAsia="Calibri"/>
           <w:b w:val="0"/>
           <w:color w:val="1B4332"/>
           <w:sz w:val="22"/>
@@ -36,7 +54,7 @@
       </w:r>
       <w:r>
         <w:rPr>
-          <w:rFonts w:ascii="Calibri" w:hAnsi="Calibri"/>
+          <w:rFonts w:ascii="Calibri" w:hAnsi="Calibri" w:eastAsia="Calibri"/>
           <w:b/>
           <w:color w:val="1B4332"/>
           <w:sz w:val="22"/>
@@ -45,7 +63,7 @@
       </w:r>
       <w:r>
         <w:rPr>
-          <w:rFonts w:ascii="Calibri" w:hAnsi="Calibri"/>
+          <w:rFonts w:ascii="Calibri" w:hAnsi="Calibri" w:eastAsia="Calibri"/>
           <w:b w:val="0"/>
           <w:color w:val="1B4332"/>
           <w:sz w:val="22"/>
@@ -54,7 +72,7 @@
       </w:r>
       <w:r>
         <w:rPr>
-          <w:rFonts w:ascii="Calibri" w:hAnsi="Calibri"/>
+          <w:rFonts w:ascii="Calibri" w:hAnsi="Calibri" w:eastAsia="Calibri"/>
           <w:b/>
           <w:color w:val="1B4332"/>
           <w:sz w:val="22"/>
@@ -63,7 +81,7 @@
       </w:r>
       <w:r>
         <w:rPr>
-          <w:rFonts w:ascii="Calibri" w:hAnsi="Calibri"/>
+          <w:rFonts w:ascii="Calibri" w:hAnsi="Calibri" w:eastAsia="Calibri"/>
           <w:b w:val="0"/>
           <w:color w:val="1B4332"/>
           <w:sz w:val="22"/>
@@ -72,7 +90,7 @@
       </w:r>
       <w:r>
         <w:rPr>
-          <w:rFonts w:ascii="Calibri" w:hAnsi="Calibri"/>
+          <w:rFonts w:ascii="Calibri" w:hAnsi="Calibri" w:eastAsia="Calibri"/>
           <w:b/>
           <w:color w:val="1B4332"/>
           <w:sz w:val="22"/>
@@ -81,7 +99,7 @@
       </w:r>
       <w:r>
         <w:rPr>
-          <w:rFonts w:ascii="Calibri" w:hAnsi="Calibri"/>
+          <w:rFonts w:ascii="Calibri" w:hAnsi="Calibri" w:eastAsia="Calibri"/>
           <w:b w:val="0"/>
           <w:color w:val="1B4332"/>
           <w:sz w:val="22"/>
@@ -90,7 +108,7 @@
       </w:r>
       <w:r>
         <w:rPr>
-          <w:rFonts w:ascii="Consolas" w:hAnsi="Consolas"/>
+          <w:rFonts w:ascii="Calibri" w:hAnsi="Calibri" w:eastAsia="Calibri"/>
           <w:b w:val="0"/>
           <w:color w:val="1B4332"/>
           <w:sz w:val="22"/>
@@ -99,7 +117,7 @@
       </w:r>
       <w:r>
         <w:rPr>
-          <w:rFonts w:ascii="Calibri" w:hAnsi="Calibri"/>
+          <w:rFonts w:ascii="Calibri" w:hAnsi="Calibri" w:eastAsia="Calibri"/>
           <w:b w:val="0"/>
           <w:color w:val="1B4332"/>
           <w:sz w:val="22"/>
@@ -108,7 +126,7 @@
       </w:r>
       <w:r>
         <w:rPr>
-          <w:rFonts w:ascii="Consolas" w:hAnsi="Consolas"/>
+          <w:rFonts w:ascii="Calibri" w:hAnsi="Calibri" w:eastAsia="Calibri"/>
           <w:b w:val="0"/>
           <w:color w:val="1B4332"/>
           <w:sz w:val="22"/>
@@ -117,7 +135,7 @@
       </w:r>
       <w:r>
         <w:rPr>
-          <w:rFonts w:ascii="Calibri" w:hAnsi="Calibri"/>
+          <w:rFonts w:ascii="Calibri" w:hAnsi="Calibri" w:eastAsia="Calibri"/>
           <w:b w:val="0"/>
           <w:color w:val="1B4332"/>
           <w:sz w:val="22"/>
@@ -126,7 +144,7 @@
       </w:r>
       <w:r>
         <w:rPr>
-          <w:rFonts w:ascii="Consolas" w:hAnsi="Consolas"/>
+          <w:rFonts w:ascii="Calibri" w:hAnsi="Calibri" w:eastAsia="Calibri"/>
           <w:b w:val="0"/>
           <w:color w:val="1B4332"/>
           <w:sz w:val="22"/>
@@ -135,7 +153,7 @@
       </w:r>
       <w:r>
         <w:rPr>
-          <w:rFonts w:ascii="Calibri" w:hAnsi="Calibri"/>
+          <w:rFonts w:ascii="Calibri" w:hAnsi="Calibri" w:eastAsia="Calibri"/>
           <w:b w:val="0"/>
           <w:color w:val="1B4332"/>
           <w:sz w:val="22"/>
@@ -144,7 +162,7 @@
       </w:r>
       <w:r>
         <w:rPr>
-          <w:rFonts w:ascii="Consolas" w:hAnsi="Consolas"/>
+          <w:rFonts w:ascii="Calibri" w:hAnsi="Calibri" w:eastAsia="Calibri"/>
           <w:b w:val="0"/>
           <w:color w:val="1B4332"/>
           <w:sz w:val="22"/>
@@ -153,7 +171,7 @@
       </w:r>
       <w:r>
         <w:rPr>
-          <w:rFonts w:ascii="Calibri" w:hAnsi="Calibri"/>
+          <w:rFonts w:ascii="Calibri" w:hAnsi="Calibri" w:eastAsia="Calibri"/>
           <w:b w:val="0"/>
           <w:color w:val="1B4332"/>
           <w:sz w:val="22"/>
@@ -164,7 +182,7 @@
     <w:p>
       <w:r>
         <w:rPr>
-          <w:rFonts w:ascii="Calibri" w:hAnsi="Calibri"/>
+          <w:rFonts w:ascii="Calibri" w:hAnsi="Calibri" w:eastAsia="Calibri"/>
           <w:b w:val="0"/>
           <w:color w:val="1B4332"/>
           <w:sz w:val="22"/>
@@ -173,7 +191,7 @@
       </w:r>
       <w:r>
         <w:rPr>
-          <w:rFonts w:ascii="Consolas" w:hAnsi="Consolas"/>
+          <w:rFonts w:ascii="Calibri" w:hAnsi="Calibri" w:eastAsia="Calibri"/>
           <w:b w:val="0"/>
           <w:color w:val="1B4332"/>
           <w:sz w:val="22"/>
@@ -182,7 +200,7 @@
       </w:r>
       <w:r>
         <w:rPr>
-          <w:rFonts w:ascii="Calibri" w:hAnsi="Calibri"/>
+          <w:rFonts w:ascii="Calibri" w:hAnsi="Calibri" w:eastAsia="Calibri"/>
           <w:b w:val="0"/>
           <w:color w:val="1B4332"/>
           <w:sz w:val="22"/>
@@ -193,7 +211,7 @@
     <w:p>
       <w:r>
         <w:rPr>
-          <w:rFonts w:ascii="Calibri" w:hAnsi="Calibri"/>
+          <w:rFonts w:ascii="Calibri" w:hAnsi="Calibri" w:eastAsia="Calibri"/>
           <w:b w:val="0"/>
           <w:color w:val="1B4332"/>
           <w:sz w:val="22"/>
@@ -204,7 +222,7 @@
     <w:p>
       <w:r>
         <w:rPr>
-          <w:rFonts w:ascii="Calibri" w:hAnsi="Calibri"/>
+          <w:rFonts w:ascii="Calibri" w:hAnsi="Calibri" w:eastAsia="Calibri"/>
           <w:b/>
           <w:color w:val="2D6A4F"/>
           <w:sz w:val="32"/>
@@ -215,7 +233,7 @@
     <w:p>
       <w:r>
         <w:rPr>
-          <w:rFonts w:ascii="Calibri" w:hAnsi="Calibri"/>
+          <w:rFonts w:ascii="Calibri" w:hAnsi="Calibri" w:eastAsia="Calibri"/>
           <w:b/>
           <w:color w:val="1B4332"/>
           <w:sz w:val="22"/>
@@ -226,7 +244,7 @@
     <w:p>
       <w:r>
         <w:rPr>
-          <w:rFonts w:ascii="Calibri" w:hAnsi="Calibri"/>
+          <w:rFonts w:ascii="Calibri" w:hAnsi="Calibri" w:eastAsia="Calibri"/>
           <w:b w:val="0"/>
           <w:color w:val="1B4332"/>
           <w:sz w:val="22"/>
@@ -240,7 +258,7 @@
       </w:pPr>
       <w:r>
         <w:rPr>
-          <w:rFonts w:ascii="Consolas" w:hAnsi="Consolas"/>
+          <w:rFonts w:ascii="Calibri" w:hAnsi="Calibri" w:eastAsia="Calibri"/>
           <w:b w:val="0"/>
           <w:color w:val="1B4332"/>
           <w:sz w:val="22"/>
@@ -249,7 +267,7 @@
       </w:r>
       <w:r>
         <w:rPr>
-          <w:rFonts w:ascii="Calibri" w:hAnsi="Calibri"/>
+          <w:rFonts w:ascii="Calibri" w:hAnsi="Calibri" w:eastAsia="Calibri"/>
           <w:b w:val="0"/>
           <w:color w:val="1B4332"/>
           <w:sz w:val="22"/>
@@ -263,7 +281,7 @@
       </w:pPr>
       <w:r>
         <w:rPr>
-          <w:rFonts w:ascii="Consolas" w:hAnsi="Consolas"/>
+          <w:rFonts w:ascii="Calibri" w:hAnsi="Calibri" w:eastAsia="Calibri"/>
           <w:b w:val="0"/>
           <w:color w:val="1B4332"/>
           <w:sz w:val="22"/>
@@ -272,7 +290,7 @@
       </w:r>
       <w:r>
         <w:rPr>
-          <w:rFonts w:ascii="Calibri" w:hAnsi="Calibri"/>
+          <w:rFonts w:ascii="Calibri" w:hAnsi="Calibri" w:eastAsia="Calibri"/>
           <w:b w:val="0"/>
           <w:color w:val="1B4332"/>
           <w:sz w:val="22"/>
@@ -286,7 +304,7 @@
       </w:pPr>
       <w:r>
         <w:rPr>
-          <w:rFonts w:ascii="Consolas" w:hAnsi="Consolas"/>
+          <w:rFonts w:ascii="Calibri" w:hAnsi="Calibri" w:eastAsia="Calibri"/>
           <w:b w:val="0"/>
           <w:color w:val="1B4332"/>
           <w:sz w:val="22"/>
@@ -295,7 +313,7 @@
       </w:r>
       <w:r>
         <w:rPr>
-          <w:rFonts w:ascii="Calibri" w:hAnsi="Calibri"/>
+          <w:rFonts w:ascii="Calibri" w:hAnsi="Calibri" w:eastAsia="Calibri"/>
           <w:b w:val="0"/>
           <w:color w:val="1B4332"/>
           <w:sz w:val="22"/>
@@ -309,7 +327,7 @@
       </w:pPr>
       <w:r>
         <w:rPr>
-          <w:rFonts w:ascii="Consolas" w:hAnsi="Consolas"/>
+          <w:rFonts w:ascii="Calibri" w:hAnsi="Calibri" w:eastAsia="Calibri"/>
           <w:b w:val="0"/>
           <w:color w:val="1B4332"/>
           <w:sz w:val="22"/>
@@ -318,7 +336,7 @@
       </w:r>
       <w:r>
         <w:rPr>
-          <w:rFonts w:ascii="Calibri" w:hAnsi="Calibri"/>
+          <w:rFonts w:ascii="Calibri" w:hAnsi="Calibri" w:eastAsia="Calibri"/>
           <w:b w:val="0"/>
           <w:color w:val="1B4332"/>
           <w:sz w:val="22"/>
@@ -332,7 +350,7 @@
       </w:pPr>
       <w:r>
         <w:rPr>
-          <w:rFonts w:ascii="Consolas" w:hAnsi="Consolas"/>
+          <w:rFonts w:ascii="Calibri" w:hAnsi="Calibri" w:eastAsia="Calibri"/>
           <w:b w:val="0"/>
           <w:color w:val="1B4332"/>
           <w:sz w:val="22"/>
@@ -341,7 +359,7 @@
       </w:r>
       <w:r>
         <w:rPr>
-          <w:rFonts w:ascii="Calibri" w:hAnsi="Calibri"/>
+          <w:rFonts w:ascii="Calibri" w:hAnsi="Calibri" w:eastAsia="Calibri"/>
           <w:b w:val="0"/>
           <w:color w:val="1B4332"/>
           <w:sz w:val="22"/>
@@ -355,7 +373,7 @@
       </w:pPr>
       <w:r>
         <w:rPr>
-          <w:rFonts w:ascii="Calibri" w:hAnsi="Calibri"/>
+          <w:rFonts w:ascii="Calibri" w:hAnsi="Calibri" w:eastAsia="Calibri"/>
           <w:b w:val="0"/>
           <w:color w:val="1B4332"/>
           <w:sz w:val="22"/>
@@ -364,7 +382,7 @@
       </w:r>
       <w:r>
         <w:rPr>
-          <w:rFonts w:ascii="Consolas" w:hAnsi="Consolas"/>
+          <w:rFonts w:ascii="Calibri" w:hAnsi="Calibri" w:eastAsia="Calibri"/>
           <w:b w:val="0"/>
           <w:color w:val="1B4332"/>
           <w:sz w:val="22"/>
@@ -373,7 +391,7 @@
       </w:r>
       <w:r>
         <w:rPr>
-          <w:rFonts w:ascii="Calibri" w:hAnsi="Calibri"/>
+          <w:rFonts w:ascii="Calibri" w:hAnsi="Calibri" w:eastAsia="Calibri"/>
           <w:b w:val="0"/>
           <w:color w:val="1B4332"/>
           <w:sz w:val="22"/>
@@ -387,7 +405,7 @@
       </w:pPr>
       <w:r>
         <w:rPr>
-          <w:rFonts w:ascii="Calibri" w:hAnsi="Calibri"/>
+          <w:rFonts w:ascii="Calibri" w:hAnsi="Calibri" w:eastAsia="Calibri"/>
           <w:b w:val="0"/>
           <w:color w:val="1B4332"/>
           <w:sz w:val="22"/>
@@ -396,7 +414,7 @@
       </w:r>
       <w:r>
         <w:rPr>
-          <w:rFonts w:ascii="Consolas" w:hAnsi="Consolas"/>
+          <w:rFonts w:ascii="Calibri" w:hAnsi="Calibri" w:eastAsia="Calibri"/>
           <w:b w:val="0"/>
           <w:color w:val="1B4332"/>
           <w:sz w:val="22"/>
@@ -405,7 +423,7 @@
       </w:r>
       <w:r>
         <w:rPr>
-          <w:rFonts w:ascii="Calibri" w:hAnsi="Calibri"/>
+          <w:rFonts w:ascii="Calibri" w:hAnsi="Calibri" w:eastAsia="Calibri"/>
           <w:b w:val="0"/>
           <w:color w:val="1B4332"/>
           <w:sz w:val="22"/>
@@ -416,7 +434,7 @@
     <w:p>
       <w:r>
         <w:rPr>
-          <w:rFonts w:ascii="Calibri" w:hAnsi="Calibri"/>
+          <w:rFonts w:ascii="Calibri" w:hAnsi="Calibri" w:eastAsia="Calibri"/>
           <w:b w:val="0"/>
           <w:color w:val="1B4332"/>
           <w:sz w:val="22"/>
@@ -427,7 +445,7 @@
     <w:p>
       <w:r>
         <w:rPr>
-          <w:rFonts w:ascii="Calibri" w:hAnsi="Calibri"/>
+          <w:rFonts w:ascii="Calibri" w:hAnsi="Calibri" w:eastAsia="Calibri"/>
           <w:b w:val="0"/>
           <w:color w:val="1B4332"/>
           <w:sz w:val="22"/>
@@ -436,7 +454,7 @@
       </w:r>
       <w:r>
         <w:rPr>
-          <w:rFonts w:ascii="Consolas" w:hAnsi="Consolas"/>
+          <w:rFonts w:ascii="Calibri" w:hAnsi="Calibri" w:eastAsia="Calibri"/>
           <w:b w:val="0"/>
           <w:color w:val="1B4332"/>
           <w:sz w:val="22"/>
@@ -445,7 +463,7 @@
       </w:r>
       <w:r>
         <w:rPr>
-          <w:rFonts w:ascii="Calibri" w:hAnsi="Calibri"/>
+          <w:rFonts w:ascii="Calibri" w:hAnsi="Calibri" w:eastAsia="Calibri"/>
           <w:b w:val="0"/>
           <w:color w:val="1B4332"/>
           <w:sz w:val="22"/>
@@ -454,7 +472,7 @@
       </w:r>
       <w:r>
         <w:rPr>
-          <w:rFonts w:ascii="Consolas" w:hAnsi="Consolas"/>
+          <w:rFonts w:ascii="Calibri" w:hAnsi="Calibri" w:eastAsia="Calibri"/>
           <w:b w:val="0"/>
           <w:color w:val="1B4332"/>
           <w:sz w:val="22"/>
@@ -463,7 +481,7 @@
       </w:r>
       <w:r>
         <w:rPr>
-          <w:rFonts w:ascii="Calibri" w:hAnsi="Calibri"/>
+          <w:rFonts w:ascii="Calibri" w:hAnsi="Calibri" w:eastAsia="Calibri"/>
           <w:b w:val="0"/>
           <w:color w:val="1B4332"/>
           <w:sz w:val="22"/>
@@ -474,7 +492,7 @@
     <w:p>
       <w:r>
         <w:rPr>
-          <w:rFonts w:ascii="Calibri" w:hAnsi="Calibri"/>
+          <w:rFonts w:ascii="Calibri" w:hAnsi="Calibri" w:eastAsia="Calibri"/>
           <w:b w:val="0"/>
           <w:color w:val="1B4332"/>
           <w:sz w:val="22"/>
@@ -483,7 +501,7 @@
       </w:r>
       <w:r>
         <w:rPr>
-          <w:rFonts w:ascii="Calibri" w:hAnsi="Calibri"/>
+          <w:rFonts w:ascii="Calibri" w:hAnsi="Calibri" w:eastAsia="Calibri"/>
           <w:b/>
           <w:color w:val="1B4332"/>
           <w:sz w:val="22"/>
@@ -492,7 +510,7 @@
       </w:r>
       <w:r>
         <w:rPr>
-          <w:rFonts w:ascii="Calibri" w:hAnsi="Calibri"/>
+          <w:rFonts w:ascii="Calibri" w:hAnsi="Calibri" w:eastAsia="Calibri"/>
           <w:b w:val="0"/>
           <w:color w:val="1B4332"/>
           <w:sz w:val="22"/>
@@ -503,7 +521,7 @@
     <w:p>
       <w:r>
         <w:rPr>
-          <w:rFonts w:ascii="Calibri" w:hAnsi="Calibri"/>
+          <w:rFonts w:ascii="Calibri" w:hAnsi="Calibri" w:eastAsia="Calibri"/>
           <w:b w:val="0"/>
           <w:color w:val="1B4332"/>
           <w:sz w:val="22"/>
@@ -512,7 +530,7 @@
       </w:r>
       <w:r>
         <w:rPr>
-          <w:rFonts w:ascii="Consolas" w:hAnsi="Consolas"/>
+          <w:rFonts w:ascii="Calibri" w:hAnsi="Calibri" w:eastAsia="Calibri"/>
           <w:b w:val="0"/>
           <w:color w:val="1B4332"/>
           <w:sz w:val="22"/>
@@ -521,7 +539,7 @@
       </w:r>
       <w:r>
         <w:rPr>
-          <w:rFonts w:ascii="Calibri" w:hAnsi="Calibri"/>
+          <w:rFonts w:ascii="Calibri" w:hAnsi="Calibri" w:eastAsia="Calibri"/>
           <w:b w:val="0"/>
           <w:color w:val="1B4332"/>
           <w:sz w:val="22"/>
@@ -530,7 +548,7 @@
       </w:r>
       <w:r>
         <w:rPr>
-          <w:rFonts w:ascii="Consolas" w:hAnsi="Consolas"/>
+          <w:rFonts w:ascii="Calibri" w:hAnsi="Calibri" w:eastAsia="Calibri"/>
           <w:b w:val="0"/>
           <w:color w:val="1B4332"/>
           <w:sz w:val="22"/>
@@ -539,7 +557,7 @@
       </w:r>
       <w:r>
         <w:rPr>
-          <w:rFonts w:ascii="Calibri" w:hAnsi="Calibri"/>
+          <w:rFonts w:ascii="Calibri" w:hAnsi="Calibri" w:eastAsia="Calibri"/>
           <w:b w:val="0"/>
           <w:color w:val="1B4332"/>
           <w:sz w:val="22"/>
@@ -548,7 +566,7 @@
       </w:r>
       <w:r>
         <w:rPr>
-          <w:rFonts w:ascii="Consolas" w:hAnsi="Consolas"/>
+          <w:rFonts w:ascii="Calibri" w:hAnsi="Calibri" w:eastAsia="Calibri"/>
           <w:b w:val="0"/>
           <w:color w:val="1B4332"/>
           <w:sz w:val="22"/>
@@ -557,7 +575,7 @@
       </w:r>
       <w:r>
         <w:rPr>
-          <w:rFonts w:ascii="Calibri" w:hAnsi="Calibri"/>
+          <w:rFonts w:ascii="Calibri" w:hAnsi="Calibri" w:eastAsia="Calibri"/>
           <w:b w:val="0"/>
           <w:color w:val="1B4332"/>
           <w:sz w:val="22"/>
@@ -566,7 +584,7 @@
       </w:r>
       <w:r>
         <w:rPr>
-          <w:rFonts w:ascii="Consolas" w:hAnsi="Consolas"/>
+          <w:rFonts w:ascii="Calibri" w:hAnsi="Calibri" w:eastAsia="Calibri"/>
           <w:b w:val="0"/>
           <w:color w:val="1B4332"/>
           <w:sz w:val="22"/>
@@ -575,7 +593,7 @@
       </w:r>
       <w:r>
         <w:rPr>
-          <w:rFonts w:ascii="Calibri" w:hAnsi="Calibri"/>
+          <w:rFonts w:ascii="Calibri" w:hAnsi="Calibri" w:eastAsia="Calibri"/>
           <w:b w:val="0"/>
           <w:color w:val="1B4332"/>
           <w:sz w:val="22"/>
@@ -586,7 +604,7 @@
     <w:p>
       <w:r>
         <w:rPr>
-          <w:rFonts w:ascii="Calibri" w:hAnsi="Calibri"/>
+          <w:rFonts w:ascii="Calibri" w:hAnsi="Calibri" w:eastAsia="Calibri"/>
           <w:b w:val="0"/>
           <w:color w:val="1B4332"/>
           <w:sz w:val="22"/>
@@ -595,7 +613,7 @@
       </w:r>
       <w:r>
         <w:rPr>
-          <w:rFonts w:ascii="Consolas" w:hAnsi="Consolas"/>
+          <w:rFonts w:ascii="Calibri" w:hAnsi="Calibri" w:eastAsia="Calibri"/>
           <w:b w:val="0"/>
           <w:color w:val="1B4332"/>
           <w:sz w:val="22"/>
@@ -604,7 +622,7 @@
       </w:r>
       <w:r>
         <w:rPr>
-          <w:rFonts w:ascii="Calibri" w:hAnsi="Calibri"/>
+          <w:rFonts w:ascii="Calibri" w:hAnsi="Calibri" w:eastAsia="Calibri"/>
           <w:b w:val="0"/>
           <w:color w:val="1B4332"/>
           <w:sz w:val="22"/>
@@ -615,7 +633,7 @@
     <w:p>
       <w:r>
         <w:rPr>
-          <w:rFonts w:ascii="Calibri" w:hAnsi="Calibri"/>
+          <w:rFonts w:ascii="Calibri" w:hAnsi="Calibri" w:eastAsia="Calibri"/>
           <w:b/>
           <w:color w:val="2D6A4F"/>
           <w:sz w:val="32"/>
@@ -626,7 +644,7 @@
     <w:p>
       <w:r>
         <w:rPr>
-          <w:rFonts w:ascii="Calibri" w:hAnsi="Calibri"/>
+          <w:rFonts w:ascii="Calibri" w:hAnsi="Calibri" w:eastAsia="Calibri"/>
           <w:b/>
           <w:color w:val="2D6A4F"/>
           <w:sz w:val="26"/>
@@ -637,7 +655,7 @@
     <w:p>
       <w:r>
         <w:rPr>
-          <w:rFonts w:ascii="Calibri" w:hAnsi="Calibri"/>
+          <w:rFonts w:ascii="Calibri" w:hAnsi="Calibri" w:eastAsia="Calibri"/>
           <w:b/>
           <w:color w:val="1B4332"/>
           <w:sz w:val="22"/>
@@ -648,7 +666,7 @@
     <w:p>
       <w:r>
         <w:rPr>
-          <w:rFonts w:ascii="Calibri" w:hAnsi="Calibri"/>
+          <w:rFonts w:ascii="Calibri" w:hAnsi="Calibri" w:eastAsia="Calibri"/>
           <w:b w:val="0"/>
           <w:color w:val="1B4332"/>
           <w:sz w:val="22"/>
@@ -659,7 +677,7 @@
     <w:p>
       <w:r>
         <w:rPr>
-          <w:rFonts w:ascii="Calibri" w:hAnsi="Calibri"/>
+          <w:rFonts w:ascii="Calibri" w:hAnsi="Calibri" w:eastAsia="Calibri"/>
           <w:b/>
           <w:color w:val="1B4332"/>
           <w:sz w:val="22"/>
@@ -668,18 +686,36 @@
       </w:r>
       <w:r>
         <w:rPr>
-          <w:rFonts w:ascii="Calibri" w:hAnsi="Calibri"/>
-          <w:b w:val="0"/>
-          <w:color w:val="1B4332"/>
-          <w:sz w:val="22"/>
-        </w:rPr>
-        <w:t xml:space="preserve"> Community Management must be the only product on the app. If Share, Sign In, or any other product is already on the app, Request access stays grayed out. Source: LinkedIn API Partner Support (https://learn.microsoft.com/en-us/linkedin/shared/linkedin-api-partner-support-guide).</w:t>
+          <w:rFonts w:ascii="Calibri" w:hAnsi="Calibri" w:eastAsia="Calibri"/>
+          <w:b w:val="0"/>
+          <w:color w:val="1B4332"/>
+          <w:sz w:val="22"/>
+        </w:rPr>
+        <w:t xml:space="preserve"> Community Management must be the only product on the app. If Share, Sign In, or any other product is already on the app, Request access stays grayed out. Source: </w:t>
+      </w:r>
+      <w:r>
+        <w:rPr>
+          <w:rFonts w:ascii="Calibri" w:hAnsi="Calibri" w:eastAsia="Calibri"/>
+          <w:b w:val="0"/>
+          <w:color w:val="1B4332"/>
+          <w:sz w:val="22"/>
+        </w:rPr>
+        <w:t>LinkedIn API Partner Support (https://learn.microsoft.com/en-us/linkedin/shared/linkedin-api-partner-support-guide)</w:t>
+      </w:r>
+      <w:r>
+        <w:rPr>
+          <w:rFonts w:ascii="Calibri" w:hAnsi="Calibri" w:eastAsia="Calibri"/>
+          <w:b w:val="0"/>
+          <w:color w:val="1B4332"/>
+          <w:sz w:val="22"/>
+        </w:rPr>
+        <w:t>.</w:t>
       </w:r>
     </w:p>
     <w:p>
       <w:r>
         <w:rPr>
-          <w:rFonts w:ascii="Calibri" w:hAnsi="Calibri"/>
+          <w:rFonts w:ascii="Calibri" w:hAnsi="Calibri" w:eastAsia="Calibri"/>
           <w:b/>
           <w:color w:val="2D6A4F"/>
           <w:sz w:val="26"/>
@@ -690,7 +726,7 @@
     <w:p>
       <w:r>
         <w:rPr>
-          <w:rFonts w:ascii="Calibri" w:hAnsi="Calibri"/>
+          <w:rFonts w:ascii="Calibri" w:hAnsi="Calibri" w:eastAsia="Calibri"/>
           <w:b/>
           <w:color w:val="1B4332"/>
           <w:sz w:val="22"/>
@@ -701,7 +737,7 @@
     <w:p>
       <w:r>
         <w:rPr>
-          <w:rFonts w:ascii="Calibri" w:hAnsi="Calibri"/>
+          <w:rFonts w:ascii="Calibri" w:hAnsi="Calibri" w:eastAsia="Calibri"/>
           <w:b w:val="0"/>
           <w:color w:val="1B4332"/>
           <w:sz w:val="22"/>
@@ -712,7 +748,7 @@
     <w:p>
       <w:r>
         <w:rPr>
-          <w:rFonts w:ascii="Calibri" w:hAnsi="Calibri"/>
+          <w:rFonts w:ascii="Calibri" w:hAnsi="Calibri" w:eastAsia="Calibri"/>
           <w:b/>
           <w:color w:val="1B4332"/>
           <w:sz w:val="22"/>
@@ -721,7 +757,7 @@
       </w:r>
       <w:r>
         <w:rPr>
-          <w:rFonts w:ascii="Calibri" w:hAnsi="Calibri"/>
+          <w:rFonts w:ascii="Calibri" w:hAnsi="Calibri" w:eastAsia="Calibri"/>
           <w:b w:val="0"/>
           <w:color w:val="1B4332"/>
           <w:sz w:val="22"/>
@@ -730,7 +766,7 @@
       </w:r>
       <w:r>
         <w:rPr>
-          <w:rFonts w:ascii="Calibri" w:hAnsi="Calibri"/>
+          <w:rFonts w:ascii="Calibri" w:hAnsi="Calibri" w:eastAsia="Calibri"/>
           <w:b/>
           <w:color w:val="1B4332"/>
           <w:sz w:val="22"/>
@@ -739,7 +775,7 @@
       </w:r>
       <w:r>
         <w:rPr>
-          <w:rFonts w:ascii="Calibri" w:hAnsi="Calibri"/>
+          <w:rFonts w:ascii="Calibri" w:hAnsi="Calibri" w:eastAsia="Calibri"/>
           <w:b w:val="0"/>
           <w:color w:val="1B4332"/>
           <w:sz w:val="22"/>
@@ -750,7 +786,7 @@
     <w:p>
       <w:r>
         <w:rPr>
-          <w:rFonts w:ascii="Calibri" w:hAnsi="Calibri"/>
+          <w:rFonts w:ascii="Calibri" w:hAnsi="Calibri" w:eastAsia="Calibri"/>
           <w:b/>
           <w:color w:val="2D6A4F"/>
           <w:sz w:val="26"/>
@@ -761,7 +797,7 @@
     <w:p>
       <w:r>
         <w:rPr>
-          <w:rFonts w:ascii="Calibri" w:hAnsi="Calibri"/>
+          <w:rFonts w:ascii="Calibri" w:hAnsi="Calibri" w:eastAsia="Calibri"/>
           <w:b/>
           <w:color w:val="1B4332"/>
           <w:sz w:val="22"/>
@@ -772,127 +808,138 @@
     <w:p>
       <w:r>
         <w:rPr>
-          <w:rFonts w:ascii="Calibri" w:hAnsi="Calibri"/>
-          <w:b w:val="0"/>
-          <w:color w:val="1B4332"/>
-          <w:sz w:val="22"/>
-        </w:rPr>
-        <w:t>FUNDACION CLEANTECH HUB S.A.S.</w:t>
+          <w:rFonts w:ascii="Calibri" w:hAnsi="Calibri" w:eastAsia="Calibri"/>
+          <w:b w:val="0"/>
+          <w:color w:val="1B4332"/>
+          <w:sz w:val="22"/>
+        </w:rPr>
+        <w:t>FUNDACIÓN CLEANTECH HUB</w:t>
       </w:r>
     </w:p>
     <w:p>
       <w:r>
         <w:rPr>
-          <w:rFonts w:ascii="Calibri" w:hAnsi="Calibri"/>
-          <w:b w:val="0"/>
-          <w:color w:val="1B4332"/>
-          <w:sz w:val="22"/>
-        </w:rPr>
-        <w:t>NIT (Número de Identificación Tributaria) 901.523.941-9.</w:t>
+          <w:rFonts w:ascii="Calibri" w:hAnsi="Calibri" w:eastAsia="Calibri"/>
+          <w:b w:val="0"/>
+          <w:color w:val="1B4332"/>
+          <w:sz w:val="22"/>
+        </w:rPr>
+        <w:t>Entidad sin ánimo de lucro (ESAL), régimen tributario especial.</w:t>
       </w:r>
     </w:p>
     <w:p>
       <w:r>
         <w:rPr>
-          <w:rFonts w:ascii="Calibri" w:hAnsi="Calibri"/>
-          <w:b w:val="0"/>
-          <w:color w:val="1B4332"/>
-          <w:sz w:val="22"/>
-        </w:rPr>
-        <w:t>Bogotá, D.C., Colombia.</w:t>
+          <w:rFonts w:ascii="Calibri" w:hAnsi="Calibri" w:eastAsia="Calibri"/>
+          <w:b w:val="0"/>
+          <w:color w:val="1B4332"/>
+          <w:sz w:val="22"/>
+        </w:rPr>
+        <w:t>NIT (Número de Identificación Tributaria) 901.523.941-9.</w:t>
       </w:r>
     </w:p>
     <w:p>
       <w:r>
         <w:rPr>
-          <w:rFonts w:ascii="Calibri" w:hAnsi="Calibri"/>
-          <w:b w:val="0"/>
-          <w:color w:val="1B4332"/>
-          <w:sz w:val="22"/>
-        </w:rPr>
-        <w:t>Legal representative named in the public data policy: Gideon Blaauw.</w:t>
+          <w:rFonts w:ascii="Calibri" w:hAnsi="Calibri" w:eastAsia="Calibri"/>
+          <w:b w:val="0"/>
+          <w:color w:val="1B4332"/>
+          <w:sz w:val="22"/>
+        </w:rPr>
+        <w:t>Bogotá D.C., Colombia.</w:t>
       </w:r>
     </w:p>
     <w:p>
       <w:r>
         <w:rPr>
-          <w:rFonts w:ascii="Calibri" w:hAnsi="Calibri"/>
-          <w:b/>
-          <w:color w:val="1B4332"/>
-          <w:sz w:val="22"/>
-        </w:rPr>
-        <w:t>Where this comes from:</w:t>
-      </w:r>
-      <w:r>
-        <w:rPr>
-          <w:rFonts w:ascii="Calibri" w:hAnsi="Calibri"/>
-          <w:b w:val="0"/>
-          <w:color w:val="1B4332"/>
-          <w:sz w:val="22"/>
-        </w:rPr>
-        <w:t xml:space="preserve"> the public “Política y tratamiento de datos” PDF linked from the governance page (https://cleantechhub.net/governance/). The introduction calls the entity FUNDACION CLEANTECH HUB S.A.S., domiciled in Bogotá, D.C., NIT 901.523.941-9. The contact block names Gideon Blaauw, cargo Representante legal, address CALLE 90 No. 19-41 OF 801, Bogotá.</w:t>
+          <w:rFonts w:ascii="Calibri" w:hAnsi="Calibri" w:eastAsia="Calibri"/>
+          <w:b w:val="0"/>
+          <w:color w:val="1B4332"/>
+          <w:sz w:val="22"/>
+        </w:rPr>
+        <w:t>Legal representative: Gideon Blaauw, Representante Legal de la Fundación CleantechHUB.</w:t>
       </w:r>
     </w:p>
     <w:p>
       <w:r>
         <w:rPr>
-          <w:rFonts w:ascii="Calibri" w:hAnsi="Calibri"/>
+          <w:rFonts w:ascii="Calibri" w:hAnsi="Calibri" w:eastAsia="Calibri"/>
           <w:b/>
           <w:color w:val="1B4332"/>
           <w:sz w:val="22"/>
         </w:rPr>
-        <w:t>Confirm before paste:</w:t>
-      </w:r>
-      <w:r>
-        <w:rPr>
-          <w:rFonts w:ascii="Calibri" w:hAnsi="Calibri"/>
-          <w:b w:val="0"/>
-          <w:color w:val="1B4332"/>
-          <w:sz w:val="22"/>
-        </w:rPr>
-        <w:t xml:space="preserve"> the governance page also says “Fundación” and links a RUT (Registro Único Tributario) file. If the RUT legal name differs from FUNDACION CLEANTECH HUB S.A.S., paste the RUT name instead. A mismatch is a known cause of </w:t>
-      </w:r>
-      <w:r>
-        <w:rPr>
-          <w:rFonts w:ascii="Calibri" w:hAnsi="Calibri"/>
-          <w:b/>
-          <w:color w:val="1B4332"/>
-          <w:sz w:val="22"/>
-        </w:rPr>
-        <w:t>Fail Organization Verification</w:t>
-      </w:r>
-      <w:r>
-        <w:rPr>
-          <w:rFonts w:ascii="Calibri" w:hAnsi="Calibri"/>
-          <w:b w:val="0"/>
-          <w:color w:val="1B4332"/>
-          <w:sz w:val="22"/>
-        </w:rPr>
-        <w:t xml:space="preserve">. </w:t>
-      </w:r>
-      <w:r>
-        <w:rPr>
-          <w:rFonts w:ascii="Consolas" w:hAnsi="Consolas"/>
-          <w:b w:val="0"/>
-          <w:color w:val="1B4332"/>
-          <w:sz w:val="22"/>
-        </w:rPr>
-        <w:t>[GIDEON TO FILL]</w:t>
-      </w:r>
-      <w:r>
-        <w:rPr>
-          <w:rFonts w:ascii="Calibri" w:hAnsi="Calibri"/>
-          <w:b w:val="0"/>
-          <w:color w:val="1B4332"/>
-          <w:sz w:val="22"/>
-        </w:rPr>
-        <w:t xml:space="preserve"> if the RUT name differs.</w:t>
+        <w:t>Where this comes from:</w:t>
+      </w:r>
+      <w:r>
+        <w:rPr>
+          <w:rFonts w:ascii="Calibri" w:hAnsi="Calibri" w:eastAsia="Calibri"/>
+          <w:b w:val="0"/>
+          <w:color w:val="1B4332"/>
+          <w:sz w:val="22"/>
+        </w:rPr>
+        <w:t xml:space="preserve"> Gideon confirmed this legal name, this non-profit form, and this tax number on 22 October 2026 for the public privacy policy. The NIT matches the public “Política y tratamiento de datos” PDF linked from </w:t>
+      </w:r>
+      <w:r>
+        <w:rPr>
+          <w:rFonts w:ascii="Calibri" w:hAnsi="Calibri" w:eastAsia="Calibri"/>
+          <w:b w:val="0"/>
+          <w:color w:val="1B4332"/>
+          <w:sz w:val="22"/>
+        </w:rPr>
+        <w:t>the governance page (https://cleantechhub.net/governance/)</w:t>
+      </w:r>
+      <w:r>
+        <w:rPr>
+          <w:rFonts w:ascii="Calibri" w:hAnsi="Calibri" w:eastAsia="Calibri"/>
+          <w:b w:val="0"/>
+          <w:color w:val="1B4332"/>
+          <w:sz w:val="22"/>
+        </w:rPr>
+        <w:t>. That page also says “Fundación”. The PDF contact block names Gideon Blaauw, cargo Representante legal.</w:t>
       </w:r>
     </w:p>
     <w:p>
       <w:r>
         <w:rPr>
-          <w:rFonts w:ascii="Calibri" w:hAnsi="Calibri"/>
+          <w:rFonts w:ascii="Calibri" w:hAnsi="Calibri" w:eastAsia="Calibri"/>
+          <w:b/>
+          <w:color w:val="1B4332"/>
+          <w:sz w:val="22"/>
+        </w:rPr>
+        <w:t>Paste this name.</w:t>
+      </w:r>
+      <w:r>
+        <w:rPr>
+          <w:rFonts w:ascii="Calibri" w:hAnsi="Calibri" w:eastAsia="Calibri"/>
+          <w:b w:val="0"/>
+          <w:color w:val="1B4332"/>
+          <w:sz w:val="22"/>
+        </w:rPr>
+        <w:t xml:space="preserve"> Do not add a simplified-stock-company suffix. The 2022 PDF used a commercial company form. Do not copy that form into this field. A name that does not match the registry is a known cause of </w:t>
+      </w:r>
+      <w:r>
+        <w:rPr>
+          <w:rFonts w:ascii="Calibri" w:hAnsi="Calibri" w:eastAsia="Calibri"/>
+          <w:b/>
+          <w:color w:val="1B4332"/>
+          <w:sz w:val="22"/>
+        </w:rPr>
+        <w:t>Fail Organization Verification</w:t>
+      </w:r>
+      <w:r>
+        <w:rPr>
+          <w:rFonts w:ascii="Calibri" w:hAnsi="Calibri" w:eastAsia="Calibri"/>
+          <w:b w:val="0"/>
+          <w:color w:val="1B4332"/>
+          <w:sz w:val="22"/>
+        </w:rPr>
+        <w:t>.</w:t>
+      </w:r>
+    </w:p>
+    <w:p>
+      <w:r>
+        <w:rPr>
+          <w:rFonts w:ascii="Calibri" w:hAnsi="Calibri" w:eastAsia="Calibri"/>
           <w:b/>
           <w:color w:val="2D6A4F"/>
           <w:sz w:val="26"/>
@@ -903,7 +950,7 @@
     <w:p>
       <w:r>
         <w:rPr>
-          <w:rFonts w:ascii="Calibri" w:hAnsi="Calibri"/>
+          <w:rFonts w:ascii="Calibri" w:hAnsi="Calibri" w:eastAsia="Calibri"/>
           <w:b/>
           <w:color w:val="1B4332"/>
           <w:sz w:val="22"/>
@@ -914,18 +961,18 @@
     <w:p>
       <w:r>
         <w:rPr>
-          <w:rFonts w:ascii="Calibri" w:hAnsi="Calibri"/>
-          <w:b w:val="0"/>
-          <w:color w:val="1B4332"/>
-          <w:sz w:val="22"/>
-        </w:rPr>
-        <w:t>CALLE 90 No. 19-41 OF 801, Bogotá, D.C., Colombia.</w:t>
+          <w:rFonts w:ascii="Calibri" w:hAnsi="Calibri" w:eastAsia="Calibri"/>
+          <w:b w:val="0"/>
+          <w:color w:val="1B4332"/>
+          <w:sz w:val="22"/>
+        </w:rPr>
+        <w:t>Calle 90 No. 19-41 Of. 801, Bogotá D.C., Colombia.</w:t>
       </w:r>
     </w:p>
     <w:p>
       <w:r>
         <w:rPr>
-          <w:rFonts w:ascii="Calibri" w:hAnsi="Calibri"/>
+          <w:rFonts w:ascii="Calibri" w:hAnsi="Calibri" w:eastAsia="Calibri"/>
           <w:b/>
           <w:color w:val="1B4332"/>
           <w:sz w:val="22"/>
@@ -934,16 +981,16 @@
       </w:r>
       <w:r>
         <w:rPr>
-          <w:rFonts w:ascii="Calibri" w:hAnsi="Calibri"/>
-          <w:b w:val="0"/>
-          <w:color w:val="1B4332"/>
-          <w:sz w:val="22"/>
-        </w:rPr>
-        <w:t xml:space="preserve"> the same public data policy, and the site footer at </w:t>
-      </w:r>
-      <w:r>
-        <w:rPr>
-          <w:rFonts w:ascii="Consolas" w:hAnsi="Consolas"/>
+          <w:rFonts w:ascii="Calibri" w:hAnsi="Calibri" w:eastAsia="Calibri"/>
+          <w:b w:val="0"/>
+          <w:color w:val="1B4332"/>
+          <w:sz w:val="22"/>
+        </w:rPr>
+        <w:t xml:space="preserve"> Gideon confirmed this address on 22 October 2026. It matches the public data policy (CALLE 90 No. 19-41 OF 801, Bogotá) and the site footer at </w:t>
+      </w:r>
+      <w:r>
+        <w:rPr>
+          <w:rFonts w:ascii="Calibri" w:hAnsi="Calibri" w:eastAsia="Calibri"/>
           <w:b w:val="0"/>
           <w:color w:val="1B4332"/>
           <w:sz w:val="22"/>
@@ -952,56 +999,29 @@
       </w:r>
       <w:r>
         <w:rPr>
-          <w:rFonts w:ascii="Calibri" w:hAnsi="Calibri"/>
-          <w:b w:val="0"/>
-          <w:color w:val="1B4332"/>
-          <w:sz w:val="22"/>
-        </w:rPr>
-        <w:t>, which prints “Cll 90 #19 - 41 Office 801”. The policy adds the city.</w:t>
+          <w:rFonts w:ascii="Calibri" w:hAnsi="Calibri" w:eastAsia="Calibri"/>
+          <w:b w:val="0"/>
+          <w:color w:val="1B4332"/>
+          <w:sz w:val="22"/>
+        </w:rPr>
+        <w:t>, which prints “Cll 90 #19 - 41 Office 801”.</w:t>
       </w:r>
     </w:p>
     <w:p>
       <w:r>
         <w:rPr>
-          <w:rFonts w:ascii="Calibri" w:hAnsi="Calibri"/>
-          <w:b/>
-          <w:color w:val="1B4332"/>
-          <w:sz w:val="22"/>
-        </w:rPr>
-        <w:t>Confirm before paste:</w:t>
-      </w:r>
-      <w:r>
-        <w:rPr>
-          <w:rFonts w:ascii="Calibri" w:hAnsi="Calibri"/>
-          <w:b w:val="0"/>
-          <w:color w:val="1B4332"/>
-          <w:sz w:val="22"/>
-        </w:rPr>
-        <w:t xml:space="preserve"> if the RUT shows a different registered address, paste the RUT address. </w:t>
-      </w:r>
-      <w:r>
-        <w:rPr>
-          <w:rFonts w:ascii="Consolas" w:hAnsi="Consolas"/>
-          <w:b w:val="0"/>
-          <w:color w:val="1B4332"/>
-          <w:sz w:val="22"/>
-        </w:rPr>
-        <w:t>[GIDEON TO FILL]</w:t>
-      </w:r>
-      <w:r>
-        <w:rPr>
-          <w:rFonts w:ascii="Calibri" w:hAnsi="Calibri"/>
-          <w:b w:val="0"/>
-          <w:color w:val="1B4332"/>
-          <w:sz w:val="22"/>
-        </w:rPr>
-        <w:t xml:space="preserve"> the address that matches the registry. Do not paste Calle 45 #9-42 from the worker authorization PDF.</w:t>
+          <w:rFonts w:ascii="Calibri" w:hAnsi="Calibri" w:eastAsia="Calibri"/>
+          <w:b w:val="0"/>
+          <w:color w:val="1B4332"/>
+          <w:sz w:val="22"/>
+        </w:rPr>
+        <w:t>Do not paste Calle 45 #9-42 from the worker authorization PDF.</w:t>
       </w:r>
     </w:p>
     <w:p>
       <w:r>
         <w:rPr>
-          <w:rFonts w:ascii="Calibri" w:hAnsi="Calibri"/>
+          <w:rFonts w:ascii="Calibri" w:hAnsi="Calibri" w:eastAsia="Calibri"/>
           <w:b/>
           <w:color w:val="2D6A4F"/>
           <w:sz w:val="26"/>
@@ -1012,7 +1032,7 @@
     <w:p>
       <w:r>
         <w:rPr>
-          <w:rFonts w:ascii="Calibri" w:hAnsi="Calibri"/>
+          <w:rFonts w:ascii="Calibri" w:hAnsi="Calibri" w:eastAsia="Calibri"/>
           <w:b/>
           <w:color w:val="1B4332"/>
           <w:sz w:val="22"/>
@@ -1023,7 +1043,7 @@
     <w:p>
       <w:r>
         <w:rPr>
-          <w:rFonts w:ascii="Calibri" w:hAnsi="Calibri"/>
+          <w:rFonts w:ascii="Calibri" w:hAnsi="Calibri" w:eastAsia="Calibri"/>
           <w:b w:val="0"/>
           <w:color w:val="1B4332"/>
           <w:sz w:val="22"/>
@@ -1034,7 +1054,7 @@
     <w:p>
       <w:r>
         <w:rPr>
-          <w:rFonts w:ascii="Calibri" w:hAnsi="Calibri"/>
+          <w:rFonts w:ascii="Calibri" w:hAnsi="Calibri" w:eastAsia="Calibri"/>
           <w:b/>
           <w:color w:val="1B4332"/>
           <w:sz w:val="22"/>
@@ -1043,18 +1063,36 @@
       </w:r>
       <w:r>
         <w:rPr>
-          <w:rFonts w:ascii="Calibri" w:hAnsi="Calibri"/>
-          <w:b w:val="0"/>
-          <w:color w:val="1B4332"/>
-          <w:sz w:val="22"/>
-        </w:rPr>
-        <w:t xml:space="preserve"> Gideon’s published address on the About page (https://cleantechhub.net/about/). The site contact address is info@cleantechhub.net.</w:t>
+          <w:rFonts w:ascii="Calibri" w:hAnsi="Calibri" w:eastAsia="Calibri"/>
+          <w:b w:val="0"/>
+          <w:color w:val="1B4332"/>
+          <w:sz w:val="22"/>
+        </w:rPr>
+        <w:t xml:space="preserve"> Gideon’s published address on </w:t>
+      </w:r>
+      <w:r>
+        <w:rPr>
+          <w:rFonts w:ascii="Calibri" w:hAnsi="Calibri" w:eastAsia="Calibri"/>
+          <w:b w:val="0"/>
+          <w:color w:val="1B4332"/>
+          <w:sz w:val="22"/>
+        </w:rPr>
+        <w:t>the About page (https://cleantechhub.net/about/)</w:t>
+      </w:r>
+      <w:r>
+        <w:rPr>
+          <w:rFonts w:ascii="Calibri" w:hAnsi="Calibri" w:eastAsia="Calibri"/>
+          <w:b w:val="0"/>
+          <w:color w:val="1B4332"/>
+          <w:sz w:val="22"/>
+        </w:rPr>
+        <w:t>. The public privacy contact is a different mailbox, admin@cleantechhub.net. Use that mailbox here only if he can open it and LinkedIn accepts it for verification. Prefer the mailbox he actually reads.</w:t>
       </w:r>
     </w:p>
     <w:p>
       <w:r>
         <w:rPr>
-          <w:rFonts w:ascii="Calibri" w:hAnsi="Calibri"/>
+          <w:rFonts w:ascii="Calibri" w:hAnsi="Calibri" w:eastAsia="Calibri"/>
           <w:b/>
           <w:color w:val="1B4332"/>
           <w:sz w:val="22"/>
@@ -1063,7 +1101,7 @@
       </w:r>
       <w:r>
         <w:rPr>
-          <w:rFonts w:ascii="Calibri" w:hAnsi="Calibri"/>
+          <w:rFonts w:ascii="Calibri" w:hAnsi="Calibri" w:eastAsia="Calibri"/>
           <w:b w:val="0"/>
           <w:color w:val="1B4332"/>
           <w:sz w:val="22"/>
@@ -1072,7 +1110,7 @@
       </w:r>
       <w:r>
         <w:rPr>
-          <w:rFonts w:ascii="Consolas" w:hAnsi="Consolas"/>
+          <w:rFonts w:ascii="Calibri" w:hAnsi="Calibri" w:eastAsia="Calibri"/>
           <w:b w:val="0"/>
           <w:color w:val="1B4332"/>
           <w:sz w:val="22"/>
@@ -1081,7 +1119,7 @@
       </w:r>
       <w:r>
         <w:rPr>
-          <w:rFonts w:ascii="Calibri" w:hAnsi="Calibri"/>
+          <w:rFonts w:ascii="Calibri" w:hAnsi="Calibri" w:eastAsia="Calibri"/>
           <w:b w:val="0"/>
           <w:color w:val="1B4332"/>
           <w:sz w:val="22"/>
@@ -1092,7 +1130,7 @@
     <w:p>
       <w:r>
         <w:rPr>
-          <w:rFonts w:ascii="Calibri" w:hAnsi="Calibri"/>
+          <w:rFonts w:ascii="Calibri" w:hAnsi="Calibri" w:eastAsia="Calibri"/>
           <w:b/>
           <w:color w:val="2D6A4F"/>
           <w:sz w:val="26"/>
@@ -1103,7 +1141,7 @@
     <w:p>
       <w:r>
         <w:rPr>
-          <w:rFonts w:ascii="Calibri" w:hAnsi="Calibri"/>
+          <w:rFonts w:ascii="Calibri" w:hAnsi="Calibri" w:eastAsia="Calibri"/>
           <w:b/>
           <w:color w:val="1B4332"/>
           <w:sz w:val="22"/>
@@ -1114,7 +1152,7 @@
     <w:p>
       <w:r>
         <w:rPr>
-          <w:rFonts w:ascii="Calibri" w:hAnsi="Calibri"/>
+          <w:rFonts w:ascii="Calibri" w:hAnsi="Calibri" w:eastAsia="Calibri"/>
           <w:b w:val="0"/>
           <w:color w:val="1B4332"/>
           <w:sz w:val="22"/>
@@ -1125,7 +1163,7 @@
     <w:p>
       <w:r>
         <w:rPr>
-          <w:rFonts w:ascii="Calibri" w:hAnsi="Calibri"/>
+          <w:rFonts w:ascii="Calibri" w:hAnsi="Calibri" w:eastAsia="Calibri"/>
           <w:b w:val="0"/>
           <w:color w:val="1B4332"/>
           <w:sz w:val="22"/>
@@ -1136,7 +1174,7 @@
     <w:p>
       <w:r>
         <w:rPr>
-          <w:rFonts w:ascii="Calibri" w:hAnsi="Calibri"/>
+          <w:rFonts w:ascii="Calibri" w:hAnsi="Calibri" w:eastAsia="Calibri"/>
           <w:b/>
           <w:color w:val="2D6A4F"/>
           <w:sz w:val="26"/>
@@ -1147,7 +1185,7 @@
     <w:p>
       <w:r>
         <w:rPr>
-          <w:rFonts w:ascii="Calibri" w:hAnsi="Calibri"/>
+          <w:rFonts w:ascii="Calibri" w:hAnsi="Calibri" w:eastAsia="Calibri"/>
           <w:b/>
           <w:color w:val="1B4332"/>
           <w:sz w:val="22"/>
@@ -1158,7 +1196,7 @@
     <w:p>
       <w:r>
         <w:rPr>
-          <w:rFonts w:ascii="Calibri" w:hAnsi="Calibri"/>
+          <w:rFonts w:ascii="Calibri" w:hAnsi="Calibri" w:eastAsia="Calibri"/>
           <w:b w:val="0"/>
           <w:color w:val="1B4332"/>
           <w:sz w:val="22"/>
@@ -1169,7 +1207,7 @@
     <w:p>
       <w:r>
         <w:rPr>
-          <w:rFonts w:ascii="Calibri" w:hAnsi="Calibri"/>
+          <w:rFonts w:ascii="Calibri" w:hAnsi="Calibri" w:eastAsia="Calibri"/>
           <w:b/>
           <w:color w:val="1B4332"/>
           <w:sz w:val="22"/>
@@ -1180,7 +1218,7 @@
     <w:p>
       <w:r>
         <w:rPr>
-          <w:rFonts w:ascii="Calibri" w:hAnsi="Calibri"/>
+          <w:rFonts w:ascii="Calibri" w:hAnsi="Calibri" w:eastAsia="Calibri"/>
           <w:b w:val="0"/>
           <w:color w:val="1B4332"/>
           <w:sz w:val="22"/>
@@ -1191,7 +1229,7 @@
     <w:p>
       <w:r>
         <w:rPr>
-          <w:rFonts w:ascii="Calibri" w:hAnsi="Calibri"/>
+          <w:rFonts w:ascii="Calibri" w:hAnsi="Calibri" w:eastAsia="Calibri"/>
           <w:b w:val="0"/>
           <w:color w:val="1B4332"/>
           <w:sz w:val="22"/>
@@ -1200,7 +1238,7 @@
       </w:r>
       <w:r>
         <w:rPr>
-          <w:rFonts w:ascii="Consolas" w:hAnsi="Consolas"/>
+          <w:rFonts w:ascii="Calibri" w:hAnsi="Calibri" w:eastAsia="Calibri"/>
           <w:b w:val="0"/>
           <w:color w:val="1B4332"/>
           <w:sz w:val="22"/>
@@ -1209,7 +1247,7 @@
       </w:r>
       <w:r>
         <w:rPr>
-          <w:rFonts w:ascii="Calibri" w:hAnsi="Calibri"/>
+          <w:rFonts w:ascii="Calibri" w:hAnsi="Calibri" w:eastAsia="Calibri"/>
           <w:b w:val="0"/>
           <w:color w:val="1B4332"/>
           <w:sz w:val="22"/>
@@ -1220,7 +1258,7 @@
     <w:p>
       <w:r>
         <w:rPr>
-          <w:rFonts w:ascii="Calibri" w:hAnsi="Calibri"/>
+          <w:rFonts w:ascii="Calibri" w:hAnsi="Calibri" w:eastAsia="Calibri"/>
           <w:b/>
           <w:color w:val="2D6A4F"/>
           <w:sz w:val="26"/>
@@ -1231,7 +1269,7 @@
     <w:p>
       <w:r>
         <w:rPr>
-          <w:rFonts w:ascii="Calibri" w:hAnsi="Calibri"/>
+          <w:rFonts w:ascii="Calibri" w:hAnsi="Calibri" w:eastAsia="Calibri"/>
           <w:b/>
           <w:color w:val="1B4332"/>
           <w:sz w:val="22"/>
@@ -1242,7 +1280,7 @@
     <w:p>
       <w:r>
         <w:rPr>
-          <w:rFonts w:ascii="Calibri" w:hAnsi="Calibri"/>
+          <w:rFonts w:ascii="Calibri" w:hAnsi="Calibri" w:eastAsia="Calibri"/>
           <w:b w:val="0"/>
           <w:color w:val="1B4332"/>
           <w:sz w:val="22"/>
@@ -1253,7 +1291,7 @@
     <w:p>
       <w:r>
         <w:rPr>
-          <w:rFonts w:ascii="Calibri" w:hAnsi="Calibri"/>
+          <w:rFonts w:ascii="Calibri" w:hAnsi="Calibri" w:eastAsia="Calibri"/>
           <w:b w:val="0"/>
           <w:color w:val="1B4332"/>
           <w:sz w:val="22"/>
@@ -1264,7 +1302,7 @@
     <w:p>
       <w:r>
         <w:rPr>
-          <w:rFonts w:ascii="Calibri" w:hAnsi="Calibri"/>
+          <w:rFonts w:ascii="Calibri" w:hAnsi="Calibri" w:eastAsia="Calibri"/>
           <w:b w:val="0"/>
           <w:color w:val="1B4332"/>
           <w:sz w:val="22"/>
@@ -1275,7 +1313,7 @@
     <w:p>
       <w:r>
         <w:rPr>
-          <w:rFonts w:ascii="Calibri" w:hAnsi="Calibri"/>
+          <w:rFonts w:ascii="Calibri" w:hAnsi="Calibri" w:eastAsia="Calibri"/>
           <w:b w:val="0"/>
           <w:color w:val="1B4332"/>
           <w:sz w:val="22"/>
@@ -1284,7 +1322,7 @@
       </w:r>
       <w:r>
         <w:rPr>
-          <w:rFonts w:ascii="Calibri" w:hAnsi="Calibri"/>
+          <w:rFonts w:ascii="Calibri" w:hAnsi="Calibri" w:eastAsia="Calibri"/>
           <w:b/>
           <w:color w:val="1B4332"/>
           <w:sz w:val="22"/>
@@ -1293,7 +1331,7 @@
       </w:r>
       <w:r>
         <w:rPr>
-          <w:rFonts w:ascii="Calibri" w:hAnsi="Calibri"/>
+          <w:rFonts w:ascii="Calibri" w:hAnsi="Calibri" w:eastAsia="Calibri"/>
           <w:b w:val="0"/>
           <w:color w:val="1B4332"/>
           <w:sz w:val="22"/>
@@ -1304,7 +1342,7 @@
     <w:p>
       <w:r>
         <w:rPr>
-          <w:rFonts w:ascii="Calibri" w:hAnsi="Calibri"/>
+          <w:rFonts w:ascii="Calibri" w:hAnsi="Calibri" w:eastAsia="Calibri"/>
           <w:b/>
           <w:color w:val="2D6A4F"/>
           <w:sz w:val="26"/>
@@ -1315,7 +1353,7 @@
     <w:p>
       <w:r>
         <w:rPr>
-          <w:rFonts w:ascii="Calibri" w:hAnsi="Calibri"/>
+          <w:rFonts w:ascii="Calibri" w:hAnsi="Calibri" w:eastAsia="Calibri"/>
           <w:b/>
           <w:color w:val="1B4332"/>
           <w:sz w:val="22"/>
@@ -1326,7 +1364,7 @@
     <w:p>
       <w:r>
         <w:rPr>
-          <w:rFonts w:ascii="Calibri" w:hAnsi="Calibri"/>
+          <w:rFonts w:ascii="Calibri" w:hAnsi="Calibri" w:eastAsia="Calibri"/>
           <w:b w:val="0"/>
           <w:color w:val="1B4332"/>
           <w:sz w:val="22"/>
@@ -1337,7 +1375,7 @@
     <w:p>
       <w:r>
         <w:rPr>
-          <w:rFonts w:ascii="Calibri" w:hAnsi="Calibri"/>
+          <w:rFonts w:ascii="Calibri" w:hAnsi="Calibri" w:eastAsia="Calibri"/>
           <w:b w:val="0"/>
           <w:color w:val="1B4332"/>
           <w:sz w:val="22"/>
@@ -1348,7 +1386,7 @@
     <w:p>
       <w:r>
         <w:rPr>
-          <w:rFonts w:ascii="Calibri" w:hAnsi="Calibri"/>
+          <w:rFonts w:ascii="Calibri" w:hAnsi="Calibri" w:eastAsia="Calibri"/>
           <w:b w:val="0"/>
           <w:color w:val="1B4332"/>
           <w:sz w:val="22"/>
@@ -1359,7 +1397,7 @@
     <w:p>
       <w:r>
         <w:rPr>
-          <w:rFonts w:ascii="Calibri" w:hAnsi="Calibri"/>
+          <w:rFonts w:ascii="Calibri" w:hAnsi="Calibri" w:eastAsia="Calibri"/>
           <w:b w:val="0"/>
           <w:color w:val="1B4332"/>
           <w:sz w:val="22"/>
@@ -1368,7 +1406,7 @@
       </w:r>
       <w:r>
         <w:rPr>
-          <w:rFonts w:ascii="Consolas" w:hAnsi="Consolas"/>
+          <w:rFonts w:ascii="Calibri" w:hAnsi="Calibri" w:eastAsia="Calibri"/>
           <w:b w:val="0"/>
           <w:color w:val="1B4332"/>
           <w:sz w:val="22"/>
@@ -1377,7 +1415,7 @@
       </w:r>
       <w:r>
         <w:rPr>
-          <w:rFonts w:ascii="Calibri" w:hAnsi="Calibri"/>
+          <w:rFonts w:ascii="Calibri" w:hAnsi="Calibri" w:eastAsia="Calibri"/>
           <w:b w:val="0"/>
           <w:color w:val="1B4332"/>
           <w:sz w:val="22"/>
@@ -1386,7 +1424,7 @@
       </w:r>
       <w:r>
         <w:rPr>
-          <w:rFonts w:ascii="Consolas" w:hAnsi="Consolas"/>
+          <w:rFonts w:ascii="Calibri" w:hAnsi="Calibri" w:eastAsia="Calibri"/>
           <w:b w:val="0"/>
           <w:color w:val="1B4332"/>
           <w:sz w:val="22"/>
@@ -1395,7 +1433,7 @@
       </w:r>
       <w:r>
         <w:rPr>
-          <w:rFonts w:ascii="Calibri" w:hAnsi="Calibri"/>
+          <w:rFonts w:ascii="Calibri" w:hAnsi="Calibri" w:eastAsia="Calibri"/>
           <w:b w:val="0"/>
           <w:color w:val="1B4332"/>
           <w:sz w:val="22"/>
@@ -1406,7 +1444,7 @@
     <w:p>
       <w:r>
         <w:rPr>
-          <w:rFonts w:ascii="Calibri" w:hAnsi="Calibri"/>
+          <w:rFonts w:ascii="Calibri" w:hAnsi="Calibri" w:eastAsia="Calibri"/>
           <w:b w:val="0"/>
           <w:color w:val="1B4332"/>
           <w:sz w:val="22"/>
@@ -1417,7 +1455,7 @@
     <w:p>
       <w:r>
         <w:rPr>
-          <w:rFonts w:ascii="Calibri" w:hAnsi="Calibri"/>
+          <w:rFonts w:ascii="Calibri" w:hAnsi="Calibri" w:eastAsia="Calibri"/>
           <w:b/>
           <w:color w:val="2D6A4F"/>
           <w:sz w:val="26"/>
@@ -1428,7 +1466,7 @@
     <w:p>
       <w:r>
         <w:rPr>
-          <w:rFonts w:ascii="Calibri" w:hAnsi="Calibri"/>
+          <w:rFonts w:ascii="Calibri" w:hAnsi="Calibri" w:eastAsia="Calibri"/>
           <w:b/>
           <w:color w:val="1B4332"/>
           <w:sz w:val="22"/>
@@ -1439,7 +1477,7 @@
     <w:p>
       <w:r>
         <w:rPr>
-          <w:rFonts w:ascii="Calibri" w:hAnsi="Calibri"/>
+          <w:rFonts w:ascii="Calibri" w:hAnsi="Calibri" w:eastAsia="Calibri"/>
           <w:b w:val="0"/>
           <w:color w:val="1B4332"/>
           <w:sz w:val="22"/>
@@ -1450,7 +1488,7 @@
     <w:p>
       <w:r>
         <w:rPr>
-          <w:rFonts w:ascii="Calibri" w:hAnsi="Calibri"/>
+          <w:rFonts w:ascii="Calibri" w:hAnsi="Calibri" w:eastAsia="Calibri"/>
           <w:b w:val="0"/>
           <w:color w:val="1B4332"/>
           <w:sz w:val="22"/>
@@ -1461,7 +1499,7 @@
     <w:p>
       <w:r>
         <w:rPr>
-          <w:rFonts w:ascii="Calibri" w:hAnsi="Calibri"/>
+          <w:rFonts w:ascii="Calibri" w:hAnsi="Calibri" w:eastAsia="Calibri"/>
           <w:b w:val="0"/>
           <w:color w:val="1B4332"/>
           <w:sz w:val="22"/>
@@ -1472,7 +1510,7 @@
     <w:p>
       <w:r>
         <w:rPr>
-          <w:rFonts w:ascii="Calibri" w:hAnsi="Calibri"/>
+          <w:rFonts w:ascii="Calibri" w:hAnsi="Calibri" w:eastAsia="Calibri"/>
           <w:b w:val="0"/>
           <w:color w:val="1B4332"/>
           <w:sz w:val="22"/>
@@ -1483,7 +1521,7 @@
     <w:p>
       <w:r>
         <w:rPr>
-          <w:rFonts w:ascii="Calibri" w:hAnsi="Calibri"/>
+          <w:rFonts w:ascii="Calibri" w:hAnsi="Calibri" w:eastAsia="Calibri"/>
           <w:b w:val="0"/>
           <w:color w:val="1B4332"/>
           <w:sz w:val="22"/>
@@ -1494,7 +1532,7 @@
     <w:p>
       <w:r>
         <w:rPr>
-          <w:rFonts w:ascii="Calibri" w:hAnsi="Calibri"/>
+          <w:rFonts w:ascii="Calibri" w:hAnsi="Calibri" w:eastAsia="Calibri"/>
           <w:b w:val="0"/>
           <w:color w:val="1B4332"/>
           <w:sz w:val="22"/>
@@ -1505,7 +1543,7 @@
     <w:p>
       <w:r>
         <w:rPr>
-          <w:rFonts w:ascii="Calibri" w:hAnsi="Calibri"/>
+          <w:rFonts w:ascii="Calibri" w:hAnsi="Calibri" w:eastAsia="Calibri"/>
           <w:b w:val="0"/>
           <w:color w:val="1B4332"/>
           <w:sz w:val="22"/>
@@ -1516,7 +1554,7 @@
     <w:p>
       <w:r>
         <w:rPr>
-          <w:rFonts w:ascii="Calibri" w:hAnsi="Calibri"/>
+          <w:rFonts w:ascii="Calibri" w:hAnsi="Calibri" w:eastAsia="Calibri"/>
           <w:b w:val="0"/>
           <w:color w:val="1B4332"/>
           <w:sz w:val="22"/>
@@ -1527,7 +1565,7 @@
     <w:p>
       <w:r>
         <w:rPr>
-          <w:rFonts w:ascii="Calibri" w:hAnsi="Calibri"/>
+          <w:rFonts w:ascii="Calibri" w:hAnsi="Calibri" w:eastAsia="Calibri"/>
           <w:b w:val="0"/>
           <w:color w:val="1B4332"/>
           <w:sz w:val="22"/>
@@ -1538,7 +1576,7 @@
     <w:p>
       <w:r>
         <w:rPr>
-          <w:rFonts w:ascii="Calibri" w:hAnsi="Calibri"/>
+          <w:rFonts w:ascii="Calibri" w:hAnsi="Calibri" w:eastAsia="Calibri"/>
           <w:b w:val="0"/>
           <w:color w:val="1B4332"/>
           <w:sz w:val="22"/>
@@ -1549,7 +1587,7 @@
     <w:p>
       <w:r>
         <w:rPr>
-          <w:rFonts w:ascii="Calibri" w:hAnsi="Calibri"/>
+          <w:rFonts w:ascii="Calibri" w:hAnsi="Calibri" w:eastAsia="Calibri"/>
           <w:b w:val="0"/>
           <w:color w:val="1B4332"/>
           <w:sz w:val="22"/>
@@ -1560,7 +1598,7 @@
     <w:p>
       <w:r>
         <w:rPr>
-          <w:rFonts w:ascii="Calibri" w:hAnsi="Calibri"/>
+          <w:rFonts w:ascii="Calibri" w:hAnsi="Calibri" w:eastAsia="Calibri"/>
           <w:b/>
           <w:color w:val="2D6A4F"/>
           <w:sz w:val="26"/>
@@ -1571,7 +1609,7 @@
     <w:p>
       <w:r>
         <w:rPr>
-          <w:rFonts w:ascii="Calibri" w:hAnsi="Calibri"/>
+          <w:rFonts w:ascii="Calibri" w:hAnsi="Calibri" w:eastAsia="Calibri"/>
           <w:b/>
           <w:color w:val="1B4332"/>
           <w:sz w:val="22"/>
@@ -1582,7 +1620,7 @@
     <w:p>
       <w:r>
         <w:rPr>
-          <w:rFonts w:ascii="Calibri" w:hAnsi="Calibri"/>
+          <w:rFonts w:ascii="Calibri" w:hAnsi="Calibri" w:eastAsia="Calibri"/>
           <w:b w:val="0"/>
           <w:color w:val="1B4332"/>
           <w:sz w:val="22"/>
@@ -1593,7 +1631,7 @@
     <w:p>
       <w:r>
         <w:rPr>
-          <w:rFonts w:ascii="Calibri" w:hAnsi="Calibri"/>
+          <w:rFonts w:ascii="Calibri" w:hAnsi="Calibri" w:eastAsia="Calibri"/>
           <w:b w:val="0"/>
           <w:color w:val="1B4332"/>
           <w:sz w:val="22"/>
@@ -1604,7 +1642,7 @@
     <w:p>
       <w:r>
         <w:rPr>
-          <w:rFonts w:ascii="Calibri" w:hAnsi="Calibri"/>
+          <w:rFonts w:ascii="Calibri" w:hAnsi="Calibri" w:eastAsia="Calibri"/>
           <w:b w:val="0"/>
           <w:color w:val="1B4332"/>
           <w:sz w:val="22"/>
@@ -1615,7 +1653,7 @@
     <w:p>
       <w:r>
         <w:rPr>
-          <w:rFonts w:ascii="Calibri" w:hAnsi="Calibri"/>
+          <w:rFonts w:ascii="Calibri" w:hAnsi="Calibri" w:eastAsia="Calibri"/>
           <w:b w:val="0"/>
           <w:color w:val="1B4332"/>
           <w:sz w:val="22"/>
@@ -1626,7 +1664,7 @@
     <w:p>
       <w:r>
         <w:rPr>
-          <w:rFonts w:ascii="Calibri" w:hAnsi="Calibri"/>
+          <w:rFonts w:ascii="Calibri" w:hAnsi="Calibri" w:eastAsia="Calibri"/>
           <w:b/>
           <w:color w:val="2D6A4F"/>
           <w:sz w:val="26"/>
@@ -1637,7 +1675,7 @@
     <w:p>
       <w:r>
         <w:rPr>
-          <w:rFonts w:ascii="Calibri" w:hAnsi="Calibri"/>
+          <w:rFonts w:ascii="Calibri" w:hAnsi="Calibri" w:eastAsia="Calibri"/>
           <w:b/>
           <w:color w:val="1B4332"/>
           <w:sz w:val="22"/>
@@ -1648,7 +1686,7 @@
     <w:p>
       <w:r>
         <w:rPr>
-          <w:rFonts w:ascii="Calibri" w:hAnsi="Calibri"/>
+          <w:rFonts w:ascii="Calibri" w:hAnsi="Calibri" w:eastAsia="Calibri"/>
           <w:b w:val="0"/>
           <w:color w:val="1B4332"/>
           <w:sz w:val="22"/>
@@ -1659,7 +1697,7 @@
     <w:p>
       <w:r>
         <w:rPr>
-          <w:rFonts w:ascii="Calibri" w:hAnsi="Calibri"/>
+          <w:rFonts w:ascii="Calibri" w:hAnsi="Calibri" w:eastAsia="Calibri"/>
           <w:b w:val="0"/>
           <w:color w:val="1B4332"/>
           <w:sz w:val="22"/>
@@ -1670,7 +1708,7 @@
     <w:p>
       <w:r>
         <w:rPr>
-          <w:rFonts w:ascii="Calibri" w:hAnsi="Calibri"/>
+          <w:rFonts w:ascii="Calibri" w:hAnsi="Calibri" w:eastAsia="Calibri"/>
           <w:b w:val="0"/>
           <w:color w:val="1B4332"/>
           <w:sz w:val="22"/>
@@ -1681,7 +1719,7 @@
     <w:p>
       <w:r>
         <w:rPr>
-          <w:rFonts w:ascii="Calibri" w:hAnsi="Calibri"/>
+          <w:rFonts w:ascii="Calibri" w:hAnsi="Calibri" w:eastAsia="Calibri"/>
           <w:b w:val="0"/>
           <w:color w:val="1B4332"/>
           <w:sz w:val="22"/>
@@ -1692,7 +1730,7 @@
     <w:p>
       <w:r>
         <w:rPr>
-          <w:rFonts w:ascii="Calibri" w:hAnsi="Calibri"/>
+          <w:rFonts w:ascii="Calibri" w:hAnsi="Calibri" w:eastAsia="Calibri"/>
           <w:b w:val="0"/>
           <w:color w:val="1B4332"/>
           <w:sz w:val="22"/>
@@ -1703,7 +1741,7 @@
     <w:p>
       <w:r>
         <w:rPr>
-          <w:rFonts w:ascii="Calibri" w:hAnsi="Calibri"/>
+          <w:rFonts w:ascii="Calibri" w:hAnsi="Calibri" w:eastAsia="Calibri"/>
           <w:b/>
           <w:color w:val="2D6A4F"/>
           <w:sz w:val="26"/>
@@ -1714,7 +1752,7 @@
     <w:p>
       <w:r>
         <w:rPr>
-          <w:rFonts w:ascii="Calibri" w:hAnsi="Calibri"/>
+          <w:rFonts w:ascii="Calibri" w:hAnsi="Calibri" w:eastAsia="Calibri"/>
           <w:b/>
           <w:color w:val="1B4332"/>
           <w:sz w:val="22"/>
@@ -1725,18 +1763,18 @@
     <w:p>
       <w:r>
         <w:rPr>
-          <w:rFonts w:ascii="Calibri" w:hAnsi="Calibri"/>
-          <w:b w:val="0"/>
-          <w:color w:val="1B4332"/>
-          <w:sz w:val="22"/>
-        </w:rPr>
-        <w:t>Data stays inside CleantechHUB’s own n8n workflow. Host, country of the server, and the deletion job: [GIDEON TO FILL].</w:t>
+          <w:rFonts w:ascii="Calibri" w:hAnsi="Calibri" w:eastAsia="Calibri"/>
+          <w:b w:val="0"/>
+          <w:color w:val="1B4332"/>
+          <w:sz w:val="22"/>
+        </w:rPr>
+        <w:t>Data stays inside CleantechHUB’s own n8n workflow. OVH hosts that workflow in Germany, the same host and country as https://cleantechhub.net. OVH’s data processing terms cover that hosting. Deletion follows the periods below.</w:t>
       </w:r>
     </w:p>
     <w:p>
       <w:r>
         <w:rPr>
-          <w:rFonts w:ascii="Calibri" w:hAnsi="Calibri"/>
+          <w:rFonts w:ascii="Calibri" w:hAnsi="Calibri" w:eastAsia="Calibri"/>
           <w:b w:val="0"/>
           <w:color w:val="1B4332"/>
           <w:sz w:val="22"/>
@@ -1747,7 +1785,7 @@
     <w:p>
       <w:r>
         <w:rPr>
-          <w:rFonts w:ascii="Calibri" w:hAnsi="Calibri"/>
+          <w:rFonts w:ascii="Calibri" w:hAnsi="Calibri" w:eastAsia="Calibri"/>
           <w:b w:val="0"/>
           <w:color w:val="1B4332"/>
           <w:sz w:val="22"/>
@@ -1758,7 +1796,7 @@
     <w:p>
       <w:r>
         <w:rPr>
-          <w:rFonts w:ascii="Calibri" w:hAnsi="Calibri"/>
+          <w:rFonts w:ascii="Calibri" w:hAnsi="Calibri" w:eastAsia="Calibri"/>
           <w:b w:val="0"/>
           <w:color w:val="1B4332"/>
           <w:sz w:val="22"/>
@@ -1769,7 +1807,7 @@
     <w:p>
       <w:r>
         <w:rPr>
-          <w:rFonts w:ascii="Calibri" w:hAnsi="Calibri"/>
+          <w:rFonts w:ascii="Calibri" w:hAnsi="Calibri" w:eastAsia="Calibri"/>
           <w:b w:val="0"/>
           <w:color w:val="1B4332"/>
           <w:sz w:val="22"/>
@@ -1780,7 +1818,7 @@
     <w:p>
       <w:r>
         <w:rPr>
-          <w:rFonts w:ascii="Calibri" w:hAnsi="Calibri"/>
+          <w:rFonts w:ascii="Calibri" w:hAnsi="Calibri" w:eastAsia="Calibri"/>
           <w:b w:val="0"/>
           <w:color w:val="1B4332"/>
           <w:sz w:val="22"/>
@@ -1791,7 +1829,7 @@
     <w:p>
       <w:r>
         <w:rPr>
-          <w:rFonts w:ascii="Calibri" w:hAnsi="Calibri"/>
+          <w:rFonts w:ascii="Calibri" w:hAnsi="Calibri" w:eastAsia="Calibri"/>
           <w:b w:val="0"/>
           <w:color w:val="1B4332"/>
           <w:sz w:val="22"/>
@@ -1802,7 +1840,7 @@
     <w:p>
       <w:r>
         <w:rPr>
-          <w:rFonts w:ascii="Calibri" w:hAnsi="Calibri"/>
+          <w:rFonts w:ascii="Calibri" w:hAnsi="Calibri" w:eastAsia="Calibri"/>
           <w:b w:val="0"/>
           <w:color w:val="1B4332"/>
           <w:sz w:val="22"/>
@@ -1813,7 +1851,7 @@
     <w:p>
       <w:r>
         <w:rPr>
-          <w:rFonts w:ascii="Calibri" w:hAnsi="Calibri"/>
+          <w:rFonts w:ascii="Calibri" w:hAnsi="Calibri" w:eastAsia="Calibri"/>
           <w:b w:val="0"/>
           <w:color w:val="1B4332"/>
           <w:sz w:val="22"/>
@@ -1824,7 +1862,7 @@
     <w:p>
       <w:r>
         <w:rPr>
-          <w:rFonts w:ascii="Calibri" w:hAnsi="Calibri"/>
+          <w:rFonts w:ascii="Calibri" w:hAnsi="Calibri" w:eastAsia="Calibri"/>
           <w:b w:val="0"/>
           <w:color w:val="1B4332"/>
           <w:sz w:val="22"/>
@@ -1835,7 +1873,7 @@
     <w:p>
       <w:r>
         <w:rPr>
-          <w:rFonts w:ascii="Calibri" w:hAnsi="Calibri"/>
+          <w:rFonts w:ascii="Calibri" w:hAnsi="Calibri" w:eastAsia="Calibri"/>
           <w:b/>
           <w:color w:val="2D6A4F"/>
           <w:sz w:val="26"/>
@@ -1846,7 +1884,7 @@
     <w:p>
       <w:r>
         <w:rPr>
-          <w:rFonts w:ascii="Calibri" w:hAnsi="Calibri"/>
+          <w:rFonts w:ascii="Calibri" w:hAnsi="Calibri" w:eastAsia="Calibri"/>
           <w:b w:val="0"/>
           <w:color w:val="1B4332"/>
           <w:sz w:val="22"/>
@@ -1855,7 +1893,7 @@
       </w:r>
       <w:r>
         <w:rPr>
-          <w:rFonts w:ascii="Calibri" w:hAnsi="Calibri"/>
+          <w:rFonts w:ascii="Calibri" w:hAnsi="Calibri" w:eastAsia="Calibri"/>
           <w:b/>
           <w:color w:val="1B4332"/>
           <w:sz w:val="22"/>
@@ -1864,7 +1902,7 @@
       </w:r>
       <w:r>
         <w:rPr>
-          <w:rFonts w:ascii="Calibri" w:hAnsi="Calibri"/>
+          <w:rFonts w:ascii="Calibri" w:hAnsi="Calibri" w:eastAsia="Calibri"/>
           <w:b w:val="0"/>
           <w:color w:val="1B4332"/>
           <w:sz w:val="22"/>
@@ -1875,7 +1913,7 @@
     <w:p>
       <w:r>
         <w:rPr>
-          <w:rFonts w:ascii="Calibri" w:hAnsi="Calibri"/>
+          <w:rFonts w:ascii="Calibri" w:hAnsi="Calibri" w:eastAsia="Calibri"/>
           <w:b/>
           <w:color w:val="1B4332"/>
           <w:sz w:val="22"/>
@@ -1886,7 +1924,7 @@
     <w:p>
       <w:r>
         <w:rPr>
-          <w:rFonts w:ascii="Calibri" w:hAnsi="Calibri"/>
+          <w:rFonts w:ascii="Calibri" w:hAnsi="Calibri" w:eastAsia="Calibri"/>
           <w:b w:val="0"/>
           <w:color w:val="1B4332"/>
           <w:sz w:val="22"/>
@@ -1897,7 +1935,7 @@
     <w:p>
       <w:r>
         <w:rPr>
-          <w:rFonts w:ascii="Calibri" w:hAnsi="Calibri"/>
+          <w:rFonts w:ascii="Calibri" w:hAnsi="Calibri" w:eastAsia="Calibri"/>
           <w:b w:val="0"/>
           <w:color w:val="1B4332"/>
           <w:sz w:val="22"/>
@@ -1908,7 +1946,7 @@
     <w:p>
       <w:r>
         <w:rPr>
-          <w:rFonts w:ascii="Calibri" w:hAnsi="Calibri"/>
+          <w:rFonts w:ascii="Calibri" w:hAnsi="Calibri" w:eastAsia="Calibri"/>
           <w:b w:val="0"/>
           <w:color w:val="1B4332"/>
           <w:sz w:val="22"/>
@@ -1919,7 +1957,7 @@
     <w:p>
       <w:r>
         <w:rPr>
-          <w:rFonts w:ascii="Calibri" w:hAnsi="Calibri"/>
+          <w:rFonts w:ascii="Calibri" w:hAnsi="Calibri" w:eastAsia="Calibri"/>
           <w:b w:val="0"/>
           <w:color w:val="1B4332"/>
           <w:sz w:val="22"/>
@@ -1930,7 +1968,7 @@
     <w:p>
       <w:r>
         <w:rPr>
-          <w:rFonts w:ascii="Calibri" w:hAnsi="Calibri"/>
+          <w:rFonts w:ascii="Calibri" w:hAnsi="Calibri" w:eastAsia="Calibri"/>
           <w:b w:val="0"/>
           <w:color w:val="1B4332"/>
           <w:sz w:val="22"/>
@@ -1941,7 +1979,7 @@
     <w:p>
       <w:r>
         <w:rPr>
-          <w:rFonts w:ascii="Calibri" w:hAnsi="Calibri"/>
+          <w:rFonts w:ascii="Calibri" w:hAnsi="Calibri" w:eastAsia="Calibri"/>
           <w:b w:val="0"/>
           <w:color w:val="1B4332"/>
           <w:sz w:val="22"/>
@@ -1952,7 +1990,7 @@
     <w:p>
       <w:r>
         <w:rPr>
-          <w:rFonts w:ascii="Calibri" w:hAnsi="Calibri"/>
+          <w:rFonts w:ascii="Calibri" w:hAnsi="Calibri" w:eastAsia="Calibri"/>
           <w:b w:val="0"/>
           <w:color w:val="1B4332"/>
           <w:sz w:val="22"/>
@@ -1966,7 +2004,7 @@
       </w:pPr>
       <w:r>
         <w:rPr>
-          <w:rFonts w:ascii="Consolas" w:hAnsi="Consolas"/>
+          <w:rFonts w:ascii="Calibri" w:hAnsi="Calibri" w:eastAsia="Calibri"/>
           <w:b w:val="0"/>
           <w:color w:val="1B4332"/>
           <w:sz w:val="22"/>
@@ -1980,7 +2018,7 @@
       </w:pPr>
       <w:r>
         <w:rPr>
-          <w:rFonts w:ascii="Consolas" w:hAnsi="Consolas"/>
+          <w:rFonts w:ascii="Calibri" w:hAnsi="Calibri" w:eastAsia="Calibri"/>
           <w:b w:val="0"/>
           <w:color w:val="1B4332"/>
           <w:sz w:val="22"/>
@@ -1994,7 +2032,7 @@
       </w:pPr>
       <w:r>
         <w:rPr>
-          <w:rFonts w:ascii="Consolas" w:hAnsi="Consolas"/>
+          <w:rFonts w:ascii="Calibri" w:hAnsi="Calibri" w:eastAsia="Calibri"/>
           <w:b w:val="0"/>
           <w:color w:val="1B4332"/>
           <w:sz w:val="22"/>
@@ -2008,7 +2046,7 @@
       </w:pPr>
       <w:r>
         <w:rPr>
-          <w:rFonts w:ascii="Consolas" w:hAnsi="Consolas"/>
+          <w:rFonts w:ascii="Calibri" w:hAnsi="Calibri" w:eastAsia="Calibri"/>
           <w:b w:val="0"/>
           <w:color w:val="1B4332"/>
           <w:sz w:val="22"/>
@@ -2022,7 +2060,7 @@
       </w:pPr>
       <w:r>
         <w:rPr>
-          <w:rFonts w:ascii="Consolas" w:hAnsi="Consolas"/>
+          <w:rFonts w:ascii="Calibri" w:hAnsi="Calibri" w:eastAsia="Calibri"/>
           <w:b w:val="0"/>
           <w:color w:val="1B4332"/>
           <w:sz w:val="22"/>
@@ -2036,7 +2074,7 @@
       </w:pPr>
       <w:r>
         <w:rPr>
-          <w:rFonts w:ascii="Consolas" w:hAnsi="Consolas"/>
+          <w:rFonts w:ascii="Calibri" w:hAnsi="Calibri" w:eastAsia="Calibri"/>
           <w:b w:val="0"/>
           <w:color w:val="1B4332"/>
           <w:sz w:val="22"/>
@@ -2050,7 +2088,7 @@
       </w:pPr>
       <w:r>
         <w:rPr>
-          <w:rFonts w:ascii="Consolas" w:hAnsi="Consolas"/>
+          <w:rFonts w:ascii="Calibri" w:hAnsi="Calibri" w:eastAsia="Calibri"/>
           <w:b w:val="0"/>
           <w:color w:val="1B4332"/>
           <w:sz w:val="22"/>
@@ -2064,7 +2102,7 @@
       </w:pPr>
       <w:r>
         <w:rPr>
-          <w:rFonts w:ascii="Consolas" w:hAnsi="Consolas"/>
+          <w:rFonts w:ascii="Calibri" w:hAnsi="Calibri" w:eastAsia="Calibri"/>
           <w:b w:val="0"/>
           <w:color w:val="1B4332"/>
           <w:sz w:val="22"/>
@@ -2075,7 +2113,7 @@
     <w:p>
       <w:r>
         <w:rPr>
-          <w:rFonts w:ascii="Calibri" w:hAnsi="Calibri"/>
+          <w:rFonts w:ascii="Calibri" w:hAnsi="Calibri" w:eastAsia="Calibri"/>
           <w:b w:val="0"/>
           <w:color w:val="1B4332"/>
           <w:sz w:val="22"/>
@@ -2084,7 +2122,7 @@
       </w:r>
       <w:r>
         <w:rPr>
-          <w:rFonts w:ascii="Consolas" w:hAnsi="Consolas"/>
+          <w:rFonts w:ascii="Calibri" w:hAnsi="Calibri" w:eastAsia="Calibri"/>
           <w:b w:val="0"/>
           <w:color w:val="1B4332"/>
           <w:sz w:val="22"/>
@@ -2093,7 +2131,7 @@
       </w:r>
       <w:r>
         <w:rPr>
-          <w:rFonts w:ascii="Calibri" w:hAnsi="Calibri"/>
+          <w:rFonts w:ascii="Calibri" w:hAnsi="Calibri" w:eastAsia="Calibri"/>
           <w:b w:val="0"/>
           <w:color w:val="1B4332"/>
           <w:sz w:val="22"/>
@@ -2104,7 +2142,7 @@
     <w:p>
       <w:r>
         <w:rPr>
-          <w:rFonts w:ascii="Calibri" w:hAnsi="Calibri"/>
+          <w:rFonts w:ascii="Calibri" w:hAnsi="Calibri" w:eastAsia="Calibri"/>
           <w:b/>
           <w:color w:val="2D6A4F"/>
           <w:sz w:val="26"/>
@@ -2115,7 +2153,7 @@
     <w:p>
       <w:r>
         <w:rPr>
-          <w:rFonts w:ascii="Calibri" w:hAnsi="Calibri"/>
+          <w:rFonts w:ascii="Calibri" w:hAnsi="Calibri" w:eastAsia="Calibri"/>
           <w:b/>
           <w:color w:val="1B4332"/>
           <w:sz w:val="22"/>
@@ -2126,7 +2164,7 @@
     <w:p>
       <w:r>
         <w:rPr>
-          <w:rFonts w:ascii="Calibri" w:hAnsi="Calibri"/>
+          <w:rFonts w:ascii="Calibri" w:hAnsi="Calibri" w:eastAsia="Calibri"/>
           <w:b w:val="0"/>
           <w:color w:val="1B4332"/>
           <w:sz w:val="22"/>
@@ -2137,7 +2175,7 @@
     <w:p>
       <w:r>
         <w:rPr>
-          <w:rFonts w:ascii="Calibri" w:hAnsi="Calibri"/>
+          <w:rFonts w:ascii="Calibri" w:hAnsi="Calibri" w:eastAsia="Calibri"/>
           <w:b w:val="0"/>
           <w:color w:val="1B4332"/>
           <w:sz w:val="22"/>
@@ -2148,7 +2186,7 @@
     <w:p>
       <w:r>
         <w:rPr>
-          <w:rFonts w:ascii="Calibri" w:hAnsi="Calibri"/>
+          <w:rFonts w:ascii="Calibri" w:hAnsi="Calibri" w:eastAsia="Calibri"/>
           <w:b w:val="0"/>
           <w:color w:val="1B4332"/>
           <w:sz w:val="22"/>
@@ -2159,7 +2197,7 @@
     <w:p>
       <w:r>
         <w:rPr>
-          <w:rFonts w:ascii="Calibri" w:hAnsi="Calibri"/>
+          <w:rFonts w:ascii="Calibri" w:hAnsi="Calibri" w:eastAsia="Calibri"/>
           <w:b w:val="0"/>
           <w:color w:val="1B4332"/>
           <w:sz w:val="22"/>
@@ -2170,7 +2208,7 @@
     <w:p>
       <w:r>
         <w:rPr>
-          <w:rFonts w:ascii="Calibri" w:hAnsi="Calibri"/>
+          <w:rFonts w:ascii="Calibri" w:hAnsi="Calibri" w:eastAsia="Calibri"/>
           <w:b w:val="0"/>
           <w:color w:val="1B4332"/>
           <w:sz w:val="22"/>
@@ -2181,7 +2219,7 @@
     <w:p>
       <w:r>
         <w:rPr>
-          <w:rFonts w:ascii="Calibri" w:hAnsi="Calibri"/>
+          <w:rFonts w:ascii="Calibri" w:hAnsi="Calibri" w:eastAsia="Calibri"/>
           <w:b w:val="0"/>
           <w:color w:val="1B4332"/>
           <w:sz w:val="22"/>
@@ -2192,7 +2230,7 @@
     <w:p>
       <w:r>
         <w:rPr>
-          <w:rFonts w:ascii="Calibri" w:hAnsi="Calibri"/>
+          <w:rFonts w:ascii="Calibri" w:hAnsi="Calibri" w:eastAsia="Calibri"/>
           <w:b/>
           <w:color w:val="1B4332"/>
           <w:sz w:val="22"/>
@@ -2201,7 +2239,7 @@
       </w:r>
       <w:r>
         <w:rPr>
-          <w:rFonts w:ascii="Calibri" w:hAnsi="Calibri"/>
+          <w:rFonts w:ascii="Calibri" w:hAnsi="Calibri" w:eastAsia="Calibri"/>
           <w:b w:val="0"/>
           <w:color w:val="1B4332"/>
           <w:sz w:val="22"/>
@@ -2212,7 +2250,7 @@
     <w:p>
       <w:r>
         <w:rPr>
-          <w:rFonts w:ascii="Calibri" w:hAnsi="Calibri"/>
+          <w:rFonts w:ascii="Calibri" w:hAnsi="Calibri" w:eastAsia="Calibri"/>
           <w:b/>
           <w:color w:val="2D6A4F"/>
           <w:sz w:val="26"/>
@@ -2223,7 +2261,7 @@
     <w:p>
       <w:r>
         <w:rPr>
-          <w:rFonts w:ascii="Calibri" w:hAnsi="Calibri"/>
+          <w:rFonts w:ascii="Calibri" w:hAnsi="Calibri" w:eastAsia="Calibri"/>
           <w:b/>
           <w:color w:val="1B4332"/>
           <w:sz w:val="22"/>
@@ -2234,7 +2272,7 @@
     <w:p>
       <w:r>
         <w:rPr>
-          <w:rFonts w:ascii="Calibri" w:hAnsi="Calibri"/>
+          <w:rFonts w:ascii="Calibri" w:hAnsi="Calibri" w:eastAsia="Calibri"/>
           <w:b w:val="0"/>
           <w:color w:val="1B4332"/>
           <w:sz w:val="22"/>
@@ -2245,7 +2283,7 @@
     <w:p>
       <w:r>
         <w:rPr>
-          <w:rFonts w:ascii="Calibri" w:hAnsi="Calibri"/>
+          <w:rFonts w:ascii="Calibri" w:hAnsi="Calibri" w:eastAsia="Calibri"/>
           <w:b w:val="0"/>
           <w:color w:val="1B4332"/>
           <w:sz w:val="22"/>
@@ -2256,7 +2294,7 @@
     <w:p>
       <w:r>
         <w:rPr>
-          <w:rFonts w:ascii="Calibri" w:hAnsi="Calibri"/>
+          <w:rFonts w:ascii="Calibri" w:hAnsi="Calibri" w:eastAsia="Calibri"/>
           <w:b w:val="0"/>
           <w:color w:val="1B4332"/>
           <w:sz w:val="22"/>
@@ -2267,7 +2305,7 @@
     <w:p>
       <w:r>
         <w:rPr>
-          <w:rFonts w:ascii="Calibri" w:hAnsi="Calibri"/>
+          <w:rFonts w:ascii="Calibri" w:hAnsi="Calibri" w:eastAsia="Calibri"/>
           <w:b w:val="0"/>
           <w:color w:val="1B4332"/>
           <w:sz w:val="22"/>
@@ -2278,7 +2316,7 @@
     <w:p>
       <w:r>
         <w:rPr>
-          <w:rFonts w:ascii="Calibri" w:hAnsi="Calibri"/>
+          <w:rFonts w:ascii="Calibri" w:hAnsi="Calibri" w:eastAsia="Calibri"/>
           <w:b w:val="0"/>
           <w:color w:val="1B4332"/>
           <w:sz w:val="22"/>
@@ -2289,7 +2327,7 @@
     <w:p>
       <w:r>
         <w:rPr>
-          <w:rFonts w:ascii="Calibri" w:hAnsi="Calibri"/>
+          <w:rFonts w:ascii="Calibri" w:hAnsi="Calibri" w:eastAsia="Calibri"/>
           <w:b w:val="0"/>
           <w:color w:val="1B4332"/>
           <w:sz w:val="22"/>
@@ -2300,7 +2338,7 @@
     <w:p>
       <w:r>
         <w:rPr>
-          <w:rFonts w:ascii="Calibri" w:hAnsi="Calibri"/>
+          <w:rFonts w:ascii="Calibri" w:hAnsi="Calibri" w:eastAsia="Calibri"/>
           <w:b/>
           <w:color w:val="2D6A4F"/>
           <w:sz w:val="26"/>
@@ -2311,7 +2349,7 @@
     <w:p>
       <w:r>
         <w:rPr>
-          <w:rFonts w:ascii="Calibri" w:hAnsi="Calibri"/>
+          <w:rFonts w:ascii="Calibri" w:hAnsi="Calibri" w:eastAsia="Calibri"/>
           <w:b w:val="0"/>
           <w:color w:val="1B4332"/>
           <w:sz w:val="22"/>
@@ -2322,7 +2360,7 @@
     <w:p>
       <w:r>
         <w:rPr>
-          <w:rFonts w:ascii="Calibri" w:hAnsi="Calibri"/>
+          <w:rFonts w:ascii="Calibri" w:hAnsi="Calibri" w:eastAsia="Calibri"/>
           <w:b/>
           <w:color w:val="1B4332"/>
           <w:sz w:val="22"/>
@@ -2331,7 +2369,7 @@
       </w:r>
       <w:r>
         <w:rPr>
-          <w:rFonts w:ascii="Calibri" w:hAnsi="Calibri"/>
+          <w:rFonts w:ascii="Calibri" w:hAnsi="Calibri" w:eastAsia="Calibri"/>
           <w:b w:val="0"/>
           <w:color w:val="1B4332"/>
           <w:sz w:val="22"/>
@@ -2342,7 +2380,7 @@
     <w:p>
       <w:r>
         <w:rPr>
-          <w:rFonts w:ascii="Calibri" w:hAnsi="Calibri"/>
+          <w:rFonts w:ascii="Calibri" w:hAnsi="Calibri" w:eastAsia="Calibri"/>
           <w:b/>
           <w:color w:val="1B4332"/>
           <w:sz w:val="22"/>
@@ -2351,7 +2389,7 @@
       </w:r>
       <w:r>
         <w:rPr>
-          <w:rFonts w:ascii="Calibri" w:hAnsi="Calibri"/>
+          <w:rFonts w:ascii="Calibri" w:hAnsi="Calibri" w:eastAsia="Calibri"/>
           <w:b w:val="0"/>
           <w:color w:val="1B4332"/>
           <w:sz w:val="22"/>
@@ -2362,7 +2400,7 @@
     <w:p>
       <w:r>
         <w:rPr>
-          <w:rFonts w:ascii="Calibri" w:hAnsi="Calibri"/>
+          <w:rFonts w:ascii="Calibri" w:hAnsi="Calibri" w:eastAsia="Calibri"/>
           <w:b/>
           <w:color w:val="1B4332"/>
           <w:sz w:val="22"/>
@@ -2371,7 +2409,7 @@
       </w:r>
       <w:r>
         <w:rPr>
-          <w:rFonts w:ascii="Calibri" w:hAnsi="Calibri"/>
+          <w:rFonts w:ascii="Calibri" w:hAnsi="Calibri" w:eastAsia="Calibri"/>
           <w:b w:val="0"/>
           <w:color w:val="1B4332"/>
           <w:sz w:val="22"/>
@@ -2380,7 +2418,7 @@
       </w:r>
       <w:r>
         <w:rPr>
-          <w:rFonts w:ascii="Consolas" w:hAnsi="Consolas"/>
+          <w:rFonts w:ascii="Calibri" w:hAnsi="Calibri" w:eastAsia="Calibri"/>
           <w:b w:val="0"/>
           <w:color w:val="1B4332"/>
           <w:sz w:val="22"/>
@@ -2389,7 +2427,7 @@
       </w:r>
       <w:r>
         <w:rPr>
-          <w:rFonts w:ascii="Calibri" w:hAnsi="Calibri"/>
+          <w:rFonts w:ascii="Calibri" w:hAnsi="Calibri" w:eastAsia="Calibri"/>
           <w:b w:val="0"/>
           <w:color w:val="1B4332"/>
           <w:sz w:val="22"/>
@@ -2400,7 +2438,7 @@
     <w:p>
       <w:r>
         <w:rPr>
-          <w:rFonts w:ascii="Calibri" w:hAnsi="Calibri"/>
+          <w:rFonts w:ascii="Calibri" w:hAnsi="Calibri" w:eastAsia="Calibri"/>
           <w:b/>
           <w:color w:val="1B4332"/>
           <w:sz w:val="22"/>
@@ -2409,7 +2447,7 @@
       </w:r>
       <w:r>
         <w:rPr>
-          <w:rFonts w:ascii="Calibri" w:hAnsi="Calibri"/>
+          <w:rFonts w:ascii="Calibri" w:hAnsi="Calibri" w:eastAsia="Calibri"/>
           <w:b w:val="0"/>
           <w:color w:val="1B4332"/>
           <w:sz w:val="22"/>
@@ -2420,7 +2458,7 @@
     <w:p>
       <w:r>
         <w:rPr>
-          <w:rFonts w:ascii="Calibri" w:hAnsi="Calibri"/>
+          <w:rFonts w:ascii="Calibri" w:hAnsi="Calibri" w:eastAsia="Calibri"/>
           <w:b/>
           <w:color w:val="2D6A4F"/>
           <w:sz w:val="32"/>
@@ -2431,7 +2469,7 @@
     <w:p>
       <w:r>
         <w:rPr>
-          <w:rFonts w:ascii="Calibri" w:hAnsi="Calibri"/>
+          <w:rFonts w:ascii="Calibri" w:hAnsi="Calibri" w:eastAsia="Calibri"/>
           <w:b w:val="0"/>
           <w:color w:val="1B4332"/>
           <w:sz w:val="22"/>
@@ -2440,7 +2478,7 @@
       </w:r>
       <w:r>
         <w:rPr>
-          <w:rFonts w:ascii="Calibri" w:hAnsi="Calibri"/>
+          <w:rFonts w:ascii="Calibri" w:hAnsi="Calibri" w:eastAsia="Calibri"/>
           <w:b/>
           <w:color w:val="1B4332"/>
           <w:sz w:val="22"/>
@@ -2449,18 +2487,18 @@
       </w:r>
       <w:r>
         <w:rPr>
-          <w:rFonts w:ascii="Calibri" w:hAnsi="Calibri"/>
-          <w:b w:val="0"/>
-          <w:color w:val="1B4332"/>
-          <w:sz w:val="22"/>
-        </w:rPr>
-        <w:t xml:space="preserve"> Community Management is not open to personal projects. The public data policy identifies FUNDACION CLEANTECH HUB S.A.S. Confirm that name on the RUT before you submit.</w:t>
+          <w:rFonts w:ascii="Calibri" w:hAnsi="Calibri" w:eastAsia="Calibri"/>
+          <w:b w:val="0"/>
+          <w:color w:val="1B4332"/>
+          <w:sz w:val="22"/>
+        </w:rPr>
+        <w:t xml:space="preserve"> Community Management is not open to personal projects. Paste FUNDACIÓN CLEANTECH HUB, a non-profit (ESAL) under the régimen tributario especial, NIT 901.523.941-9. Gideon confirmed that name on 22 October 2026. Do not add a simplified-stock-company suffix.</w:t>
       </w:r>
     </w:p>
     <w:p>
       <w:r>
         <w:rPr>
-          <w:rFonts w:ascii="Calibri" w:hAnsi="Calibri"/>
+          <w:rFonts w:ascii="Calibri" w:hAnsi="Calibri" w:eastAsia="Calibri"/>
           <w:b w:val="0"/>
           <w:color w:val="1B4332"/>
           <w:sz w:val="22"/>
@@ -2469,7 +2507,7 @@
       </w:r>
       <w:r>
         <w:rPr>
-          <w:rFonts w:ascii="Calibri" w:hAnsi="Calibri"/>
+          <w:rFonts w:ascii="Calibri" w:hAnsi="Calibri" w:eastAsia="Calibri"/>
           <w:b/>
           <w:color w:val="1B4332"/>
           <w:sz w:val="22"/>
@@ -2478,7 +2516,7 @@
       </w:r>
       <w:r>
         <w:rPr>
-          <w:rFonts w:ascii="Calibri" w:hAnsi="Calibri"/>
+          <w:rFonts w:ascii="Calibri" w:hAnsi="Calibri" w:eastAsia="Calibri"/>
           <w:b w:val="0"/>
           <w:color w:val="1B4332"/>
           <w:sz w:val="22"/>
@@ -2489,7 +2527,7 @@
     <w:p>
       <w:r>
         <w:rPr>
-          <w:rFonts w:ascii="Calibri" w:hAnsi="Calibri"/>
+          <w:rFonts w:ascii="Calibri" w:hAnsi="Calibri" w:eastAsia="Calibri"/>
           <w:b w:val="0"/>
           <w:color w:val="1B4332"/>
           <w:sz w:val="22"/>
@@ -2498,7 +2536,7 @@
       </w:r>
       <w:r>
         <w:rPr>
-          <w:rFonts w:ascii="Calibri" w:hAnsi="Calibri"/>
+          <w:rFonts w:ascii="Calibri" w:hAnsi="Calibri" w:eastAsia="Calibri"/>
           <w:b/>
           <w:color w:val="1B4332"/>
           <w:sz w:val="22"/>
@@ -2507,7 +2545,7 @@
       </w:r>
       <w:r>
         <w:rPr>
-          <w:rFonts w:ascii="Calibri" w:hAnsi="Calibri"/>
+          <w:rFonts w:ascii="Calibri" w:hAnsi="Calibri" w:eastAsia="Calibri"/>
           <w:b w:val="0"/>
           <w:color w:val="1B4332"/>
           <w:sz w:val="22"/>
@@ -2518,7 +2556,7 @@
     <w:p>
       <w:r>
         <w:rPr>
-          <w:rFonts w:ascii="Calibri" w:hAnsi="Calibri"/>
+          <w:rFonts w:ascii="Calibri" w:hAnsi="Calibri" w:eastAsia="Calibri"/>
           <w:b w:val="0"/>
           <w:color w:val="1B4332"/>
           <w:sz w:val="22"/>
@@ -2527,7 +2565,7 @@
       </w:r>
       <w:r>
         <w:rPr>
-          <w:rFonts w:ascii="Calibri" w:hAnsi="Calibri"/>
+          <w:rFonts w:ascii="Calibri" w:hAnsi="Calibri" w:eastAsia="Calibri"/>
           <w:b/>
           <w:color w:val="1B4332"/>
           <w:sz w:val="22"/>
@@ -2536,7 +2574,7 @@
       </w:r>
       <w:r>
         <w:rPr>
-          <w:rFonts w:ascii="Calibri" w:hAnsi="Calibri"/>
+          <w:rFonts w:ascii="Calibri" w:hAnsi="Calibri" w:eastAsia="Calibri"/>
           <w:b w:val="0"/>
           <w:color w:val="1B4332"/>
           <w:sz w:val="22"/>
@@ -2545,7 +2583,7 @@
       </w:r>
       <w:r>
         <w:rPr>
-          <w:rFonts w:ascii="Consolas" w:hAnsi="Consolas"/>
+          <w:rFonts w:ascii="Calibri" w:hAnsi="Calibri" w:eastAsia="Calibri"/>
           <w:b w:val="0"/>
           <w:color w:val="1B4332"/>
           <w:sz w:val="22"/>
@@ -2554,7 +2592,7 @@
       </w:r>
       <w:r>
         <w:rPr>
-          <w:rFonts w:ascii="Calibri" w:hAnsi="Calibri"/>
+          <w:rFonts w:ascii="Calibri" w:hAnsi="Calibri" w:eastAsia="Calibri"/>
           <w:b w:val="0"/>
           <w:color w:val="1B4332"/>
           <w:sz w:val="22"/>
@@ -2563,7 +2601,7 @@
       </w:r>
       <w:r>
         <w:rPr>
-          <w:rFonts w:ascii="Consolas" w:hAnsi="Consolas"/>
+          <w:rFonts w:ascii="Calibri" w:hAnsi="Calibri" w:eastAsia="Calibri"/>
           <w:b w:val="0"/>
           <w:color w:val="1B4332"/>
           <w:sz w:val="22"/>
@@ -2572,7 +2610,7 @@
       </w:r>
       <w:r>
         <w:rPr>
-          <w:rFonts w:ascii="Calibri" w:hAnsi="Calibri"/>
+          <w:rFonts w:ascii="Calibri" w:hAnsi="Calibri" w:eastAsia="Calibri"/>
           <w:b w:val="0"/>
           <w:color w:val="1B4332"/>
           <w:sz w:val="22"/>
@@ -2581,7 +2619,7 @@
       </w:r>
       <w:r>
         <w:rPr>
-          <w:rFonts w:ascii="Consolas" w:hAnsi="Consolas"/>
+          <w:rFonts w:ascii="Calibri" w:hAnsi="Calibri" w:eastAsia="Calibri"/>
           <w:b w:val="0"/>
           <w:color w:val="1B4332"/>
           <w:sz w:val="22"/>
@@ -2590,7 +2628,7 @@
       </w:r>
       <w:r>
         <w:rPr>
-          <w:rFonts w:ascii="Calibri" w:hAnsi="Calibri"/>
+          <w:rFonts w:ascii="Calibri" w:hAnsi="Calibri" w:eastAsia="Calibri"/>
           <w:b w:val="0"/>
           <w:color w:val="1B4332"/>
           <w:sz w:val="22"/>
@@ -2599,7 +2637,7 @@
       </w:r>
       <w:r>
         <w:rPr>
-          <w:rFonts w:ascii="Consolas" w:hAnsi="Consolas"/>
+          <w:rFonts w:ascii="Calibri" w:hAnsi="Calibri" w:eastAsia="Calibri"/>
           <w:b w:val="0"/>
           <w:color w:val="1B4332"/>
           <w:sz w:val="22"/>
@@ -2608,7 +2646,7 @@
       </w:r>
       <w:r>
         <w:rPr>
-          <w:rFonts w:ascii="Calibri" w:hAnsi="Calibri"/>
+          <w:rFonts w:ascii="Calibri" w:hAnsi="Calibri" w:eastAsia="Calibri"/>
           <w:b w:val="0"/>
           <w:color w:val="1B4332"/>
           <w:sz w:val="22"/>
@@ -2619,7 +2657,7 @@
     <w:p>
       <w:r>
         <w:rPr>
-          <w:rFonts w:ascii="Calibri" w:hAnsi="Calibri"/>
+          <w:rFonts w:ascii="Calibri" w:hAnsi="Calibri" w:eastAsia="Calibri"/>
           <w:b w:val="0"/>
           <w:color w:val="1B4332"/>
           <w:sz w:val="22"/>
@@ -2628,7 +2666,7 @@
       </w:r>
       <w:r>
         <w:rPr>
-          <w:rFonts w:ascii="Calibri" w:hAnsi="Calibri"/>
+          <w:rFonts w:ascii="Calibri" w:hAnsi="Calibri" w:eastAsia="Calibri"/>
           <w:b/>
           <w:color w:val="1B4332"/>
           <w:sz w:val="22"/>
@@ -2637,7 +2675,7 @@
       </w:r>
       <w:r>
         <w:rPr>
-          <w:rFonts w:ascii="Calibri" w:hAnsi="Calibri"/>
+          <w:rFonts w:ascii="Calibri" w:hAnsi="Calibri" w:eastAsia="Calibri"/>
           <w:b w:val="0"/>
           <w:color w:val="1B4332"/>
           <w:sz w:val="22"/>
@@ -2648,7 +2686,7 @@
     <w:p>
       <w:r>
         <w:rPr>
-          <w:rFonts w:ascii="Calibri" w:hAnsi="Calibri"/>
+          <w:rFonts w:ascii="Calibri" w:hAnsi="Calibri" w:eastAsia="Calibri"/>
           <w:b w:val="0"/>
           <w:color w:val="1B4332"/>
           <w:sz w:val="22"/>
@@ -2657,7 +2695,7 @@
       </w:r>
       <w:r>
         <w:rPr>
-          <w:rFonts w:ascii="Calibri" w:hAnsi="Calibri"/>
+          <w:rFonts w:ascii="Calibri" w:hAnsi="Calibri" w:eastAsia="Calibri"/>
           <w:b/>
           <w:color w:val="1B4332"/>
           <w:sz w:val="22"/>
@@ -2666,7 +2704,7 @@
       </w:r>
       <w:r>
         <w:rPr>
-          <w:rFonts w:ascii="Calibri" w:hAnsi="Calibri"/>
+          <w:rFonts w:ascii="Calibri" w:hAnsi="Calibri" w:eastAsia="Calibri"/>
           <w:b w:val="0"/>
           <w:color w:val="1B4332"/>
           <w:sz w:val="22"/>
@@ -2677,7 +2715,7 @@
     <w:p>
       <w:r>
         <w:rPr>
-          <w:rFonts w:ascii="Calibri" w:hAnsi="Calibri"/>
+          <w:rFonts w:ascii="Calibri" w:hAnsi="Calibri" w:eastAsia="Calibri"/>
           <w:b w:val="0"/>
           <w:color w:val="1B4332"/>
           <w:sz w:val="22"/>
@@ -2686,7 +2724,7 @@
       </w:r>
       <w:r>
         <w:rPr>
-          <w:rFonts w:ascii="Calibri" w:hAnsi="Calibri"/>
+          <w:rFonts w:ascii="Calibri" w:hAnsi="Calibri" w:eastAsia="Calibri"/>
           <w:b/>
           <w:color w:val="1B4332"/>
           <w:sz w:val="22"/>
@@ -2695,7 +2733,7 @@
       </w:r>
       <w:r>
         <w:rPr>
-          <w:rFonts w:ascii="Calibri" w:hAnsi="Calibri"/>
+          <w:rFonts w:ascii="Calibri" w:hAnsi="Calibri" w:eastAsia="Calibri"/>
           <w:b w:val="0"/>
           <w:color w:val="1B4332"/>
           <w:sz w:val="22"/>
@@ -2704,7 +2742,7 @@
       </w:r>
       <w:r>
         <w:rPr>
-          <w:rFonts w:ascii="Consolas" w:hAnsi="Consolas"/>
+          <w:rFonts w:ascii="Calibri" w:hAnsi="Calibri" w:eastAsia="Calibri"/>
           <w:b w:val="0"/>
           <w:color w:val="1B4332"/>
           <w:sz w:val="22"/>
@@ -2713,7 +2751,7 @@
       </w:r>
       <w:r>
         <w:rPr>
-          <w:rFonts w:ascii="Calibri" w:hAnsi="Calibri"/>
+          <w:rFonts w:ascii="Calibri" w:hAnsi="Calibri" w:eastAsia="Calibri"/>
           <w:b w:val="0"/>
           <w:color w:val="1B4332"/>
           <w:sz w:val="22"/>
@@ -2724,7 +2762,7 @@
     <w:p>
       <w:r>
         <w:rPr>
-          <w:rFonts w:ascii="Calibri" w:hAnsi="Calibri"/>
+          <w:rFonts w:ascii="Calibri" w:hAnsi="Calibri" w:eastAsia="Calibri"/>
           <w:b w:val="0"/>
           <w:color w:val="1B4332"/>
           <w:sz w:val="22"/>
@@ -2733,7 +2771,7 @@
       </w:r>
       <w:r>
         <w:rPr>
-          <w:rFonts w:ascii="Calibri" w:hAnsi="Calibri"/>
+          <w:rFonts w:ascii="Calibri" w:hAnsi="Calibri" w:eastAsia="Calibri"/>
           <w:b/>
           <w:color w:val="1B4332"/>
           <w:sz w:val="22"/>
@@ -2744,62 +2782,107 @@
     <w:p>
       <w:r>
         <w:rPr>
-          <w:rFonts w:ascii="Calibri" w:hAnsi="Calibri"/>
-          <w:b w:val="0"/>
-          <w:color w:val="1B4332"/>
-          <w:sz w:val="22"/>
-        </w:rPr>
-        <w:t>- LinkedIn Marketing API terms (https://www.linkedin.com/legal/l/marketing-api-terms)</w:t>
+          <w:rFonts w:ascii="Calibri" w:hAnsi="Calibri" w:eastAsia="Calibri"/>
+          <w:b w:val="0"/>
+          <w:color w:val="1B4332"/>
+          <w:sz w:val="22"/>
+        </w:rPr>
+        <w:t xml:space="preserve">- </w:t>
+      </w:r>
+      <w:r>
+        <w:rPr>
+          <w:rFonts w:ascii="Calibri" w:hAnsi="Calibri" w:eastAsia="Calibri"/>
+          <w:b w:val="0"/>
+          <w:color w:val="1B4332"/>
+          <w:sz w:val="22"/>
+        </w:rPr>
+        <w:t>LinkedIn Marketing API terms (https://www.linkedin.com/legal/l/marketing-api-terms)</w:t>
       </w:r>
     </w:p>
     <w:p>
       <w:r>
         <w:rPr>
-          <w:rFonts w:ascii="Calibri" w:hAnsi="Calibri"/>
-          <w:b w:val="0"/>
-          <w:color w:val="1B4332"/>
-          <w:sz w:val="22"/>
-        </w:rPr>
-        <w:t>- LinkedIn API Terms of Use (https://www.linkedin.com/legal/l/api-terms-of-use)</w:t>
+          <w:rFonts w:ascii="Calibri" w:hAnsi="Calibri" w:eastAsia="Calibri"/>
+          <w:b w:val="0"/>
+          <w:color w:val="1B4332"/>
+          <w:sz w:val="22"/>
+        </w:rPr>
+        <w:t xml:space="preserve">- </w:t>
+      </w:r>
+      <w:r>
+        <w:rPr>
+          <w:rFonts w:ascii="Calibri" w:hAnsi="Calibri" w:eastAsia="Calibri"/>
+          <w:b w:val="0"/>
+          <w:color w:val="1B4332"/>
+          <w:sz w:val="22"/>
+        </w:rPr>
+        <w:t>LinkedIn API Terms of Use (https://www.linkedin.com/legal/l/api-terms-of-use)</w:t>
       </w:r>
     </w:p>
     <w:p>
       <w:r>
         <w:rPr>
-          <w:rFonts w:ascii="Calibri" w:hAnsi="Calibri"/>
-          <w:b w:val="0"/>
-          <w:color w:val="1B4332"/>
-          <w:sz w:val="22"/>
-        </w:rPr>
-        <w:t>- Restricted use cases (https://learn.microsoft.com/en-us/linkedin/marketing/restricted-use-cases?view=li-lms-2026-09)</w:t>
+          <w:rFonts w:ascii="Calibri" w:hAnsi="Calibri" w:eastAsia="Calibri"/>
+          <w:b w:val="0"/>
+          <w:color w:val="1B4332"/>
+          <w:sz w:val="22"/>
+        </w:rPr>
+        <w:t xml:space="preserve">- </w:t>
+      </w:r>
+      <w:r>
+        <w:rPr>
+          <w:rFonts w:ascii="Calibri" w:hAnsi="Calibri" w:eastAsia="Calibri"/>
+          <w:b w:val="0"/>
+          <w:color w:val="1B4332"/>
+          <w:sz w:val="22"/>
+        </w:rPr>
+        <w:t>Restricted use cases (https://learn.microsoft.com/en-us/linkedin/marketing/restricted-use-cases?view=li-lms-2026-09)</w:t>
       </w:r>
     </w:p>
     <w:p>
       <w:r>
         <w:rPr>
-          <w:rFonts w:ascii="Calibri" w:hAnsi="Calibri"/>
-          <w:b w:val="0"/>
-          <w:color w:val="1B4332"/>
-          <w:sz w:val="22"/>
-        </w:rPr>
-        <w:t>- Data storage requirements (https://learn.microsoft.com/en-us/linkedin/marketing/data-storage-requirements?view=li-lms-2026-09)</w:t>
+          <w:rFonts w:ascii="Calibri" w:hAnsi="Calibri" w:eastAsia="Calibri"/>
+          <w:b w:val="0"/>
+          <w:color w:val="1B4332"/>
+          <w:sz w:val="22"/>
+        </w:rPr>
+        <w:t xml:space="preserve">- </w:t>
+      </w:r>
+      <w:r>
+        <w:rPr>
+          <w:rFonts w:ascii="Calibri" w:hAnsi="Calibri" w:eastAsia="Calibri"/>
+          <w:b w:val="0"/>
+          <w:color w:val="1B4332"/>
+          <w:sz w:val="22"/>
+        </w:rPr>
+        <w:t>Data storage requirements (https://learn.microsoft.com/en-us/linkedin/marketing/data-storage-requirements?view=li-lms-2026-09)</w:t>
       </w:r>
     </w:p>
     <w:p>
       <w:r>
         <w:rPr>
-          <w:rFonts w:ascii="Calibri" w:hAnsi="Calibri"/>
-          <w:b w:val="0"/>
-          <w:color w:val="1B4332"/>
-          <w:sz w:val="22"/>
-        </w:rPr>
-        <w:t>- Community Management app review (https://learn.microsoft.com/en-us/linkedin/marketing/community-management-app-review?view=li-lms-2026-09)</w:t>
+          <w:rFonts w:ascii="Calibri" w:hAnsi="Calibri" w:eastAsia="Calibri"/>
+          <w:b w:val="0"/>
+          <w:color w:val="1B4332"/>
+          <w:sz w:val="22"/>
+        </w:rPr>
+        <w:t xml:space="preserve">- </w:t>
+      </w:r>
+      <w:r>
+        <w:rPr>
+          <w:rFonts w:ascii="Calibri" w:hAnsi="Calibri" w:eastAsia="Calibri"/>
+          <w:b w:val="0"/>
+          <w:color w:val="1B4332"/>
+          <w:sz w:val="22"/>
+        </w:rPr>
+        <w:t>Community Management app review (https://learn.microsoft.com/en-us/linkedin/marketing/community-management-app-review?view=li-lms-2026-09)</w:t>
       </w:r>
     </w:p>
     <w:p>
       <w:r>
         <w:rPr>
-          <w:rFonts w:ascii="Calibri" w:hAnsi="Calibri"/>
+          <w:rFonts w:ascii="Calibri" w:hAnsi="Calibri" w:eastAsia="Calibri"/>
           <w:b w:val="0"/>
           <w:color w:val="1B4332"/>
           <w:sz w:val="22"/>
@@ -2808,7 +2891,7 @@
       </w:r>
       <w:r>
         <w:rPr>
-          <w:rFonts w:ascii="Calibri" w:hAnsi="Calibri"/>
+          <w:rFonts w:ascii="Calibri" w:hAnsi="Calibri" w:eastAsia="Calibri"/>
           <w:b/>
           <w:color w:val="1B4332"/>
           <w:sz w:val="22"/>
@@ -2817,18 +2900,36 @@
       </w:r>
       <w:r>
         <w:rPr>
-          <w:rFonts w:ascii="Calibri" w:hAnsi="Calibri"/>
-          <w:b w:val="0"/>
-          <w:color w:val="1B4332"/>
-          <w:sz w:val="22"/>
-        </w:rPr>
-        <w:t xml:space="preserve"> That version sunsets on 16 November 2026. Use a supported version from the migrations documentation (https://learn.microsoft.com/en-us/linkedin/marketing/integrations/recent-changes?view=li-lms-2026-09). This request does not need the version header.</w:t>
+          <w:rFonts w:ascii="Calibri" w:hAnsi="Calibri" w:eastAsia="Calibri"/>
+          <w:b w:val="0"/>
+          <w:color w:val="1B4332"/>
+          <w:sz w:val="22"/>
+        </w:rPr>
+        <w:t xml:space="preserve"> That version sunsets on 16 November 2026. Use a supported version from the </w:t>
+      </w:r>
+      <w:r>
+        <w:rPr>
+          <w:rFonts w:ascii="Calibri" w:hAnsi="Calibri" w:eastAsia="Calibri"/>
+          <w:b w:val="0"/>
+          <w:color w:val="1B4332"/>
+          <w:sz w:val="22"/>
+        </w:rPr>
+        <w:t>migrations documentation (https://learn.microsoft.com/en-us/linkedin/marketing/integrations/recent-changes?view=li-lms-2026-09)</w:t>
+      </w:r>
+      <w:r>
+        <w:rPr>
+          <w:rFonts w:ascii="Calibri" w:hAnsi="Calibri" w:eastAsia="Calibri"/>
+          <w:b w:val="0"/>
+          <w:color w:val="1B4332"/>
+          <w:sz w:val="22"/>
+        </w:rPr>
+        <w:t>. This request does not need the version header.</w:t>
       </w:r>
     </w:p>
     <w:p>
       <w:r>
         <w:rPr>
-          <w:rFonts w:ascii="Calibri" w:hAnsi="Calibri"/>
+          <w:rFonts w:ascii="Calibri" w:hAnsi="Calibri" w:eastAsia="Calibri"/>
           <w:b/>
           <w:color w:val="2D6A4F"/>
           <w:sz w:val="32"/>
@@ -2839,7 +2940,7 @@
     <w:p>
       <w:r>
         <w:rPr>
-          <w:rFonts w:ascii="Calibri" w:hAnsi="Calibri"/>
+          <w:rFonts w:ascii="Calibri" w:hAnsi="Calibri" w:eastAsia="Calibri"/>
           <w:b w:val="0"/>
           <w:color w:val="1B4332"/>
           <w:sz w:val="22"/>
@@ -2850,7 +2951,7 @@
     <w:p>
       <w:r>
         <w:rPr>
-          <w:rFonts w:ascii="Calibri" w:hAnsi="Calibri"/>
+          <w:rFonts w:ascii="Calibri" w:hAnsi="Calibri" w:eastAsia="Calibri"/>
           <w:b w:val="0"/>
           <w:color w:val="1B4332"/>
           <w:sz w:val="22"/>
@@ -2861,7 +2962,7 @@
     <w:p>
       <w:r>
         <w:rPr>
-          <w:rFonts w:ascii="Calibri" w:hAnsi="Calibri"/>
+          <w:rFonts w:ascii="Calibri" w:hAnsi="Calibri" w:eastAsia="Calibri"/>
           <w:b w:val="0"/>
           <w:color w:val="1B4332"/>
           <w:sz w:val="22"/>
@@ -2872,18 +2973,36 @@
     <w:p>
       <w:r>
         <w:rPr>
-          <w:rFonts w:ascii="Calibri" w:hAnsi="Calibri"/>
-          <w:b w:val="0"/>
-          <w:color w:val="1B4332"/>
-          <w:sz w:val="22"/>
-        </w:rPr>
-        <w:t>3. Open https://www.linkedin.com/developers/apps and sign in with Gideon’s own LinkedIn account. Source for the portal path: LinkedIn API Partner Support (https://learn.microsoft.com/en-us/linkedin/shared/linkedin-api-partner-support-guide), section “Request API access”.</w:t>
+          <w:rFonts w:ascii="Calibri" w:hAnsi="Calibri" w:eastAsia="Calibri"/>
+          <w:b w:val="0"/>
+          <w:color w:val="1B4332"/>
+          <w:sz w:val="22"/>
+        </w:rPr>
+        <w:t xml:space="preserve">3. Open https://www.linkedin.com/developers/apps and sign in with Gideon’s own LinkedIn account. Source for the portal path: </w:t>
+      </w:r>
+      <w:r>
+        <w:rPr>
+          <w:rFonts w:ascii="Calibri" w:hAnsi="Calibri" w:eastAsia="Calibri"/>
+          <w:b w:val="0"/>
+          <w:color w:val="1B4332"/>
+          <w:sz w:val="22"/>
+        </w:rPr>
+        <w:t>LinkedIn API Partner Support (https://learn.microsoft.com/en-us/linkedin/shared/linkedin-api-partner-support-guide)</w:t>
+      </w:r>
+      <w:r>
+        <w:rPr>
+          <w:rFonts w:ascii="Calibri" w:hAnsi="Calibri" w:eastAsia="Calibri"/>
+          <w:b w:val="0"/>
+          <w:color w:val="1B4332"/>
+          <w:sz w:val="22"/>
+        </w:rPr>
+        <w:t>, section “Request API access”.</w:t>
       </w:r>
     </w:p>
     <w:p>
       <w:r>
         <w:rPr>
-          <w:rFonts w:ascii="Calibri" w:hAnsi="Calibri"/>
+          <w:rFonts w:ascii="Calibri" w:hAnsi="Calibri" w:eastAsia="Calibri"/>
           <w:b w:val="0"/>
           <w:color w:val="1B4332"/>
           <w:sz w:val="22"/>
@@ -2892,7 +3011,7 @@
       </w:r>
       <w:r>
         <w:rPr>
-          <w:rFonts w:ascii="Calibri" w:hAnsi="Calibri"/>
+          <w:rFonts w:ascii="Calibri" w:hAnsi="Calibri" w:eastAsia="Calibri"/>
           <w:b/>
           <w:color w:val="1B4332"/>
           <w:sz w:val="22"/>
@@ -2901,7 +3020,7 @@
       </w:r>
       <w:r>
         <w:rPr>
-          <w:rFonts w:ascii="Calibri" w:hAnsi="Calibri"/>
+          <w:rFonts w:ascii="Calibri" w:hAnsi="Calibri" w:eastAsia="Calibri"/>
           <w:b w:val="0"/>
           <w:color w:val="1B4332"/>
           <w:sz w:val="22"/>
@@ -2910,7 +3029,7 @@
       </w:r>
       <w:r>
         <w:rPr>
-          <w:rFonts w:ascii="Calibri" w:hAnsi="Calibri"/>
+          <w:rFonts w:ascii="Calibri" w:hAnsi="Calibri" w:eastAsia="Calibri"/>
           <w:b/>
           <w:color w:val="1B4332"/>
           <w:sz w:val="22"/>
@@ -2919,7 +3038,7 @@
       </w:r>
       <w:r>
         <w:rPr>
-          <w:rFonts w:ascii="Calibri" w:hAnsi="Calibri"/>
+          <w:rFonts w:ascii="Calibri" w:hAnsi="Calibri" w:eastAsia="Calibri"/>
           <w:b w:val="0"/>
           <w:color w:val="1B4332"/>
           <w:sz w:val="22"/>
@@ -2930,7 +3049,7 @@
     <w:p>
       <w:r>
         <w:rPr>
-          <w:rFonts w:ascii="Calibri" w:hAnsi="Calibri"/>
+          <w:rFonts w:ascii="Calibri" w:hAnsi="Calibri" w:eastAsia="Calibri"/>
           <w:b w:val="0"/>
           <w:color w:val="1B4332"/>
           <w:sz w:val="22"/>
@@ -2939,7 +3058,7 @@
       </w:r>
       <w:r>
         <w:rPr>
-          <w:rFonts w:ascii="Calibri" w:hAnsi="Calibri"/>
+          <w:rFonts w:ascii="Calibri" w:hAnsi="Calibri" w:eastAsia="Calibri"/>
           <w:b/>
           <w:color w:val="1B4332"/>
           <w:sz w:val="22"/>
@@ -2948,7 +3067,7 @@
       </w:r>
       <w:r>
         <w:rPr>
-          <w:rFonts w:ascii="Calibri" w:hAnsi="Calibri"/>
+          <w:rFonts w:ascii="Calibri" w:hAnsi="Calibri" w:eastAsia="Calibri"/>
           <w:b w:val="0"/>
           <w:color w:val="1B4332"/>
           <w:sz w:val="22"/>
@@ -2957,7 +3076,7 @@
       </w:r>
       <w:r>
         <w:rPr>
-          <w:rFonts w:ascii="Calibri" w:hAnsi="Calibri"/>
+          <w:rFonts w:ascii="Calibri" w:hAnsi="Calibri" w:eastAsia="Calibri"/>
           <w:b/>
           <w:color w:val="1B4332"/>
           <w:sz w:val="22"/>
@@ -2966,18 +3085,36 @@
       </w:r>
       <w:r>
         <w:rPr>
-          <w:rFonts w:ascii="Calibri" w:hAnsi="Calibri"/>
-          <w:b w:val="0"/>
-          <w:color w:val="1B4332"/>
-          <w:sz w:val="22"/>
-        </w:rPr>
-        <w:t>. Select the CleantechHUB LinkedIn Page as the publisher. Enter the new privacy-policy URL. Add no other product. Source: Partner Support, “Create App”, and Community Management overview (https://learn.microsoft.com/en-us/linkedin/marketing/community-management/community-management-overview?view=li-lms-2026-09), FAQ on the grayed-out request.</w:t>
+          <w:rFonts w:ascii="Calibri" w:hAnsi="Calibri" w:eastAsia="Calibri"/>
+          <w:b w:val="0"/>
+          <w:color w:val="1B4332"/>
+          <w:sz w:val="22"/>
+        </w:rPr>
+        <w:t xml:space="preserve">. Select the CleantechHUB LinkedIn Page as the publisher. Enter the new privacy-policy URL. Add no other product. Source: Partner Support, “Create App”, and </w:t>
+      </w:r>
+      <w:r>
+        <w:rPr>
+          <w:rFonts w:ascii="Calibri" w:hAnsi="Calibri" w:eastAsia="Calibri"/>
+          <w:b w:val="0"/>
+          <w:color w:val="1B4332"/>
+          <w:sz w:val="22"/>
+        </w:rPr>
+        <w:t>Community Management overview (https://learn.microsoft.com/en-us/linkedin/marketing/community-management/community-management-overview?view=li-lms-2026-09)</w:t>
+      </w:r>
+      <w:r>
+        <w:rPr>
+          <w:rFonts w:ascii="Calibri" w:hAnsi="Calibri" w:eastAsia="Calibri"/>
+          <w:b w:val="0"/>
+          <w:color w:val="1B4332"/>
+          <w:sz w:val="22"/>
+        </w:rPr>
+        <w:t>, FAQ on the grayed-out request.</w:t>
       </w:r>
     </w:p>
     <w:p>
       <w:r>
         <w:rPr>
-          <w:rFonts w:ascii="Calibri" w:hAnsi="Calibri"/>
+          <w:rFonts w:ascii="Calibri" w:hAnsi="Calibri" w:eastAsia="Calibri"/>
           <w:b w:val="0"/>
           <w:color w:val="1B4332"/>
           <w:sz w:val="22"/>
@@ -2986,7 +3123,7 @@
       </w:r>
       <w:r>
         <w:rPr>
-          <w:rFonts w:ascii="Calibri" w:hAnsi="Calibri"/>
+          <w:rFonts w:ascii="Calibri" w:hAnsi="Calibri" w:eastAsia="Calibri"/>
           <w:b/>
           <w:color w:val="1B4332"/>
           <w:sz w:val="22"/>
@@ -2995,7 +3132,7 @@
       </w:r>
       <w:r>
         <w:rPr>
-          <w:rFonts w:ascii="Calibri" w:hAnsi="Calibri"/>
+          <w:rFonts w:ascii="Calibri" w:hAnsi="Calibri" w:eastAsia="Calibri"/>
           <w:b w:val="0"/>
           <w:color w:val="1B4332"/>
           <w:sz w:val="22"/>
@@ -3004,7 +3141,7 @@
       </w:r>
       <w:r>
         <w:rPr>
-          <w:rFonts w:ascii="Calibri" w:hAnsi="Calibri"/>
+          <w:rFonts w:ascii="Calibri" w:hAnsi="Calibri" w:eastAsia="Calibri"/>
           <w:b/>
           <w:color w:val="1B4332"/>
           <w:sz w:val="22"/>
@@ -3013,7 +3150,7 @@
       </w:r>
       <w:r>
         <w:rPr>
-          <w:rFonts w:ascii="Calibri" w:hAnsi="Calibri"/>
+          <w:rFonts w:ascii="Calibri" w:hAnsi="Calibri" w:eastAsia="Calibri"/>
           <w:b w:val="0"/>
           <w:color w:val="1B4332"/>
           <w:sz w:val="22"/>
@@ -3022,7 +3159,7 @@
       </w:r>
       <w:r>
         <w:rPr>
-          <w:rFonts w:ascii="Calibri" w:hAnsi="Calibri"/>
+          <w:rFonts w:ascii="Calibri" w:hAnsi="Calibri" w:eastAsia="Calibri"/>
           <w:b/>
           <w:color w:val="1B4332"/>
           <w:sz w:val="22"/>
@@ -3031,7 +3168,7 @@
       </w:r>
       <w:r>
         <w:rPr>
-          <w:rFonts w:ascii="Calibri" w:hAnsi="Calibri"/>
+          <w:rFonts w:ascii="Calibri" w:hAnsi="Calibri" w:eastAsia="Calibri"/>
           <w:b w:val="0"/>
           <w:color w:val="1B4332"/>
           <w:sz w:val="22"/>
@@ -3040,7 +3177,7 @@
       </w:r>
       <w:r>
         <w:rPr>
-          <w:rFonts w:ascii="Calibri" w:hAnsi="Calibri"/>
+          <w:rFonts w:ascii="Calibri" w:hAnsi="Calibri" w:eastAsia="Calibri"/>
           <w:b/>
           <w:color w:val="1B4332"/>
           <w:sz w:val="22"/>
@@ -3049,7 +3186,7 @@
       </w:r>
       <w:r>
         <w:rPr>
-          <w:rFonts w:ascii="Calibri" w:hAnsi="Calibri"/>
+          <w:rFonts w:ascii="Calibri" w:hAnsi="Calibri" w:eastAsia="Calibri"/>
           <w:b w:val="0"/>
           <w:color w:val="1B4332"/>
           <w:sz w:val="22"/>
@@ -3058,7 +3195,7 @@
       </w:r>
       <w:r>
         <w:rPr>
-          <w:rFonts w:ascii="Calibri" w:hAnsi="Calibri"/>
+          <w:rFonts w:ascii="Calibri" w:hAnsi="Calibri" w:eastAsia="Calibri"/>
           <w:b/>
           <w:color w:val="1B4332"/>
           <w:sz w:val="22"/>
@@ -3067,29 +3204,83 @@
       </w:r>
       <w:r>
         <w:rPr>
-          <w:rFonts w:ascii="Calibri" w:hAnsi="Calibri"/>
-          <w:b w:val="0"/>
-          <w:color w:val="1B4332"/>
-          <w:sz w:val="22"/>
-        </w:rPr>
-        <w:t>. Source: Send an app verification request (https://www.linkedin.com/help/linkedin/answer/a1665329).</w:t>
+          <w:rFonts w:ascii="Calibri" w:hAnsi="Calibri" w:eastAsia="Calibri"/>
+          <w:b w:val="0"/>
+          <w:color w:val="1B4332"/>
+          <w:sz w:val="22"/>
+        </w:rPr>
+        <w:t xml:space="preserve">. Source: </w:t>
+      </w:r>
+      <w:r>
+        <w:rPr>
+          <w:rFonts w:ascii="Calibri" w:hAnsi="Calibri" w:eastAsia="Calibri"/>
+          <w:b w:val="0"/>
+          <w:color w:val="1B4332"/>
+          <w:sz w:val="22"/>
+        </w:rPr>
+        <w:t>Send an app verification request (https://www.linkedin.com/help/linkedin/answer/a1665329)</w:t>
+      </w:r>
+      <w:r>
+        <w:rPr>
+          <w:rFonts w:ascii="Calibri" w:hAnsi="Calibri" w:eastAsia="Calibri"/>
+          <w:b w:val="0"/>
+          <w:color w:val="1B4332"/>
+          <w:sz w:val="22"/>
+        </w:rPr>
+        <w:t>.</w:t>
       </w:r>
     </w:p>
     <w:p>
       <w:r>
         <w:rPr>
-          <w:rFonts w:ascii="Calibri" w:hAnsi="Calibri"/>
-          <w:b w:val="0"/>
-          <w:color w:val="1B4332"/>
-          <w:sz w:val="22"/>
-        </w:rPr>
-        <w:t>7. The super admin opens the URL within 30 days, signs in, and approves. The screen shows the Page, the app, and the requestor’s name. Approval cannot be undone. A denied or expired link means you generate a new URL. Source: Approve or deny an app verification request (https://www.linkedin.com/help/linkedin/answer/a1669245). The Page association is permanent and cannot move to another Page. Source: Associate an app with a LinkedIn Page (https://www.linkedin.com/help/linkedin/answer/a548360).</w:t>
+          <w:rFonts w:ascii="Calibri" w:hAnsi="Calibri" w:eastAsia="Calibri"/>
+          <w:b w:val="0"/>
+          <w:color w:val="1B4332"/>
+          <w:sz w:val="22"/>
+        </w:rPr>
+        <w:t xml:space="preserve">7. The super admin opens the URL within 30 days, signs in, and approves. The screen shows the Page, the app, and the requestor’s name. Approval cannot be undone. A denied or expired link means you generate a new URL. Source: </w:t>
+      </w:r>
+      <w:r>
+        <w:rPr>
+          <w:rFonts w:ascii="Calibri" w:hAnsi="Calibri" w:eastAsia="Calibri"/>
+          <w:b w:val="0"/>
+          <w:color w:val="1B4332"/>
+          <w:sz w:val="22"/>
+        </w:rPr>
+        <w:t>Approve or deny an app verification request (https://www.linkedin.com/help/linkedin/answer/a1669245)</w:t>
+      </w:r>
+      <w:r>
+        <w:rPr>
+          <w:rFonts w:ascii="Calibri" w:hAnsi="Calibri" w:eastAsia="Calibri"/>
+          <w:b w:val="0"/>
+          <w:color w:val="1B4332"/>
+          <w:sz w:val="22"/>
+        </w:rPr>
+        <w:t xml:space="preserve">. The Page association is permanent and cannot move to another Page. Source: </w:t>
+      </w:r>
+      <w:r>
+        <w:rPr>
+          <w:rFonts w:ascii="Calibri" w:hAnsi="Calibri" w:eastAsia="Calibri"/>
+          <w:b w:val="0"/>
+          <w:color w:val="1B4332"/>
+          <w:sz w:val="22"/>
+        </w:rPr>
+        <w:t>Associate an app with a LinkedIn Page (https://www.linkedin.com/help/linkedin/answer/a548360)</w:t>
+      </w:r>
+      <w:r>
+        <w:rPr>
+          <w:rFonts w:ascii="Calibri" w:hAnsi="Calibri" w:eastAsia="Calibri"/>
+          <w:b w:val="0"/>
+          <w:color w:val="1B4332"/>
+          <w:sz w:val="22"/>
+        </w:rPr>
+        <w:t>.</w:t>
       </w:r>
     </w:p>
     <w:p>
       <w:r>
         <w:rPr>
-          <w:rFonts w:ascii="Calibri" w:hAnsi="Calibri"/>
+          <w:rFonts w:ascii="Calibri" w:hAnsi="Calibri" w:eastAsia="Calibri"/>
           <w:b w:val="0"/>
           <w:color w:val="1B4332"/>
           <w:sz w:val="22"/>
@@ -3098,7 +3289,7 @@
       </w:r>
       <w:r>
         <w:rPr>
-          <w:rFonts w:ascii="Calibri" w:hAnsi="Calibri"/>
+          <w:rFonts w:ascii="Calibri" w:hAnsi="Calibri" w:eastAsia="Calibri"/>
           <w:b/>
           <w:color w:val="1B4332"/>
           <w:sz w:val="22"/>
@@ -3107,18 +3298,36 @@
       </w:r>
       <w:r>
         <w:rPr>
-          <w:rFonts w:ascii="Calibri" w:hAnsi="Calibri"/>
-          <w:b w:val="0"/>
-          <w:color w:val="1B4332"/>
-          <w:sz w:val="22"/>
-        </w:rPr>
-        <w:t xml:space="preserve"> and confirm the Page shows as verified. The docs require this before the access form is reviewed. Source: Community Management app review (https://learn.microsoft.com/en-us/linkedin/marketing/community-management-app-review?view=li-lms-2026-09).</w:t>
+          <w:rFonts w:ascii="Calibri" w:hAnsi="Calibri" w:eastAsia="Calibri"/>
+          <w:b w:val="0"/>
+          <w:color w:val="1B4332"/>
+          <w:sz w:val="22"/>
+        </w:rPr>
+        <w:t xml:space="preserve"> and confirm the Page shows as verified. The docs require this before the access form is reviewed. Source: </w:t>
+      </w:r>
+      <w:r>
+        <w:rPr>
+          <w:rFonts w:ascii="Calibri" w:hAnsi="Calibri" w:eastAsia="Calibri"/>
+          <w:b w:val="0"/>
+          <w:color w:val="1B4332"/>
+          <w:sz w:val="22"/>
+        </w:rPr>
+        <w:t>Community Management app review (https://learn.microsoft.com/en-us/linkedin/marketing/community-management-app-review?view=li-lms-2026-09)</w:t>
+      </w:r>
+      <w:r>
+        <w:rPr>
+          <w:rFonts w:ascii="Calibri" w:hAnsi="Calibri" w:eastAsia="Calibri"/>
+          <w:b w:val="0"/>
+          <w:color w:val="1B4332"/>
+          <w:sz w:val="22"/>
+        </w:rPr>
+        <w:t>.</w:t>
       </w:r>
     </w:p>
     <w:p>
       <w:r>
         <w:rPr>
-          <w:rFonts w:ascii="Calibri" w:hAnsi="Calibri"/>
+          <w:rFonts w:ascii="Calibri" w:hAnsi="Calibri" w:eastAsia="Calibri"/>
           <w:b w:val="0"/>
           <w:color w:val="1B4332"/>
           <w:sz w:val="22"/>
@@ -3127,7 +3336,7 @@
       </w:r>
       <w:r>
         <w:rPr>
-          <w:rFonts w:ascii="Calibri" w:hAnsi="Calibri"/>
+          <w:rFonts w:ascii="Calibri" w:hAnsi="Calibri" w:eastAsia="Calibri"/>
           <w:b/>
           <w:color w:val="1B4332"/>
           <w:sz w:val="22"/>
@@ -3136,7 +3345,7 @@
       </w:r>
       <w:r>
         <w:rPr>
-          <w:rFonts w:ascii="Calibri" w:hAnsi="Calibri"/>
+          <w:rFonts w:ascii="Calibri" w:hAnsi="Calibri" w:eastAsia="Calibri"/>
           <w:b w:val="0"/>
           <w:color w:val="1B4332"/>
           <w:sz w:val="22"/>
@@ -3145,7 +3354,7 @@
       </w:r>
       <w:r>
         <w:rPr>
-          <w:rFonts w:ascii="Calibri" w:hAnsi="Calibri"/>
+          <w:rFonts w:ascii="Calibri" w:hAnsi="Calibri" w:eastAsia="Calibri"/>
           <w:b/>
           <w:color w:val="1B4332"/>
           <w:sz w:val="22"/>
@@ -3154,7 +3363,7 @@
       </w:r>
       <w:r>
         <w:rPr>
-          <w:rFonts w:ascii="Calibri" w:hAnsi="Calibri"/>
+          <w:rFonts w:ascii="Calibri" w:hAnsi="Calibri" w:eastAsia="Calibri"/>
           <w:b w:val="0"/>
           <w:color w:val="1B4332"/>
           <w:sz w:val="22"/>
@@ -3163,7 +3372,7 @@
       </w:r>
       <w:r>
         <w:rPr>
-          <w:rFonts w:ascii="Calibri" w:hAnsi="Calibri"/>
+          <w:rFonts w:ascii="Calibri" w:hAnsi="Calibri" w:eastAsia="Calibri"/>
           <w:b/>
           <w:color w:val="1B4332"/>
           <w:sz w:val="22"/>
@@ -3172,7 +3381,7 @@
       </w:r>
       <w:r>
         <w:rPr>
-          <w:rFonts w:ascii="Calibri" w:hAnsi="Calibri"/>
+          <w:rFonts w:ascii="Calibri" w:hAnsi="Calibri" w:eastAsia="Calibri"/>
           <w:b w:val="0"/>
           <w:color w:val="1B4332"/>
           <w:sz w:val="22"/>
@@ -3181,7 +3390,7 @@
       </w:r>
       <w:r>
         <w:rPr>
-          <w:rFonts w:ascii="Calibri" w:hAnsi="Calibri"/>
+          <w:rFonts w:ascii="Calibri" w:hAnsi="Calibri" w:eastAsia="Calibri"/>
           <w:b/>
           <w:color w:val="1B4332"/>
           <w:sz w:val="22"/>
@@ -3190,29 +3399,65 @@
       </w:r>
       <w:r>
         <w:rPr>
-          <w:rFonts w:ascii="Calibri" w:hAnsi="Calibri"/>
-          <w:b w:val="0"/>
-          <w:color w:val="1B4332"/>
-          <w:sz w:val="22"/>
-        </w:rPr>
-        <w:t>. Source: Migration guide, How to Apply (https://learn.microsoft.com/en-us/linkedin/marketing/community-management/community-management-api-migration-guide?view=li-lms-2026-09).</w:t>
+          <w:rFonts w:ascii="Calibri" w:hAnsi="Calibri" w:eastAsia="Calibri"/>
+          <w:b w:val="0"/>
+          <w:color w:val="1B4332"/>
+          <w:sz w:val="22"/>
+        </w:rPr>
+        <w:t xml:space="preserve">. Source: </w:t>
+      </w:r>
+      <w:r>
+        <w:rPr>
+          <w:rFonts w:ascii="Calibri" w:hAnsi="Calibri" w:eastAsia="Calibri"/>
+          <w:b w:val="0"/>
+          <w:color w:val="1B4332"/>
+          <w:sz w:val="22"/>
+        </w:rPr>
+        <w:t>Migration guide, How to Apply (https://learn.microsoft.com/en-us/linkedin/marketing/community-management/community-management-api-migration-guide?view=li-lms-2026-09)</w:t>
+      </w:r>
+      <w:r>
+        <w:rPr>
+          <w:rFonts w:ascii="Calibri" w:hAnsi="Calibri" w:eastAsia="Calibri"/>
+          <w:b w:val="0"/>
+          <w:color w:val="1B4332"/>
+          <w:sz w:val="22"/>
+        </w:rPr>
+        <w:t>.</w:t>
       </w:r>
     </w:p>
     <w:p>
       <w:r>
         <w:rPr>
-          <w:rFonts w:ascii="Calibri" w:hAnsi="Calibri"/>
-          <w:b w:val="0"/>
-          <w:color w:val="1B4332"/>
-          <w:sz w:val="22"/>
-        </w:rPr>
-        <w:t>10. Complete the survey within 21 days of the day it appears. Paste section 1. Use the business email. Check spam, junk, social, and promotions for the verification message. Source: Partner Support, vetting survey (https://learn.microsoft.com/en-us/linkedin/shared/linkedin-api-partner-support-guide).</w:t>
+          <w:rFonts w:ascii="Calibri" w:hAnsi="Calibri" w:eastAsia="Calibri"/>
+          <w:b w:val="0"/>
+          <w:color w:val="1B4332"/>
+          <w:sz w:val="22"/>
+        </w:rPr>
+        <w:t xml:space="preserve">10. Complete the survey within 21 days of the day it appears. Paste section 1. Use the business email. Check spam, junk, social, and promotions for the verification message. Source: </w:t>
+      </w:r>
+      <w:r>
+        <w:rPr>
+          <w:rFonts w:ascii="Calibri" w:hAnsi="Calibri" w:eastAsia="Calibri"/>
+          <w:b w:val="0"/>
+          <w:color w:val="1B4332"/>
+          <w:sz w:val="22"/>
+        </w:rPr>
+        <w:t>Partner Support, vetting survey (https://learn.microsoft.com/en-us/linkedin/shared/linkedin-api-partner-support-guide)</w:t>
+      </w:r>
+      <w:r>
+        <w:rPr>
+          <w:rFonts w:ascii="Calibri" w:hAnsi="Calibri" w:eastAsia="Calibri"/>
+          <w:b w:val="0"/>
+          <w:color w:val="1B4332"/>
+          <w:sz w:val="22"/>
+        </w:rPr>
+        <w:t>.</w:t>
       </w:r>
     </w:p>
     <w:p>
       <w:r>
         <w:rPr>
-          <w:rFonts w:ascii="Calibri" w:hAnsi="Calibri"/>
+          <w:rFonts w:ascii="Calibri" w:hAnsi="Calibri" w:eastAsia="Calibri"/>
           <w:b w:val="0"/>
           <w:color w:val="1B4332"/>
           <w:sz w:val="22"/>
@@ -3221,7 +3466,7 @@
       </w:r>
       <w:r>
         <w:rPr>
-          <w:rFonts w:ascii="Consolas" w:hAnsi="Consolas"/>
+          <w:rFonts w:ascii="Calibri" w:hAnsi="Calibri" w:eastAsia="Calibri"/>
           <w:b w:val="0"/>
           <w:color w:val="1B4332"/>
           <w:sz w:val="22"/>
@@ -3230,7 +3475,7 @@
       </w:r>
       <w:r>
         <w:rPr>
-          <w:rFonts w:ascii="Calibri" w:hAnsi="Calibri"/>
+          <w:rFonts w:ascii="Calibri" w:hAnsi="Calibri" w:eastAsia="Calibri"/>
           <w:b w:val="0"/>
           <w:color w:val="1B4332"/>
           <w:sz w:val="22"/>
@@ -3241,7 +3486,7 @@
     <w:p>
       <w:r>
         <w:rPr>
-          <w:rFonts w:ascii="Calibri" w:hAnsi="Calibri"/>
+          <w:rFonts w:ascii="Calibri" w:hAnsi="Calibri" w:eastAsia="Calibri"/>
           <w:b w:val="0"/>
           <w:color w:val="1B4332"/>
           <w:sz w:val="22"/>
@@ -3250,7 +3495,7 @@
       </w:r>
       <w:r>
         <w:rPr>
-          <w:rFonts w:ascii="Calibri" w:hAnsi="Calibri"/>
+          <w:rFonts w:ascii="Calibri" w:hAnsi="Calibri" w:eastAsia="Calibri"/>
           <w:b/>
           <w:color w:val="1B4332"/>
           <w:sz w:val="22"/>
@@ -3259,7 +3504,7 @@
       </w:r>
       <w:r>
         <w:rPr>
-          <w:rFonts w:ascii="Calibri" w:hAnsi="Calibri"/>
+          <w:rFonts w:ascii="Calibri" w:hAnsi="Calibri" w:eastAsia="Calibri"/>
           <w:b w:val="0"/>
           <w:color w:val="1B4332"/>
           <w:sz w:val="22"/>
@@ -3268,7 +3513,7 @@
       </w:r>
       <w:r>
         <w:rPr>
-          <w:rFonts w:ascii="Calibri" w:hAnsi="Calibri"/>
+          <w:rFonts w:ascii="Calibri" w:hAnsi="Calibri" w:eastAsia="Calibri"/>
           <w:b/>
           <w:color w:val="1B4332"/>
           <w:sz w:val="22"/>
@@ -3277,7 +3522,7 @@
       </w:r>
       <w:r>
         <w:rPr>
-          <w:rFonts w:ascii="Calibri" w:hAnsi="Calibri"/>
+          <w:rFonts w:ascii="Calibri" w:hAnsi="Calibri" w:eastAsia="Calibri"/>
           <w:b w:val="0"/>
           <w:color w:val="1B4332"/>
           <w:sz w:val="22"/>
@@ -3286,7 +3531,7 @@
       </w:r>
       <w:r>
         <w:rPr>
-          <w:rFonts w:ascii="Calibri" w:hAnsi="Calibri"/>
+          <w:rFonts w:ascii="Calibri" w:hAnsi="Calibri" w:eastAsia="Calibri"/>
           <w:b/>
           <w:color w:val="1B4332"/>
           <w:sz w:val="22"/>
@@ -3295,7 +3540,7 @@
       </w:r>
       <w:r>
         <w:rPr>
-          <w:rFonts w:ascii="Calibri" w:hAnsi="Calibri"/>
+          <w:rFonts w:ascii="Calibri" w:hAnsi="Calibri" w:eastAsia="Calibri"/>
           <w:b w:val="0"/>
           <w:color w:val="1B4332"/>
           <w:sz w:val="22"/>
@@ -3304,7 +3549,7 @@
       </w:r>
       <w:r>
         <w:rPr>
-          <w:rFonts w:ascii="Calibri" w:hAnsi="Calibri"/>
+          <w:rFonts w:ascii="Calibri" w:hAnsi="Calibri" w:eastAsia="Calibri"/>
           <w:b/>
           <w:color w:val="1B4332"/>
           <w:sz w:val="22"/>
@@ -3313,18 +3558,36 @@
       </w:r>
       <w:r>
         <w:rPr>
-          <w:rFonts w:ascii="Calibri" w:hAnsi="Calibri"/>
-          <w:b w:val="0"/>
-          <w:color w:val="1B4332"/>
-          <w:sz w:val="22"/>
-        </w:rPr>
-        <w:t xml:space="preserve"> is the screencast stage. Source: Developer application review status definitions (https://www.linkedin.com/help/linkedin/answer/a1449586).</w:t>
+          <w:rFonts w:ascii="Calibri" w:hAnsi="Calibri" w:eastAsia="Calibri"/>
+          <w:b w:val="0"/>
+          <w:color w:val="1B4332"/>
+          <w:sz w:val="22"/>
+        </w:rPr>
+        <w:t xml:space="preserve"> is the screencast stage. Source: </w:t>
+      </w:r>
+      <w:r>
+        <w:rPr>
+          <w:rFonts w:ascii="Calibri" w:hAnsi="Calibri" w:eastAsia="Calibri"/>
+          <w:b w:val="0"/>
+          <w:color w:val="1B4332"/>
+          <w:sz w:val="22"/>
+        </w:rPr>
+        <w:t>Developer application review status definitions (https://www.linkedin.com/help/linkedin/answer/a1449586)</w:t>
+      </w:r>
+      <w:r>
+        <w:rPr>
+          <w:rFonts w:ascii="Calibri" w:hAnsi="Calibri" w:eastAsia="Calibri"/>
+          <w:b w:val="0"/>
+          <w:color w:val="1B4332"/>
+          <w:sz w:val="22"/>
+        </w:rPr>
+        <w:t>.</w:t>
       </w:r>
     </w:p>
     <w:p>
       <w:r>
         <w:rPr>
-          <w:rFonts w:ascii="Calibri" w:hAnsi="Calibri"/>
+          <w:rFonts w:ascii="Calibri" w:hAnsi="Calibri" w:eastAsia="Calibri"/>
           <w:b w:val="0"/>
           <w:color w:val="1B4332"/>
           <w:sz w:val="22"/>
@@ -3333,7 +3596,7 @@
       </w:r>
       <w:r>
         <w:rPr>
-          <w:rFonts w:ascii="Calibri" w:hAnsi="Calibri"/>
+          <w:rFonts w:ascii="Calibri" w:hAnsi="Calibri" w:eastAsia="Calibri"/>
           <w:b/>
           <w:color w:val="1B4332"/>
           <w:sz w:val="22"/>
@@ -3342,7 +3605,7 @@
       </w:r>
       <w:r>
         <w:rPr>
-          <w:rFonts w:ascii="Calibri" w:hAnsi="Calibri"/>
+          <w:rFonts w:ascii="Calibri" w:hAnsi="Calibri" w:eastAsia="Calibri"/>
           <w:b w:val="0"/>
           <w:color w:val="1B4332"/>
           <w:sz w:val="22"/>
@@ -3353,7 +3616,7 @@
     <w:p>
       <w:r>
         <w:rPr>
-          <w:rFonts w:ascii="Calibri" w:hAnsi="Calibri"/>
+          <w:rFonts w:ascii="Calibri" w:hAnsi="Calibri" w:eastAsia="Calibri"/>
           <w:b w:val="0"/>
           <w:color w:val="1B4332"/>
           <w:sz w:val="22"/>
@@ -3362,7 +3625,7 @@
       </w:r>
       <w:r>
         <w:rPr>
-          <w:rFonts w:ascii="Calibri" w:hAnsi="Calibri"/>
+          <w:rFonts w:ascii="Calibri" w:hAnsi="Calibri" w:eastAsia="Calibri"/>
           <w:b/>
           <w:color w:val="1B4332"/>
           <w:sz w:val="22"/>
@@ -3371,7 +3634,7 @@
       </w:r>
       <w:r>
         <w:rPr>
-          <w:rFonts w:ascii="Calibri" w:hAnsi="Calibri"/>
+          <w:rFonts w:ascii="Calibri" w:hAnsi="Calibri" w:eastAsia="Calibri"/>
           <w:b w:val="0"/>
           <w:color w:val="1B4332"/>
           <w:sz w:val="22"/>
@@ -3380,7 +3643,7 @@
       </w:r>
       <w:r>
         <w:rPr>
-          <w:rFonts w:ascii="Calibri" w:hAnsi="Calibri"/>
+          <w:rFonts w:ascii="Calibri" w:hAnsi="Calibri" w:eastAsia="Calibri"/>
           <w:b/>
           <w:color w:val="1B4332"/>
           <w:sz w:val="22"/>
@@ -3389,18 +3652,54 @@
       </w:r>
       <w:r>
         <w:rPr>
-          <w:rFonts w:ascii="Calibri" w:hAnsi="Calibri"/>
-          <w:b w:val="0"/>
-          <w:color w:val="1B4332"/>
-          <w:sz w:val="22"/>
-        </w:rPr>
-        <w:t>, and attach the screencast from section 1.17. If you do not reach Standard tier within 12 months, LinkedIn removes the access for inactivity. Source: Marketing API FAQ (https://learn.microsoft.com/en-us/linkedin/marketing/lms-faq?view=li-lms-2026-09) and Increasing access (https://learn.microsoft.com/en-us/linkedin/marketing/increasing-access?view=li-lms-2026-09).</w:t>
+          <w:rFonts w:ascii="Calibri" w:hAnsi="Calibri" w:eastAsia="Calibri"/>
+          <w:b w:val="0"/>
+          <w:color w:val="1B4332"/>
+          <w:sz w:val="22"/>
+        </w:rPr>
+        <w:t xml:space="preserve">, and attach the screencast from section 1.17. If you do not reach Standard tier within 12 months, LinkedIn removes the access for inactivity. Source: </w:t>
+      </w:r>
+      <w:r>
+        <w:rPr>
+          <w:rFonts w:ascii="Calibri" w:hAnsi="Calibri" w:eastAsia="Calibri"/>
+          <w:b w:val="0"/>
+          <w:color w:val="1B4332"/>
+          <w:sz w:val="22"/>
+        </w:rPr>
+        <w:t>Marketing API FAQ (https://learn.microsoft.com/en-us/linkedin/marketing/lms-faq?view=li-lms-2026-09)</w:t>
+      </w:r>
+      <w:r>
+        <w:rPr>
+          <w:rFonts w:ascii="Calibri" w:hAnsi="Calibri" w:eastAsia="Calibri"/>
+          <w:b w:val="0"/>
+          <w:color w:val="1B4332"/>
+          <w:sz w:val="22"/>
+        </w:rPr>
+        <w:t xml:space="preserve"> and </w:t>
+      </w:r>
+      <w:r>
+        <w:rPr>
+          <w:rFonts w:ascii="Calibri" w:hAnsi="Calibri" w:eastAsia="Calibri"/>
+          <w:b w:val="0"/>
+          <w:color w:val="1B4332"/>
+          <w:sz w:val="22"/>
+        </w:rPr>
+        <w:t>Increasing access (https://learn.microsoft.com/en-us/linkedin/marketing/increasing-access?view=li-lms-2026-09)</w:t>
+      </w:r>
+      <w:r>
+        <w:rPr>
+          <w:rFonts w:ascii="Calibri" w:hAnsi="Calibri" w:eastAsia="Calibri"/>
+          <w:b w:val="0"/>
+          <w:color w:val="1B4332"/>
+          <w:sz w:val="22"/>
+        </w:rPr>
+        <w:t>.</w:t>
       </w:r>
     </w:p>
     <w:p>
       <w:r>
         <w:rPr>
-          <w:rFonts w:ascii="Calibri" w:hAnsi="Calibri"/>
+          <w:rFonts w:ascii="Calibri" w:hAnsi="Calibri" w:eastAsia="Calibri"/>
           <w:b/>
           <w:color w:val="2D6A4F"/>
           <w:sz w:val="32"/>
@@ -3411,7 +3710,7 @@
     <w:p>
       <w:r>
         <w:rPr>
-          <w:rFonts w:ascii="Calibri" w:hAnsi="Calibri"/>
+          <w:rFonts w:ascii="Calibri" w:hAnsi="Calibri" w:eastAsia="Calibri"/>
           <w:b w:val="0"/>
           <w:color w:val="1B4332"/>
           <w:sz w:val="22"/>
@@ -3422,29 +3721,65 @@
     <w:p>
       <w:r>
         <w:rPr>
-          <w:rFonts w:ascii="Calibri" w:hAnsi="Calibri"/>
-          <w:b w:val="0"/>
-          <w:color w:val="1B4332"/>
-          <w:sz w:val="22"/>
-        </w:rPr>
-        <w:t>The Marketing API terms say LinkedIn will make reasonable efforts to respond, and that LinkedIn is not committing to any timeframe. Source: Marketing API terms (https://www.linkedin.com/legal/l/marketing-api-terms), in the vetting paragraph.</w:t>
+          <w:rFonts w:ascii="Calibri" w:hAnsi="Calibri" w:eastAsia="Calibri"/>
+          <w:b w:val="0"/>
+          <w:color w:val="1B4332"/>
+          <w:sz w:val="22"/>
+        </w:rPr>
+        <w:t xml:space="preserve">The Marketing API terms say LinkedIn will make reasonable efforts to respond, and that LinkedIn is not committing to any timeframe. Source: </w:t>
+      </w:r>
+      <w:r>
+        <w:rPr>
+          <w:rFonts w:ascii="Calibri" w:hAnsi="Calibri" w:eastAsia="Calibri"/>
+          <w:b w:val="0"/>
+          <w:color w:val="1B4332"/>
+          <w:sz w:val="22"/>
+        </w:rPr>
+        <w:t>Marketing API terms (https://www.linkedin.com/legal/l/marketing-api-terms)</w:t>
+      </w:r>
+      <w:r>
+        <w:rPr>
+          <w:rFonts w:ascii="Calibri" w:hAnsi="Calibri" w:eastAsia="Calibri"/>
+          <w:b w:val="0"/>
+          <w:color w:val="1B4332"/>
+          <w:sz w:val="22"/>
+        </w:rPr>
+        <w:t>, in the vetting paragraph.</w:t>
       </w:r>
     </w:p>
     <w:p>
       <w:r>
         <w:rPr>
-          <w:rFonts w:ascii="Calibri" w:hAnsi="Calibri"/>
-          <w:b w:val="0"/>
-          <w:color w:val="1B4332"/>
-          <w:sz w:val="22"/>
-        </w:rPr>
-        <w:t>Partner Support says the review team works through requests in a timely manner. Extra questions, sent to the business email, can add delay. Source: Partner Support (https://learn.microsoft.com/en-us/linkedin/shared/linkedin-api-partner-support-guide).</w:t>
+          <w:rFonts w:ascii="Calibri" w:hAnsi="Calibri" w:eastAsia="Calibri"/>
+          <w:b w:val="0"/>
+          <w:color w:val="1B4332"/>
+          <w:sz w:val="22"/>
+        </w:rPr>
+        <w:t xml:space="preserve">Partner Support says the review team works through requests in a timely manner. Extra questions, sent to the business email, can add delay. Source: </w:t>
+      </w:r>
+      <w:r>
+        <w:rPr>
+          <w:rFonts w:ascii="Calibri" w:hAnsi="Calibri" w:eastAsia="Calibri"/>
+          <w:b w:val="0"/>
+          <w:color w:val="1B4332"/>
+          <w:sz w:val="22"/>
+        </w:rPr>
+        <w:t>Partner Support (https://learn.microsoft.com/en-us/linkedin/shared/linkedin-api-partner-support-guide)</w:t>
+      </w:r>
+      <w:r>
+        <w:rPr>
+          <w:rFonts w:ascii="Calibri" w:hAnsi="Calibri" w:eastAsia="Calibri"/>
+          <w:b w:val="0"/>
+          <w:color w:val="1B4332"/>
+          <w:sz w:val="22"/>
+        </w:rPr>
+        <w:t>.</w:t>
       </w:r>
     </w:p>
     <w:p>
       <w:r>
         <w:rPr>
-          <w:rFonts w:ascii="Calibri" w:hAnsi="Calibri"/>
+          <w:rFonts w:ascii="Calibri" w:hAnsi="Calibri" w:eastAsia="Calibri"/>
           <w:b w:val="0"/>
           <w:color w:val="1B4332"/>
           <w:sz w:val="22"/>
@@ -3458,7 +3793,7 @@
       </w:pPr>
       <w:r>
         <w:rPr>
-          <w:rFonts w:ascii="Calibri" w:hAnsi="Calibri"/>
+          <w:rFonts w:ascii="Calibri" w:hAnsi="Calibri" w:eastAsia="Calibri"/>
           <w:b w:val="0"/>
           <w:color w:val="1B4332"/>
           <w:sz w:val="22"/>
@@ -3467,7 +3802,7 @@
       </w:r>
       <w:r>
         <w:rPr>
-          <w:rFonts w:ascii="Calibri" w:hAnsi="Calibri"/>
+          <w:rFonts w:ascii="Calibri" w:hAnsi="Calibri" w:eastAsia="Calibri"/>
           <w:b/>
           <w:color w:val="1B4332"/>
           <w:sz w:val="22"/>
@@ -3476,7 +3811,7 @@
       </w:r>
       <w:r>
         <w:rPr>
-          <w:rFonts w:ascii="Calibri" w:hAnsi="Calibri"/>
+          <w:rFonts w:ascii="Calibri" w:hAnsi="Calibri" w:eastAsia="Calibri"/>
           <w:b w:val="0"/>
           <w:color w:val="1B4332"/>
           <w:sz w:val="22"/>
@@ -3490,7 +3825,7 @@
       </w:pPr>
       <w:r>
         <w:rPr>
-          <w:rFonts w:ascii="Calibri" w:hAnsi="Calibri"/>
+          <w:rFonts w:ascii="Calibri" w:hAnsi="Calibri" w:eastAsia="Calibri"/>
           <w:b w:val="0"/>
           <w:color w:val="1B4332"/>
           <w:sz w:val="22"/>
@@ -3499,7 +3834,7 @@
       </w:r>
       <w:r>
         <w:rPr>
-          <w:rFonts w:ascii="Calibri" w:hAnsi="Calibri"/>
+          <w:rFonts w:ascii="Calibri" w:hAnsi="Calibri" w:eastAsia="Calibri"/>
           <w:b/>
           <w:color w:val="1B4332"/>
           <w:sz w:val="22"/>
@@ -3508,7 +3843,7 @@
       </w:r>
       <w:r>
         <w:rPr>
-          <w:rFonts w:ascii="Calibri" w:hAnsi="Calibri"/>
+          <w:rFonts w:ascii="Calibri" w:hAnsi="Calibri" w:eastAsia="Calibri"/>
           <w:b w:val="0"/>
           <w:color w:val="1B4332"/>
           <w:sz w:val="22"/>
@@ -3517,7 +3852,7 @@
       </w:r>
       <w:r>
         <w:rPr>
-          <w:rFonts w:ascii="Calibri" w:hAnsi="Calibri"/>
+          <w:rFonts w:ascii="Calibri" w:hAnsi="Calibri" w:eastAsia="Calibri"/>
           <w:b/>
           <w:color w:val="1B4332"/>
           <w:sz w:val="22"/>
@@ -3526,7 +3861,7 @@
       </w:r>
       <w:r>
         <w:rPr>
-          <w:rFonts w:ascii="Calibri" w:hAnsi="Calibri"/>
+          <w:rFonts w:ascii="Calibri" w:hAnsi="Calibri" w:eastAsia="Calibri"/>
           <w:b w:val="0"/>
           <w:color w:val="1B4332"/>
           <w:sz w:val="22"/>
@@ -3535,7 +3870,7 @@
       </w:r>
       <w:r>
         <w:rPr>
-          <w:rFonts w:ascii="Calibri" w:hAnsi="Calibri"/>
+          <w:rFonts w:ascii="Calibri" w:hAnsi="Calibri" w:eastAsia="Calibri"/>
           <w:b/>
           <w:color w:val="1B4332"/>
           <w:sz w:val="22"/>
@@ -3544,7 +3879,7 @@
       </w:r>
       <w:r>
         <w:rPr>
-          <w:rFonts w:ascii="Calibri" w:hAnsi="Calibri"/>
+          <w:rFonts w:ascii="Calibri" w:hAnsi="Calibri" w:eastAsia="Calibri"/>
           <w:b w:val="0"/>
           <w:color w:val="1B4332"/>
           <w:sz w:val="22"/>
@@ -3558,7 +3893,7 @@
       </w:pPr>
       <w:r>
         <w:rPr>
-          <w:rFonts w:ascii="Calibri" w:hAnsi="Calibri"/>
+          <w:rFonts w:ascii="Calibri" w:hAnsi="Calibri" w:eastAsia="Calibri"/>
           <w:b w:val="0"/>
           <w:color w:val="1B4332"/>
           <w:sz w:val="22"/>
@@ -3567,7 +3902,7 @@
       </w:r>
       <w:r>
         <w:rPr>
-          <w:rFonts w:ascii="Calibri" w:hAnsi="Calibri"/>
+          <w:rFonts w:ascii="Calibri" w:hAnsi="Calibri" w:eastAsia="Calibri"/>
           <w:b/>
           <w:color w:val="1B4332"/>
           <w:sz w:val="22"/>
@@ -3576,7 +3911,7 @@
       </w:r>
       <w:r>
         <w:rPr>
-          <w:rFonts w:ascii="Calibri" w:hAnsi="Calibri"/>
+          <w:rFonts w:ascii="Calibri" w:hAnsi="Calibri" w:eastAsia="Calibri"/>
           <w:b w:val="0"/>
           <w:color w:val="1B4332"/>
           <w:sz w:val="22"/>
@@ -3590,7 +3925,7 @@
       </w:pPr>
       <w:r>
         <w:rPr>
-          <w:rFonts w:ascii="Calibri" w:hAnsi="Calibri"/>
+          <w:rFonts w:ascii="Calibri" w:hAnsi="Calibri" w:eastAsia="Calibri"/>
           <w:b w:val="0"/>
           <w:color w:val="1B4332"/>
           <w:sz w:val="22"/>
@@ -3599,7 +3934,7 @@
       </w:r>
       <w:r>
         <w:rPr>
-          <w:rFonts w:ascii="Calibri" w:hAnsi="Calibri"/>
+          <w:rFonts w:ascii="Calibri" w:hAnsi="Calibri" w:eastAsia="Calibri"/>
           <w:b/>
           <w:color w:val="1B4332"/>
           <w:sz w:val="22"/>
@@ -3608,7 +3943,7 @@
       </w:r>
       <w:r>
         <w:rPr>
-          <w:rFonts w:ascii="Calibri" w:hAnsi="Calibri"/>
+          <w:rFonts w:ascii="Calibri" w:hAnsi="Calibri" w:eastAsia="Calibri"/>
           <w:b w:val="0"/>
           <w:color w:val="1B4332"/>
           <w:sz w:val="22"/>
@@ -3622,7 +3957,7 @@
       </w:pPr>
       <w:r>
         <w:rPr>
-          <w:rFonts w:ascii="Calibri" w:hAnsi="Calibri"/>
+          <w:rFonts w:ascii="Calibri" w:hAnsi="Calibri" w:eastAsia="Calibri"/>
           <w:b w:val="0"/>
           <w:color w:val="1B4332"/>
           <w:sz w:val="22"/>
@@ -3631,7 +3966,7 @@
       </w:r>
       <w:r>
         <w:rPr>
-          <w:rFonts w:ascii="Calibri" w:hAnsi="Calibri"/>
+          <w:rFonts w:ascii="Calibri" w:hAnsi="Calibri" w:eastAsia="Calibri"/>
           <w:b/>
           <w:color w:val="1B4332"/>
           <w:sz w:val="22"/>
@@ -3640,7 +3975,7 @@
       </w:r>
       <w:r>
         <w:rPr>
-          <w:rFonts w:ascii="Calibri" w:hAnsi="Calibri"/>
+          <w:rFonts w:ascii="Calibri" w:hAnsi="Calibri" w:eastAsia="Calibri"/>
           <w:b w:val="0"/>
           <w:color w:val="1B4332"/>
           <w:sz w:val="22"/>
@@ -3649,7 +3984,7 @@
       </w:r>
       <w:r>
         <w:rPr>
-          <w:rFonts w:ascii="Calibri" w:hAnsi="Calibri"/>
+          <w:rFonts w:ascii="Calibri" w:hAnsi="Calibri" w:eastAsia="Calibri"/>
           <w:b/>
           <w:color w:val="1B4332"/>
           <w:sz w:val="22"/>
@@ -3658,7 +3993,7 @@
       </w:r>
       <w:r>
         <w:rPr>
-          <w:rFonts w:ascii="Calibri" w:hAnsi="Calibri"/>
+          <w:rFonts w:ascii="Calibri" w:hAnsi="Calibri" w:eastAsia="Calibri"/>
           <w:b w:val="0"/>
           <w:color w:val="1B4332"/>
           <w:sz w:val="22"/>
@@ -3667,7 +4002,7 @@
       </w:r>
       <w:r>
         <w:rPr>
-          <w:rFonts w:ascii="Consolas" w:hAnsi="Consolas"/>
+          <w:rFonts w:ascii="Calibri" w:hAnsi="Calibri" w:eastAsia="Calibri"/>
           <w:b w:val="0"/>
           <w:color w:val="1B4332"/>
           <w:sz w:val="22"/>
@@ -3676,7 +4011,7 @@
       </w:r>
       <w:r>
         <w:rPr>
-          <w:rFonts w:ascii="Calibri" w:hAnsi="Calibri"/>
+          <w:rFonts w:ascii="Calibri" w:hAnsi="Calibri" w:eastAsia="Calibri"/>
           <w:b w:val="0"/>
           <w:color w:val="1B4332"/>
           <w:sz w:val="22"/>
@@ -3687,7 +4022,7 @@
     <w:p>
       <w:r>
         <w:rPr>
-          <w:rFonts w:ascii="Calibri" w:hAnsi="Calibri"/>
+          <w:rFonts w:ascii="Calibri" w:hAnsi="Calibri" w:eastAsia="Calibri"/>
           <w:b w:val="0"/>
           <w:color w:val="1B4332"/>
           <w:sz w:val="22"/>
@@ -3698,7 +4033,7 @@
     <w:p>
       <w:r>
         <w:rPr>
-          <w:rFonts w:ascii="Calibri" w:hAnsi="Calibri"/>
+          <w:rFonts w:ascii="Calibri" w:hAnsi="Calibri" w:eastAsia="Calibri"/>
           <w:b/>
           <w:color w:val="2D6A4F"/>
           <w:sz w:val="32"/>
@@ -3709,12 +4044,30 @@
     <w:p>
       <w:r>
         <w:rPr>
-          <w:rFonts w:ascii="Calibri" w:hAnsi="Calibri"/>
-          <w:b w:val="0"/>
-          <w:color w:val="1B4332"/>
-          <w:sz w:val="22"/>
-        </w:rPr>
-        <w:t>The list below is the published rejection table. Source: Developer application review status definitions (https://www.linkedin.com/help/linkedin/answer/a1449586).</w:t>
+          <w:rFonts w:ascii="Calibri" w:hAnsi="Calibri" w:eastAsia="Calibri"/>
+          <w:b w:val="0"/>
+          <w:color w:val="1B4332"/>
+          <w:sz w:val="22"/>
+        </w:rPr>
+        <w:t xml:space="preserve">The list below is the published rejection table. Source: </w:t>
+      </w:r>
+      <w:r>
+        <w:rPr>
+          <w:rFonts w:ascii="Calibri" w:hAnsi="Calibri" w:eastAsia="Calibri"/>
+          <w:b w:val="0"/>
+          <w:color w:val="1B4332"/>
+          <w:sz w:val="22"/>
+        </w:rPr>
+        <w:t>Developer application review status definitions (https://www.linkedin.com/help/linkedin/answer/a1449586)</w:t>
+      </w:r>
+      <w:r>
+        <w:rPr>
+          <w:rFonts w:ascii="Calibri" w:hAnsi="Calibri" w:eastAsia="Calibri"/>
+          <w:b w:val="0"/>
+          <w:color w:val="1B4332"/>
+          <w:sz w:val="22"/>
+        </w:rPr>
+        <w:t>.</w:t>
       </w:r>
     </w:p>
     <w:tbl>
@@ -3724,19 +4077,19 @@
         <w:tblLook w:firstColumn="1" w:firstRow="1" w:lastColumn="0" w:lastRow="0" w:noHBand="0" w:noVBand="1" w:val="04A0"/>
       </w:tblPr>
       <w:tblGrid>
-        <w:gridCol w:w="5043"/>
-        <w:gridCol w:w="5043"/>
+        <w:gridCol w:w="4320"/>
+        <w:gridCol w:w="4320"/>
       </w:tblGrid>
       <w:tr>
         <w:tc>
           <w:tcPr>
-            <w:tcW w:type="dxa" w:w="5043"/>
+            <w:tcW w:type="dxa" w:w="4320"/>
           </w:tcPr>
           <w:p>
             <w:r/>
             <w:r>
               <w:rPr>
-                <w:rFonts w:ascii="Calibri" w:hAnsi="Calibri"/>
+                <w:rFonts w:ascii="Calibri" w:hAnsi="Calibri" w:eastAsia="Calibri"/>
                 <w:b/>
                 <w:color w:val="1B4332"/>
                 <w:sz w:val="20"/>
@@ -3747,13 +4100,13 @@
         </w:tc>
         <w:tc>
           <w:tcPr>
-            <w:tcW w:type="dxa" w:w="5043"/>
+            <w:tcW w:type="dxa" w:w="4320"/>
           </w:tcPr>
           <w:p>
             <w:r/>
             <w:r>
               <w:rPr>
-                <w:rFonts w:ascii="Calibri" w:hAnsi="Calibri"/>
+                <w:rFonts w:ascii="Calibri" w:hAnsi="Calibri" w:eastAsia="Calibri"/>
                 <w:b/>
                 <w:color w:val="1B4332"/>
                 <w:sz w:val="20"/>
@@ -3766,13 +4119,13 @@
       <w:tr>
         <w:tc>
           <w:tcPr>
-            <w:tcW w:type="dxa" w:w="5043"/>
+            <w:tcW w:type="dxa" w:w="4320"/>
           </w:tcPr>
           <w:p>
             <w:r/>
             <w:r>
               <w:rPr>
-                <w:rFonts w:ascii="Calibri" w:hAnsi="Calibri"/>
+                <w:rFonts w:ascii="Calibri" w:hAnsi="Calibri" w:eastAsia="Calibri"/>
                 <w:b w:val="0"/>
                 <w:color w:val="1B4332"/>
                 <w:sz w:val="20"/>
@@ -3783,13 +4136,13 @@
         </w:tc>
         <w:tc>
           <w:tcPr>
-            <w:tcW w:type="dxa" w:w="5043"/>
+            <w:tcW w:type="dxa" w:w="4320"/>
           </w:tcPr>
           <w:p>
             <w:r/>
             <w:r>
               <w:rPr>
-                <w:rFonts w:ascii="Calibri" w:hAnsi="Calibri"/>
+                <w:rFonts w:ascii="Calibri" w:hAnsi="Calibri" w:eastAsia="Calibri"/>
                 <w:b w:val="0"/>
                 <w:color w:val="1B4332"/>
                 <w:sz w:val="20"/>
@@ -3798,7 +4151,7 @@
             </w:r>
             <w:r>
               <w:rPr>
-                <w:rFonts w:ascii="Consolas" w:hAnsi="Consolas"/>
+                <w:rFonts w:ascii="Calibri" w:hAnsi="Calibri" w:eastAsia="Calibri"/>
                 <w:b w:val="0"/>
                 <w:color w:val="1B4332"/>
                 <w:sz w:val="20"/>
@@ -3807,7 +4160,7 @@
             </w:r>
             <w:r>
               <w:rPr>
-                <w:rFonts w:ascii="Calibri" w:hAnsi="Calibri"/>
+                <w:rFonts w:ascii="Calibri" w:hAnsi="Calibri" w:eastAsia="Calibri"/>
                 <w:b w:val="0"/>
                 <w:color w:val="1B4332"/>
                 <w:sz w:val="20"/>
@@ -3820,13 +4173,13 @@
       <w:tr>
         <w:tc>
           <w:tcPr>
-            <w:tcW w:type="dxa" w:w="5043"/>
+            <w:tcW w:type="dxa" w:w="4320"/>
           </w:tcPr>
           <w:p>
             <w:r/>
             <w:r>
               <w:rPr>
-                <w:rFonts w:ascii="Calibri" w:hAnsi="Calibri"/>
+                <w:rFonts w:ascii="Calibri" w:hAnsi="Calibri" w:eastAsia="Calibri"/>
                 <w:b w:val="0"/>
                 <w:color w:val="1B4332"/>
                 <w:sz w:val="20"/>
@@ -3837,13 +4190,13 @@
         </w:tc>
         <w:tc>
           <w:tcPr>
-            <w:tcW w:type="dxa" w:w="5043"/>
+            <w:tcW w:type="dxa" w:w="4320"/>
           </w:tcPr>
           <w:p>
             <w:r/>
             <w:r>
               <w:rPr>
-                <w:rFonts w:ascii="Calibri" w:hAnsi="Calibri"/>
+                <w:rFonts w:ascii="Calibri" w:hAnsi="Calibri" w:eastAsia="Calibri"/>
                 <w:b w:val="0"/>
                 <w:color w:val="1B4332"/>
                 <w:sz w:val="20"/>
@@ -3856,13 +4209,13 @@
       <w:tr>
         <w:tc>
           <w:tcPr>
-            <w:tcW w:type="dxa" w:w="5043"/>
+            <w:tcW w:type="dxa" w:w="4320"/>
           </w:tcPr>
           <w:p>
             <w:r/>
             <w:r>
               <w:rPr>
-                <w:rFonts w:ascii="Calibri" w:hAnsi="Calibri"/>
+                <w:rFonts w:ascii="Calibri" w:hAnsi="Calibri" w:eastAsia="Calibri"/>
                 <w:b w:val="0"/>
                 <w:color w:val="1B4332"/>
                 <w:sz w:val="20"/>
@@ -3873,13 +4226,13 @@
         </w:tc>
         <w:tc>
           <w:tcPr>
-            <w:tcW w:type="dxa" w:w="5043"/>
+            <w:tcW w:type="dxa" w:w="4320"/>
           </w:tcPr>
           <w:p>
             <w:r/>
             <w:r>
               <w:rPr>
-                <w:rFonts w:ascii="Calibri" w:hAnsi="Calibri"/>
+                <w:rFonts w:ascii="Calibri" w:hAnsi="Calibri" w:eastAsia="Calibri"/>
                 <w:b w:val="0"/>
                 <w:color w:val="1B4332"/>
                 <w:sz w:val="20"/>
@@ -3892,13 +4245,13 @@
       <w:tr>
         <w:tc>
           <w:tcPr>
-            <w:tcW w:type="dxa" w:w="5043"/>
+            <w:tcW w:type="dxa" w:w="4320"/>
           </w:tcPr>
           <w:p>
             <w:r/>
             <w:r>
               <w:rPr>
-                <w:rFonts w:ascii="Calibri" w:hAnsi="Calibri"/>
+                <w:rFonts w:ascii="Calibri" w:hAnsi="Calibri" w:eastAsia="Calibri"/>
                 <w:b w:val="0"/>
                 <w:color w:val="1B4332"/>
                 <w:sz w:val="20"/>
@@ -3909,18 +4262,18 @@
         </w:tc>
         <w:tc>
           <w:tcPr>
-            <w:tcW w:type="dxa" w:w="5043"/>
+            <w:tcW w:type="dxa" w:w="4320"/>
           </w:tcPr>
           <w:p>
             <w:r/>
             <w:r>
               <w:rPr>
-                <w:rFonts w:ascii="Calibri" w:hAnsi="Calibri"/>
+                <w:rFonts w:ascii="Calibri" w:hAnsi="Calibri" w:eastAsia="Calibri"/>
                 <w:b w:val="0"/>
                 <w:color w:val="1B4332"/>
                 <w:sz w:val="20"/>
               </w:rPr>
-              <w:t>The legal name or address does not match a registered, active entity. Confirm the RUT before paste.</w:t>
+              <w:t>The legal name or address does not match a registered, active entity. Paste section 1.3 and section 1.4.</w:t>
             </w:r>
           </w:p>
         </w:tc>
@@ -3928,13 +4281,13 @@
       <w:tr>
         <w:tc>
           <w:tcPr>
-            <w:tcW w:type="dxa" w:w="5043"/>
+            <w:tcW w:type="dxa" w:w="4320"/>
           </w:tcPr>
           <w:p>
             <w:r/>
             <w:r>
               <w:rPr>
-                <w:rFonts w:ascii="Calibri" w:hAnsi="Calibri"/>
+                <w:rFonts w:ascii="Calibri" w:hAnsi="Calibri" w:eastAsia="Calibri"/>
                 <w:b w:val="0"/>
                 <w:color w:val="1B4332"/>
                 <w:sz w:val="20"/>
@@ -3945,13 +4298,13 @@
         </w:tc>
         <w:tc>
           <w:tcPr>
-            <w:tcW w:type="dxa" w:w="5043"/>
+            <w:tcW w:type="dxa" w:w="4320"/>
           </w:tcPr>
           <w:p>
             <w:r/>
             <w:r>
               <w:rPr>
-                <w:rFonts w:ascii="Calibri" w:hAnsi="Calibri"/>
+                <w:rFonts w:ascii="Calibri" w:hAnsi="Calibri" w:eastAsia="Calibri"/>
                 <w:b w:val="0"/>
                 <w:color w:val="1B4332"/>
                 <w:sz w:val="20"/>
@@ -3964,13 +4317,13 @@
       <w:tr>
         <w:tc>
           <w:tcPr>
-            <w:tcW w:type="dxa" w:w="5043"/>
+            <w:tcW w:type="dxa" w:w="4320"/>
           </w:tcPr>
           <w:p>
             <w:r/>
             <w:r>
               <w:rPr>
-                <w:rFonts w:ascii="Calibri" w:hAnsi="Calibri"/>
+                <w:rFonts w:ascii="Calibri" w:hAnsi="Calibri" w:eastAsia="Calibri"/>
                 <w:b w:val="0"/>
                 <w:color w:val="1B4332"/>
                 <w:sz w:val="20"/>
@@ -3981,13 +4334,13 @@
         </w:tc>
         <w:tc>
           <w:tcPr>
-            <w:tcW w:type="dxa" w:w="5043"/>
+            <w:tcW w:type="dxa" w:w="4320"/>
           </w:tcPr>
           <w:p>
             <w:r/>
             <w:r>
               <w:rPr>
-                <w:rFonts w:ascii="Calibri" w:hAnsi="Calibri"/>
+                <w:rFonts w:ascii="Calibri" w:hAnsi="Calibri" w:eastAsia="Calibri"/>
                 <w:b w:val="0"/>
                 <w:color w:val="1B4332"/>
                 <w:sz w:val="20"/>
@@ -4000,13 +4353,13 @@
       <w:tr>
         <w:tc>
           <w:tcPr>
-            <w:tcW w:type="dxa" w:w="5043"/>
+            <w:tcW w:type="dxa" w:w="4320"/>
           </w:tcPr>
           <w:p>
             <w:r/>
             <w:r>
               <w:rPr>
-                <w:rFonts w:ascii="Calibri" w:hAnsi="Calibri"/>
+                <w:rFonts w:ascii="Calibri" w:hAnsi="Calibri" w:eastAsia="Calibri"/>
                 <w:b w:val="0"/>
                 <w:color w:val="1B4332"/>
                 <w:sz w:val="20"/>
@@ -4017,13 +4370,13 @@
         </w:tc>
         <w:tc>
           <w:tcPr>
-            <w:tcW w:type="dxa" w:w="5043"/>
+            <w:tcW w:type="dxa" w:w="4320"/>
           </w:tcPr>
           <w:p>
             <w:r/>
             <w:r>
               <w:rPr>
-                <w:rFonts w:ascii="Calibri" w:hAnsi="Calibri"/>
+                <w:rFonts w:ascii="Calibri" w:hAnsi="Calibri" w:eastAsia="Calibri"/>
                 <w:b w:val="0"/>
                 <w:color w:val="1B4332"/>
                 <w:sz w:val="20"/>
@@ -4036,13 +4389,13 @@
       <w:tr>
         <w:tc>
           <w:tcPr>
-            <w:tcW w:type="dxa" w:w="5043"/>
+            <w:tcW w:type="dxa" w:w="4320"/>
           </w:tcPr>
           <w:p>
             <w:r/>
             <w:r>
               <w:rPr>
-                <w:rFonts w:ascii="Calibri" w:hAnsi="Calibri"/>
+                <w:rFonts w:ascii="Calibri" w:hAnsi="Calibri" w:eastAsia="Calibri"/>
                 <w:b w:val="0"/>
                 <w:color w:val="1B4332"/>
                 <w:sz w:val="20"/>
@@ -4053,13 +4406,13 @@
         </w:tc>
         <w:tc>
           <w:tcPr>
-            <w:tcW w:type="dxa" w:w="5043"/>
+            <w:tcW w:type="dxa" w:w="4320"/>
           </w:tcPr>
           <w:p>
             <w:r/>
             <w:r>
               <w:rPr>
-                <w:rFonts w:ascii="Calibri" w:hAnsi="Calibri"/>
+                <w:rFonts w:ascii="Calibri" w:hAnsi="Calibri" w:eastAsia="Calibri"/>
                 <w:b w:val="0"/>
                 <w:color w:val="1B4332"/>
                 <w:sz w:val="20"/>
@@ -4072,13 +4425,13 @@
       <w:tr>
         <w:tc>
           <w:tcPr>
-            <w:tcW w:type="dxa" w:w="5043"/>
+            <w:tcW w:type="dxa" w:w="4320"/>
           </w:tcPr>
           <w:p>
             <w:r/>
             <w:r>
               <w:rPr>
-                <w:rFonts w:ascii="Calibri" w:hAnsi="Calibri"/>
+                <w:rFonts w:ascii="Calibri" w:hAnsi="Calibri" w:eastAsia="Calibri"/>
                 <w:b w:val="0"/>
                 <w:color w:val="1B4332"/>
                 <w:sz w:val="20"/>
@@ -4089,13 +4442,13 @@
         </w:tc>
         <w:tc>
           <w:tcPr>
-            <w:tcW w:type="dxa" w:w="5043"/>
+            <w:tcW w:type="dxa" w:w="4320"/>
           </w:tcPr>
           <w:p>
             <w:r/>
             <w:r>
               <w:rPr>
-                <w:rFonts w:ascii="Calibri" w:hAnsi="Calibri"/>
+                <w:rFonts w:ascii="Calibri" w:hAnsi="Calibri" w:eastAsia="Calibri"/>
                 <w:b w:val="0"/>
                 <w:color w:val="1B4332"/>
                 <w:sz w:val="20"/>
@@ -4108,13 +4461,13 @@
       <w:tr>
         <w:tc>
           <w:tcPr>
-            <w:tcW w:type="dxa" w:w="5043"/>
+            <w:tcW w:type="dxa" w:w="4320"/>
           </w:tcPr>
           <w:p>
             <w:r/>
             <w:r>
               <w:rPr>
-                <w:rFonts w:ascii="Calibri" w:hAnsi="Calibri"/>
+                <w:rFonts w:ascii="Calibri" w:hAnsi="Calibri" w:eastAsia="Calibri"/>
                 <w:b w:val="0"/>
                 <w:color w:val="1B4332"/>
                 <w:sz w:val="20"/>
@@ -4125,13 +4478,13 @@
         </w:tc>
         <w:tc>
           <w:tcPr>
-            <w:tcW w:type="dxa" w:w="5043"/>
+            <w:tcW w:type="dxa" w:w="4320"/>
           </w:tcPr>
           <w:p>
             <w:r/>
             <w:r>
               <w:rPr>
-                <w:rFonts w:ascii="Calibri" w:hAnsi="Calibri"/>
+                <w:rFonts w:ascii="Calibri" w:hAnsi="Calibri" w:eastAsia="Calibri"/>
                 <w:b w:val="0"/>
                 <w:color w:val="1B4332"/>
                 <w:sz w:val="20"/>
@@ -4144,13 +4497,13 @@
       <w:tr>
         <w:tc>
           <w:tcPr>
-            <w:tcW w:type="dxa" w:w="5043"/>
+            <w:tcW w:type="dxa" w:w="4320"/>
           </w:tcPr>
           <w:p>
             <w:r/>
             <w:r>
               <w:rPr>
-                <w:rFonts w:ascii="Calibri" w:hAnsi="Calibri"/>
+                <w:rFonts w:ascii="Calibri" w:hAnsi="Calibri" w:eastAsia="Calibri"/>
                 <w:b w:val="0"/>
                 <w:color w:val="1B4332"/>
                 <w:sz w:val="20"/>
@@ -4161,13 +4514,13 @@
         </w:tc>
         <w:tc>
           <w:tcPr>
-            <w:tcW w:type="dxa" w:w="5043"/>
+            <w:tcW w:type="dxa" w:w="4320"/>
           </w:tcPr>
           <w:p>
             <w:r/>
             <w:r>
               <w:rPr>
-                <w:rFonts w:ascii="Calibri" w:hAnsi="Calibri"/>
+                <w:rFonts w:ascii="Calibri" w:hAnsi="Calibri" w:eastAsia="Calibri"/>
                 <w:b w:val="0"/>
                 <w:color w:val="1B4332"/>
                 <w:sz w:val="20"/>
@@ -4178,22 +4531,39 @@
         </w:tc>
       </w:tr>
     </w:tbl>
-    <w:p/>
     <w:p>
       <w:r>
         <w:rPr>
-          <w:rFonts w:ascii="Calibri" w:hAnsi="Calibri"/>
-          <w:b w:val="0"/>
-          <w:color w:val="1B4332"/>
-          <w:sz w:val="22"/>
-        </w:rPr>
-        <w:t>A refused Development-tier application cannot request Development access again on that same app. You create a new app and start over. Source: Community Management app review (https://learn.microsoft.com/en-us/linkedin/marketing/community-management-app-review?view=li-lms-2026-09).</w:t>
+          <w:rFonts w:ascii="Calibri" w:hAnsi="Calibri" w:eastAsia="Calibri"/>
+          <w:b w:val="0"/>
+          <w:color w:val="1B4332"/>
+          <w:sz w:val="22"/>
+        </w:rPr>
+        <w:t xml:space="preserve">A refused Development-tier application cannot request Development access again on that same app. You create a new app and start over. Source: </w:t>
+      </w:r>
+      <w:r>
+        <w:rPr>
+          <w:rFonts w:ascii="Calibri" w:hAnsi="Calibri" w:eastAsia="Calibri"/>
+          <w:b w:val="0"/>
+          <w:color w:val="1B4332"/>
+          <w:sz w:val="22"/>
+        </w:rPr>
+        <w:t>Community Management app review (https://learn.microsoft.com/en-us/linkedin/marketing/community-management-app-review?view=li-lms-2026-09)</w:t>
+      </w:r>
+      <w:r>
+        <w:rPr>
+          <w:rFonts w:ascii="Calibri" w:hAnsi="Calibri" w:eastAsia="Calibri"/>
+          <w:b w:val="0"/>
+          <w:color w:val="1B4332"/>
+          <w:sz w:val="22"/>
+        </w:rPr>
+        <w:t>.</w:t>
       </w:r>
     </w:p>
     <w:p>
       <w:r>
         <w:rPr>
-          <w:rFonts w:ascii="Calibri" w:hAnsi="Calibri"/>
+          <w:rFonts w:ascii="Calibri" w:hAnsi="Calibri" w:eastAsia="Calibri"/>
           <w:b/>
           <w:color w:val="1B4332"/>
           <w:sz w:val="22"/>
@@ -4202,7 +4572,7 @@
       </w:r>
       <w:r>
         <w:rPr>
-          <w:rFonts w:ascii="Calibri" w:hAnsi="Calibri"/>
+          <w:rFonts w:ascii="Calibri" w:hAnsi="Calibri" w:eastAsia="Calibri"/>
           <w:b w:val="0"/>
           <w:color w:val="1B4332"/>
           <w:sz w:val="22"/>
@@ -4211,7 +4581,7 @@
       </w:r>
       <w:r>
         <w:rPr>
-          <w:rFonts w:ascii="Calibri" w:hAnsi="Calibri"/>
+          <w:rFonts w:ascii="Calibri" w:hAnsi="Calibri" w:eastAsia="Calibri"/>
           <w:b/>
           <w:color w:val="1B4332"/>
           <w:sz w:val="22"/>
@@ -4220,18 +4590,36 @@
       </w:r>
       <w:r>
         <w:rPr>
-          <w:rFonts w:ascii="Calibri" w:hAnsi="Calibri"/>
-          <w:b w:val="0"/>
-          <w:color w:val="1B4332"/>
-          <w:sz w:val="22"/>
-        </w:rPr>
-        <w:t xml:space="preserve"> is offered on the same app. Source: Partner Support (https://learn.microsoft.com/en-us/linkedin/shared/linkedin-api-partner-support-guide).</w:t>
+          <w:rFonts w:ascii="Calibri" w:hAnsi="Calibri" w:eastAsia="Calibri"/>
+          <w:b w:val="0"/>
+          <w:color w:val="1B4332"/>
+          <w:sz w:val="22"/>
+        </w:rPr>
+        <w:t xml:space="preserve"> is offered on the same app. Source: </w:t>
+      </w:r>
+      <w:r>
+        <w:rPr>
+          <w:rFonts w:ascii="Calibri" w:hAnsi="Calibri" w:eastAsia="Calibri"/>
+          <w:b w:val="0"/>
+          <w:color w:val="1B4332"/>
+          <w:sz w:val="22"/>
+        </w:rPr>
+        <w:t>Partner Support (https://learn.microsoft.com/en-us/linkedin/shared/linkedin-api-partner-support-guide)</w:t>
+      </w:r>
+      <w:r>
+        <w:rPr>
+          <w:rFonts w:ascii="Calibri" w:hAnsi="Calibri" w:eastAsia="Calibri"/>
+          <w:b w:val="0"/>
+          <w:color w:val="1B4332"/>
+          <w:sz w:val="22"/>
+        </w:rPr>
+        <w:t>.</w:t>
       </w:r>
     </w:p>
     <w:p>
       <w:r>
         <w:rPr>
-          <w:rFonts w:ascii="Calibri" w:hAnsi="Calibri"/>
+          <w:rFonts w:ascii="Calibri" w:hAnsi="Calibri" w:eastAsia="Calibri"/>
           <w:b/>
           <w:color w:val="2D6A4F"/>
           <w:sz w:val="32"/>
@@ -4242,7 +4630,7 @@
     <w:p>
       <w:r>
         <w:rPr>
-          <w:rFonts w:ascii="Calibri" w:hAnsi="Calibri"/>
+          <w:rFonts w:ascii="Calibri" w:hAnsi="Calibri" w:eastAsia="Calibri"/>
           <w:b w:val="0"/>
           <w:color w:val="1B4332"/>
           <w:sz w:val="22"/>
@@ -4256,7 +4644,7 @@
       </w:pPr>
       <w:r>
         <w:rPr>
-          <w:rFonts w:ascii="Calibri" w:hAnsi="Calibri"/>
+          <w:rFonts w:ascii="Calibri" w:hAnsi="Calibri" w:eastAsia="Calibri"/>
           <w:b w:val="0"/>
           <w:color w:val="1B4332"/>
           <w:sz w:val="22"/>
@@ -4270,7 +4658,7 @@
       </w:pPr>
       <w:r>
         <w:rPr>
-          <w:rFonts w:ascii="Calibri" w:hAnsi="Calibri"/>
+          <w:rFonts w:ascii="Calibri" w:hAnsi="Calibri" w:eastAsia="Calibri"/>
           <w:b w:val="0"/>
           <w:color w:val="1B4332"/>
           <w:sz w:val="22"/>
@@ -4284,7 +4672,7 @@
       </w:pPr>
       <w:r>
         <w:rPr>
-          <w:rFonts w:ascii="Calibri" w:hAnsi="Calibri"/>
+          <w:rFonts w:ascii="Calibri" w:hAnsi="Calibri" w:eastAsia="Calibri"/>
           <w:b w:val="0"/>
           <w:color w:val="1B4332"/>
           <w:sz w:val="22"/>
@@ -4298,7 +4686,7 @@
       </w:pPr>
       <w:r>
         <w:rPr>
-          <w:rFonts w:ascii="Calibri" w:hAnsi="Calibri"/>
+          <w:rFonts w:ascii="Calibri" w:hAnsi="Calibri" w:eastAsia="Calibri"/>
           <w:b w:val="0"/>
           <w:color w:val="1B4332"/>
           <w:sz w:val="22"/>
@@ -4312,7 +4700,7 @@
       </w:pPr>
       <w:r>
         <w:rPr>
-          <w:rFonts w:ascii="Calibri" w:hAnsi="Calibri"/>
+          <w:rFonts w:ascii="Calibri" w:hAnsi="Calibri" w:eastAsia="Calibri"/>
           <w:b w:val="0"/>
           <w:color w:val="1B4332"/>
           <w:sz w:val="22"/>
@@ -4326,7 +4714,7 @@
       </w:pPr>
       <w:r>
         <w:rPr>
-          <w:rFonts w:ascii="Calibri" w:hAnsi="Calibri"/>
+          <w:rFonts w:ascii="Calibri" w:hAnsi="Calibri" w:eastAsia="Calibri"/>
           <w:b w:val="0"/>
           <w:color w:val="1B4332"/>
           <w:sz w:val="22"/>
@@ -4340,7 +4728,7 @@
       </w:pPr>
       <w:r>
         <w:rPr>
-          <w:rFonts w:ascii="Calibri" w:hAnsi="Calibri"/>
+          <w:rFonts w:ascii="Calibri" w:hAnsi="Calibri" w:eastAsia="Calibri"/>
           <w:b w:val="0"/>
           <w:color w:val="1B4332"/>
           <w:sz w:val="22"/>
@@ -4354,7 +4742,7 @@
       </w:pPr>
       <w:r>
         <w:rPr>
-          <w:rFonts w:ascii="Calibri" w:hAnsi="Calibri"/>
+          <w:rFonts w:ascii="Calibri" w:hAnsi="Calibri" w:eastAsia="Calibri"/>
           <w:b w:val="0"/>
           <w:color w:val="1B4332"/>
           <w:sz w:val="22"/>
@@ -4368,7 +4756,7 @@
       </w:pPr>
       <w:r>
         <w:rPr>
-          <w:rFonts w:ascii="Calibri" w:hAnsi="Calibri"/>
+          <w:rFonts w:ascii="Calibri" w:hAnsi="Calibri" w:eastAsia="Calibri"/>
           <w:b w:val="0"/>
           <w:color w:val="1B4332"/>
           <w:sz w:val="22"/>
@@ -4382,7 +4770,7 @@
       </w:pPr>
       <w:r>
         <w:rPr>
-          <w:rFonts w:ascii="Calibri" w:hAnsi="Calibri"/>
+          <w:rFonts w:ascii="Calibri" w:hAnsi="Calibri" w:eastAsia="Calibri"/>
           <w:b w:val="0"/>
           <w:color w:val="1B4332"/>
           <w:sz w:val="22"/>
@@ -4396,7 +4784,7 @@
       </w:pPr>
       <w:r>
         <w:rPr>
-          <w:rFonts w:ascii="Calibri" w:hAnsi="Calibri"/>
+          <w:rFonts w:ascii="Calibri" w:hAnsi="Calibri" w:eastAsia="Calibri"/>
           <w:b w:val="0"/>
           <w:color w:val="1B4332"/>
           <w:sz w:val="22"/>
@@ -4410,7 +4798,7 @@
       </w:pPr>
       <w:r>
         <w:rPr>
-          <w:rFonts w:ascii="Calibri" w:hAnsi="Calibri"/>
+          <w:rFonts w:ascii="Calibri" w:hAnsi="Calibri" w:eastAsia="Calibri"/>
           <w:b w:val="0"/>
           <w:color w:val="1B4332"/>
           <w:sz w:val="22"/>
@@ -4424,7 +4812,7 @@
       </w:pPr>
       <w:r>
         <w:rPr>
-          <w:rFonts w:ascii="Calibri" w:hAnsi="Calibri"/>
+          <w:rFonts w:ascii="Calibri" w:hAnsi="Calibri" w:eastAsia="Calibri"/>
           <w:b w:val="0"/>
           <w:color w:val="1B4332"/>
           <w:sz w:val="22"/>
@@ -4438,7 +4826,7 @@
       </w:pPr>
       <w:r>
         <w:rPr>
-          <w:rFonts w:ascii="Calibri" w:hAnsi="Calibri"/>
+          <w:rFonts w:ascii="Calibri" w:hAnsi="Calibri" w:eastAsia="Calibri"/>
           <w:b w:val="0"/>
           <w:color w:val="1B4332"/>
           <w:sz w:val="22"/>
@@ -4452,7 +4840,7 @@
       </w:pPr>
       <w:r>
         <w:rPr>
-          <w:rFonts w:ascii="Calibri" w:hAnsi="Calibri"/>
+          <w:rFonts w:ascii="Calibri" w:hAnsi="Calibri" w:eastAsia="Calibri"/>
           <w:b w:val="0"/>
           <w:color w:val="1B4332"/>
           <w:sz w:val="22"/>
@@ -4466,7 +4854,7 @@
       </w:pPr>
       <w:r>
         <w:rPr>
-          <w:rFonts w:ascii="Calibri" w:hAnsi="Calibri"/>
+          <w:rFonts w:ascii="Calibri" w:hAnsi="Calibri" w:eastAsia="Calibri"/>
           <w:b w:val="0"/>
           <w:color w:val="1B4332"/>
           <w:sz w:val="22"/>
@@ -4480,7 +4868,7 @@
       </w:pPr>
       <w:r>
         <w:rPr>
-          <w:rFonts w:ascii="Calibri" w:hAnsi="Calibri"/>
+          <w:rFonts w:ascii="Calibri" w:hAnsi="Calibri" w:eastAsia="Calibri"/>
           <w:b w:val="0"/>
           <w:color w:val="1B4332"/>
           <w:sz w:val="22"/>
@@ -4494,7 +4882,7 @@
       </w:pPr>
       <w:r>
         <w:rPr>
-          <w:rFonts w:ascii="Calibri" w:hAnsi="Calibri"/>
+          <w:rFonts w:ascii="Calibri" w:hAnsi="Calibri" w:eastAsia="Calibri"/>
           <w:b w:val="0"/>
           <w:color w:val="1B4332"/>
           <w:sz w:val="22"/>
@@ -4508,7 +4896,7 @@
       </w:pPr>
       <w:r>
         <w:rPr>
-          <w:rFonts w:ascii="Calibri" w:hAnsi="Calibri"/>
+          <w:rFonts w:ascii="Calibri" w:hAnsi="Calibri" w:eastAsia="Calibri"/>
           <w:b w:val="0"/>
           <w:color w:val="1B4332"/>
           <w:sz w:val="22"/>
@@ -4522,18 +4910,63 @@
       </w:pPr>
       <w:r>
         <w:rPr>
-          <w:rFonts w:ascii="Calibri" w:hAnsi="Calibri"/>
-          <w:b w:val="0"/>
-          <w:color w:val="1B4332"/>
-          <w:sz w:val="22"/>
-        </w:rPr>
-        <w:t>cleantechhub.net (https://cleantechhub.net/), About (https://cleantechhub.net/about/), Governance (https://cleantechhub.net/governance/), and the data-policy PDF linked there</w:t>
+          <w:rFonts w:ascii="Calibri" w:hAnsi="Calibri" w:eastAsia="Calibri"/>
+          <w:b w:val="0"/>
+          <w:color w:val="1B4332"/>
+          <w:sz w:val="22"/>
+        </w:rPr>
+        <w:t>cleantechhub.net (https://cleantechhub.net/)</w:t>
+      </w:r>
+      <w:r>
+        <w:rPr>
+          <w:rFonts w:ascii="Calibri" w:hAnsi="Calibri" w:eastAsia="Calibri"/>
+          <w:b w:val="0"/>
+          <w:color w:val="1B4332"/>
+          <w:sz w:val="22"/>
+        </w:rPr>
+        <w:t xml:space="preserve">, </w:t>
+      </w:r>
+      <w:r>
+        <w:rPr>
+          <w:rFonts w:ascii="Calibri" w:hAnsi="Calibri" w:eastAsia="Calibri"/>
+          <w:b w:val="0"/>
+          <w:color w:val="1B4332"/>
+          <w:sz w:val="22"/>
+        </w:rPr>
+        <w:t>About (https://cleantechhub.net/about/)</w:t>
+      </w:r>
+      <w:r>
+        <w:rPr>
+          <w:rFonts w:ascii="Calibri" w:hAnsi="Calibri" w:eastAsia="Calibri"/>
+          <w:b w:val="0"/>
+          <w:color w:val="1B4332"/>
+          <w:sz w:val="22"/>
+        </w:rPr>
+        <w:t xml:space="preserve">, </w:t>
+      </w:r>
+      <w:r>
+        <w:rPr>
+          <w:rFonts w:ascii="Calibri" w:hAnsi="Calibri" w:eastAsia="Calibri"/>
+          <w:b w:val="0"/>
+          <w:color w:val="1B4332"/>
+          <w:sz w:val="22"/>
+        </w:rPr>
+        <w:t>Governance (https://cleantechhub.net/governance/)</w:t>
+      </w:r>
+      <w:r>
+        <w:rPr>
+          <w:rFonts w:ascii="Calibri" w:hAnsi="Calibri" w:eastAsia="Calibri"/>
+          <w:b w:val="0"/>
+          <w:color w:val="1B4332"/>
+          <w:sz w:val="22"/>
+        </w:rPr>
+        <w:t>, and the data-policy PDF linked there</w:t>
       </w:r>
     </w:p>
     <w:p>
       <w:r>
         <w:rPr>
-          <w:rFonts w:ascii="Calibri" w:hAnsi="Calibri"/>
+          <w:rFonts w:ascii="Calibri" w:hAnsi="Calibri" w:eastAsia="Calibri"/>
           <w:b/>
           <w:color w:val="2D6A4F"/>
           <w:sz w:val="32"/>
@@ -4547,7 +4980,7 @@
       </w:pPr>
       <w:r>
         <w:rPr>
-          <w:rFonts w:ascii="Calibri" w:hAnsi="Calibri"/>
+          <w:rFonts w:ascii="Calibri" w:hAnsi="Calibri" w:eastAsia="Calibri"/>
           <w:b w:val="0"/>
           <w:color w:val="1B4332"/>
           <w:sz w:val="22"/>
@@ -4556,7 +4989,7 @@
       </w:r>
       <w:r>
         <w:rPr>
-          <w:rFonts w:ascii="Consolas" w:hAnsi="Consolas"/>
+          <w:rFonts w:ascii="Calibri" w:hAnsi="Calibri" w:eastAsia="Calibri"/>
           <w:b w:val="0"/>
           <w:color w:val="1B4332"/>
           <w:sz w:val="22"/>
@@ -4565,7 +4998,7 @@
       </w:r>
       <w:r>
         <w:rPr>
-          <w:rFonts w:ascii="Calibri" w:hAnsi="Calibri"/>
+          <w:rFonts w:ascii="Calibri" w:hAnsi="Calibri" w:eastAsia="Calibri"/>
           <w:b w:val="0"/>
           <w:color w:val="1B4332"/>
           <w:sz w:val="22"/>
@@ -4579,12 +5012,12 @@
       </w:pPr>
       <w:r>
         <w:rPr>
-          <w:rFonts w:ascii="Calibri" w:hAnsi="Calibri"/>
-          <w:b w:val="0"/>
-          <w:color w:val="1B4332"/>
-          <w:sz w:val="22"/>
-        </w:rPr>
-        <w:t>RUT legal name, if it differs from FUNDACION CLEANTECH HUB S.A.S.</w:t>
+          <w:rFonts w:ascii="Calibri" w:hAnsi="Calibri" w:eastAsia="Calibri"/>
+          <w:b w:val="0"/>
+          <w:color w:val="1B4332"/>
+          <w:sz w:val="22"/>
+        </w:rPr>
+        <w:t>Business mailbox, if he cannot receive mail at gideon.blaauw@cleantechhub.net. The privacy contact admin@cleantechhub.net is already filled in the public policy.</w:t>
       </w:r>
     </w:p>
     <w:p>
@@ -4593,12 +5026,12 @@
       </w:pPr>
       <w:r>
         <w:rPr>
-          <w:rFonts w:ascii="Calibri" w:hAnsi="Calibri"/>
-          <w:b w:val="0"/>
-          <w:color w:val="1B4332"/>
-          <w:sz w:val="22"/>
-        </w:rPr>
-        <w:t>Registered address, if the RUT differs from CALLE 90 No. 19-41 OF 801, Bogotá.</w:t>
+          <w:rFonts w:ascii="Calibri" w:hAnsi="Calibri" w:eastAsia="Calibri"/>
+          <w:b w:val="0"/>
+          <w:color w:val="1B4332"/>
+          <w:sz w:val="22"/>
+        </w:rPr>
+        <w:t>LinkedIn Page URL and organization id.</w:t>
       </w:r>
     </w:p>
     <w:p>
@@ -4607,12 +5040,12 @@
       </w:pPr>
       <w:r>
         <w:rPr>
-          <w:rFonts w:ascii="Calibri" w:hAnsi="Calibri"/>
-          <w:b w:val="0"/>
-          <w:color w:val="1B4332"/>
-          <w:sz w:val="22"/>
-        </w:rPr>
-        <w:t>Business mailbox, if he cannot receive mail at gideon.blaauw@cleantechhub.net.</w:t>
+          <w:rFonts w:ascii="Calibri" w:hAnsi="Calibri" w:eastAsia="Calibri"/>
+          <w:b w:val="0"/>
+          <w:color w:val="1B4332"/>
+          <w:sz w:val="22"/>
+        </w:rPr>
+        <w:t>Page super admin name, and the member who will grant the token.</w:t>
       </w:r>
     </w:p>
     <w:p>
@@ -4621,12 +5054,12 @@
       </w:pPr>
       <w:r>
         <w:rPr>
-          <w:rFonts w:ascii="Calibri" w:hAnsi="Calibri"/>
-          <w:b w:val="0"/>
-          <w:color w:val="1B4332"/>
-          <w:sz w:val="22"/>
-        </w:rPr>
-        <w:t>LinkedIn Page URL and organization id.</w:t>
+          <w:rFonts w:ascii="Calibri" w:hAnsi="Calibri" w:eastAsia="Calibri"/>
+          <w:b w:val="0"/>
+          <w:color w:val="1B4332"/>
+          <w:sz w:val="22"/>
+        </w:rPr>
+        <w:t>Posts per month, and API calls per day.</w:t>
       </w:r>
     </w:p>
     <w:p>
@@ -4635,12 +5068,12 @@
       </w:pPr>
       <w:r>
         <w:rPr>
-          <w:rFonts w:ascii="Calibri" w:hAnsi="Calibri"/>
-          <w:b w:val="0"/>
-          <w:color w:val="1B4332"/>
-          <w:sz w:val="22"/>
-        </w:rPr>
-        <w:t>Page super admin name, and the member who will grant the token.</w:t>
+          <w:rFonts w:ascii="Calibri" w:hAnsi="Calibri" w:eastAsia="Calibri"/>
+          <w:b w:val="0"/>
+          <w:color w:val="1B4332"/>
+          <w:sz w:val="22"/>
+        </w:rPr>
+        <w:t>Confirm the live n8n workflow deletes on the periods in section 1.13. Host and country are OVH in Germany.</w:t>
       </w:r>
     </w:p>
     <w:p>
@@ -4649,12 +5082,12 @@
       </w:pPr>
       <w:r>
         <w:rPr>
-          <w:rFonts w:ascii="Calibri" w:hAnsi="Calibri"/>
-          <w:b w:val="0"/>
-          <w:color w:val="1B4332"/>
-          <w:sz w:val="22"/>
-        </w:rPr>
-        <w:t>Posts per month, and API calls per day.</w:t>
+          <w:rFonts w:ascii="Calibri" w:hAnsi="Calibri" w:eastAsia="Calibri"/>
+          <w:b w:val="0"/>
+          <w:color w:val="1B4332"/>
+          <w:sz w:val="22"/>
+        </w:rPr>
+        <w:t>The new app’s Client ID, after he creates it.</w:t>
       </w:r>
     </w:p>
     <w:p>
@@ -4663,35 +5096,7 @@
       </w:pPr>
       <w:r>
         <w:rPr>
-          <w:rFonts w:ascii="Calibri" w:hAnsi="Calibri"/>
-          <w:b w:val="0"/>
-          <w:color w:val="1B4332"/>
-          <w:sz w:val="22"/>
-        </w:rPr>
-        <w:t>Where n8n stores the data, including country and the deletion job.</w:t>
-      </w:r>
-    </w:p>
-    <w:p>
-      <w:pPr>
-        <w:pStyle w:val="ListBullet"/>
-      </w:pPr>
-      <w:r>
-        <w:rPr>
-          <w:rFonts w:ascii="Calibri" w:hAnsi="Calibri"/>
-          <w:b w:val="0"/>
-          <w:color w:val="1B4332"/>
-          <w:sz w:val="22"/>
-        </w:rPr>
-        <w:t>The new app’s Client ID, after he creates it.</w:t>
-      </w:r>
-    </w:p>
-    <w:p>
-      <w:pPr>
-        <w:pStyle w:val="ListBullet"/>
-      </w:pPr>
-      <w:r>
-        <w:rPr>
-          <w:rFonts w:ascii="Calibri" w:hAnsi="Calibri"/>
+          <w:rFonts w:ascii="Calibri" w:hAnsi="Calibri" w:eastAsia="Calibri"/>
           <w:b w:val="0"/>
           <w:color w:val="1B4332"/>
           <w:sz w:val="22"/>
@@ -4701,7 +5106,7 @@
     </w:p>
     <w:sectPr>
       <w:pgSz w:w="12240" w:h="15840"/>
-      <w:pgMar w:top="1020" w:right="1077" w:bottom="1020" w:left="1077" w:header="720" w:footer="720" w:gutter="0"/>
+      <w:pgMar w:top="1440" w:right="1800" w:bottom="1440" w:left="1800" w:header="720" w:footer="720" w:gutter="0"/>
       <w:cols w:space="720"/>
       <w:docGrid w:linePitch="360"/>
     </w:sectPr>
@@ -5073,7 +5478,7 @@
     <w:qFormat/>
     <w:rsid w:val="00FC693F"/>
     <w:rPr>
-      <w:rFonts w:ascii="Calibri" w:hAnsi="Calibri" w:eastAsia="Calibri"/>
+      <w:rFonts w:ascii="Calibri" w:hAnsi="Calibri"/>
       <w:color w:val="1B4332"/>
       <w:sz w:val="22"/>
     </w:rPr>

</xml_diff>

<commit_message>
Record that the privacy page has no live URL yet.
The Caddy hosts answer, but there is no Infisical credential to publish the page, and the diagnostico checkbox stays an open WordPress item.

Co-authored-by: gideonblaauw-creator <gideonblaauw-creator@users.noreply.github.com>
</commit_message>
<xml_diff>
--- a/artifacts/linkedin-cm-api-application.docx
+++ b/artifacts/linkedin-cm-api-application.docx
@@ -187,7 +187,7 @@
           <w:color w:val="1B4332"/>
           <w:sz w:val="22"/>
         </w:rPr>
-        <w:t xml:space="preserve">LinkedIn does not publish the live survey’s exact question labels. A survey is generated in the Developer Portal after you request the product. The paste blocks below cover every item the current docs say the form must contain. If a live question does not match a block, leave it as </w:t>
+        <w:t xml:space="preserve">LinkedIn does not publish the live survey’s exact question labels. A survey is generated in the Developer Portal after you request the product. The paste blocks below cover every item the current docs say the form must contain. Resolved fields are filled below. Anything only Gideon knows stays as </w:t>
       </w:r>
       <w:r>
         <w:rPr>
@@ -238,7 +238,34 @@
           <w:color w:val="1B4332"/>
           <w:sz w:val="22"/>
         </w:rPr>
-        <w:t>A privacy-policy URL on cleantechhub.net is missing.</w:t>
+        <w:t>Privacy-policy URL: not live.</w:t>
+      </w:r>
+      <w:r>
+        <w:rPr>
+          <w:rFonts w:ascii="Calibri" w:hAnsi="Calibri" w:eastAsia="Calibri"/>
+          <w:b w:val="0"/>
+          <w:color w:val="1B4332"/>
+          <w:sz w:val="22"/>
+        </w:rPr>
+        <w:t xml:space="preserve"> There is no URL to paste yet. Do not submit the access form until a private window returns 200 on a page that is this privacy policy, with valid TLS, and without a login. LinkedIn’s rejection for a missing page is </w:t>
+      </w:r>
+      <w:r>
+        <w:rPr>
+          <w:rFonts w:ascii="Calibri" w:hAnsi="Calibri" w:eastAsia="Calibri"/>
+          <w:b/>
+          <w:color w:val="1B4332"/>
+          <w:sz w:val="22"/>
+        </w:rPr>
+        <w:t>Invalid Privacy Policy</w:t>
+      </w:r>
+      <w:r>
+        <w:rPr>
+          <w:rFonts w:ascii="Calibri" w:hAnsi="Calibri" w:eastAsia="Calibri"/>
+          <w:b w:val="0"/>
+          <w:color w:val="1B4332"/>
+          <w:sz w:val="22"/>
+        </w:rPr>
+        <w:t>. A Development-tier rejection cannot be retried on the same app.</w:t>
       </w:r>
     </w:p>
     <w:p>
@@ -249,7 +276,7 @@
           <w:color w:val="1B4332"/>
           <w:sz w:val="22"/>
         </w:rPr>
-        <w:t>Checked on 22 October 2026:</w:t>
+        <w:t>Checked on 22 October 2026, without a login:</w:t>
       </w:r>
     </w:p>
     <w:p>
@@ -263,16 +290,16 @@
           <w:color w:val="1B4332"/>
           <w:sz w:val="22"/>
         </w:rPr>
-        <w:t>https://cleantechhub.net/privacy</w:t>
-      </w:r>
-      <w:r>
-        <w:rPr>
-          <w:rFonts w:ascii="Calibri" w:hAnsi="Calibri" w:eastAsia="Calibri"/>
-          <w:b w:val="0"/>
-          <w:color w:val="1B4332"/>
-          <w:sz w:val="22"/>
-        </w:rPr>
-        <w:t xml:space="preserve"> returns 404.</w:t>
+        <w:t>https://cleantechhub.net/politica-de-privacidad/</w:t>
+      </w:r>
+      <w:r>
+        <w:rPr>
+          <w:rFonts w:ascii="Calibri" w:hAnsi="Calibri" w:eastAsia="Calibri"/>
+          <w:b w:val="0"/>
+          <w:color w:val="1B4332"/>
+          <w:sz w:val="22"/>
+        </w:rPr>
+        <w:t xml:space="preserve"> returns 404. WordPress is not the publish path. There is no WordPress admin access.</w:t>
       </w:r>
     </w:p>
     <w:p>
@@ -286,16 +313,34 @@
           <w:color w:val="1B4332"/>
           <w:sz w:val="22"/>
         </w:rPr>
-        <w:t>https://cleantechhub.net/privacy-policy</w:t>
-      </w:r>
-      <w:r>
-        <w:rPr>
-          <w:rFonts w:ascii="Calibri" w:hAnsi="Calibri" w:eastAsia="Calibri"/>
-          <w:b w:val="0"/>
-          <w:color w:val="1B4332"/>
-          <w:sz w:val="22"/>
-        </w:rPr>
-        <w:t xml:space="preserve"> returns 404.</w:t>
+        <w:t>https://jobs.cleantechhub.net/privacidad/</w:t>
+      </w:r>
+      <w:r>
+        <w:rPr>
+          <w:rFonts w:ascii="Calibri" w:hAnsi="Calibri" w:eastAsia="Calibri"/>
+          <w:b w:val="0"/>
+          <w:color w:val="1B4332"/>
+          <w:sz w:val="22"/>
+        </w:rPr>
+        <w:t xml:space="preserve"> and </w:t>
+      </w:r>
+      <w:r>
+        <w:rPr>
+          <w:rFonts w:ascii="Calibri" w:hAnsi="Calibri" w:eastAsia="Calibri"/>
+          <w:b w:val="0"/>
+          <w:color w:val="1B4332"/>
+          <w:sz w:val="22"/>
+        </w:rPr>
+        <w:t>https://jobs.cleantechhub.net/privacy</w:t>
+      </w:r>
+      <w:r>
+        <w:rPr>
+          <w:rFonts w:ascii="Calibri" w:hAnsi="Calibri" w:eastAsia="Calibri"/>
+          <w:b w:val="0"/>
+          <w:color w:val="1B4332"/>
+          <w:sz w:val="22"/>
+        </w:rPr>
+        <w:t xml:space="preserve"> return 200, but the body is the jobs homepage, not this policy. Do not paste those URLs.</w:t>
       </w:r>
     </w:p>
     <w:p>
@@ -309,16 +354,1496 @@
           <w:color w:val="1B4332"/>
           <w:sz w:val="22"/>
         </w:rPr>
-        <w:t>https://cleantechhub.net/privacy-policy/</w:t>
-      </w:r>
-      <w:r>
-        <w:rPr>
-          <w:rFonts w:ascii="Calibri" w:hAnsi="Calibri" w:eastAsia="Calibri"/>
-          <w:b w:val="0"/>
-          <w:color w:val="1B4332"/>
-          <w:sz w:val="22"/>
-        </w:rPr>
-        <w:t xml:space="preserve"> returns 404.</w:t>
+        <w:t>https://agents.cleantechhub.net/privacidad/</w:t>
+      </w:r>
+      <w:r>
+        <w:rPr>
+          <w:rFonts w:ascii="Calibri" w:hAnsi="Calibri" w:eastAsia="Calibri"/>
+          <w:b w:val="0"/>
+          <w:color w:val="1B4332"/>
+          <w:sz w:val="22"/>
+        </w:rPr>
+        <w:t xml:space="preserve"> and </w:t>
+      </w:r>
+      <w:r>
+        <w:rPr>
+          <w:rFonts w:ascii="Calibri" w:hAnsi="Calibri" w:eastAsia="Calibri"/>
+          <w:b w:val="0"/>
+          <w:color w:val="1B4332"/>
+          <w:sz w:val="22"/>
+        </w:rPr>
+        <w:t>https://agents.cleantechhub.net/privacy</w:t>
+      </w:r>
+      <w:r>
+        <w:rPr>
+          <w:rFonts w:ascii="Calibri" w:hAnsi="Calibri" w:eastAsia="Calibri"/>
+          <w:b w:val="0"/>
+          <w:color w:val="1B4332"/>
+          <w:sz w:val="22"/>
+        </w:rPr>
+        <w:t xml:space="preserve"> return 200 with an empty body. Do not paste those URLs.</w:t>
+      </w:r>
+    </w:p>
+    <w:p>
+      <w:r>
+        <w:rPr>
+          <w:rFonts w:ascii="Calibri" w:hAnsi="Calibri" w:eastAsia="Calibri"/>
+          <w:b w:val="0"/>
+          <w:color w:val="1B4332"/>
+          <w:sz w:val="22"/>
+        </w:rPr>
+        <w:t xml:space="preserve">The approved draft is </w:t>
+      </w:r>
+      <w:r>
+        <w:rPr>
+          <w:rFonts w:ascii="Calibri" w:hAnsi="Calibri" w:eastAsia="Calibri"/>
+          <w:b w:val="0"/>
+          <w:color w:val="1B4332"/>
+          <w:sz w:val="22"/>
+        </w:rPr>
+        <w:t>artifacts/cleantechhub-privacy-policy.html</w:t>
+      </w:r>
+      <w:r>
+        <w:rPr>
+          <w:rFonts w:ascii="Calibri" w:hAnsi="Calibri" w:eastAsia="Calibri"/>
+          <w:b w:val="0"/>
+          <w:color w:val="1B4332"/>
+          <w:sz w:val="22"/>
+        </w:rPr>
+        <w:t xml:space="preserve">. It was not deployed. Both candidate hostnames resolve to the OVH VPS </w:t>
+      </w:r>
+      <w:r>
+        <w:rPr>
+          <w:rFonts w:ascii="Calibri" w:hAnsi="Calibri" w:eastAsia="Calibri"/>
+          <w:b w:val="0"/>
+          <w:color w:val="1B4332"/>
+          <w:sz w:val="22"/>
+        </w:rPr>
+        <w:t>51.195.45.77</w:t>
+      </w:r>
+      <w:r>
+        <w:rPr>
+          <w:rFonts w:ascii="Calibri" w:hAnsi="Calibri" w:eastAsia="Calibri"/>
+          <w:b w:val="0"/>
+          <w:color w:val="1B4332"/>
+          <w:sz w:val="22"/>
+        </w:rPr>
+        <w:t xml:space="preserve"> and answer with Caddy. Writing a file there needs a secret from Infisical. This environment has no Infisical CLI, no Infisical identity variables, and no Infisical config file. Vercel is connected, but neither hostname points at Vercel, and a new DNS record was not allowed.</w:t>
+      </w:r>
+    </w:p>
+    <w:p>
+      <w:r>
+        <w:rPr>
+          <w:rFonts w:ascii="Calibri" w:hAnsi="Calibri" w:eastAsia="Calibri"/>
+          <w:b w:val="0"/>
+          <w:color w:val="1B4332"/>
+          <w:sz w:val="22"/>
+        </w:rPr>
+        <w:t xml:space="preserve">The </w:t>
+      </w:r>
+      <w:r>
+        <w:rPr>
+          <w:rFonts w:ascii="Calibri" w:hAnsi="Calibri" w:eastAsia="Calibri"/>
+          <w:b w:val="0"/>
+          <w:color w:val="1B4332"/>
+          <w:sz w:val="22"/>
+        </w:rPr>
+        <w:t>/diagnostico</w:t>
+      </w:r>
+      <w:r>
+        <w:rPr>
+          <w:rFonts w:ascii="Calibri" w:hAnsi="Calibri" w:eastAsia="Calibri"/>
+          <w:b w:val="0"/>
+          <w:color w:val="1B4332"/>
+          <w:sz w:val="22"/>
+        </w:rPr>
+        <w:t xml:space="preserve"> green-finance checkbox is still an open item. A fresh fetch of </w:t>
+      </w:r>
+      <w:r>
+        <w:rPr>
+          <w:rFonts w:ascii="Calibri" w:hAnsi="Calibri" w:eastAsia="Calibri"/>
+          <w:b w:val="0"/>
+          <w:color w:val="1B4332"/>
+          <w:sz w:val="22"/>
+        </w:rPr>
+        <w:t>https://cleantechhub.net/diagnostico/</w:t>
+      </w:r>
+      <w:r>
+        <w:rPr>
+          <w:rFonts w:ascii="Calibri" w:hAnsi="Calibri" w:eastAsia="Calibri"/>
+          <w:b w:val="0"/>
+          <w:color w:val="1B4332"/>
+          <w:sz w:val="22"/>
+        </w:rPr>
+        <w:t xml:space="preserve"> still contains </w:t>
+      </w:r>
+      <w:r>
+        <w:rPr>
+          <w:rFonts w:ascii="Calibri" w:hAnsi="Calibri" w:eastAsia="Calibri"/>
+          <w:b w:val="0"/>
+          <w:color w:val="1B4332"/>
+          <w:sz w:val="22"/>
+        </w:rPr>
+        <w:t>&lt;input type="checkbox" id="newsletter-consent" checked&gt;</w:t>
+      </w:r>
+      <w:r>
+        <w:rPr>
+          <w:rFonts w:ascii="Calibri" w:hAnsi="Calibri" w:eastAsia="Calibri"/>
+          <w:b w:val="0"/>
+          <w:color w:val="1B4332"/>
+          <w:sz w:val="22"/>
+        </w:rPr>
+        <w:t>. It was not changed. Fixing it needs WordPress admin, which is not available.</w:t>
+      </w:r>
+    </w:p>
+    <w:p>
+      <w:r>
+        <w:rPr>
+          <w:rFonts w:ascii="Calibri" w:hAnsi="Calibri" w:eastAsia="Calibri"/>
+          <w:b w:val="0"/>
+          <w:color w:val="1B4332"/>
+          <w:sz w:val="22"/>
+        </w:rPr>
+        <w:t>Do not paste the Google Drive policy PDF into the privacy-policy field. That file is not a page on cleantechhub.net.</w:t>
+      </w:r>
+    </w:p>
+    <w:p>
+      <w:r>
+        <w:rPr>
+          <w:rFonts w:ascii="Calibri" w:hAnsi="Calibri" w:eastAsia="Calibri"/>
+          <w:b w:val="0"/>
+          <w:color w:val="1B4332"/>
+          <w:sz w:val="22"/>
+        </w:rPr>
+        <w:t xml:space="preserve">The worker authorization PDF is also the wrong document. Do not use </w:t>
+      </w:r>
+      <w:r>
+        <w:rPr>
+          <w:rFonts w:ascii="Calibri" w:hAnsi="Calibri" w:eastAsia="Calibri"/>
+          <w:b w:val="0"/>
+          <w:color w:val="1B4332"/>
+          <w:sz w:val="22"/>
+        </w:rPr>
+        <w:t>https://cleantechhub.net/wp-content/uploads/2026/07/Autorizacion-Tratamiento-Datos-Trabajadores.pdf</w:t>
+      </w:r>
+      <w:r>
+        <w:rPr>
+          <w:rFonts w:ascii="Calibri" w:hAnsi="Calibri" w:eastAsia="Calibri"/>
+          <w:b w:val="0"/>
+          <w:color w:val="1B4332"/>
+          <w:sz w:val="22"/>
+        </w:rPr>
+        <w:t>. It is a consent form for workers and contractors. Its street line also disagrees with the website and with the data policy.</w:t>
+      </w:r>
+    </w:p>
+    <w:p>
+      <w:r>
+        <w:rPr>
+          <w:rFonts w:ascii="Calibri" w:hAnsi="Calibri" w:eastAsia="Calibri"/>
+          <w:b/>
+          <w:color w:val="2D6A4F"/>
+          <w:sz w:val="32"/>
+        </w:rPr>
+        <w:t>1. Paste-ready form answers</w:t>
+      </w:r>
+    </w:p>
+    <w:p>
+      <w:r>
+        <w:rPr>
+          <w:rFonts w:ascii="Calibri" w:hAnsi="Calibri" w:eastAsia="Calibri"/>
+          <w:b/>
+          <w:color w:val="2D6A4F"/>
+          <w:sz w:val="26"/>
+        </w:rPr>
+        <w:t>1.1 Which app</w:t>
+      </w:r>
+    </w:p>
+    <w:p>
+      <w:r>
+        <w:rPr>
+          <w:rFonts w:ascii="Calibri" w:hAnsi="Calibri" w:eastAsia="Calibri"/>
+          <w:b/>
+          <w:color w:val="1B4332"/>
+          <w:sz w:val="22"/>
+        </w:rPr>
+        <w:t>Paste if the new app is the one in front of you:</w:t>
+      </w:r>
+    </w:p>
+    <w:p>
+      <w:r>
+        <w:rPr>
+          <w:rFonts w:ascii="Calibri" w:hAnsi="Calibri" w:eastAsia="Calibri"/>
+          <w:b w:val="0"/>
+          <w:color w:val="1B4332"/>
+          <w:sz w:val="22"/>
+        </w:rPr>
+        <w:t>This request is for a new CleantechHUB developer app. Its only product is the Community Management API. The existing app is n8n-li CleantechHUB, Client ID 782xlcklyvbakg. That app already has Sign In with LinkedIn and member posting. Leave that app in place for personal-profile posting.</w:t>
+      </w:r>
+    </w:p>
+    <w:p>
+      <w:r>
+        <w:rPr>
+          <w:rFonts w:ascii="Calibri" w:hAnsi="Calibri" w:eastAsia="Calibri"/>
+          <w:b/>
+          <w:color w:val="1B4332"/>
+          <w:sz w:val="22"/>
+        </w:rPr>
+        <w:t>Why:</w:t>
+      </w:r>
+      <w:r>
+        <w:rPr>
+          <w:rFonts w:ascii="Calibri" w:hAnsi="Calibri" w:eastAsia="Calibri"/>
+          <w:b w:val="0"/>
+          <w:color w:val="1B4332"/>
+          <w:sz w:val="22"/>
+        </w:rPr>
+        <w:t xml:space="preserve"> Community Management must be the only product on the app. If Share, Sign In, or any other product is already on the app, Request access stays grayed out. Source: </w:t>
+      </w:r>
+      <w:r>
+        <w:rPr>
+          <w:rFonts w:ascii="Calibri" w:hAnsi="Calibri" w:eastAsia="Calibri"/>
+          <w:b w:val="0"/>
+          <w:color w:val="1B4332"/>
+          <w:sz w:val="22"/>
+        </w:rPr>
+        <w:t>LinkedIn API Partner Support (https://learn.microsoft.com/en-us/linkedin/shared/linkedin-api-partner-support-guide)</w:t>
+      </w:r>
+      <w:r>
+        <w:rPr>
+          <w:rFonts w:ascii="Calibri" w:hAnsi="Calibri" w:eastAsia="Calibri"/>
+          <w:b w:val="0"/>
+          <w:color w:val="1B4332"/>
+          <w:sz w:val="22"/>
+        </w:rPr>
+        <w:t>.</w:t>
+      </w:r>
+    </w:p>
+    <w:p>
+      <w:r>
+        <w:rPr>
+          <w:rFonts w:ascii="Calibri" w:hAnsi="Calibri" w:eastAsia="Calibri"/>
+          <w:b/>
+          <w:color w:val="2D6A4F"/>
+          <w:sz w:val="26"/>
+        </w:rPr>
+        <w:t>1.2 App name</w:t>
+      </w:r>
+    </w:p>
+    <w:p>
+      <w:r>
+        <w:rPr>
+          <w:rFonts w:ascii="Calibri" w:hAnsi="Calibri" w:eastAsia="Calibri"/>
+          <w:b/>
+          <w:color w:val="1B4332"/>
+          <w:sz w:val="22"/>
+        </w:rPr>
+        <w:t>Paste:</w:t>
+      </w:r>
+    </w:p>
+    <w:p>
+      <w:r>
+        <w:rPr>
+          <w:rFonts w:ascii="Calibri" w:hAnsi="Calibri" w:eastAsia="Calibri"/>
+          <w:b w:val="0"/>
+          <w:color w:val="1B4332"/>
+          <w:sz w:val="22"/>
+        </w:rPr>
+        <w:t>CleantechHUB n8n</w:t>
+      </w:r>
+    </w:p>
+    <w:p>
+      <w:r>
+        <w:rPr>
+          <w:rFonts w:ascii="Calibri" w:hAnsi="Calibri" w:eastAsia="Calibri"/>
+          <w:b/>
+          <w:color w:val="1B4332"/>
+          <w:sz w:val="22"/>
+        </w:rPr>
+        <w:t>Do not use</w:t>
+      </w:r>
+      <w:r>
+        <w:rPr>
+          <w:rFonts w:ascii="Calibri" w:hAnsi="Calibri" w:eastAsia="Calibri"/>
+          <w:b w:val="0"/>
+          <w:color w:val="1B4332"/>
+          <w:sz w:val="22"/>
+        </w:rPr>
+        <w:t xml:space="preserve"> a name that contains Linked, In, LinkedIn, Microsoft, or the abbreviation li. </w:t>
+      </w:r>
+      <w:r>
+        <w:rPr>
+          <w:rFonts w:ascii="Calibri" w:hAnsi="Calibri" w:eastAsia="Calibri"/>
+          <w:b/>
+          <w:color w:val="1B4332"/>
+          <w:sz w:val="22"/>
+        </w:rPr>
+        <w:t>Invalid App Name</w:t>
+      </w:r>
+      <w:r>
+        <w:rPr>
+          <w:rFonts w:ascii="Calibri" w:hAnsi="Calibri" w:eastAsia="Calibri"/>
+          <w:b w:val="0"/>
+          <w:color w:val="1B4332"/>
+          <w:sz w:val="22"/>
+        </w:rPr>
+        <w:t xml:space="preserve"> is a published rejection. The examples in the docs are “Linked” and “In”. The current name n8n-li contains “li”. The docs do not say whether reviewers treat those two letters as a portion of LinkedIn. Use the clean name on the new app so a rejection is not spent on the name.</w:t>
+      </w:r>
+    </w:p>
+    <w:p>
+      <w:r>
+        <w:rPr>
+          <w:rFonts w:ascii="Calibri" w:hAnsi="Calibri" w:eastAsia="Calibri"/>
+          <w:b/>
+          <w:color w:val="2D6A4F"/>
+          <w:sz w:val="26"/>
+        </w:rPr>
+        <w:t>1.3 Company and legal entity</w:t>
+      </w:r>
+    </w:p>
+    <w:p>
+      <w:r>
+        <w:rPr>
+          <w:rFonts w:ascii="Calibri" w:hAnsi="Calibri" w:eastAsia="Calibri"/>
+          <w:b/>
+          <w:color w:val="1B4332"/>
+          <w:sz w:val="22"/>
+        </w:rPr>
+        <w:t>Paste:</w:t>
+      </w:r>
+    </w:p>
+    <w:p>
+      <w:r>
+        <w:rPr>
+          <w:rFonts w:ascii="Calibri" w:hAnsi="Calibri" w:eastAsia="Calibri"/>
+          <w:b w:val="0"/>
+          <w:color w:val="1B4332"/>
+          <w:sz w:val="22"/>
+        </w:rPr>
+        <w:t>FUNDACIÓN CLEANTECH HUB</w:t>
+      </w:r>
+    </w:p>
+    <w:p>
+      <w:r>
+        <w:rPr>
+          <w:rFonts w:ascii="Calibri" w:hAnsi="Calibri" w:eastAsia="Calibri"/>
+          <w:b w:val="0"/>
+          <w:color w:val="1B4332"/>
+          <w:sz w:val="22"/>
+        </w:rPr>
+        <w:t>Entidad sin ánimo de lucro (ESAL), régimen tributario especial.</w:t>
+      </w:r>
+    </w:p>
+    <w:p>
+      <w:r>
+        <w:rPr>
+          <w:rFonts w:ascii="Calibri" w:hAnsi="Calibri" w:eastAsia="Calibri"/>
+          <w:b w:val="0"/>
+          <w:color w:val="1B4332"/>
+          <w:sz w:val="22"/>
+        </w:rPr>
+        <w:t>NIT (Número de Identificación Tributaria) 901.523.941-9.</w:t>
+      </w:r>
+    </w:p>
+    <w:p>
+      <w:r>
+        <w:rPr>
+          <w:rFonts w:ascii="Calibri" w:hAnsi="Calibri" w:eastAsia="Calibri"/>
+          <w:b w:val="0"/>
+          <w:color w:val="1B4332"/>
+          <w:sz w:val="22"/>
+        </w:rPr>
+        <w:t>Bogotá D.C., Colombia.</w:t>
+      </w:r>
+    </w:p>
+    <w:p>
+      <w:r>
+        <w:rPr>
+          <w:rFonts w:ascii="Calibri" w:hAnsi="Calibri" w:eastAsia="Calibri"/>
+          <w:b w:val="0"/>
+          <w:color w:val="1B4332"/>
+          <w:sz w:val="22"/>
+        </w:rPr>
+        <w:t>Legal representative: Gideon Blaauw, Representante Legal de la Fundación CleantechHUB.</w:t>
+      </w:r>
+    </w:p>
+    <w:p>
+      <w:r>
+        <w:rPr>
+          <w:rFonts w:ascii="Calibri" w:hAnsi="Calibri" w:eastAsia="Calibri"/>
+          <w:b w:val="0"/>
+          <w:color w:val="1B4332"/>
+          <w:sz w:val="22"/>
+        </w:rPr>
+        <w:t>Phone: +57 313 715 5965.</w:t>
+      </w:r>
+    </w:p>
+    <w:p>
+      <w:r>
+        <w:rPr>
+          <w:rFonts w:ascii="Calibri" w:hAnsi="Calibri" w:eastAsia="Calibri"/>
+          <w:b/>
+          <w:color w:val="1B4332"/>
+          <w:sz w:val="22"/>
+        </w:rPr>
+        <w:t>Where this comes from:</w:t>
+      </w:r>
+      <w:r>
+        <w:rPr>
+          <w:rFonts w:ascii="Calibri" w:hAnsi="Calibri" w:eastAsia="Calibri"/>
+          <w:b w:val="0"/>
+          <w:color w:val="1B4332"/>
+          <w:sz w:val="22"/>
+        </w:rPr>
+        <w:t xml:space="preserve"> Gideon confirmed this legal name, this non-profit form, and this tax number on 22 October 2026 for the public privacy policy. The NIT matches the public “Política y tratamiento de datos” PDF linked from </w:t>
+      </w:r>
+      <w:r>
+        <w:rPr>
+          <w:rFonts w:ascii="Calibri" w:hAnsi="Calibri" w:eastAsia="Calibri"/>
+          <w:b w:val="0"/>
+          <w:color w:val="1B4332"/>
+          <w:sz w:val="22"/>
+        </w:rPr>
+        <w:t>the governance page (https://cleantechhub.net/governance/)</w:t>
+      </w:r>
+      <w:r>
+        <w:rPr>
+          <w:rFonts w:ascii="Calibri" w:hAnsi="Calibri" w:eastAsia="Calibri"/>
+          <w:b w:val="0"/>
+          <w:color w:val="1B4332"/>
+          <w:sz w:val="22"/>
+        </w:rPr>
+        <w:t>. That page also says “Fundación”. The PDF contact block names Gideon Blaauw, cargo Representante legal.</w:t>
+      </w:r>
+    </w:p>
+    <w:p>
+      <w:r>
+        <w:rPr>
+          <w:rFonts w:ascii="Calibri" w:hAnsi="Calibri" w:eastAsia="Calibri"/>
+          <w:b/>
+          <w:color w:val="1B4332"/>
+          <w:sz w:val="22"/>
+        </w:rPr>
+        <w:t>Paste this name.</w:t>
+      </w:r>
+      <w:r>
+        <w:rPr>
+          <w:rFonts w:ascii="Calibri" w:hAnsi="Calibri" w:eastAsia="Calibri"/>
+          <w:b w:val="0"/>
+          <w:color w:val="1B4332"/>
+          <w:sz w:val="22"/>
+        </w:rPr>
+        <w:t xml:space="preserve"> Do not add a simplified-stock-company suffix. The 2022 PDF used a commercial company form. Do not copy that form into this field. A name that does not match the registry is a known cause of </w:t>
+      </w:r>
+      <w:r>
+        <w:rPr>
+          <w:rFonts w:ascii="Calibri" w:hAnsi="Calibri" w:eastAsia="Calibri"/>
+          <w:b/>
+          <w:color w:val="1B4332"/>
+          <w:sz w:val="22"/>
+        </w:rPr>
+        <w:t>Fail Organization Verification</w:t>
+      </w:r>
+      <w:r>
+        <w:rPr>
+          <w:rFonts w:ascii="Calibri" w:hAnsi="Calibri" w:eastAsia="Calibri"/>
+          <w:b w:val="0"/>
+          <w:color w:val="1B4332"/>
+          <w:sz w:val="22"/>
+        </w:rPr>
+        <w:t>.</w:t>
+      </w:r>
+    </w:p>
+    <w:p>
+      <w:r>
+        <w:rPr>
+          <w:rFonts w:ascii="Calibri" w:hAnsi="Calibri" w:eastAsia="Calibri"/>
+          <w:b/>
+          <w:color w:val="2D6A4F"/>
+          <w:sz w:val="26"/>
+        </w:rPr>
+        <w:t>1.4 Registered address</w:t>
+      </w:r>
+    </w:p>
+    <w:p>
+      <w:r>
+        <w:rPr>
+          <w:rFonts w:ascii="Calibri" w:hAnsi="Calibri" w:eastAsia="Calibri"/>
+          <w:b/>
+          <w:color w:val="1B4332"/>
+          <w:sz w:val="22"/>
+        </w:rPr>
+        <w:t>Paste:</w:t>
+      </w:r>
+    </w:p>
+    <w:p>
+      <w:r>
+        <w:rPr>
+          <w:rFonts w:ascii="Calibri" w:hAnsi="Calibri" w:eastAsia="Calibri"/>
+          <w:b w:val="0"/>
+          <w:color w:val="1B4332"/>
+          <w:sz w:val="22"/>
+        </w:rPr>
+        <w:t>Calle 90 No. 19-41 Of. 801, Bogotá D.C., Colombia.</w:t>
+      </w:r>
+    </w:p>
+    <w:p>
+      <w:r>
+        <w:rPr>
+          <w:rFonts w:ascii="Calibri" w:hAnsi="Calibri" w:eastAsia="Calibri"/>
+          <w:b/>
+          <w:color w:val="1B4332"/>
+          <w:sz w:val="22"/>
+        </w:rPr>
+        <w:t>Where this comes from:</w:t>
+      </w:r>
+      <w:r>
+        <w:rPr>
+          <w:rFonts w:ascii="Calibri" w:hAnsi="Calibri" w:eastAsia="Calibri"/>
+          <w:b w:val="0"/>
+          <w:color w:val="1B4332"/>
+          <w:sz w:val="22"/>
+        </w:rPr>
+        <w:t xml:space="preserve"> Gideon confirmed this address on 22 October 2026. It matches the public data policy (CALLE 90 No. 19-41 OF 801, Bogotá) and the site footer at </w:t>
+      </w:r>
+      <w:r>
+        <w:rPr>
+          <w:rFonts w:ascii="Calibri" w:hAnsi="Calibri" w:eastAsia="Calibri"/>
+          <w:b w:val="0"/>
+          <w:color w:val="1B4332"/>
+          <w:sz w:val="22"/>
+        </w:rPr>
+        <w:t>https://cleantechhub.net/</w:t>
+      </w:r>
+      <w:r>
+        <w:rPr>
+          <w:rFonts w:ascii="Calibri" w:hAnsi="Calibri" w:eastAsia="Calibri"/>
+          <w:b w:val="0"/>
+          <w:color w:val="1B4332"/>
+          <w:sz w:val="22"/>
+        </w:rPr>
+        <w:t>, which prints “Cll 90 #19 - 41 Office 801”.</w:t>
+      </w:r>
+    </w:p>
+    <w:p>
+      <w:r>
+        <w:rPr>
+          <w:rFonts w:ascii="Calibri" w:hAnsi="Calibri" w:eastAsia="Calibri"/>
+          <w:b w:val="0"/>
+          <w:color w:val="1B4332"/>
+          <w:sz w:val="22"/>
+        </w:rPr>
+        <w:t>Do not paste Calle 45 #9-42 from the worker authorization PDF.</w:t>
+      </w:r>
+    </w:p>
+    <w:p>
+      <w:r>
+        <w:rPr>
+          <w:rFonts w:ascii="Calibri" w:hAnsi="Calibri" w:eastAsia="Calibri"/>
+          <w:b/>
+          <w:color w:val="2D6A4F"/>
+          <w:sz w:val="26"/>
+        </w:rPr>
+        <w:t>1.5 Business email</w:t>
+      </w:r>
+    </w:p>
+    <w:p>
+      <w:r>
+        <w:rPr>
+          <w:rFonts w:ascii="Calibri" w:hAnsi="Calibri" w:eastAsia="Calibri"/>
+          <w:b/>
+          <w:color w:val="1B4332"/>
+          <w:sz w:val="22"/>
+        </w:rPr>
+        <w:t>Paste:</w:t>
+      </w:r>
+    </w:p>
+    <w:p>
+      <w:r>
+        <w:rPr>
+          <w:rFonts w:ascii="Calibri" w:hAnsi="Calibri" w:eastAsia="Calibri"/>
+          <w:b w:val="0"/>
+          <w:color w:val="1B4332"/>
+          <w:sz w:val="22"/>
+        </w:rPr>
+        <w:t>admin@cleantechhub.net</w:t>
+      </w:r>
+    </w:p>
+    <w:p>
+      <w:r>
+        <w:rPr>
+          <w:rFonts w:ascii="Calibri" w:hAnsi="Calibri" w:eastAsia="Calibri"/>
+          <w:b/>
+          <w:color w:val="1B4332"/>
+          <w:sz w:val="22"/>
+        </w:rPr>
+        <w:t>Where this comes from:</w:t>
+      </w:r>
+      <w:r>
+        <w:rPr>
+          <w:rFonts w:ascii="Calibri" w:hAnsi="Calibri" w:eastAsia="Calibri"/>
+          <w:b w:val="0"/>
+          <w:color w:val="1B4332"/>
+          <w:sz w:val="22"/>
+        </w:rPr>
+        <w:t xml:space="preserve"> Gideon set this as the public contact on 22 October 2026. It is the address in the privacy policy.</w:t>
+      </w:r>
+    </w:p>
+    <w:p>
+      <w:r>
+        <w:rPr>
+          <w:rFonts w:ascii="Calibri" w:hAnsi="Calibri" w:eastAsia="Calibri"/>
+          <w:b/>
+          <w:color w:val="1B4332"/>
+          <w:sz w:val="22"/>
+        </w:rPr>
+        <w:t>Rules from the docs:</w:t>
+      </w:r>
+      <w:r>
+        <w:rPr>
+          <w:rFonts w:ascii="Calibri" w:hAnsi="Calibri" w:eastAsia="Calibri"/>
+          <w:b w:val="0"/>
+          <w:color w:val="1B4332"/>
+          <w:sz w:val="22"/>
+        </w:rPr>
+        <w:t xml:space="preserve"> the address must be a business email. A personal mailbox will not pass. LinkedIn sends a verification message to this address. Check spam, junk, the social tab, and the promotions tab. He must be able to open admin@cleantechhub.net.</w:t>
+      </w:r>
+    </w:p>
+    <w:p>
+      <w:r>
+        <w:rPr>
+          <w:rFonts w:ascii="Calibri" w:hAnsi="Calibri" w:eastAsia="Calibri"/>
+          <w:b/>
+          <w:color w:val="2D6A4F"/>
+          <w:sz w:val="26"/>
+        </w:rPr>
+        <w:t>1.6 Website</w:t>
+      </w:r>
+    </w:p>
+    <w:p>
+      <w:r>
+        <w:rPr>
+          <w:rFonts w:ascii="Calibri" w:hAnsi="Calibri" w:eastAsia="Calibri"/>
+          <w:b/>
+          <w:color w:val="1B4332"/>
+          <w:sz w:val="22"/>
+        </w:rPr>
+        <w:t>Paste:</w:t>
+      </w:r>
+    </w:p>
+    <w:p>
+      <w:r>
+        <w:rPr>
+          <w:rFonts w:ascii="Calibri" w:hAnsi="Calibri" w:eastAsia="Calibri"/>
+          <w:b w:val="0"/>
+          <w:color w:val="1B4332"/>
+          <w:sz w:val="22"/>
+        </w:rPr>
+        <w:t>https://cleantechhub.net</w:t>
+      </w:r>
+    </w:p>
+    <w:p>
+      <w:r>
+        <w:rPr>
+          <w:rFonts w:ascii="Calibri" w:hAnsi="Calibri" w:eastAsia="Calibri"/>
+          <w:b w:val="0"/>
+          <w:color w:val="1B4332"/>
+          <w:sz w:val="22"/>
+        </w:rPr>
+        <w:t>The organization website and the domain must match this site. Review checks a verified organization website and domain.</w:t>
+      </w:r>
+    </w:p>
+    <w:p>
+      <w:r>
+        <w:rPr>
+          <w:rFonts w:ascii="Calibri" w:hAnsi="Calibri" w:eastAsia="Calibri"/>
+          <w:b/>
+          <w:color w:val="2D6A4F"/>
+          <w:sz w:val="26"/>
+        </w:rPr>
+        <w:t>1.7 Privacy policy URL</w:t>
+      </w:r>
+    </w:p>
+    <w:p>
+      <w:r>
+        <w:rPr>
+          <w:rFonts w:ascii="Calibri" w:hAnsi="Calibri" w:eastAsia="Calibri"/>
+          <w:b/>
+          <w:color w:val="1B4332"/>
+          <w:sz w:val="22"/>
+        </w:rPr>
+        <w:t>Status: not live. Do not paste a URL yet.</w:t>
+      </w:r>
+    </w:p>
+    <w:p>
+      <w:r>
+        <w:rPr>
+          <w:rFonts w:ascii="Calibri" w:hAnsi="Calibri" w:eastAsia="Calibri"/>
+          <w:b w:val="0"/>
+          <w:color w:val="1B4332"/>
+          <w:sz w:val="22"/>
+        </w:rPr>
+        <w:t xml:space="preserve">The approved page is </w:t>
+      </w:r>
+      <w:r>
+        <w:rPr>
+          <w:rFonts w:ascii="Calibri" w:hAnsi="Calibri" w:eastAsia="Calibri"/>
+          <w:b w:val="0"/>
+          <w:color w:val="1B4332"/>
+          <w:sz w:val="22"/>
+        </w:rPr>
+        <w:t>artifacts/cleantechhub-privacy-policy.html</w:t>
+      </w:r>
+      <w:r>
+        <w:rPr>
+          <w:rFonts w:ascii="Calibri" w:hAnsi="Calibri" w:eastAsia="Calibri"/>
+          <w:b w:val="0"/>
+          <w:color w:val="1B4332"/>
+          <w:sz w:val="22"/>
+        </w:rPr>
+        <w:t>. It is not on a public URL. See the stop notice. Paste the URL only after it returns 200 without a login and the body is this policy.</w:t>
+      </w:r>
+    </w:p>
+    <w:p>
+      <w:r>
+        <w:rPr>
+          <w:rFonts w:ascii="Calibri" w:hAnsi="Calibri" w:eastAsia="Calibri"/>
+          <w:b/>
+          <w:color w:val="2D6A4F"/>
+          <w:sz w:val="26"/>
+        </w:rPr>
+        <w:t>1.8 LinkedIn Page</w:t>
+      </w:r>
+    </w:p>
+    <w:p>
+      <w:r>
+        <w:rPr>
+          <w:rFonts w:ascii="Calibri" w:hAnsi="Calibri" w:eastAsia="Calibri"/>
+          <w:b/>
+          <w:color w:val="1B4332"/>
+          <w:sz w:val="22"/>
+        </w:rPr>
+        <w:t>Paste:</w:t>
+      </w:r>
+    </w:p>
+    <w:p>
+      <w:r>
+        <w:rPr>
+          <w:rFonts w:ascii="Calibri" w:hAnsi="Calibri" w:eastAsia="Calibri"/>
+          <w:b w:val="0"/>
+          <w:color w:val="1B4332"/>
+          <w:sz w:val="22"/>
+        </w:rPr>
+        <w:t>LinkedIn Page name: CleantechHUB.</w:t>
+      </w:r>
+    </w:p>
+    <w:p>
+      <w:r>
+        <w:rPr>
+          <w:rFonts w:ascii="Calibri" w:hAnsi="Calibri" w:eastAsia="Calibri"/>
+          <w:b w:val="0"/>
+          <w:color w:val="1B4332"/>
+          <w:sz w:val="22"/>
+        </w:rPr>
+        <w:t>LinkedIn Page URL: [GIDEON TO FILL].</w:t>
+      </w:r>
+    </w:p>
+    <w:p>
+      <w:r>
+        <w:rPr>
+          <w:rFonts w:ascii="Calibri" w:hAnsi="Calibri" w:eastAsia="Calibri"/>
+          <w:b w:val="0"/>
+          <w:color w:val="1B4332"/>
+          <w:sz w:val="22"/>
+        </w:rPr>
+        <w:t>Organization ID: [GIDEON TO FILL].</w:t>
+      </w:r>
+    </w:p>
+    <w:p>
+      <w:r>
+        <w:rPr>
+          <w:rFonts w:ascii="Calibri" w:hAnsi="Calibri" w:eastAsia="Calibri"/>
+          <w:b w:val="0"/>
+          <w:color w:val="1B4332"/>
+          <w:sz w:val="22"/>
+        </w:rPr>
+        <w:t xml:space="preserve">The public pages checked on cleantechhub.net do not print the company Page URL or the organization id. The Page must belong to the same organization as the legal entity. A Page for a different organization is </w:t>
+      </w:r>
+      <w:r>
+        <w:rPr>
+          <w:rFonts w:ascii="Calibri" w:hAnsi="Calibri" w:eastAsia="Calibri"/>
+          <w:b/>
+          <w:color w:val="1B4332"/>
+          <w:sz w:val="22"/>
+        </w:rPr>
+        <w:t>Invalid Company Page</w:t>
+      </w:r>
+      <w:r>
+        <w:rPr>
+          <w:rFonts w:ascii="Calibri" w:hAnsi="Calibri" w:eastAsia="Calibri"/>
+          <w:b w:val="0"/>
+          <w:color w:val="1B4332"/>
+          <w:sz w:val="22"/>
+        </w:rPr>
+        <w:t>.</w:t>
+      </w:r>
+    </w:p>
+    <w:p>
+      <w:r>
+        <w:rPr>
+          <w:rFonts w:ascii="Calibri" w:hAnsi="Calibri" w:eastAsia="Calibri"/>
+          <w:b/>
+          <w:color w:val="2D6A4F"/>
+          <w:sz w:val="26"/>
+        </w:rPr>
+        <w:t>1.9 Page admin</w:t>
+      </w:r>
+    </w:p>
+    <w:p>
+      <w:r>
+        <w:rPr>
+          <w:rFonts w:ascii="Calibri" w:hAnsi="Calibri" w:eastAsia="Calibri"/>
+          <w:b/>
+          <w:color w:val="1B4332"/>
+          <w:sz w:val="22"/>
+        </w:rPr>
+        <w:t>Paste:</w:t>
+      </w:r>
+    </w:p>
+    <w:p>
+      <w:r>
+        <w:rPr>
+          <w:rFonts w:ascii="Calibri" w:hAnsi="Calibri" w:eastAsia="Calibri"/>
+          <w:b w:val="0"/>
+          <w:color w:val="1B4332"/>
+          <w:sz w:val="22"/>
+        </w:rPr>
+        <w:t>Page super admin who will approve the app verification URL: [GIDEON TO FILL].</w:t>
+      </w:r>
+    </w:p>
+    <w:p>
+      <w:r>
+        <w:rPr>
+          <w:rFonts w:ascii="Calibri" w:hAnsi="Calibri" w:eastAsia="Calibri"/>
+          <w:b w:val="0"/>
+          <w:color w:val="1B4332"/>
+          <w:sz w:val="22"/>
+        </w:rPr>
+        <w:t>LinkedIn member who will sign in and grant the token: [GIDEON TO FILL].</w:t>
+      </w:r>
+    </w:p>
+    <w:p>
+      <w:r>
+        <w:rPr>
+          <w:rFonts w:ascii="Calibri" w:hAnsi="Calibri" w:eastAsia="Calibri"/>
+          <w:b w:val="0"/>
+          <w:color w:val="1B4332"/>
+          <w:sz w:val="22"/>
+        </w:rPr>
+        <w:t>That member’s company Page role: ADMINISTRATOR.</w:t>
+      </w:r>
+    </w:p>
+    <w:p>
+      <w:r>
+        <w:rPr>
+          <w:rFonts w:ascii="Calibri" w:hAnsi="Calibri" w:eastAsia="Calibri"/>
+          <w:b w:val="0"/>
+          <w:color w:val="1B4332"/>
+          <w:sz w:val="22"/>
+        </w:rPr>
+        <w:t xml:space="preserve">Verification is done by a Page super admin. Posting can be done by an ADMINISTRATOR, a DIRECT_SPONSORED_CONTENT_POSTER, or a CONTENT_ADMIN. Page analytics under </w:t>
+      </w:r>
+      <w:r>
+        <w:rPr>
+          <w:rFonts w:ascii="Calibri" w:hAnsi="Calibri" w:eastAsia="Calibri"/>
+          <w:b w:val="0"/>
+          <w:color w:val="1B4332"/>
+          <w:sz w:val="22"/>
+        </w:rPr>
+        <w:t>rw_organization_admin</w:t>
+      </w:r>
+      <w:r>
+        <w:rPr>
+          <w:rFonts w:ascii="Calibri" w:hAnsi="Calibri" w:eastAsia="Calibri"/>
+          <w:b w:val="0"/>
+          <w:color w:val="1B4332"/>
+          <w:sz w:val="22"/>
+        </w:rPr>
+        <w:t xml:space="preserve"> is limited to the ADMINISTRATOR role. Gideon is named as legal representative in the data policy. That sentence does not prove his LinkedIn Page role. </w:t>
+      </w:r>
+      <w:r>
+        <w:rPr>
+          <w:rFonts w:ascii="Calibri" w:hAnsi="Calibri" w:eastAsia="Calibri"/>
+          <w:b w:val="0"/>
+          <w:color w:val="1B4332"/>
+          <w:sz w:val="22"/>
+        </w:rPr>
+        <w:t>[GIDEON TO FILL]</w:t>
+      </w:r>
+      <w:r>
+        <w:rPr>
+          <w:rFonts w:ascii="Calibri" w:hAnsi="Calibri" w:eastAsia="Calibri"/>
+          <w:b w:val="0"/>
+          <w:color w:val="1B4332"/>
+          <w:sz w:val="22"/>
+        </w:rPr>
+        <w:t xml:space="preserve"> both names, even if they are Gideon.</w:t>
+      </w:r>
+    </w:p>
+    <w:p>
+      <w:r>
+        <w:rPr>
+          <w:rFonts w:ascii="Calibri" w:hAnsi="Calibri" w:eastAsia="Calibri"/>
+          <w:b w:val="0"/>
+          <w:color w:val="1B4332"/>
+          <w:sz w:val="22"/>
+        </w:rPr>
+        <w:t>The super admin has 30 days to open the verification URL. Approval is permanent. The app cannot later move to another Page.</w:t>
+      </w:r>
+    </w:p>
+    <w:p>
+      <w:r>
+        <w:rPr>
+          <w:rFonts w:ascii="Calibri" w:hAnsi="Calibri" w:eastAsia="Calibri"/>
+          <w:b/>
+          <w:color w:val="2D6A4F"/>
+          <w:sz w:val="26"/>
+        </w:rPr>
+        <w:t>1.10 Use case description</w:t>
+      </w:r>
+    </w:p>
+    <w:p>
+      <w:r>
+        <w:rPr>
+          <w:rFonts w:ascii="Calibri" w:hAnsi="Calibri" w:eastAsia="Calibri"/>
+          <w:b/>
+          <w:color w:val="1B4332"/>
+          <w:sz w:val="22"/>
+        </w:rPr>
+        <w:t>Paste:</w:t>
+      </w:r>
+    </w:p>
+    <w:p>
+      <w:r>
+        <w:rPr>
+          <w:rFonts w:ascii="Calibri" w:hAnsi="Calibri" w:eastAsia="Calibri"/>
+          <w:b w:val="0"/>
+          <w:color w:val="1B4332"/>
+          <w:sz w:val="22"/>
+        </w:rPr>
+        <w:t>CleantechHUB will use the Community Management API for its own LinkedIn Page only.</w:t>
+      </w:r>
+    </w:p>
+    <w:p>
+      <w:r>
+        <w:rPr>
+          <w:rFonts w:ascii="Calibri" w:hAnsi="Calibri" w:eastAsia="Calibri"/>
+          <w:b w:val="0"/>
+          <w:color w:val="1B4332"/>
+          <w:sz w:val="22"/>
+        </w:rPr>
+        <w:t>The use cases are Page Management and Page Analytics.</w:t>
+      </w:r>
+    </w:p>
+    <w:p>
+      <w:r>
+        <w:rPr>
+          <w:rFonts w:ascii="Calibri" w:hAnsi="Calibri" w:eastAsia="Calibri"/>
+          <w:b w:val="0"/>
+          <w:color w:val="1B4332"/>
+          <w:sz w:val="22"/>
+        </w:rPr>
+        <w:t>A private n8n workflow, run by CleantechHUB, will publish CleantechHUB jobs, program news, and newsletters as that Page.</w:t>
+      </w:r>
+    </w:p>
+    <w:p>
+      <w:r>
+        <w:rPr>
+          <w:rFonts w:ascii="Calibri" w:hAnsi="Calibri" w:eastAsia="Calibri"/>
+          <w:b w:val="0"/>
+          <w:color w:val="1B4332"/>
+          <w:sz w:val="22"/>
+        </w:rPr>
+        <w:t>The same workflow will read that Page’s own posts and comments.</w:t>
+      </w:r>
+    </w:p>
+    <w:p>
+      <w:r>
+        <w:rPr>
+          <w:rFonts w:ascii="Calibri" w:hAnsi="Calibri" w:eastAsia="Calibri"/>
+          <w:b w:val="0"/>
+          <w:color w:val="1B4332"/>
+          <w:sz w:val="22"/>
+        </w:rPr>
+        <w:t>It will read aggregate analytics for those posts. The counts are impressions, clicks, reactions, comments, shares, and engagement.</w:t>
+      </w:r>
+    </w:p>
+    <w:p>
+      <w:r>
+        <w:rPr>
+          <w:rFonts w:ascii="Calibri" w:hAnsi="Calibri" w:eastAsia="Calibri"/>
+          <w:b w:val="0"/>
+          <w:color w:val="1B4332"/>
+          <w:sz w:val="22"/>
+        </w:rPr>
+        <w:t>It will read aggregate follower counts and page view counts for that same Page.</w:t>
+      </w:r>
+    </w:p>
+    <w:p>
+      <w:r>
+        <w:rPr>
+          <w:rFonts w:ascii="Calibri" w:hAnsi="Calibri" w:eastAsia="Calibri"/>
+          <w:b w:val="0"/>
+          <w:color w:val="1B4332"/>
+          <w:sz w:val="22"/>
+        </w:rPr>
+        <w:t>The workflow serves no other organization.</w:t>
+      </w:r>
+    </w:p>
+    <w:p>
+      <w:r>
+        <w:rPr>
+          <w:rFonts w:ascii="Calibri" w:hAnsi="Calibri" w:eastAsia="Calibri"/>
+          <w:b w:val="0"/>
+          <w:color w:val="1B4332"/>
+          <w:sz w:val="22"/>
+        </w:rPr>
+        <w:t>It does not scrape member profiles.</w:t>
+      </w:r>
+    </w:p>
+    <w:p>
+      <w:r>
+        <w:rPr>
+          <w:rFonts w:ascii="Calibri" w:hAnsi="Calibri" w:eastAsia="Calibri"/>
+          <w:b w:val="0"/>
+          <w:color w:val="1B4332"/>
+          <w:sz w:val="22"/>
+        </w:rPr>
+        <w:t>It does not use LinkedIn data for ads, sales, recruiting, lead lists, or audience building.</w:t>
+      </w:r>
+    </w:p>
+    <w:p>
+      <w:r>
+        <w:rPr>
+          <w:rFonts w:ascii="Calibri" w:hAnsi="Calibri" w:eastAsia="Calibri"/>
+          <w:b w:val="0"/>
+          <w:color w:val="1B4332"/>
+          <w:sz w:val="22"/>
+        </w:rPr>
+        <w:t>It does not place a LinkedIn feed on cleantechhub.net or on an intranet.</w:t>
+      </w:r>
+    </w:p>
+    <w:p>
+      <w:r>
+        <w:rPr>
+          <w:rFonts w:ascii="Calibri" w:hAnsi="Calibri" w:eastAsia="Calibri"/>
+          <w:b w:val="0"/>
+          <w:color w:val="1B4332"/>
+          <w:sz w:val="22"/>
+        </w:rPr>
+        <w:t>It does not combine member data with a CRM (customer relationship management) system or any other database.</w:t>
+      </w:r>
+    </w:p>
+    <w:p>
+      <w:r>
+        <w:rPr>
+          <w:rFonts w:ascii="Calibri" w:hAnsi="Calibri" w:eastAsia="Calibri"/>
+          <w:b/>
+          <w:color w:val="2D6A4F"/>
+          <w:sz w:val="26"/>
+        </w:rPr>
+        <w:t>1.11 Company and product overview</w:t>
+      </w:r>
+    </w:p>
+    <w:p>
+      <w:r>
+        <w:rPr>
+          <w:rFonts w:ascii="Calibri" w:hAnsi="Calibri" w:eastAsia="Calibri"/>
+          <w:b/>
+          <w:color w:val="1B4332"/>
+          <w:sz w:val="22"/>
+        </w:rPr>
+        <w:t>Paste:</w:t>
+      </w:r>
+    </w:p>
+    <w:p>
+      <w:r>
+        <w:rPr>
+          <w:rFonts w:ascii="Calibri" w:hAnsi="Calibri" w:eastAsia="Calibri"/>
+          <w:b w:val="0"/>
+          <w:color w:val="1B4332"/>
+          <w:sz w:val="22"/>
+        </w:rPr>
+        <w:t>CleantechHUB is a climate innovation organization in Latin America. Its public site is https://cleantechhub.net.</w:t>
+      </w:r>
+    </w:p>
+    <w:p>
+      <w:r>
+        <w:rPr>
+          <w:rFonts w:ascii="Calibri" w:hAnsi="Calibri" w:eastAsia="Calibri"/>
+          <w:b w:val="0"/>
+          <w:color w:val="1B4332"/>
+          <w:sz w:val="22"/>
+        </w:rPr>
+        <w:t>This application is not sold to other companies. It is CleantechHUB’s own publishing workflow.</w:t>
+      </w:r>
+    </w:p>
+    <w:p>
+      <w:r>
+        <w:rPr>
+          <w:rFonts w:ascii="Calibri" w:hAnsi="Calibri" w:eastAsia="Calibri"/>
+          <w:b w:val="0"/>
+          <w:color w:val="1B4332"/>
+          <w:sz w:val="22"/>
+        </w:rPr>
+        <w:t>The workflow posts CleantechHUB content to the CleantechHUB Page, then reads that Page’s results.</w:t>
+      </w:r>
+    </w:p>
+    <w:p>
+      <w:r>
+        <w:rPr>
+          <w:rFonts w:ascii="Calibri" w:hAnsi="Calibri" w:eastAsia="Calibri"/>
+          <w:b w:val="0"/>
+          <w:color w:val="1B4332"/>
+          <w:sz w:val="22"/>
+        </w:rPr>
+        <w:t>No third-party Pages are connected. No ads account is connected.</w:t>
+      </w:r>
+    </w:p>
+    <w:p>
+      <w:r>
+        <w:rPr>
+          <w:rFonts w:ascii="Calibri" w:hAnsi="Calibri" w:eastAsia="Calibri"/>
+          <w:b/>
+          <w:color w:val="2D6A4F"/>
+          <w:sz w:val="26"/>
+        </w:rPr>
+        <w:t>1.12 How the data is used</w:t>
+      </w:r>
+    </w:p>
+    <w:p>
+      <w:r>
+        <w:rPr>
+          <w:rFonts w:ascii="Calibri" w:hAnsi="Calibri" w:eastAsia="Calibri"/>
+          <w:b/>
+          <w:color w:val="1B4332"/>
+          <w:sz w:val="22"/>
+        </w:rPr>
+        <w:t>Paste:</w:t>
+      </w:r>
+    </w:p>
+    <w:p>
+      <w:r>
+        <w:rPr>
+          <w:rFonts w:ascii="Calibri" w:hAnsi="Calibri" w:eastAsia="Calibri"/>
+          <w:b w:val="0"/>
+          <w:color w:val="1B4332"/>
+          <w:sz w:val="22"/>
+        </w:rPr>
+        <w:t>We use organization posts we created so the Page can show CleantechHUB jobs, programs, and newsletters.</w:t>
+      </w:r>
+    </w:p>
+    <w:p>
+      <w:r>
+        <w:rPr>
+          <w:rFonts w:ascii="Calibri" w:hAnsi="Calibri" w:eastAsia="Calibri"/>
+          <w:b w:val="0"/>
+          <w:color w:val="1B4332"/>
+          <w:sz w:val="22"/>
+        </w:rPr>
+        <w:t>We use our own post ids so the workflow can avoid duplicate posts and can fetch analytics for those posts.</w:t>
+      </w:r>
+    </w:p>
+    <w:p>
+      <w:r>
+        <w:rPr>
+          <w:rFonts w:ascii="Calibri" w:hAnsi="Calibri" w:eastAsia="Calibri"/>
+          <w:b w:val="0"/>
+          <w:color w:val="1B4332"/>
+          <w:sz w:val="22"/>
+        </w:rPr>
+        <w:t>We use aggregate Page analytics so CleantechHUB staff can see how our own posts performed. The figures are impressions, clicks, reactions, comments, shares, follower counts, and page views.</w:t>
+      </w:r>
+    </w:p>
+    <w:p>
+      <w:r>
+        <w:rPr>
+          <w:rFonts w:ascii="Calibri" w:hAnsi="Calibri" w:eastAsia="Calibri"/>
+          <w:b w:val="0"/>
+          <w:color w:val="1B4332"/>
+          <w:sz w:val="22"/>
+        </w:rPr>
+        <w:t>We display comments on our own posts only to CleantechHUB people who manage that Page.</w:t>
+      </w:r>
+    </w:p>
+    <w:p>
+      <w:r>
+        <w:rPr>
+          <w:rFonts w:ascii="Calibri" w:hAnsi="Calibri" w:eastAsia="Calibri"/>
+          <w:b w:val="0"/>
+          <w:color w:val="1B4332"/>
+          <w:sz w:val="22"/>
+        </w:rPr>
+        <w:t>We request only the member data required to show that a comment exists. We do not export member data. We do not build member profiles. We do not enrich any other database.</w:t>
+      </w:r>
+    </w:p>
+    <w:p>
+      <w:r>
+        <w:rPr>
+          <w:rFonts w:ascii="Calibri" w:hAnsi="Calibri" w:eastAsia="Calibri"/>
+          <w:b/>
+          <w:color w:val="2D6A4F"/>
+          <w:sz w:val="26"/>
+        </w:rPr>
+        <w:t>1.13 How the data is stored</w:t>
+      </w:r>
+    </w:p>
+    <w:p>
+      <w:r>
+        <w:rPr>
+          <w:rFonts w:ascii="Calibri" w:hAnsi="Calibri" w:eastAsia="Calibri"/>
+          <w:b/>
+          <w:color w:val="1B4332"/>
+          <w:sz w:val="22"/>
+        </w:rPr>
+        <w:t>Paste:</w:t>
+      </w:r>
+    </w:p>
+    <w:p>
+      <w:r>
+        <w:rPr>
+          <w:rFonts w:ascii="Calibri" w:hAnsi="Calibri" w:eastAsia="Calibri"/>
+          <w:b w:val="0"/>
+          <w:color w:val="1B4332"/>
+          <w:sz w:val="22"/>
+        </w:rPr>
+        <w:t>Data stays inside CleantechHUB’s own n8n workflow. OVH hosts that workflow in Germany, the same host and country as https://cleantechhub.net. OVH’s data processing terms cover that hosting. Deletion follows the periods below.</w:t>
+      </w:r>
+    </w:p>
+    <w:p>
+      <w:r>
+        <w:rPr>
+          <w:rFonts w:ascii="Calibri" w:hAnsi="Calibri" w:eastAsia="Calibri"/>
+          <w:b w:val="0"/>
+          <w:color w:val="1B4332"/>
+          <w:sz w:val="22"/>
+        </w:rPr>
+        <w:t>Storage follows the LinkedIn Marketing API data storage requirements.</w:t>
+      </w:r>
+    </w:p>
+    <w:p>
+      <w:r>
+        <w:rPr>
+          <w:rFonts w:ascii="Calibri" w:hAnsi="Calibri" w:eastAsia="Calibri"/>
+          <w:b w:val="0"/>
+          <w:color w:val="1B4332"/>
+          <w:sz w:val="22"/>
+        </w:rPr>
+        <w:t>Posts and other social activity by our own Page may be stored for up to six months, because the Page authenticates into this app. The shorter public cap, where the organization has not authenticated, is six weeks.</w:t>
+      </w:r>
+    </w:p>
+    <w:p>
+      <w:r>
+        <w:rPr>
+          <w:rFonts w:ascii="Calibri" w:hAnsi="Calibri" w:eastAsia="Calibri"/>
+          <w:b w:val="0"/>
+          <w:color w:val="1B4332"/>
+          <w:sz w:val="22"/>
+        </w:rPr>
+        <w:t>Aggregate Page admin and reporting data, with no individual member record, may be stored for up to one year. This includes follower counts and summaries of social actions.</w:t>
+      </w:r>
+    </w:p>
+    <w:p>
+      <w:r>
+        <w:rPr>
+          <w:rFonts w:ascii="Calibri" w:hAnsi="Calibri" w:eastAsia="Calibri"/>
+          <w:b w:val="0"/>
+          <w:color w:val="1B4332"/>
+          <w:sz w:val="22"/>
+        </w:rPr>
+        <w:t>Our Page’s name and logo URL may be stored for up to eight weeks while the Page is authenticated.</w:t>
+      </w:r>
+    </w:p>
+    <w:p>
+      <w:r>
+        <w:rPr>
+          <w:rFonts w:ascii="Calibri" w:hAnsi="Calibri" w:eastAsia="Calibri"/>
+          <w:b w:val="0"/>
+          <w:color w:val="1B4332"/>
+          <w:sz w:val="22"/>
+        </w:rPr>
+        <w:t>Ids for the organization, our posts, and social actions may be kept with no LinkedIn time cap.</w:t>
+      </w:r>
+    </w:p>
+    <w:p>
+      <w:r>
+        <w:rPr>
+          <w:rFonts w:ascii="Calibri" w:hAnsi="Calibri" w:eastAsia="Calibri"/>
+          <w:b w:val="0"/>
+          <w:color w:val="1B4332"/>
+          <w:sz w:val="22"/>
+        </w:rPr>
+        <w:t>The signed-in Page admin’s person id and basic profile may be kept with no LinkedIn time cap. We keep them only to hold that admin’s authorization.</w:t>
+      </w:r>
+    </w:p>
+    <w:p>
+      <w:r>
+        <w:rPr>
+          <w:rFonts w:ascii="Calibri" w:hAnsi="Calibri" w:eastAsia="Calibri"/>
+          <w:b w:val="0"/>
+          <w:color w:val="1B4332"/>
+          <w:sz w:val="22"/>
+        </w:rPr>
+        <w:t>Content of member comments, reactions, and other member social activity is kept for no more than 48 hours, then deleted.</w:t>
+      </w:r>
+    </w:p>
+    <w:p>
+      <w:r>
+        <w:rPr>
+          <w:rFonts w:ascii="Calibri" w:hAnsi="Calibri" w:eastAsia="Calibri"/>
+          <w:b w:val="0"/>
+          <w:color w:val="1B4332"/>
+          <w:sz w:val="22"/>
+        </w:rPr>
+        <w:t>Profile fields of members who did not sign in are cached for no more than 24 hours. Examples are a commenter’s name, photo, or headline. They are not stored.</w:t>
+      </w:r>
+    </w:p>
+    <w:p>
+      <w:r>
+        <w:rPr>
+          <w:rFonts w:ascii="Calibri" w:hAnsi="Calibri" w:eastAsia="Calibri"/>
+          <w:b w:val="0"/>
+          <w:color w:val="1B4332"/>
+          <w:sz w:val="22"/>
+        </w:rPr>
+        <w:t>We delete stored member data when the admin asks, and when LinkedIn asks. On termination of the Marketing API terms, member data is deleted immediately, except lead-form and Page-messaging data, which this app does not collect.</w:t>
+      </w:r>
+    </w:p>
+    <w:p>
+      <w:r>
+        <w:rPr>
+          <w:rFonts w:ascii="Calibri" w:hAnsi="Calibri" w:eastAsia="Calibri"/>
+          <w:b/>
+          <w:color w:val="2D6A4F"/>
+          <w:sz w:val="26"/>
+        </w:rPr>
+        <w:t>1.14 Scopes and why</w:t>
+      </w:r>
+    </w:p>
+    <w:p>
+      <w:r>
+        <w:rPr>
+          <w:rFonts w:ascii="Calibri" w:hAnsi="Calibri" w:eastAsia="Calibri"/>
+          <w:b w:val="0"/>
+          <w:color w:val="1B4332"/>
+          <w:sz w:val="22"/>
+        </w:rPr>
+        <w:t xml:space="preserve">Request the </w:t>
+      </w:r>
+      <w:r>
+        <w:rPr>
+          <w:rFonts w:ascii="Calibri" w:hAnsi="Calibri" w:eastAsia="Calibri"/>
+          <w:b/>
+          <w:color w:val="1B4332"/>
+          <w:sz w:val="22"/>
+        </w:rPr>
+        <w:t>Community Management API</w:t>
+      </w:r>
+      <w:r>
+        <w:rPr>
+          <w:rFonts w:ascii="Calibri" w:hAnsi="Calibri" w:eastAsia="Calibri"/>
+          <w:b w:val="0"/>
+          <w:color w:val="1B4332"/>
+          <w:sz w:val="22"/>
+        </w:rPr>
+        <w:t xml:space="preserve"> product. Approval grants a bundle of scopes to the app. In the OAuth (Open Authorization) consent call, ask only for the three scopes below. Marketing permissions are three-legged. A member must sign in. Client-credentials access is not available.</w:t>
+      </w:r>
+    </w:p>
+    <w:p>
+      <w:r>
+        <w:rPr>
+          <w:rFonts w:ascii="Calibri" w:hAnsi="Calibri" w:eastAsia="Calibri"/>
+          <w:b/>
+          <w:color w:val="1B4332"/>
+          <w:sz w:val="22"/>
+        </w:rPr>
+        <w:t>Paste:</w:t>
+      </w:r>
+    </w:p>
+    <w:p>
+      <w:r>
+        <w:rPr>
+          <w:rFonts w:ascii="Calibri" w:hAnsi="Calibri" w:eastAsia="Calibri"/>
+          <w:b w:val="0"/>
+          <w:color w:val="1B4332"/>
+          <w:sz w:val="22"/>
+        </w:rPr>
+        <w:t>We need three scopes, and we will request only these three in the member consent screen.</w:t>
+      </w:r>
+    </w:p>
+    <w:p>
+      <w:r>
+        <w:rPr>
+          <w:rFonts w:ascii="Calibri" w:hAnsi="Calibri" w:eastAsia="Calibri"/>
+          <w:b w:val="0"/>
+          <w:color w:val="1B4332"/>
+          <w:sz w:val="22"/>
+        </w:rPr>
+        <w:t>w_organization_social. This scope posts, comments, and likes as the organization. We use it to publish CleantechHUB jobs, programs, and newsletters as the Page. The signed-in member must be an ADMINISTRATOR, a DIRECT_SPONSORED_CONTENT_POSTER, or a CONTENT_ADMIN. Source: Posts API.</w:t>
+      </w:r>
+    </w:p>
+    <w:p>
+      <w:r>
+        <w:rPr>
+          <w:rFonts w:ascii="Calibri" w:hAnsi="Calibri" w:eastAsia="Calibri"/>
+          <w:b w:val="0"/>
+          <w:color w:val="1B4332"/>
+          <w:sz w:val="22"/>
+        </w:rPr>
+        <w:t>r_organization_social. This scope reads the organization’s posts, comments, and likes. We use it to read our own Page’s posts and comments. The same Page roles apply. Source: Posts API.</w:t>
+      </w:r>
+    </w:p>
+    <w:p>
+      <w:r>
+        <w:rPr>
+          <w:rFonts w:ascii="Calibri" w:hAnsi="Calibri" w:eastAsia="Calibri"/>
+          <w:b w:val="0"/>
+          <w:color w:val="1B4332"/>
+          <w:sz w:val="22"/>
+        </w:rPr>
+        <w:t>rw_organization_admin. This scope manages organization pages and retrieves reporting data. We use it for aggregate post analytics, follower statistics, and page statistics. The signed-in member must be an ADMINISTRATOR. Sources: Organization Share Statistics, Organization Follower Statistics, Organization Page Statistics, and Organization Lookup. Total follower count uses networkSizes on the Organization Lookup page, under this same permission.</w:t>
+      </w:r>
+    </w:p>
+    <w:p>
+      <w:r>
+        <w:rPr>
+          <w:rFonts w:ascii="Calibri" w:hAnsi="Calibri" w:eastAsia="Calibri"/>
+          <w:b w:val="0"/>
+          <w:color w:val="1B4332"/>
+          <w:sz w:val="22"/>
+        </w:rPr>
+        <w:t>We do not need r_organization_followers for analytics. The docs describe that scope as follower data so an organization can mention followers in posts. We will not mention followers. We will not request that scope.</w:t>
+      </w:r>
+    </w:p>
+    <w:p>
+      <w:r>
+        <w:rPr>
+          <w:rFonts w:ascii="Calibri" w:hAnsi="Calibri" w:eastAsia="Calibri"/>
+          <w:b w:val="0"/>
+          <w:color w:val="1B4332"/>
+          <w:sz w:val="22"/>
+        </w:rPr>
+        <w:t>We do not need r_organization_admin. That scope is listed on the Advertising API and the Lead Sync API. It is not in the Community Management permission list. Page analytics on Community Management uses rw_organization_admin. We are not applying for the Advertising API.</w:t>
+      </w:r>
+    </w:p>
+    <w:p>
+      <w:r>
+        <w:rPr>
+          <w:rFonts w:ascii="Calibri" w:hAnsi="Calibri" w:eastAsia="Calibri"/>
+          <w:b w:val="0"/>
+          <w:color w:val="1B4332"/>
+          <w:sz w:val="22"/>
+        </w:rPr>
+        <w:t>The Community Management product also makes other scopes available on the app. We will not request them in OAuth, and we will not call them.</w:t>
       </w:r>
     </w:p>
     <w:p>
@@ -332,16 +1857,7 @@
           <w:color w:val="1B4332"/>
           <w:sz w:val="22"/>
         </w:rPr>
-        <w:t>https://cleantechhub.net/politica-de-privacidad</w:t>
-      </w:r>
-      <w:r>
-        <w:rPr>
-          <w:rFonts w:ascii="Calibri" w:hAnsi="Calibri" w:eastAsia="Calibri"/>
-          <w:b w:val="0"/>
-          <w:color w:val="1B4332"/>
-          <w:sz w:val="22"/>
-        </w:rPr>
-        <w:t xml:space="preserve"> returns 404.</w:t>
+        <w:t>r_1st_connections_size</w:t>
       </w:r>
     </w:p>
     <w:p>
@@ -355,16 +1871,7 @@
           <w:color w:val="1B4332"/>
           <w:sz w:val="22"/>
         </w:rPr>
-        <w:t>https://cleantechhub.net/politica-de-privacidad/</w:t>
-      </w:r>
-      <w:r>
-        <w:rPr>
-          <w:rFonts w:ascii="Calibri" w:hAnsi="Calibri" w:eastAsia="Calibri"/>
-          <w:b w:val="0"/>
-          <w:color w:val="1B4332"/>
-          <w:sz w:val="22"/>
-        </w:rPr>
-        <w:t xml:space="preserve"> returns 404.</w:t>
+        <w:t>r_basicprofile</w:t>
       </w:r>
     </w:p>
     <w:p>
@@ -378,25 +1885,7 @@
           <w:color w:val="1B4332"/>
           <w:sz w:val="22"/>
         </w:rPr>
-        <w:t xml:space="preserve">The public page sitemap has no privacy, legal, or cookie page. Source: </w:t>
-      </w:r>
-      <w:r>
-        <w:rPr>
-          <w:rFonts w:ascii="Calibri" w:hAnsi="Calibri" w:eastAsia="Calibri"/>
-          <w:b w:val="0"/>
-          <w:color w:val="1B4332"/>
-          <w:sz w:val="22"/>
-        </w:rPr>
-        <w:t>https://cleantechhub.net/page-sitemap.xml</w:t>
-      </w:r>
-      <w:r>
-        <w:rPr>
-          <w:rFonts w:ascii="Calibri" w:hAnsi="Calibri" w:eastAsia="Calibri"/>
-          <w:b w:val="0"/>
-          <w:color w:val="1B4332"/>
-          <w:sz w:val="22"/>
-        </w:rPr>
-        <w:t>.</w:t>
+        <w:t>r_organization_social_feed</w:t>
       </w:r>
     </w:p>
     <w:p>
@@ -410,1592 +1899,7 @@
           <w:color w:val="1B4332"/>
           <w:sz w:val="22"/>
         </w:rPr>
-        <w:t xml:space="preserve">The homepage footer has contact details only. It has no privacy link. Source: </w:t>
-      </w:r>
-      <w:r>
-        <w:rPr>
-          <w:rFonts w:ascii="Calibri" w:hAnsi="Calibri" w:eastAsia="Calibri"/>
-          <w:b w:val="0"/>
-          <w:color w:val="1B4332"/>
-          <w:sz w:val="22"/>
-        </w:rPr>
-        <w:t>https://cleantechhub.net/</w:t>
-      </w:r>
-      <w:r>
-        <w:rPr>
-          <w:rFonts w:ascii="Calibri" w:hAnsi="Calibri" w:eastAsia="Calibri"/>
-          <w:b w:val="0"/>
-          <w:color w:val="1B4332"/>
-          <w:sz w:val="22"/>
-        </w:rPr>
-        <w:t>.</w:t>
-      </w:r>
-    </w:p>
-    <w:p>
-      <w:r>
-        <w:rPr>
-          <w:rFonts w:ascii="Calibri" w:hAnsi="Calibri" w:eastAsia="Calibri"/>
-          <w:b w:val="0"/>
-          <w:color w:val="1B4332"/>
-          <w:sz w:val="22"/>
-        </w:rPr>
-        <w:t>The governance page does link a Google Drive PDF titled “Política y tratamiento de datos”.</w:t>
-      </w:r>
-    </w:p>
-    <w:p>
-      <w:r>
-        <w:rPr>
-          <w:rFonts w:ascii="Calibri" w:hAnsi="Calibri" w:eastAsia="Calibri"/>
-          <w:b w:val="0"/>
-          <w:color w:val="1B4332"/>
-          <w:sz w:val="22"/>
-        </w:rPr>
-        <w:t xml:space="preserve">The page is </w:t>
-      </w:r>
-      <w:r>
-        <w:rPr>
-          <w:rFonts w:ascii="Calibri" w:hAnsi="Calibri" w:eastAsia="Calibri"/>
-          <w:b w:val="0"/>
-          <w:color w:val="1B4332"/>
-          <w:sz w:val="22"/>
-        </w:rPr>
-        <w:t>https://cleantechhub.net/governance/</w:t>
-      </w:r>
-      <w:r>
-        <w:rPr>
-          <w:rFonts w:ascii="Calibri" w:hAnsi="Calibri" w:eastAsia="Calibri"/>
-          <w:b w:val="0"/>
-          <w:color w:val="1B4332"/>
-          <w:sz w:val="22"/>
-        </w:rPr>
-        <w:t xml:space="preserve">. The file is </w:t>
-      </w:r>
-      <w:r>
-        <w:rPr>
-          <w:rFonts w:ascii="Calibri" w:hAnsi="Calibri" w:eastAsia="Calibri"/>
-          <w:b w:val="0"/>
-          <w:color w:val="1B4332"/>
-          <w:sz w:val="22"/>
-        </w:rPr>
-        <w:t>https://drive.google.com/file/d/1CdLIitekr5MSZJ-kUlHzvJGJh-lwfyHP/view</w:t>
-      </w:r>
-      <w:r>
-        <w:rPr>
-          <w:rFonts w:ascii="Calibri" w:hAnsi="Calibri" w:eastAsia="Calibri"/>
-          <w:b w:val="0"/>
-          <w:color w:val="1B4332"/>
-          <w:sz w:val="22"/>
-        </w:rPr>
-        <w:t>.</w:t>
-      </w:r>
-    </w:p>
-    <w:p>
-      <w:r>
-        <w:rPr>
-          <w:rFonts w:ascii="Calibri" w:hAnsi="Calibri" w:eastAsia="Calibri"/>
-          <w:b w:val="0"/>
-          <w:color w:val="1B4332"/>
-          <w:sz w:val="22"/>
-        </w:rPr>
-        <w:t xml:space="preserve">That PDF is a Colombian Law 1581 internal data-treatment policy. It is not a page on cleantechhub.net. Do not paste the Drive link into the privacy-policy field. LinkedIn’s rejection message for this failure is </w:t>
-      </w:r>
-      <w:r>
-        <w:rPr>
-          <w:rFonts w:ascii="Calibri" w:hAnsi="Calibri" w:eastAsia="Calibri"/>
-          <w:b/>
-          <w:color w:val="1B4332"/>
-          <w:sz w:val="22"/>
-        </w:rPr>
-        <w:t>Invalid Privacy Policy</w:t>
-      </w:r>
-      <w:r>
-        <w:rPr>
-          <w:rFonts w:ascii="Calibri" w:hAnsi="Calibri" w:eastAsia="Calibri"/>
-          <w:b w:val="0"/>
-          <w:color w:val="1B4332"/>
-          <w:sz w:val="22"/>
-        </w:rPr>
-        <w:t>. The published meaning is that LinkedIn could not verify the organization’s privacy policy. A Development-tier rejection cannot be retried on the same app.</w:t>
-      </w:r>
-    </w:p>
-    <w:p>
-      <w:r>
-        <w:rPr>
-          <w:rFonts w:ascii="Calibri" w:hAnsi="Calibri" w:eastAsia="Calibri"/>
-          <w:b w:val="0"/>
-          <w:color w:val="1B4332"/>
-          <w:sz w:val="22"/>
-        </w:rPr>
-        <w:t xml:space="preserve">A draft public page is ready in </w:t>
-      </w:r>
-      <w:r>
-        <w:rPr>
-          <w:rFonts w:ascii="Calibri" w:hAnsi="Calibri" w:eastAsia="Calibri"/>
-          <w:b w:val="0"/>
-          <w:color w:val="1B4332"/>
-          <w:sz w:val="22"/>
-        </w:rPr>
-        <w:t>artifacts/cleantechhub-privacy-policy.html</w:t>
-      </w:r>
-      <w:r>
-        <w:rPr>
-          <w:rFonts w:ascii="Calibri" w:hAnsi="Calibri" w:eastAsia="Calibri"/>
-          <w:b w:val="0"/>
-          <w:color w:val="1B4332"/>
-          <w:sz w:val="22"/>
-        </w:rPr>
-        <w:t xml:space="preserve">. It is not on the site. Publish it at </w:t>
-      </w:r>
-      <w:r>
-        <w:rPr>
-          <w:rFonts w:ascii="Calibri" w:hAnsi="Calibri" w:eastAsia="Calibri"/>
-          <w:b w:val="0"/>
-          <w:color w:val="1B4332"/>
-          <w:sz w:val="22"/>
-        </w:rPr>
-        <w:t>https://cleantechhub.net/politica-de-privacidad/</w:t>
-      </w:r>
-      <w:r>
-        <w:rPr>
-          <w:rFonts w:ascii="Calibri" w:hAnsi="Calibri" w:eastAsia="Calibri"/>
-          <w:b w:val="0"/>
-          <w:color w:val="1B4332"/>
-          <w:sz w:val="22"/>
-        </w:rPr>
-        <w:t xml:space="preserve"> and redirect </w:t>
-      </w:r>
-      <w:r>
-        <w:rPr>
-          <w:rFonts w:ascii="Calibri" w:hAnsi="Calibri" w:eastAsia="Calibri"/>
-          <w:b w:val="0"/>
-          <w:color w:val="1B4332"/>
-          <w:sz w:val="22"/>
-        </w:rPr>
-        <w:t>/privacy</w:t>
-      </w:r>
-      <w:r>
-        <w:rPr>
-          <w:rFonts w:ascii="Calibri" w:hAnsi="Calibri" w:eastAsia="Calibri"/>
-          <w:b w:val="0"/>
-          <w:color w:val="1B4332"/>
-          <w:sz w:val="22"/>
-        </w:rPr>
-        <w:t xml:space="preserve"> there. The page must open without a login. Then paste that URL. Until the live URL returns 200, the field stays </w:t>
-      </w:r>
-      <w:r>
-        <w:rPr>
-          <w:rFonts w:ascii="Calibri" w:hAnsi="Calibri" w:eastAsia="Calibri"/>
-          <w:b w:val="0"/>
-          <w:color w:val="1B4332"/>
-          <w:sz w:val="22"/>
-        </w:rPr>
-        <w:t>[GIDEON TO FILL]</w:t>
-      </w:r>
-      <w:r>
-        <w:rPr>
-          <w:rFonts w:ascii="Calibri" w:hAnsi="Calibri" w:eastAsia="Calibri"/>
-          <w:b w:val="0"/>
-          <w:color w:val="1B4332"/>
-          <w:sz w:val="22"/>
-        </w:rPr>
-        <w:t>.</w:t>
-      </w:r>
-    </w:p>
-    <w:p>
-      <w:r>
-        <w:rPr>
-          <w:rFonts w:ascii="Calibri" w:hAnsi="Calibri" w:eastAsia="Calibri"/>
-          <w:b w:val="0"/>
-          <w:color w:val="1B4332"/>
-          <w:sz w:val="22"/>
-        </w:rPr>
-        <w:t xml:space="preserve">The worker authorization PDF is also the wrong document. Do not use </w:t>
-      </w:r>
-      <w:r>
-        <w:rPr>
-          <w:rFonts w:ascii="Calibri" w:hAnsi="Calibri" w:eastAsia="Calibri"/>
-          <w:b w:val="0"/>
-          <w:color w:val="1B4332"/>
-          <w:sz w:val="22"/>
-        </w:rPr>
-        <w:t>https://cleantechhub.net/wp-content/uploads/2026/07/Autorizacion-Tratamiento-Datos-Trabajadores.pdf</w:t>
-      </w:r>
-      <w:r>
-        <w:rPr>
-          <w:rFonts w:ascii="Calibri" w:hAnsi="Calibri" w:eastAsia="Calibri"/>
-          <w:b w:val="0"/>
-          <w:color w:val="1B4332"/>
-          <w:sz w:val="22"/>
-        </w:rPr>
-        <w:t>. It is a consent form for workers and contractors. Its street line also disagrees with the website and with the data policy.</w:t>
-      </w:r>
-    </w:p>
-    <w:p>
-      <w:r>
-        <w:rPr>
-          <w:rFonts w:ascii="Calibri" w:hAnsi="Calibri" w:eastAsia="Calibri"/>
-          <w:b/>
-          <w:color w:val="2D6A4F"/>
-          <w:sz w:val="32"/>
-        </w:rPr>
-        <w:t>1. Paste-ready form answers</w:t>
-      </w:r>
-    </w:p>
-    <w:p>
-      <w:r>
-        <w:rPr>
-          <w:rFonts w:ascii="Calibri" w:hAnsi="Calibri" w:eastAsia="Calibri"/>
-          <w:b/>
-          <w:color w:val="2D6A4F"/>
-          <w:sz w:val="26"/>
-        </w:rPr>
-        <w:t>1.1 Which app</w:t>
-      </w:r>
-    </w:p>
-    <w:p>
-      <w:r>
-        <w:rPr>
-          <w:rFonts w:ascii="Calibri" w:hAnsi="Calibri" w:eastAsia="Calibri"/>
-          <w:b/>
-          <w:color w:val="1B4332"/>
-          <w:sz w:val="22"/>
-        </w:rPr>
-        <w:t>Paste if the new app is the one in front of you:</w:t>
-      </w:r>
-    </w:p>
-    <w:p>
-      <w:r>
-        <w:rPr>
-          <w:rFonts w:ascii="Calibri" w:hAnsi="Calibri" w:eastAsia="Calibri"/>
-          <w:b w:val="0"/>
-          <w:color w:val="1B4332"/>
-          <w:sz w:val="22"/>
-        </w:rPr>
-        <w:t>This request is for a new CleantechHUB developer app. Its only product is the Community Management API. The existing app is n8n-li CleantechHUB, Client ID 782xlcklyvbakg. That app already has Sign In with LinkedIn and member posting. Leave that app in place for personal-profile posting.</w:t>
-      </w:r>
-    </w:p>
-    <w:p>
-      <w:r>
-        <w:rPr>
-          <w:rFonts w:ascii="Calibri" w:hAnsi="Calibri" w:eastAsia="Calibri"/>
-          <w:b/>
-          <w:color w:val="1B4332"/>
-          <w:sz w:val="22"/>
-        </w:rPr>
-        <w:t>Why:</w:t>
-      </w:r>
-      <w:r>
-        <w:rPr>
-          <w:rFonts w:ascii="Calibri" w:hAnsi="Calibri" w:eastAsia="Calibri"/>
-          <w:b w:val="0"/>
-          <w:color w:val="1B4332"/>
-          <w:sz w:val="22"/>
-        </w:rPr>
-        <w:t xml:space="preserve"> Community Management must be the only product on the app. If Share, Sign In, or any other product is already on the app, Request access stays grayed out. Source: </w:t>
-      </w:r>
-      <w:r>
-        <w:rPr>
-          <w:rFonts w:ascii="Calibri" w:hAnsi="Calibri" w:eastAsia="Calibri"/>
-          <w:b w:val="0"/>
-          <w:color w:val="1B4332"/>
-          <w:sz w:val="22"/>
-        </w:rPr>
-        <w:t>LinkedIn API Partner Support (https://learn.microsoft.com/en-us/linkedin/shared/linkedin-api-partner-support-guide)</w:t>
-      </w:r>
-      <w:r>
-        <w:rPr>
-          <w:rFonts w:ascii="Calibri" w:hAnsi="Calibri" w:eastAsia="Calibri"/>
-          <w:b w:val="0"/>
-          <w:color w:val="1B4332"/>
-          <w:sz w:val="22"/>
-        </w:rPr>
-        <w:t>.</w:t>
-      </w:r>
-    </w:p>
-    <w:p>
-      <w:r>
-        <w:rPr>
-          <w:rFonts w:ascii="Calibri" w:hAnsi="Calibri" w:eastAsia="Calibri"/>
-          <w:b/>
-          <w:color w:val="2D6A4F"/>
-          <w:sz w:val="26"/>
-        </w:rPr>
-        <w:t>1.2 App name</w:t>
-      </w:r>
-    </w:p>
-    <w:p>
-      <w:r>
-        <w:rPr>
-          <w:rFonts w:ascii="Calibri" w:hAnsi="Calibri" w:eastAsia="Calibri"/>
-          <w:b/>
-          <w:color w:val="1B4332"/>
-          <w:sz w:val="22"/>
-        </w:rPr>
-        <w:t>Paste:</w:t>
-      </w:r>
-    </w:p>
-    <w:p>
-      <w:r>
-        <w:rPr>
-          <w:rFonts w:ascii="Calibri" w:hAnsi="Calibri" w:eastAsia="Calibri"/>
-          <w:b w:val="0"/>
-          <w:color w:val="1B4332"/>
-          <w:sz w:val="22"/>
-        </w:rPr>
-        <w:t>CleantechHUB n8n</w:t>
-      </w:r>
-    </w:p>
-    <w:p>
-      <w:r>
-        <w:rPr>
-          <w:rFonts w:ascii="Calibri" w:hAnsi="Calibri" w:eastAsia="Calibri"/>
-          <w:b/>
-          <w:color w:val="1B4332"/>
-          <w:sz w:val="22"/>
-        </w:rPr>
-        <w:t>Do not use</w:t>
-      </w:r>
-      <w:r>
-        <w:rPr>
-          <w:rFonts w:ascii="Calibri" w:hAnsi="Calibri" w:eastAsia="Calibri"/>
-          <w:b w:val="0"/>
-          <w:color w:val="1B4332"/>
-          <w:sz w:val="22"/>
-        </w:rPr>
-        <w:t xml:space="preserve"> a name that contains Linked, In, LinkedIn, Microsoft, or the abbreviation li. </w:t>
-      </w:r>
-      <w:r>
-        <w:rPr>
-          <w:rFonts w:ascii="Calibri" w:hAnsi="Calibri" w:eastAsia="Calibri"/>
-          <w:b/>
-          <w:color w:val="1B4332"/>
-          <w:sz w:val="22"/>
-        </w:rPr>
-        <w:t>Invalid App Name</w:t>
-      </w:r>
-      <w:r>
-        <w:rPr>
-          <w:rFonts w:ascii="Calibri" w:hAnsi="Calibri" w:eastAsia="Calibri"/>
-          <w:b w:val="0"/>
-          <w:color w:val="1B4332"/>
-          <w:sz w:val="22"/>
-        </w:rPr>
-        <w:t xml:space="preserve"> is a published rejection. The examples in the docs are “Linked” and “In”. The current name n8n-li contains “li”. The docs do not say whether reviewers treat those two letters as a portion of LinkedIn. Use the clean name on the new app so a rejection is not spent on the name.</w:t>
-      </w:r>
-    </w:p>
-    <w:p>
-      <w:r>
-        <w:rPr>
-          <w:rFonts w:ascii="Calibri" w:hAnsi="Calibri" w:eastAsia="Calibri"/>
-          <w:b/>
-          <w:color w:val="2D6A4F"/>
-          <w:sz w:val="26"/>
-        </w:rPr>
-        <w:t>1.3 Company and legal entity</w:t>
-      </w:r>
-    </w:p>
-    <w:p>
-      <w:r>
-        <w:rPr>
-          <w:rFonts w:ascii="Calibri" w:hAnsi="Calibri" w:eastAsia="Calibri"/>
-          <w:b/>
-          <w:color w:val="1B4332"/>
-          <w:sz w:val="22"/>
-        </w:rPr>
-        <w:t>Paste:</w:t>
-      </w:r>
-    </w:p>
-    <w:p>
-      <w:r>
-        <w:rPr>
-          <w:rFonts w:ascii="Calibri" w:hAnsi="Calibri" w:eastAsia="Calibri"/>
-          <w:b w:val="0"/>
-          <w:color w:val="1B4332"/>
-          <w:sz w:val="22"/>
-        </w:rPr>
-        <w:t>FUNDACIÓN CLEANTECH HUB</w:t>
-      </w:r>
-    </w:p>
-    <w:p>
-      <w:r>
-        <w:rPr>
-          <w:rFonts w:ascii="Calibri" w:hAnsi="Calibri" w:eastAsia="Calibri"/>
-          <w:b w:val="0"/>
-          <w:color w:val="1B4332"/>
-          <w:sz w:val="22"/>
-        </w:rPr>
-        <w:t>Entidad sin ánimo de lucro (ESAL), régimen tributario especial.</w:t>
-      </w:r>
-    </w:p>
-    <w:p>
-      <w:r>
-        <w:rPr>
-          <w:rFonts w:ascii="Calibri" w:hAnsi="Calibri" w:eastAsia="Calibri"/>
-          <w:b w:val="0"/>
-          <w:color w:val="1B4332"/>
-          <w:sz w:val="22"/>
-        </w:rPr>
-        <w:t>NIT (Número de Identificación Tributaria) 901.523.941-9.</w:t>
-      </w:r>
-    </w:p>
-    <w:p>
-      <w:r>
-        <w:rPr>
-          <w:rFonts w:ascii="Calibri" w:hAnsi="Calibri" w:eastAsia="Calibri"/>
-          <w:b w:val="0"/>
-          <w:color w:val="1B4332"/>
-          <w:sz w:val="22"/>
-        </w:rPr>
-        <w:t>Bogotá D.C., Colombia.</w:t>
-      </w:r>
-    </w:p>
-    <w:p>
-      <w:r>
-        <w:rPr>
-          <w:rFonts w:ascii="Calibri" w:hAnsi="Calibri" w:eastAsia="Calibri"/>
-          <w:b w:val="0"/>
-          <w:color w:val="1B4332"/>
-          <w:sz w:val="22"/>
-        </w:rPr>
-        <w:t>Legal representative: Gideon Blaauw, Representante Legal de la Fundación CleantechHUB.</w:t>
-      </w:r>
-    </w:p>
-    <w:p>
-      <w:r>
-        <w:rPr>
-          <w:rFonts w:ascii="Calibri" w:hAnsi="Calibri" w:eastAsia="Calibri"/>
-          <w:b/>
-          <w:color w:val="1B4332"/>
-          <w:sz w:val="22"/>
-        </w:rPr>
-        <w:t>Where this comes from:</w:t>
-      </w:r>
-      <w:r>
-        <w:rPr>
-          <w:rFonts w:ascii="Calibri" w:hAnsi="Calibri" w:eastAsia="Calibri"/>
-          <w:b w:val="0"/>
-          <w:color w:val="1B4332"/>
-          <w:sz w:val="22"/>
-        </w:rPr>
-        <w:t xml:space="preserve"> Gideon confirmed this legal name, this non-profit form, and this tax number on 22 October 2026 for the public privacy policy. The NIT matches the public “Política y tratamiento de datos” PDF linked from </w:t>
-      </w:r>
-      <w:r>
-        <w:rPr>
-          <w:rFonts w:ascii="Calibri" w:hAnsi="Calibri" w:eastAsia="Calibri"/>
-          <w:b w:val="0"/>
-          <w:color w:val="1B4332"/>
-          <w:sz w:val="22"/>
-        </w:rPr>
-        <w:t>the governance page (https://cleantechhub.net/governance/)</w:t>
-      </w:r>
-      <w:r>
-        <w:rPr>
-          <w:rFonts w:ascii="Calibri" w:hAnsi="Calibri" w:eastAsia="Calibri"/>
-          <w:b w:val="0"/>
-          <w:color w:val="1B4332"/>
-          <w:sz w:val="22"/>
-        </w:rPr>
-        <w:t>. That page also says “Fundación”. The PDF contact block names Gideon Blaauw, cargo Representante legal.</w:t>
-      </w:r>
-    </w:p>
-    <w:p>
-      <w:r>
-        <w:rPr>
-          <w:rFonts w:ascii="Calibri" w:hAnsi="Calibri" w:eastAsia="Calibri"/>
-          <w:b/>
-          <w:color w:val="1B4332"/>
-          <w:sz w:val="22"/>
-        </w:rPr>
-        <w:t>Paste this name.</w:t>
-      </w:r>
-      <w:r>
-        <w:rPr>
-          <w:rFonts w:ascii="Calibri" w:hAnsi="Calibri" w:eastAsia="Calibri"/>
-          <w:b w:val="0"/>
-          <w:color w:val="1B4332"/>
-          <w:sz w:val="22"/>
-        </w:rPr>
-        <w:t xml:space="preserve"> Do not add a simplified-stock-company suffix. The 2022 PDF used a commercial company form. Do not copy that form into this field. A name that does not match the registry is a known cause of </w:t>
-      </w:r>
-      <w:r>
-        <w:rPr>
-          <w:rFonts w:ascii="Calibri" w:hAnsi="Calibri" w:eastAsia="Calibri"/>
-          <w:b/>
-          <w:color w:val="1B4332"/>
-          <w:sz w:val="22"/>
-        </w:rPr>
-        <w:t>Fail Organization Verification</w:t>
-      </w:r>
-      <w:r>
-        <w:rPr>
-          <w:rFonts w:ascii="Calibri" w:hAnsi="Calibri" w:eastAsia="Calibri"/>
-          <w:b w:val="0"/>
-          <w:color w:val="1B4332"/>
-          <w:sz w:val="22"/>
-        </w:rPr>
-        <w:t>.</w:t>
-      </w:r>
-    </w:p>
-    <w:p>
-      <w:r>
-        <w:rPr>
-          <w:rFonts w:ascii="Calibri" w:hAnsi="Calibri" w:eastAsia="Calibri"/>
-          <w:b/>
-          <w:color w:val="2D6A4F"/>
-          <w:sz w:val="26"/>
-        </w:rPr>
-        <w:t>1.4 Registered address</w:t>
-      </w:r>
-    </w:p>
-    <w:p>
-      <w:r>
-        <w:rPr>
-          <w:rFonts w:ascii="Calibri" w:hAnsi="Calibri" w:eastAsia="Calibri"/>
-          <w:b/>
-          <w:color w:val="1B4332"/>
-          <w:sz w:val="22"/>
-        </w:rPr>
-        <w:t>Paste:</w:t>
-      </w:r>
-    </w:p>
-    <w:p>
-      <w:r>
-        <w:rPr>
-          <w:rFonts w:ascii="Calibri" w:hAnsi="Calibri" w:eastAsia="Calibri"/>
-          <w:b w:val="0"/>
-          <w:color w:val="1B4332"/>
-          <w:sz w:val="22"/>
-        </w:rPr>
-        <w:t>Calle 90 No. 19-41 Of. 801, Bogotá D.C., Colombia.</w:t>
-      </w:r>
-    </w:p>
-    <w:p>
-      <w:r>
-        <w:rPr>
-          <w:rFonts w:ascii="Calibri" w:hAnsi="Calibri" w:eastAsia="Calibri"/>
-          <w:b/>
-          <w:color w:val="1B4332"/>
-          <w:sz w:val="22"/>
-        </w:rPr>
-        <w:t>Where this comes from:</w:t>
-      </w:r>
-      <w:r>
-        <w:rPr>
-          <w:rFonts w:ascii="Calibri" w:hAnsi="Calibri" w:eastAsia="Calibri"/>
-          <w:b w:val="0"/>
-          <w:color w:val="1B4332"/>
-          <w:sz w:val="22"/>
-        </w:rPr>
-        <w:t xml:space="preserve"> Gideon confirmed this address on 22 October 2026. It matches the public data policy (CALLE 90 No. 19-41 OF 801, Bogotá) and the site footer at </w:t>
-      </w:r>
-      <w:r>
-        <w:rPr>
-          <w:rFonts w:ascii="Calibri" w:hAnsi="Calibri" w:eastAsia="Calibri"/>
-          <w:b w:val="0"/>
-          <w:color w:val="1B4332"/>
-          <w:sz w:val="22"/>
-        </w:rPr>
-        <w:t>https://cleantechhub.net/</w:t>
-      </w:r>
-      <w:r>
-        <w:rPr>
-          <w:rFonts w:ascii="Calibri" w:hAnsi="Calibri" w:eastAsia="Calibri"/>
-          <w:b w:val="0"/>
-          <w:color w:val="1B4332"/>
-          <w:sz w:val="22"/>
-        </w:rPr>
-        <w:t>, which prints “Cll 90 #19 - 41 Office 801”.</w:t>
-      </w:r>
-    </w:p>
-    <w:p>
-      <w:r>
-        <w:rPr>
-          <w:rFonts w:ascii="Calibri" w:hAnsi="Calibri" w:eastAsia="Calibri"/>
-          <w:b w:val="0"/>
-          <w:color w:val="1B4332"/>
-          <w:sz w:val="22"/>
-        </w:rPr>
-        <w:t>Do not paste Calle 45 #9-42 from the worker authorization PDF.</w:t>
-      </w:r>
-    </w:p>
-    <w:p>
-      <w:r>
-        <w:rPr>
-          <w:rFonts w:ascii="Calibri" w:hAnsi="Calibri" w:eastAsia="Calibri"/>
-          <w:b/>
-          <w:color w:val="2D6A4F"/>
-          <w:sz w:val="26"/>
-        </w:rPr>
-        <w:t>1.5 Business email</w:t>
-      </w:r>
-    </w:p>
-    <w:p>
-      <w:r>
-        <w:rPr>
-          <w:rFonts w:ascii="Calibri" w:hAnsi="Calibri" w:eastAsia="Calibri"/>
-          <w:b/>
-          <w:color w:val="1B4332"/>
-          <w:sz w:val="22"/>
-        </w:rPr>
-        <w:t>Paste:</w:t>
-      </w:r>
-    </w:p>
-    <w:p>
-      <w:r>
-        <w:rPr>
-          <w:rFonts w:ascii="Calibri" w:hAnsi="Calibri" w:eastAsia="Calibri"/>
-          <w:b w:val="0"/>
-          <w:color w:val="1B4332"/>
-          <w:sz w:val="22"/>
-        </w:rPr>
-        <w:t>gideon.blaauw@cleantechhub.net</w:t>
-      </w:r>
-    </w:p>
-    <w:p>
-      <w:r>
-        <w:rPr>
-          <w:rFonts w:ascii="Calibri" w:hAnsi="Calibri" w:eastAsia="Calibri"/>
-          <w:b/>
-          <w:color w:val="1B4332"/>
-          <w:sz w:val="22"/>
-        </w:rPr>
-        <w:t>Where this comes from:</w:t>
-      </w:r>
-      <w:r>
-        <w:rPr>
-          <w:rFonts w:ascii="Calibri" w:hAnsi="Calibri" w:eastAsia="Calibri"/>
-          <w:b w:val="0"/>
-          <w:color w:val="1B4332"/>
-          <w:sz w:val="22"/>
-        </w:rPr>
-        <w:t xml:space="preserve"> Gideon’s published address on </w:t>
-      </w:r>
-      <w:r>
-        <w:rPr>
-          <w:rFonts w:ascii="Calibri" w:hAnsi="Calibri" w:eastAsia="Calibri"/>
-          <w:b w:val="0"/>
-          <w:color w:val="1B4332"/>
-          <w:sz w:val="22"/>
-        </w:rPr>
-        <w:t>the About page (https://cleantechhub.net/about/)</w:t>
-      </w:r>
-      <w:r>
-        <w:rPr>
-          <w:rFonts w:ascii="Calibri" w:hAnsi="Calibri" w:eastAsia="Calibri"/>
-          <w:b w:val="0"/>
-          <w:color w:val="1B4332"/>
-          <w:sz w:val="22"/>
-        </w:rPr>
-        <w:t>. The public privacy contact is a different mailbox, admin@cleantechhub.net. Use that mailbox here only if he can open it and LinkedIn accepts it for verification. Prefer the mailbox he actually reads.</w:t>
-      </w:r>
-    </w:p>
-    <w:p>
-      <w:r>
-        <w:rPr>
-          <w:rFonts w:ascii="Calibri" w:hAnsi="Calibri" w:eastAsia="Calibri"/>
-          <w:b/>
-          <w:color w:val="1B4332"/>
-          <w:sz w:val="22"/>
-        </w:rPr>
-        <w:t>Rules from the docs:</w:t>
-      </w:r>
-      <w:r>
-        <w:rPr>
-          <w:rFonts w:ascii="Calibri" w:hAnsi="Calibri" w:eastAsia="Calibri"/>
-          <w:b w:val="0"/>
-          <w:color w:val="1B4332"/>
-          <w:sz w:val="22"/>
-        </w:rPr>
-        <w:t xml:space="preserve"> the address must be a business email. A personal mailbox will not pass. LinkedIn sends a verification message. Check spam, junk, the social tab, and the promotions tab. </w:t>
-      </w:r>
-      <w:r>
-        <w:rPr>
-          <w:rFonts w:ascii="Calibri" w:hAnsi="Calibri" w:eastAsia="Calibri"/>
-          <w:b w:val="0"/>
-          <w:color w:val="1B4332"/>
-          <w:sz w:val="22"/>
-        </w:rPr>
-        <w:t>[GIDEON TO FILL]</w:t>
-      </w:r>
-      <w:r>
-        <w:rPr>
-          <w:rFonts w:ascii="Calibri" w:hAnsi="Calibri" w:eastAsia="Calibri"/>
-          <w:b w:val="0"/>
-          <w:color w:val="1B4332"/>
-          <w:sz w:val="22"/>
-        </w:rPr>
-        <w:t xml:space="preserve"> if he cannot receive mail at gideon.blaauw@cleantechhub.net. Use another @cleantechhub.net mailbox he can open. The data-policy PDF email line is not clean enough to copy. The extracted text shows a space inside the local part.</w:t>
-      </w:r>
-    </w:p>
-    <w:p>
-      <w:r>
-        <w:rPr>
-          <w:rFonts w:ascii="Calibri" w:hAnsi="Calibri" w:eastAsia="Calibri"/>
-          <w:b/>
-          <w:color w:val="2D6A4F"/>
-          <w:sz w:val="26"/>
-        </w:rPr>
-        <w:t>1.6 Website</w:t>
-      </w:r>
-    </w:p>
-    <w:p>
-      <w:r>
-        <w:rPr>
-          <w:rFonts w:ascii="Calibri" w:hAnsi="Calibri" w:eastAsia="Calibri"/>
-          <w:b/>
-          <w:color w:val="1B4332"/>
-          <w:sz w:val="22"/>
-        </w:rPr>
-        <w:t>Paste:</w:t>
-      </w:r>
-    </w:p>
-    <w:p>
-      <w:r>
-        <w:rPr>
-          <w:rFonts w:ascii="Calibri" w:hAnsi="Calibri" w:eastAsia="Calibri"/>
-          <w:b w:val="0"/>
-          <w:color w:val="1B4332"/>
-          <w:sz w:val="22"/>
-        </w:rPr>
-        <w:t>https://cleantechhub.net</w:t>
-      </w:r>
-    </w:p>
-    <w:p>
-      <w:r>
-        <w:rPr>
-          <w:rFonts w:ascii="Calibri" w:hAnsi="Calibri" w:eastAsia="Calibri"/>
-          <w:b w:val="0"/>
-          <w:color w:val="1B4332"/>
-          <w:sz w:val="22"/>
-        </w:rPr>
-        <w:t>The organization website and the domain must match this site. Review checks a verified organization website and domain.</w:t>
-      </w:r>
-    </w:p>
-    <w:p>
-      <w:r>
-        <w:rPr>
-          <w:rFonts w:ascii="Calibri" w:hAnsi="Calibri" w:eastAsia="Calibri"/>
-          <w:b/>
-          <w:color w:val="2D6A4F"/>
-          <w:sz w:val="26"/>
-        </w:rPr>
-        <w:t>1.7 Privacy policy URL</w:t>
-      </w:r>
-    </w:p>
-    <w:p>
-      <w:r>
-        <w:rPr>
-          <w:rFonts w:ascii="Calibri" w:hAnsi="Calibri" w:eastAsia="Calibri"/>
-          <w:b/>
-          <w:color w:val="1B4332"/>
-          <w:sz w:val="22"/>
-        </w:rPr>
-        <w:t>Paste only after the live page returns 200:</w:t>
-      </w:r>
-    </w:p>
-    <w:p>
-      <w:r>
-        <w:rPr>
-          <w:rFonts w:ascii="Calibri" w:hAnsi="Calibri" w:eastAsia="Calibri"/>
-          <w:b w:val="0"/>
-          <w:color w:val="1B4332"/>
-          <w:sz w:val="22"/>
-        </w:rPr>
-        <w:t>https://cleantechhub.net/politica-de-privacidad/</w:t>
-      </w:r>
-    </w:p>
-    <w:p>
-      <w:r>
-        <w:rPr>
-          <w:rFonts w:ascii="Calibri" w:hAnsi="Calibri" w:eastAsia="Calibri"/>
-          <w:b/>
-          <w:color w:val="1B4332"/>
-          <w:sz w:val="22"/>
-        </w:rPr>
-        <w:t>Until that page is public, paste:</w:t>
-      </w:r>
-    </w:p>
-    <w:p>
-      <w:r>
-        <w:rPr>
-          <w:rFonts w:ascii="Calibri" w:hAnsi="Calibri" w:eastAsia="Calibri"/>
-          <w:b w:val="0"/>
-          <w:color w:val="1B4332"/>
-          <w:sz w:val="22"/>
-        </w:rPr>
-        <w:t>[GIDEON TO FILL]</w:t>
-      </w:r>
-    </w:p>
-    <w:p>
-      <w:r>
-        <w:rPr>
-          <w:rFonts w:ascii="Calibri" w:hAnsi="Calibri" w:eastAsia="Calibri"/>
-          <w:b w:val="0"/>
-          <w:color w:val="1B4332"/>
-          <w:sz w:val="22"/>
-        </w:rPr>
-        <w:t xml:space="preserve">The draft is </w:t>
-      </w:r>
-      <w:r>
-        <w:rPr>
-          <w:rFonts w:ascii="Calibri" w:hAnsi="Calibri" w:eastAsia="Calibri"/>
-          <w:b w:val="0"/>
-          <w:color w:val="1B4332"/>
-          <w:sz w:val="22"/>
-        </w:rPr>
-        <w:t>artifacts/cleantechhub-privacy-policy.html</w:t>
-      </w:r>
-      <w:r>
-        <w:rPr>
-          <w:rFonts w:ascii="Calibri" w:hAnsi="Calibri" w:eastAsia="Calibri"/>
-          <w:b w:val="0"/>
-          <w:color w:val="1B4332"/>
-          <w:sz w:val="22"/>
-        </w:rPr>
-        <w:t>. It is bilingual, Spanish first. It is not deployed. See “Stop before you submit” above.</w:t>
-      </w:r>
-    </w:p>
-    <w:p>
-      <w:r>
-        <w:rPr>
-          <w:rFonts w:ascii="Calibri" w:hAnsi="Calibri" w:eastAsia="Calibri"/>
-          <w:b/>
-          <w:color w:val="2D6A4F"/>
-          <w:sz w:val="26"/>
-        </w:rPr>
-        <w:t>1.8 LinkedIn Page</w:t>
-      </w:r>
-    </w:p>
-    <w:p>
-      <w:r>
-        <w:rPr>
-          <w:rFonts w:ascii="Calibri" w:hAnsi="Calibri" w:eastAsia="Calibri"/>
-          <w:b/>
-          <w:color w:val="1B4332"/>
-          <w:sz w:val="22"/>
-        </w:rPr>
-        <w:t>Paste:</w:t>
-      </w:r>
-    </w:p>
-    <w:p>
-      <w:r>
-        <w:rPr>
-          <w:rFonts w:ascii="Calibri" w:hAnsi="Calibri" w:eastAsia="Calibri"/>
-          <w:b w:val="0"/>
-          <w:color w:val="1B4332"/>
-          <w:sz w:val="22"/>
-        </w:rPr>
-        <w:t>LinkedIn Page name: CleantechHUB.</w:t>
-      </w:r>
-    </w:p>
-    <w:p>
-      <w:r>
-        <w:rPr>
-          <w:rFonts w:ascii="Calibri" w:hAnsi="Calibri" w:eastAsia="Calibri"/>
-          <w:b w:val="0"/>
-          <w:color w:val="1B4332"/>
-          <w:sz w:val="22"/>
-        </w:rPr>
-        <w:t>LinkedIn Page URL: [GIDEON TO FILL].</w:t>
-      </w:r>
-    </w:p>
-    <w:p>
-      <w:r>
-        <w:rPr>
-          <w:rFonts w:ascii="Calibri" w:hAnsi="Calibri" w:eastAsia="Calibri"/>
-          <w:b w:val="0"/>
-          <w:color w:val="1B4332"/>
-          <w:sz w:val="22"/>
-        </w:rPr>
-        <w:t>Organization ID: [GIDEON TO FILL].</w:t>
-      </w:r>
-    </w:p>
-    <w:p>
-      <w:r>
-        <w:rPr>
-          <w:rFonts w:ascii="Calibri" w:hAnsi="Calibri" w:eastAsia="Calibri"/>
-          <w:b w:val="0"/>
-          <w:color w:val="1B4332"/>
-          <w:sz w:val="22"/>
-        </w:rPr>
-        <w:t xml:space="preserve">The public pages checked on cleantechhub.net do not print the company Page URL or the organization id. The Page must belong to the same organization as the legal entity. A Page for a different organization is </w:t>
-      </w:r>
-      <w:r>
-        <w:rPr>
-          <w:rFonts w:ascii="Calibri" w:hAnsi="Calibri" w:eastAsia="Calibri"/>
-          <w:b/>
-          <w:color w:val="1B4332"/>
-          <w:sz w:val="22"/>
-        </w:rPr>
-        <w:t>Invalid Company Page</w:t>
-      </w:r>
-      <w:r>
-        <w:rPr>
-          <w:rFonts w:ascii="Calibri" w:hAnsi="Calibri" w:eastAsia="Calibri"/>
-          <w:b w:val="0"/>
-          <w:color w:val="1B4332"/>
-          <w:sz w:val="22"/>
-        </w:rPr>
-        <w:t>.</w:t>
-      </w:r>
-    </w:p>
-    <w:p>
-      <w:r>
-        <w:rPr>
-          <w:rFonts w:ascii="Calibri" w:hAnsi="Calibri" w:eastAsia="Calibri"/>
-          <w:b/>
-          <w:color w:val="2D6A4F"/>
-          <w:sz w:val="26"/>
-        </w:rPr>
-        <w:t>1.9 Page admin</w:t>
-      </w:r>
-    </w:p>
-    <w:p>
-      <w:r>
-        <w:rPr>
-          <w:rFonts w:ascii="Calibri" w:hAnsi="Calibri" w:eastAsia="Calibri"/>
-          <w:b/>
-          <w:color w:val="1B4332"/>
-          <w:sz w:val="22"/>
-        </w:rPr>
-        <w:t>Paste:</w:t>
-      </w:r>
-    </w:p>
-    <w:p>
-      <w:r>
-        <w:rPr>
-          <w:rFonts w:ascii="Calibri" w:hAnsi="Calibri" w:eastAsia="Calibri"/>
-          <w:b w:val="0"/>
-          <w:color w:val="1B4332"/>
-          <w:sz w:val="22"/>
-        </w:rPr>
-        <w:t>Page super admin who will approve the app verification URL: [GIDEON TO FILL].</w:t>
-      </w:r>
-    </w:p>
-    <w:p>
-      <w:r>
-        <w:rPr>
-          <w:rFonts w:ascii="Calibri" w:hAnsi="Calibri" w:eastAsia="Calibri"/>
-          <w:b w:val="0"/>
-          <w:color w:val="1B4332"/>
-          <w:sz w:val="22"/>
-        </w:rPr>
-        <w:t>LinkedIn member who will sign in and grant the token: [GIDEON TO FILL].</w:t>
-      </w:r>
-    </w:p>
-    <w:p>
-      <w:r>
-        <w:rPr>
-          <w:rFonts w:ascii="Calibri" w:hAnsi="Calibri" w:eastAsia="Calibri"/>
-          <w:b w:val="0"/>
-          <w:color w:val="1B4332"/>
-          <w:sz w:val="22"/>
-        </w:rPr>
-        <w:t>That member’s company Page role: ADMINISTRATOR.</w:t>
-      </w:r>
-    </w:p>
-    <w:p>
-      <w:r>
-        <w:rPr>
-          <w:rFonts w:ascii="Calibri" w:hAnsi="Calibri" w:eastAsia="Calibri"/>
-          <w:b w:val="0"/>
-          <w:color w:val="1B4332"/>
-          <w:sz w:val="22"/>
-        </w:rPr>
-        <w:t xml:space="preserve">Verification is done by a Page super admin. Posting can be done by an ADMINISTRATOR, a DIRECT_SPONSORED_CONTENT_POSTER, or a CONTENT_ADMIN. Page analytics under </w:t>
-      </w:r>
-      <w:r>
-        <w:rPr>
-          <w:rFonts w:ascii="Calibri" w:hAnsi="Calibri" w:eastAsia="Calibri"/>
-          <w:b w:val="0"/>
-          <w:color w:val="1B4332"/>
-          <w:sz w:val="22"/>
-        </w:rPr>
-        <w:t>rw_organization_admin</w:t>
-      </w:r>
-      <w:r>
-        <w:rPr>
-          <w:rFonts w:ascii="Calibri" w:hAnsi="Calibri" w:eastAsia="Calibri"/>
-          <w:b w:val="0"/>
-          <w:color w:val="1B4332"/>
-          <w:sz w:val="22"/>
-        </w:rPr>
-        <w:t xml:space="preserve"> is limited to the ADMINISTRATOR role. Gideon is named as legal representative in the data policy. That sentence does not prove his LinkedIn Page role. </w:t>
-      </w:r>
-      <w:r>
-        <w:rPr>
-          <w:rFonts w:ascii="Calibri" w:hAnsi="Calibri" w:eastAsia="Calibri"/>
-          <w:b w:val="0"/>
-          <w:color w:val="1B4332"/>
-          <w:sz w:val="22"/>
-        </w:rPr>
-        <w:t>[GIDEON TO FILL]</w:t>
-      </w:r>
-      <w:r>
-        <w:rPr>
-          <w:rFonts w:ascii="Calibri" w:hAnsi="Calibri" w:eastAsia="Calibri"/>
-          <w:b w:val="0"/>
-          <w:color w:val="1B4332"/>
-          <w:sz w:val="22"/>
-        </w:rPr>
-        <w:t xml:space="preserve"> both names, even if they are Gideon.</w:t>
-      </w:r>
-    </w:p>
-    <w:p>
-      <w:r>
-        <w:rPr>
-          <w:rFonts w:ascii="Calibri" w:hAnsi="Calibri" w:eastAsia="Calibri"/>
-          <w:b w:val="0"/>
-          <w:color w:val="1B4332"/>
-          <w:sz w:val="22"/>
-        </w:rPr>
-        <w:t>The super admin has 30 days to open the verification URL. Approval is permanent. The app cannot later move to another Page.</w:t>
-      </w:r>
-    </w:p>
-    <w:p>
-      <w:r>
-        <w:rPr>
-          <w:rFonts w:ascii="Calibri" w:hAnsi="Calibri" w:eastAsia="Calibri"/>
-          <w:b/>
-          <w:color w:val="2D6A4F"/>
-          <w:sz w:val="26"/>
-        </w:rPr>
-        <w:t>1.10 Use case description</w:t>
-      </w:r>
-    </w:p>
-    <w:p>
-      <w:r>
-        <w:rPr>
-          <w:rFonts w:ascii="Calibri" w:hAnsi="Calibri" w:eastAsia="Calibri"/>
-          <w:b/>
-          <w:color w:val="1B4332"/>
-          <w:sz w:val="22"/>
-        </w:rPr>
-        <w:t>Paste:</w:t>
-      </w:r>
-    </w:p>
-    <w:p>
-      <w:r>
-        <w:rPr>
-          <w:rFonts w:ascii="Calibri" w:hAnsi="Calibri" w:eastAsia="Calibri"/>
-          <w:b w:val="0"/>
-          <w:color w:val="1B4332"/>
-          <w:sz w:val="22"/>
-        </w:rPr>
-        <w:t>CleantechHUB will use the Community Management API for its own LinkedIn Page only.</w:t>
-      </w:r>
-    </w:p>
-    <w:p>
-      <w:r>
-        <w:rPr>
-          <w:rFonts w:ascii="Calibri" w:hAnsi="Calibri" w:eastAsia="Calibri"/>
-          <w:b w:val="0"/>
-          <w:color w:val="1B4332"/>
-          <w:sz w:val="22"/>
-        </w:rPr>
-        <w:t>The use cases are Page Management and Page Analytics.</w:t>
-      </w:r>
-    </w:p>
-    <w:p>
-      <w:r>
-        <w:rPr>
-          <w:rFonts w:ascii="Calibri" w:hAnsi="Calibri" w:eastAsia="Calibri"/>
-          <w:b w:val="0"/>
-          <w:color w:val="1B4332"/>
-          <w:sz w:val="22"/>
-        </w:rPr>
-        <w:t>A private n8n workflow, run by CleantechHUB, will publish CleantechHUB jobs, program news, and newsletters as that Page.</w:t>
-      </w:r>
-    </w:p>
-    <w:p>
-      <w:r>
-        <w:rPr>
-          <w:rFonts w:ascii="Calibri" w:hAnsi="Calibri" w:eastAsia="Calibri"/>
-          <w:b w:val="0"/>
-          <w:color w:val="1B4332"/>
-          <w:sz w:val="22"/>
-        </w:rPr>
-        <w:t>The same workflow will read that Page’s own posts and comments.</w:t>
-      </w:r>
-    </w:p>
-    <w:p>
-      <w:r>
-        <w:rPr>
-          <w:rFonts w:ascii="Calibri" w:hAnsi="Calibri" w:eastAsia="Calibri"/>
-          <w:b w:val="0"/>
-          <w:color w:val="1B4332"/>
-          <w:sz w:val="22"/>
-        </w:rPr>
-        <w:t>It will read aggregate analytics for those posts. The counts are impressions, clicks, reactions, comments, shares, and engagement.</w:t>
-      </w:r>
-    </w:p>
-    <w:p>
-      <w:r>
-        <w:rPr>
-          <w:rFonts w:ascii="Calibri" w:hAnsi="Calibri" w:eastAsia="Calibri"/>
-          <w:b w:val="0"/>
-          <w:color w:val="1B4332"/>
-          <w:sz w:val="22"/>
-        </w:rPr>
-        <w:t>It will read aggregate follower counts and page view counts for that same Page.</w:t>
-      </w:r>
-    </w:p>
-    <w:p>
-      <w:r>
-        <w:rPr>
-          <w:rFonts w:ascii="Calibri" w:hAnsi="Calibri" w:eastAsia="Calibri"/>
-          <w:b w:val="0"/>
-          <w:color w:val="1B4332"/>
-          <w:sz w:val="22"/>
-        </w:rPr>
-        <w:t>The workflow serves no other organization.</w:t>
-      </w:r>
-    </w:p>
-    <w:p>
-      <w:r>
-        <w:rPr>
-          <w:rFonts w:ascii="Calibri" w:hAnsi="Calibri" w:eastAsia="Calibri"/>
-          <w:b w:val="0"/>
-          <w:color w:val="1B4332"/>
-          <w:sz w:val="22"/>
-        </w:rPr>
-        <w:t>It does not scrape member profiles.</w:t>
-      </w:r>
-    </w:p>
-    <w:p>
-      <w:r>
-        <w:rPr>
-          <w:rFonts w:ascii="Calibri" w:hAnsi="Calibri" w:eastAsia="Calibri"/>
-          <w:b w:val="0"/>
-          <w:color w:val="1B4332"/>
-          <w:sz w:val="22"/>
-        </w:rPr>
-        <w:t>It does not use LinkedIn data for ads, sales, recruiting, lead lists, or audience building.</w:t>
-      </w:r>
-    </w:p>
-    <w:p>
-      <w:r>
-        <w:rPr>
-          <w:rFonts w:ascii="Calibri" w:hAnsi="Calibri" w:eastAsia="Calibri"/>
-          <w:b w:val="0"/>
-          <w:color w:val="1B4332"/>
-          <w:sz w:val="22"/>
-        </w:rPr>
-        <w:t>It does not place a LinkedIn feed on cleantechhub.net or on an intranet.</w:t>
-      </w:r>
-    </w:p>
-    <w:p>
-      <w:r>
-        <w:rPr>
-          <w:rFonts w:ascii="Calibri" w:hAnsi="Calibri" w:eastAsia="Calibri"/>
-          <w:b w:val="0"/>
-          <w:color w:val="1B4332"/>
-          <w:sz w:val="22"/>
-        </w:rPr>
-        <w:t>It does not combine member data with a CRM (customer relationship management) system or any other database.</w:t>
-      </w:r>
-    </w:p>
-    <w:p>
-      <w:r>
-        <w:rPr>
-          <w:rFonts w:ascii="Calibri" w:hAnsi="Calibri" w:eastAsia="Calibri"/>
-          <w:b/>
-          <w:color w:val="2D6A4F"/>
-          <w:sz w:val="26"/>
-        </w:rPr>
-        <w:t>1.11 Company and product overview</w:t>
-      </w:r>
-    </w:p>
-    <w:p>
-      <w:r>
-        <w:rPr>
-          <w:rFonts w:ascii="Calibri" w:hAnsi="Calibri" w:eastAsia="Calibri"/>
-          <w:b/>
-          <w:color w:val="1B4332"/>
-          <w:sz w:val="22"/>
-        </w:rPr>
-        <w:t>Paste:</w:t>
-      </w:r>
-    </w:p>
-    <w:p>
-      <w:r>
-        <w:rPr>
-          <w:rFonts w:ascii="Calibri" w:hAnsi="Calibri" w:eastAsia="Calibri"/>
-          <w:b w:val="0"/>
-          <w:color w:val="1B4332"/>
-          <w:sz w:val="22"/>
-        </w:rPr>
-        <w:t>CleantechHUB is a climate innovation organization in Latin America. Its public site is https://cleantechhub.net.</w:t>
-      </w:r>
-    </w:p>
-    <w:p>
-      <w:r>
-        <w:rPr>
-          <w:rFonts w:ascii="Calibri" w:hAnsi="Calibri" w:eastAsia="Calibri"/>
-          <w:b w:val="0"/>
-          <w:color w:val="1B4332"/>
-          <w:sz w:val="22"/>
-        </w:rPr>
-        <w:t>This application is not sold to other companies. It is CleantechHUB’s own publishing workflow.</w:t>
-      </w:r>
-    </w:p>
-    <w:p>
-      <w:r>
-        <w:rPr>
-          <w:rFonts w:ascii="Calibri" w:hAnsi="Calibri" w:eastAsia="Calibri"/>
-          <w:b w:val="0"/>
-          <w:color w:val="1B4332"/>
-          <w:sz w:val="22"/>
-        </w:rPr>
-        <w:t>The workflow posts CleantechHUB content to the CleantechHUB Page, then reads that Page’s results.</w:t>
-      </w:r>
-    </w:p>
-    <w:p>
-      <w:r>
-        <w:rPr>
-          <w:rFonts w:ascii="Calibri" w:hAnsi="Calibri" w:eastAsia="Calibri"/>
-          <w:b w:val="0"/>
-          <w:color w:val="1B4332"/>
-          <w:sz w:val="22"/>
-        </w:rPr>
-        <w:t>No third-party Pages are connected. No ads account is connected.</w:t>
-      </w:r>
-    </w:p>
-    <w:p>
-      <w:r>
-        <w:rPr>
-          <w:rFonts w:ascii="Calibri" w:hAnsi="Calibri" w:eastAsia="Calibri"/>
-          <w:b/>
-          <w:color w:val="2D6A4F"/>
-          <w:sz w:val="26"/>
-        </w:rPr>
-        <w:t>1.12 How the data is used</w:t>
-      </w:r>
-    </w:p>
-    <w:p>
-      <w:r>
-        <w:rPr>
-          <w:rFonts w:ascii="Calibri" w:hAnsi="Calibri" w:eastAsia="Calibri"/>
-          <w:b/>
-          <w:color w:val="1B4332"/>
-          <w:sz w:val="22"/>
-        </w:rPr>
-        <w:t>Paste:</w:t>
-      </w:r>
-    </w:p>
-    <w:p>
-      <w:r>
-        <w:rPr>
-          <w:rFonts w:ascii="Calibri" w:hAnsi="Calibri" w:eastAsia="Calibri"/>
-          <w:b w:val="0"/>
-          <w:color w:val="1B4332"/>
-          <w:sz w:val="22"/>
-        </w:rPr>
-        <w:t>We use organization posts we created so the Page can show CleantechHUB jobs, programs, and newsletters.</w:t>
-      </w:r>
-    </w:p>
-    <w:p>
-      <w:r>
-        <w:rPr>
-          <w:rFonts w:ascii="Calibri" w:hAnsi="Calibri" w:eastAsia="Calibri"/>
-          <w:b w:val="0"/>
-          <w:color w:val="1B4332"/>
-          <w:sz w:val="22"/>
-        </w:rPr>
-        <w:t>We use our own post ids so the workflow can avoid duplicate posts and can fetch analytics for those posts.</w:t>
-      </w:r>
-    </w:p>
-    <w:p>
-      <w:r>
-        <w:rPr>
-          <w:rFonts w:ascii="Calibri" w:hAnsi="Calibri" w:eastAsia="Calibri"/>
-          <w:b w:val="0"/>
-          <w:color w:val="1B4332"/>
-          <w:sz w:val="22"/>
-        </w:rPr>
-        <w:t>We use aggregate Page analytics so CleantechHUB staff can see how our own posts performed. The figures are impressions, clicks, reactions, comments, shares, follower counts, and page views.</w:t>
-      </w:r>
-    </w:p>
-    <w:p>
-      <w:r>
-        <w:rPr>
-          <w:rFonts w:ascii="Calibri" w:hAnsi="Calibri" w:eastAsia="Calibri"/>
-          <w:b w:val="0"/>
-          <w:color w:val="1B4332"/>
-          <w:sz w:val="22"/>
-        </w:rPr>
-        <w:t>We display comments on our own posts only to CleantechHUB people who manage that Page.</w:t>
-      </w:r>
-    </w:p>
-    <w:p>
-      <w:r>
-        <w:rPr>
-          <w:rFonts w:ascii="Calibri" w:hAnsi="Calibri" w:eastAsia="Calibri"/>
-          <w:b w:val="0"/>
-          <w:color w:val="1B4332"/>
-          <w:sz w:val="22"/>
-        </w:rPr>
-        <w:t>We request only the member data required to show that a comment exists. We do not export member data. We do not build member profiles. We do not enrich any other database.</w:t>
-      </w:r>
-    </w:p>
-    <w:p>
-      <w:r>
-        <w:rPr>
-          <w:rFonts w:ascii="Calibri" w:hAnsi="Calibri" w:eastAsia="Calibri"/>
-          <w:b/>
-          <w:color w:val="2D6A4F"/>
-          <w:sz w:val="26"/>
-        </w:rPr>
-        <w:t>1.13 How the data is stored</w:t>
-      </w:r>
-    </w:p>
-    <w:p>
-      <w:r>
-        <w:rPr>
-          <w:rFonts w:ascii="Calibri" w:hAnsi="Calibri" w:eastAsia="Calibri"/>
-          <w:b/>
-          <w:color w:val="1B4332"/>
-          <w:sz w:val="22"/>
-        </w:rPr>
-        <w:t>Paste:</w:t>
-      </w:r>
-    </w:p>
-    <w:p>
-      <w:r>
-        <w:rPr>
-          <w:rFonts w:ascii="Calibri" w:hAnsi="Calibri" w:eastAsia="Calibri"/>
-          <w:b w:val="0"/>
-          <w:color w:val="1B4332"/>
-          <w:sz w:val="22"/>
-        </w:rPr>
-        <w:t>Data stays inside CleantechHUB’s own n8n workflow. OVH hosts that workflow in Germany, the same host and country as https://cleantechhub.net. OVH’s data processing terms cover that hosting. Deletion follows the periods below.</w:t>
-      </w:r>
-    </w:p>
-    <w:p>
-      <w:r>
-        <w:rPr>
-          <w:rFonts w:ascii="Calibri" w:hAnsi="Calibri" w:eastAsia="Calibri"/>
-          <w:b w:val="0"/>
-          <w:color w:val="1B4332"/>
-          <w:sz w:val="22"/>
-        </w:rPr>
-        <w:t>Storage follows the LinkedIn Marketing API data storage requirements.</w:t>
-      </w:r>
-    </w:p>
-    <w:p>
-      <w:r>
-        <w:rPr>
-          <w:rFonts w:ascii="Calibri" w:hAnsi="Calibri" w:eastAsia="Calibri"/>
-          <w:b w:val="0"/>
-          <w:color w:val="1B4332"/>
-          <w:sz w:val="22"/>
-        </w:rPr>
-        <w:t>Posts and other social activity by our own Page may be stored for up to six months, because the Page authenticates into this app. The shorter public cap, where the organization has not authenticated, is six weeks.</w:t>
-      </w:r>
-    </w:p>
-    <w:p>
-      <w:r>
-        <w:rPr>
-          <w:rFonts w:ascii="Calibri" w:hAnsi="Calibri" w:eastAsia="Calibri"/>
-          <w:b w:val="0"/>
-          <w:color w:val="1B4332"/>
-          <w:sz w:val="22"/>
-        </w:rPr>
-        <w:t>Aggregate Page admin and reporting data, with no individual member record, may be stored for up to one year. This includes follower counts and summaries of social actions.</w:t>
-      </w:r>
-    </w:p>
-    <w:p>
-      <w:r>
-        <w:rPr>
-          <w:rFonts w:ascii="Calibri" w:hAnsi="Calibri" w:eastAsia="Calibri"/>
-          <w:b w:val="0"/>
-          <w:color w:val="1B4332"/>
-          <w:sz w:val="22"/>
-        </w:rPr>
-        <w:t>Our Page’s name and logo URL may be stored for up to eight weeks while the Page is authenticated.</w:t>
-      </w:r>
-    </w:p>
-    <w:p>
-      <w:r>
-        <w:rPr>
-          <w:rFonts w:ascii="Calibri" w:hAnsi="Calibri" w:eastAsia="Calibri"/>
-          <w:b w:val="0"/>
-          <w:color w:val="1B4332"/>
-          <w:sz w:val="22"/>
-        </w:rPr>
-        <w:t>Ids for the organization, our posts, and social actions may be kept with no LinkedIn time cap.</w:t>
-      </w:r>
-    </w:p>
-    <w:p>
-      <w:r>
-        <w:rPr>
-          <w:rFonts w:ascii="Calibri" w:hAnsi="Calibri" w:eastAsia="Calibri"/>
-          <w:b w:val="0"/>
-          <w:color w:val="1B4332"/>
-          <w:sz w:val="22"/>
-        </w:rPr>
-        <w:t>The signed-in Page admin’s person id and basic profile may be kept with no LinkedIn time cap. We keep them only to hold that admin’s authorization.</w:t>
-      </w:r>
-    </w:p>
-    <w:p>
-      <w:r>
-        <w:rPr>
-          <w:rFonts w:ascii="Calibri" w:hAnsi="Calibri" w:eastAsia="Calibri"/>
-          <w:b w:val="0"/>
-          <w:color w:val="1B4332"/>
-          <w:sz w:val="22"/>
-        </w:rPr>
-        <w:t>Content of member comments, reactions, and other member social activity is kept for no more than 48 hours, then deleted.</w:t>
-      </w:r>
-    </w:p>
-    <w:p>
-      <w:r>
-        <w:rPr>
-          <w:rFonts w:ascii="Calibri" w:hAnsi="Calibri" w:eastAsia="Calibri"/>
-          <w:b w:val="0"/>
-          <w:color w:val="1B4332"/>
-          <w:sz w:val="22"/>
-        </w:rPr>
-        <w:t>Profile fields of members who did not sign in are cached for no more than 24 hours. Examples are a commenter’s name, photo, or headline. They are not stored.</w:t>
-      </w:r>
-    </w:p>
-    <w:p>
-      <w:r>
-        <w:rPr>
-          <w:rFonts w:ascii="Calibri" w:hAnsi="Calibri" w:eastAsia="Calibri"/>
-          <w:b w:val="0"/>
-          <w:color w:val="1B4332"/>
-          <w:sz w:val="22"/>
-        </w:rPr>
-        <w:t>We delete stored member data when the admin asks, and when LinkedIn asks. On termination of the Marketing API terms, member data is deleted immediately, except lead-form and Page-messaging data, which this app does not collect.</w:t>
-      </w:r>
-    </w:p>
-    <w:p>
-      <w:r>
-        <w:rPr>
-          <w:rFonts w:ascii="Calibri" w:hAnsi="Calibri" w:eastAsia="Calibri"/>
-          <w:b/>
-          <w:color w:val="2D6A4F"/>
-          <w:sz w:val="26"/>
-        </w:rPr>
-        <w:t>1.14 Scopes and why</w:t>
-      </w:r>
-    </w:p>
-    <w:p>
-      <w:r>
-        <w:rPr>
-          <w:rFonts w:ascii="Calibri" w:hAnsi="Calibri" w:eastAsia="Calibri"/>
-          <w:b w:val="0"/>
-          <w:color w:val="1B4332"/>
-          <w:sz w:val="22"/>
-        </w:rPr>
-        <w:t xml:space="preserve">Request the </w:t>
-      </w:r>
-      <w:r>
-        <w:rPr>
-          <w:rFonts w:ascii="Calibri" w:hAnsi="Calibri" w:eastAsia="Calibri"/>
-          <w:b/>
-          <w:color w:val="1B4332"/>
-          <w:sz w:val="22"/>
-        </w:rPr>
-        <w:t>Community Management API</w:t>
-      </w:r>
-      <w:r>
-        <w:rPr>
-          <w:rFonts w:ascii="Calibri" w:hAnsi="Calibri" w:eastAsia="Calibri"/>
-          <w:b w:val="0"/>
-          <w:color w:val="1B4332"/>
-          <w:sz w:val="22"/>
-        </w:rPr>
-        <w:t xml:space="preserve"> product. Approval grants a bundle of scopes to the app. In the OAuth (Open Authorization) consent call, ask only for the three scopes below. Marketing permissions are three-legged. A member must sign in. Client-credentials access is not available.</w:t>
-      </w:r>
-    </w:p>
-    <w:p>
-      <w:r>
-        <w:rPr>
-          <w:rFonts w:ascii="Calibri" w:hAnsi="Calibri" w:eastAsia="Calibri"/>
-          <w:b/>
-          <w:color w:val="1B4332"/>
-          <w:sz w:val="22"/>
-        </w:rPr>
-        <w:t>Paste:</w:t>
-      </w:r>
-    </w:p>
-    <w:p>
-      <w:r>
-        <w:rPr>
-          <w:rFonts w:ascii="Calibri" w:hAnsi="Calibri" w:eastAsia="Calibri"/>
-          <w:b w:val="0"/>
-          <w:color w:val="1B4332"/>
-          <w:sz w:val="22"/>
-        </w:rPr>
-        <w:t>We need three scopes, and we will request only these three in the member consent screen.</w:t>
-      </w:r>
-    </w:p>
-    <w:p>
-      <w:r>
-        <w:rPr>
-          <w:rFonts w:ascii="Calibri" w:hAnsi="Calibri" w:eastAsia="Calibri"/>
-          <w:b w:val="0"/>
-          <w:color w:val="1B4332"/>
-          <w:sz w:val="22"/>
-        </w:rPr>
-        <w:t>w_organization_social. This scope posts, comments, and likes as the organization. We use it to publish CleantechHUB jobs, programs, and newsletters as the Page. The signed-in member must be an ADMINISTRATOR, a DIRECT_SPONSORED_CONTENT_POSTER, or a CONTENT_ADMIN. Source: Posts API.</w:t>
-      </w:r>
-    </w:p>
-    <w:p>
-      <w:r>
-        <w:rPr>
-          <w:rFonts w:ascii="Calibri" w:hAnsi="Calibri" w:eastAsia="Calibri"/>
-          <w:b w:val="0"/>
-          <w:color w:val="1B4332"/>
-          <w:sz w:val="22"/>
-        </w:rPr>
-        <w:t>r_organization_social. This scope reads the organization’s posts, comments, and likes. We use it to read our own Page’s posts and comments. The same Page roles apply. Source: Posts API.</w:t>
-      </w:r>
-    </w:p>
-    <w:p>
-      <w:r>
-        <w:rPr>
-          <w:rFonts w:ascii="Calibri" w:hAnsi="Calibri" w:eastAsia="Calibri"/>
-          <w:b w:val="0"/>
-          <w:color w:val="1B4332"/>
-          <w:sz w:val="22"/>
-        </w:rPr>
-        <w:t>rw_organization_admin. This scope manages organization pages and retrieves reporting data. We use it for aggregate post analytics, follower statistics, and page statistics. The signed-in member must be an ADMINISTRATOR. Sources: Organization Share Statistics, Organization Follower Statistics, Organization Page Statistics, and Organization Lookup. Total follower count uses networkSizes on the Organization Lookup page, under this same permission.</w:t>
-      </w:r>
-    </w:p>
-    <w:p>
-      <w:r>
-        <w:rPr>
-          <w:rFonts w:ascii="Calibri" w:hAnsi="Calibri" w:eastAsia="Calibri"/>
-          <w:b w:val="0"/>
-          <w:color w:val="1B4332"/>
-          <w:sz w:val="22"/>
-        </w:rPr>
-        <w:t>We do not need r_organization_followers for analytics. The docs describe that scope as follower data so an organization can mention followers in posts. We will not mention followers. We will not request that scope.</w:t>
-      </w:r>
-    </w:p>
-    <w:p>
-      <w:r>
-        <w:rPr>
-          <w:rFonts w:ascii="Calibri" w:hAnsi="Calibri" w:eastAsia="Calibri"/>
-          <w:b w:val="0"/>
-          <w:color w:val="1B4332"/>
-          <w:sz w:val="22"/>
-        </w:rPr>
-        <w:t>We do not need r_organization_admin. That scope is listed on the Advertising API and the Lead Sync API. It is not in the Community Management permission list. Page analytics on Community Management uses rw_organization_admin. We are not applying for the Advertising API.</w:t>
-      </w:r>
-    </w:p>
-    <w:p>
-      <w:r>
-        <w:rPr>
-          <w:rFonts w:ascii="Calibri" w:hAnsi="Calibri" w:eastAsia="Calibri"/>
-          <w:b w:val="0"/>
-          <w:color w:val="1B4332"/>
-          <w:sz w:val="22"/>
-        </w:rPr>
-        <w:t>The Community Management product also makes other scopes available on the app. We will not request them in OAuth, and we will not call them.</w:t>
+        <w:t>w_member_social</w:t>
       </w:r>
     </w:p>
     <w:p>
@@ -2009,7 +1913,7 @@
           <w:color w:val="1B4332"/>
           <w:sz w:val="22"/>
         </w:rPr>
-        <w:t>r_1st_connections_size</w:t>
+        <w:t>w_member_social_feed</w:t>
       </w:r>
     </w:p>
     <w:p>
@@ -2023,7 +1927,7 @@
           <w:color w:val="1B4332"/>
           <w:sz w:val="22"/>
         </w:rPr>
-        <w:t>r_basicprofile</w:t>
+        <w:t>w_organization_social_feed</w:t>
       </w:r>
     </w:p>
     <w:p>
@@ -2037,7 +1941,7 @@
           <w:color w:val="1B4332"/>
           <w:sz w:val="22"/>
         </w:rPr>
-        <w:t>r_organization_social_feed</w:t>
+        <w:t>r_member_profileAnalytics</w:t>
       </w:r>
     </w:p>
     <w:p>
@@ -2051,62 +1955,6 @@
           <w:color w:val="1B4332"/>
           <w:sz w:val="22"/>
         </w:rPr>
-        <w:t>w_member_social</w:t>
-      </w:r>
-    </w:p>
-    <w:p>
-      <w:pPr>
-        <w:pStyle w:val="ListBullet"/>
-      </w:pPr>
-      <w:r>
-        <w:rPr>
-          <w:rFonts w:ascii="Calibri" w:hAnsi="Calibri" w:eastAsia="Calibri"/>
-          <w:b w:val="0"/>
-          <w:color w:val="1B4332"/>
-          <w:sz w:val="22"/>
-        </w:rPr>
-        <w:t>w_member_social_feed</w:t>
-      </w:r>
-    </w:p>
-    <w:p>
-      <w:pPr>
-        <w:pStyle w:val="ListBullet"/>
-      </w:pPr>
-      <w:r>
-        <w:rPr>
-          <w:rFonts w:ascii="Calibri" w:hAnsi="Calibri" w:eastAsia="Calibri"/>
-          <w:b w:val="0"/>
-          <w:color w:val="1B4332"/>
-          <w:sz w:val="22"/>
-        </w:rPr>
-        <w:t>w_organization_social_feed</w:t>
-      </w:r>
-    </w:p>
-    <w:p>
-      <w:pPr>
-        <w:pStyle w:val="ListBullet"/>
-      </w:pPr>
-      <w:r>
-        <w:rPr>
-          <w:rFonts w:ascii="Calibri" w:hAnsi="Calibri" w:eastAsia="Calibri"/>
-          <w:b w:val="0"/>
-          <w:color w:val="1B4332"/>
-          <w:sz w:val="22"/>
-        </w:rPr>
-        <w:t>r_member_profileAnalytics</w:t>
-      </w:r>
-    </w:p>
-    <w:p>
-      <w:pPr>
-        <w:pStyle w:val="ListBullet"/>
-      </w:pPr>
-      <w:r>
-        <w:rPr>
-          <w:rFonts w:ascii="Calibri" w:hAnsi="Calibri" w:eastAsia="Calibri"/>
-          <w:b w:val="0"/>
-          <w:color w:val="1B4332"/>
-          <w:sz w:val="22"/>
-        </w:rPr>
         <w:t>r_member_postAnalytics</w:t>
       </w:r>
     </w:p>
@@ -2700,16 +2548,16 @@
           <w:color w:val="1B4332"/>
           <w:sz w:val="22"/>
         </w:rPr>
-        <w:t>A public privacy-policy URL on cleantechhub.net.</w:t>
-      </w:r>
-      <w:r>
-        <w:rPr>
-          <w:rFonts w:ascii="Calibri" w:hAnsi="Calibri" w:eastAsia="Calibri"/>
-          <w:b w:val="0"/>
-          <w:color w:val="1B4332"/>
-          <w:sz w:val="22"/>
-        </w:rPr>
-        <w:t xml:space="preserve"> This is missing today. See the stop notice.</w:t>
+        <w:t>A public privacy-policy URL.</w:t>
+      </w:r>
+      <w:r>
+        <w:rPr>
+          <w:rFonts w:ascii="Calibri" w:hAnsi="Calibri" w:eastAsia="Calibri"/>
+          <w:b w:val="0"/>
+          <w:color w:val="1B4332"/>
+          <w:sz w:val="22"/>
+        </w:rPr>
+        <w:t xml:space="preserve"> Not live. See the stop notice. Do not submit while the only responses are a WordPress 404, the jobs homepage, or an empty agents response.</w:t>
       </w:r>
     </w:p>
     <w:p>
@@ -4971,7 +4819,36 @@
           <w:color w:val="2D6A4F"/>
           <w:sz w:val="32"/>
         </w:rPr>
-        <w:t>7. Unknowns left for Gideon</w:t>
+        <w:t>7. Still only Gideon knows</w:t>
+      </w:r>
+    </w:p>
+    <w:p>
+      <w:r>
+        <w:rPr>
+          <w:rFonts w:ascii="Calibri" w:hAnsi="Calibri" w:eastAsia="Calibri"/>
+          <w:b w:val="0"/>
+          <w:color w:val="1B4332"/>
+          <w:sz w:val="22"/>
+        </w:rPr>
+        <w:t xml:space="preserve">These stay as </w:t>
+      </w:r>
+      <w:r>
+        <w:rPr>
+          <w:rFonts w:ascii="Calibri" w:hAnsi="Calibri" w:eastAsia="Calibri"/>
+          <w:b w:val="0"/>
+          <w:color w:val="1B4332"/>
+          <w:sz w:val="22"/>
+        </w:rPr>
+        <w:t>[GIDEON TO FILL]</w:t>
+      </w:r>
+      <w:r>
+        <w:rPr>
+          <w:rFonts w:ascii="Calibri" w:hAnsi="Calibri" w:eastAsia="Calibri"/>
+          <w:b w:val="0"/>
+          <w:color w:val="1B4332"/>
+          <w:sz w:val="22"/>
+        </w:rPr>
+        <w:t>. They are not on the public site, and they were not in the approval of 22 October 2026.</w:t>
       </w:r>
     </w:p>
     <w:p>
@@ -4985,25 +4862,7 @@
           <w:color w:val="1B4332"/>
           <w:sz w:val="22"/>
         </w:rPr>
-        <w:t xml:space="preserve">Privacy-policy URL on cleantechhub.net. The draft exists. The live URL is still missing until he publishes </w:t>
-      </w:r>
-      <w:r>
-        <w:rPr>
-          <w:rFonts w:ascii="Calibri" w:hAnsi="Calibri" w:eastAsia="Calibri"/>
-          <w:b w:val="0"/>
-          <w:color w:val="1B4332"/>
-          <w:sz w:val="22"/>
-        </w:rPr>
-        <w:t>https://cleantechhub.net/politica-de-privacidad/</w:t>
-      </w:r>
-      <w:r>
-        <w:rPr>
-          <w:rFonts w:ascii="Calibri" w:hAnsi="Calibri" w:eastAsia="Calibri"/>
-          <w:b w:val="0"/>
-          <w:color w:val="1B4332"/>
-          <w:sz w:val="22"/>
-        </w:rPr>
-        <w:t>.</w:t>
+        <w:t>LinkedIn Page URL.</w:t>
       </w:r>
     </w:p>
     <w:p>
@@ -5017,7 +4876,7 @@
           <w:color w:val="1B4332"/>
           <w:sz w:val="22"/>
         </w:rPr>
-        <w:t>Business mailbox, if he cannot receive mail at gideon.blaauw@cleantechhub.net. The privacy contact admin@cleantechhub.net is already filled in the public policy.</w:t>
+        <w:t>LinkedIn organization id.</w:t>
       </w:r>
     </w:p>
     <w:p>
@@ -5031,7 +4890,7 @@
           <w:color w:val="1B4332"/>
           <w:sz w:val="22"/>
         </w:rPr>
-        <w:t>LinkedIn Page URL and organization id.</w:t>
+        <w:t>Page super admin who will open the verification URL.</w:t>
       </w:r>
     </w:p>
     <w:p>
@@ -5045,7 +4904,7 @@
           <w:color w:val="1B4332"/>
           <w:sz w:val="22"/>
         </w:rPr>
-        <w:t>Page super admin name, and the member who will grant the token.</w:t>
+        <w:t>LinkedIn member who will sign in and grant the token, if that person is not the super admin. The legal-representative title does not prove the Page role.</w:t>
       </w:r>
     </w:p>
     <w:p>
@@ -5073,7 +4932,25 @@
           <w:color w:val="1B4332"/>
           <w:sz w:val="22"/>
         </w:rPr>
-        <w:t>Confirm the live n8n workflow deletes on the periods in section 1.13. Host and country are OVH in Germany.</w:t>
+        <w:t xml:space="preserve">The new app’s Client ID, after he creates </w:t>
+      </w:r>
+      <w:r>
+        <w:rPr>
+          <w:rFonts w:ascii="Calibri" w:hAnsi="Calibri" w:eastAsia="Calibri"/>
+          <w:b/>
+          <w:color w:val="1B4332"/>
+          <w:sz w:val="22"/>
+        </w:rPr>
+        <w:t>CleantechHUB n8n</w:t>
+      </w:r>
+      <w:r>
+        <w:rPr>
+          <w:rFonts w:ascii="Calibri" w:hAnsi="Calibri" w:eastAsia="Calibri"/>
+          <w:b w:val="0"/>
+          <w:color w:val="1B4332"/>
+          <w:sz w:val="22"/>
+        </w:rPr>
+        <w:t>.</w:t>
       </w:r>
     </w:p>
     <w:p>
@@ -5087,21 +4964,276 @@
           <w:color w:val="1B4332"/>
           <w:sz w:val="22"/>
         </w:rPr>
-        <w:t>The new app’s Client ID, after he creates it.</w:t>
+        <w:t>Standard-tier test credentials, later. Do not put a live password in this file.</w:t>
       </w:r>
     </w:p>
     <w:p>
-      <w:pPr>
-        <w:pStyle w:val="ListBullet"/>
-      </w:pPr>
-      <w:r>
-        <w:rPr>
-          <w:rFonts w:ascii="Calibri" w:hAnsi="Calibri" w:eastAsia="Calibri"/>
-          <w:b w:val="0"/>
-          <w:color w:val="1B4332"/>
-          <w:sz w:val="22"/>
-        </w:rPr>
-        <w:t>Standard-tier test credentials, later.</w:t>
+      <w:r>
+        <w:rPr>
+          <w:rFonts w:ascii="Calibri" w:hAnsi="Calibri" w:eastAsia="Calibri"/>
+          <w:b w:val="0"/>
+          <w:color w:val="1B4332"/>
+          <w:sz w:val="22"/>
+        </w:rPr>
+        <w:t>Already filled, so no longer blank: legal name FUNDACIÓN CLEANTECH HUB (ESAL), NIT 901.523.941-9, Calle 90 No. 19-41 Of. 801, Bogotá D.C., admin@cleantechhub.net, +57 313 715 5965, and website https://cleantechhub.net. n8n host country is Germany, on OVH. The privacy URL is not filled, because no page is live.</w:t>
+      </w:r>
+    </w:p>
+    <w:p>
+      <w:r>
+        <w:rPr>
+          <w:rFonts w:ascii="Calibri" w:hAnsi="Calibri" w:eastAsia="Calibri"/>
+          <w:b w:val="0"/>
+          <w:color w:val="1B4332"/>
+          <w:sz w:val="22"/>
+        </w:rPr>
+        <w:t xml:space="preserve">Open item, not fixed: the </w:t>
+      </w:r>
+      <w:r>
+        <w:rPr>
+          <w:rFonts w:ascii="Calibri" w:hAnsi="Calibri" w:eastAsia="Calibri"/>
+          <w:b w:val="0"/>
+          <w:color w:val="1B4332"/>
+          <w:sz w:val="22"/>
+        </w:rPr>
+        <w:t>/diagnostico</w:t>
+      </w:r>
+      <w:r>
+        <w:rPr>
+          <w:rFonts w:ascii="Calibri" w:hAnsi="Calibri" w:eastAsia="Calibri"/>
+          <w:b w:val="0"/>
+          <w:color w:val="1B4332"/>
+          <w:sz w:val="22"/>
+        </w:rPr>
+        <w:t xml:space="preserve"> checkbox still loads checked. That change needs WordPress admin.</w:t>
+      </w:r>
+    </w:p>
+    <w:p>
+      <w:r>
+        <w:rPr>
+          <w:rFonts w:ascii="Calibri" w:hAnsi="Calibri" w:eastAsia="Calibri"/>
+          <w:b/>
+          <w:color w:val="2D6A4F"/>
+          <w:sz w:val="32"/>
+        </w:rPr>
+        <w:t>8. Final submit steps</w:t>
+      </w:r>
+    </w:p>
+    <w:p>
+      <w:r>
+        <w:rPr>
+          <w:rFonts w:ascii="Calibri" w:hAnsi="Calibri" w:eastAsia="Calibri"/>
+          <w:b w:val="0"/>
+          <w:color w:val="1B4332"/>
+          <w:sz w:val="22"/>
+        </w:rPr>
+        <w:t>Do these on Gideon’s own device. Do not submit until the privacy URL returns 200 without a login and the body is this policy.</w:t>
+      </w:r>
+    </w:p>
+    <w:p>
+      <w:r>
+        <w:rPr>
+          <w:rFonts w:ascii="Calibri" w:hAnsi="Calibri" w:eastAsia="Calibri"/>
+          <w:b w:val="0"/>
+          <w:color w:val="1B4332"/>
+          <w:sz w:val="22"/>
+        </w:rPr>
+        <w:t>1. Publish the approved HTML on an existing host (</w:t>
+      </w:r>
+      <w:r>
+        <w:rPr>
+          <w:rFonts w:ascii="Calibri" w:hAnsi="Calibri" w:eastAsia="Calibri"/>
+          <w:b w:val="0"/>
+          <w:color w:val="1B4332"/>
+          <w:sz w:val="22"/>
+        </w:rPr>
+        <w:t>jobs.cleantechhub.net</w:t>
+      </w:r>
+      <w:r>
+        <w:rPr>
+          <w:rFonts w:ascii="Calibri" w:hAnsi="Calibri" w:eastAsia="Calibri"/>
+          <w:b w:val="0"/>
+          <w:color w:val="1B4332"/>
+          <w:sz w:val="22"/>
+        </w:rPr>
+        <w:t xml:space="preserve"> or </w:t>
+      </w:r>
+      <w:r>
+        <w:rPr>
+          <w:rFonts w:ascii="Calibri" w:hAnsi="Calibri" w:eastAsia="Calibri"/>
+          <w:b w:val="0"/>
+          <w:color w:val="1B4332"/>
+          <w:sz w:val="22"/>
+        </w:rPr>
+        <w:t>agents.cleantechhub.net</w:t>
+      </w:r>
+      <w:r>
+        <w:rPr>
+          <w:rFonts w:ascii="Calibri" w:hAnsi="Calibri" w:eastAsia="Calibri"/>
+          <w:b w:val="0"/>
+          <w:color w:val="1B4332"/>
+          <w:sz w:val="22"/>
+        </w:rPr>
+        <w:t xml:space="preserve">) at </w:t>
+      </w:r>
+      <w:r>
+        <w:rPr>
+          <w:rFonts w:ascii="Calibri" w:hAnsi="Calibri" w:eastAsia="Calibri"/>
+          <w:b w:val="0"/>
+          <w:color w:val="1B4332"/>
+          <w:sz w:val="22"/>
+        </w:rPr>
+        <w:t>/privacidad/</w:t>
+      </w:r>
+      <w:r>
+        <w:rPr>
+          <w:rFonts w:ascii="Calibri" w:hAnsi="Calibri" w:eastAsia="Calibri"/>
+          <w:b w:val="0"/>
+          <w:color w:val="1B4332"/>
+          <w:sz w:val="22"/>
+        </w:rPr>
+        <w:t xml:space="preserve">, with </w:t>
+      </w:r>
+      <w:r>
+        <w:rPr>
+          <w:rFonts w:ascii="Calibri" w:hAnsi="Calibri" w:eastAsia="Calibri"/>
+          <w:b w:val="0"/>
+          <w:color w:val="1B4332"/>
+          <w:sz w:val="22"/>
+        </w:rPr>
+        <w:t>/privacy</w:t>
+      </w:r>
+      <w:r>
+        <w:rPr>
+          <w:rFonts w:ascii="Calibri" w:hAnsi="Calibri" w:eastAsia="Calibri"/>
+          <w:b w:val="0"/>
+          <w:color w:val="1B4332"/>
+          <w:sz w:val="22"/>
+        </w:rPr>
+        <w:t xml:space="preserve"> redirecting there. That publish did not happen from this run. It needs an Infisical secret that can write to the Caddy host </w:t>
+      </w:r>
+      <w:r>
+        <w:rPr>
+          <w:rFonts w:ascii="Calibri" w:hAnsi="Calibri" w:eastAsia="Calibri"/>
+          <w:b w:val="0"/>
+          <w:color w:val="1B4332"/>
+          <w:sz w:val="22"/>
+        </w:rPr>
+        <w:t>51.195.45.77</w:t>
+      </w:r>
+      <w:r>
+        <w:rPr>
+          <w:rFonts w:ascii="Calibri" w:hAnsi="Calibri" w:eastAsia="Calibri"/>
+          <w:b w:val="0"/>
+          <w:color w:val="1B4332"/>
+          <w:sz w:val="22"/>
+        </w:rPr>
+        <w:t>. Set the effective date on the day it actually goes live.</w:t>
+      </w:r>
+    </w:p>
+    <w:p>
+      <w:r>
+        <w:rPr>
+          <w:rFonts w:ascii="Calibri" w:hAnsi="Calibri" w:eastAsia="Calibri"/>
+          <w:b w:val="0"/>
+          <w:color w:val="1B4332"/>
+          <w:sz w:val="22"/>
+        </w:rPr>
+        <w:t>2. Open the live URL in a private window. Confirm HTTP 200, valid TLS, and no login wall.</w:t>
+      </w:r>
+    </w:p>
+    <w:p>
+      <w:r>
+        <w:rPr>
+          <w:rFonts w:ascii="Calibri" w:hAnsi="Calibri" w:eastAsia="Calibri"/>
+          <w:b w:val="0"/>
+          <w:color w:val="1B4332"/>
+          <w:sz w:val="22"/>
+        </w:rPr>
+        <w:t>3. Open https://www.linkedin.com/developers/apps and sign in with Gideon’s own LinkedIn account.</w:t>
+      </w:r>
+    </w:p>
+    <w:p>
+      <w:r>
+        <w:rPr>
+          <w:rFonts w:ascii="Calibri" w:hAnsi="Calibri" w:eastAsia="Calibri"/>
+          <w:b w:val="0"/>
+          <w:color w:val="1B4332"/>
+          <w:sz w:val="22"/>
+        </w:rPr>
+        <w:t xml:space="preserve">4. Create the app </w:t>
+      </w:r>
+      <w:r>
+        <w:rPr>
+          <w:rFonts w:ascii="Calibri" w:hAnsi="Calibri" w:eastAsia="Calibri"/>
+          <w:b/>
+          <w:color w:val="1B4332"/>
+          <w:sz w:val="22"/>
+        </w:rPr>
+        <w:t>CleantechHUB n8n</w:t>
+      </w:r>
+      <w:r>
+        <w:rPr>
+          <w:rFonts w:ascii="Calibri" w:hAnsi="Calibri" w:eastAsia="Calibri"/>
+          <w:b w:val="0"/>
+          <w:color w:val="1B4332"/>
+          <w:sz w:val="22"/>
+        </w:rPr>
+        <w:t>. Select the CleantechHUB Page. Paste the live privacy URL. Add no other product.</w:t>
+      </w:r>
+    </w:p>
+    <w:p>
+      <w:r>
+        <w:rPr>
+          <w:rFonts w:ascii="Calibri" w:hAnsi="Calibri" w:eastAsia="Calibri"/>
+          <w:b w:val="0"/>
+          <w:color w:val="1B4332"/>
+          <w:sz w:val="22"/>
+        </w:rPr>
+        <w:t>5. Settings → Verify → Generate URL → send it to the Page super admin. The super admin approves within 30 days.</w:t>
+      </w:r>
+    </w:p>
+    <w:p>
+      <w:r>
+        <w:rPr>
+          <w:rFonts w:ascii="Calibri" w:hAnsi="Calibri" w:eastAsia="Calibri"/>
+          <w:b w:val="0"/>
+          <w:color w:val="1B4332"/>
+          <w:sz w:val="22"/>
+        </w:rPr>
+        <w:t>6. Products → Request access for the Community Management API. Paste section 1. Use admin@cleantechhub.net. Fill only the blanks in section 7.</w:t>
+      </w:r>
+    </w:p>
+    <w:p>
+      <w:r>
+        <w:rPr>
+          <w:rFonts w:ascii="Calibri" w:hAnsi="Calibri" w:eastAsia="Calibri"/>
+          <w:b w:val="0"/>
+          <w:color w:val="1B4332"/>
+          <w:sz w:val="22"/>
+        </w:rPr>
+        <w:t>7. Finish the survey within 21 days. Watch Access Form Review, then Identity Vetting.</w:t>
+      </w:r>
+    </w:p>
+    <w:p>
+      <w:r>
+        <w:rPr>
+          <w:rFonts w:ascii="Calibri" w:hAnsi="Calibri" w:eastAsia="Calibri"/>
+          <w:b w:val="0"/>
+          <w:color w:val="1B4332"/>
+          <w:sz w:val="22"/>
+        </w:rPr>
+        <w:t>8. After Development approval, build within 12 months, then apply for Standard tier with the screencast in section 1.17.</w:t>
+      </w:r>
+    </w:p>
+    <w:p>
+      <w:r>
+        <w:rPr>
+          <w:rFonts w:ascii="Calibri" w:hAnsi="Calibri" w:eastAsia="Calibri"/>
+          <w:b w:val="0"/>
+          <w:color w:val="1B4332"/>
+          <w:sz w:val="22"/>
+        </w:rPr>
+        <w:t>The numbered portal detail, with the doc links, is section 3.</w:t>
       </w:r>
     </w:p>
     <w:sectPr>

</xml_diff>

<commit_message>
Match the privacy page to the live jobs URL.
Set the effective date to 22 October 2026 and paste https://jobs.cleantechhub.net/privacidad/ in the LinkedIn access pack.

Co-authored-by: gideonblaauw-creator <gideonblaauw-creator@users.noreply.github.com>
</commit_message>
<xml_diff>
--- a/artifacts/linkedin-cm-api-application.docx
+++ b/artifacts/linkedin-cm-api-application.docx
@@ -238,34 +238,34 @@
           <w:color w:val="1B4332"/>
           <w:sz w:val="22"/>
         </w:rPr>
-        <w:t>Privacy-policy URL: not live.</w:t>
-      </w:r>
-      <w:r>
-        <w:rPr>
-          <w:rFonts w:ascii="Calibri" w:hAnsi="Calibri" w:eastAsia="Calibri"/>
-          <w:b w:val="0"/>
-          <w:color w:val="1B4332"/>
-          <w:sz w:val="22"/>
-        </w:rPr>
-        <w:t xml:space="preserve"> There is no URL to paste yet. Do not submit the access form until a private window returns 200 on a page that is this privacy policy, with valid TLS, and without a login. LinkedIn’s rejection for a missing page is </w:t>
-      </w:r>
-      <w:r>
-        <w:rPr>
-          <w:rFonts w:ascii="Calibri" w:hAnsi="Calibri" w:eastAsia="Calibri"/>
-          <w:b/>
-          <w:color w:val="1B4332"/>
-          <w:sz w:val="22"/>
-        </w:rPr>
-        <w:t>Invalid Privacy Policy</w:t>
-      </w:r>
-      <w:r>
-        <w:rPr>
-          <w:rFonts w:ascii="Calibri" w:hAnsi="Calibri" w:eastAsia="Calibri"/>
-          <w:b w:val="0"/>
-          <w:color w:val="1B4332"/>
-          <w:sz w:val="22"/>
-        </w:rPr>
-        <w:t>. A Development-tier rejection cannot be retried on the same app.</w:t>
+        <w:t>Privacy-policy URL: live.</w:t>
+      </w:r>
+      <w:r>
+        <w:rPr>
+          <w:rFonts w:ascii="Calibri" w:hAnsi="Calibri" w:eastAsia="Calibri"/>
+          <w:b w:val="0"/>
+          <w:color w:val="1B4332"/>
+          <w:sz w:val="22"/>
+        </w:rPr>
+        <w:t xml:space="preserve"> Paste </w:t>
+      </w:r>
+      <w:r>
+        <w:rPr>
+          <w:rFonts w:ascii="Calibri" w:hAnsi="Calibri" w:eastAsia="Calibri"/>
+          <w:b w:val="0"/>
+          <w:color w:val="1B4332"/>
+          <w:sz w:val="22"/>
+        </w:rPr>
+        <w:t>https://jobs.cleantechhub.net/privacidad/</w:t>
+      </w:r>
+      <w:r>
+        <w:rPr>
+          <w:rFonts w:ascii="Calibri" w:hAnsi="Calibri" w:eastAsia="Calibri"/>
+          <w:b w:val="0"/>
+          <w:color w:val="1B4332"/>
+          <w:sz w:val="22"/>
+        </w:rPr>
+        <w:t>.</w:t>
       </w:r>
     </w:p>
     <w:p>
@@ -276,7 +276,1563 @@
           <w:color w:val="1B4332"/>
           <w:sz w:val="22"/>
         </w:rPr>
-        <w:t>Checked on 22 October 2026, without a login:</w:t>
+        <w:t xml:space="preserve">Checked on 22 October 2026, without a login. The page returns HTTP 200. The body is the CleantechHUB privacy policy, with </w:t>
+      </w:r>
+      <w:r>
+        <w:rPr>
+          <w:rFonts w:ascii="Calibri" w:hAnsi="Calibri" w:eastAsia="Calibri"/>
+          <w:b w:val="0"/>
+          <w:color w:val="1B4332"/>
+          <w:sz w:val="22"/>
+        </w:rPr>
+        <w:t>Vigente desde: 22 de octubre de 2026</w:t>
+      </w:r>
+      <w:r>
+        <w:rPr>
+          <w:rFonts w:ascii="Calibri" w:hAnsi="Calibri" w:eastAsia="Calibri"/>
+          <w:b w:val="0"/>
+          <w:color w:val="1B4332"/>
+          <w:sz w:val="22"/>
+        </w:rPr>
+        <w:t xml:space="preserve"> and </w:t>
+      </w:r>
+      <w:r>
+        <w:rPr>
+          <w:rFonts w:ascii="Calibri" w:hAnsi="Calibri" w:eastAsia="Calibri"/>
+          <w:b w:val="0"/>
+          <w:color w:val="1B4332"/>
+          <w:sz w:val="22"/>
+        </w:rPr>
+        <w:t>Effective from: 22 October 2026</w:t>
+      </w:r>
+      <w:r>
+        <w:rPr>
+          <w:rFonts w:ascii="Calibri" w:hAnsi="Calibri" w:eastAsia="Calibri"/>
+          <w:b w:val="0"/>
+          <w:color w:val="1B4332"/>
+          <w:sz w:val="22"/>
+        </w:rPr>
+        <w:t xml:space="preserve">. </w:t>
+      </w:r>
+      <w:r>
+        <w:rPr>
+          <w:rFonts w:ascii="Calibri" w:hAnsi="Calibri" w:eastAsia="Calibri"/>
+          <w:b w:val="0"/>
+          <w:color w:val="1B4332"/>
+          <w:sz w:val="22"/>
+        </w:rPr>
+        <w:t>https://jobs.cleantechhub.net/privacy</w:t>
+      </w:r>
+      <w:r>
+        <w:rPr>
+          <w:rFonts w:ascii="Calibri" w:hAnsi="Calibri" w:eastAsia="Calibri"/>
+          <w:b w:val="0"/>
+          <w:color w:val="1B4332"/>
+          <w:sz w:val="22"/>
+        </w:rPr>
+        <w:t xml:space="preserve"> and </w:t>
+      </w:r>
+      <w:r>
+        <w:rPr>
+          <w:rFonts w:ascii="Calibri" w:hAnsi="Calibri" w:eastAsia="Calibri"/>
+          <w:b w:val="0"/>
+          <w:color w:val="1B4332"/>
+          <w:sz w:val="22"/>
+        </w:rPr>
+        <w:t>https://jobs.cleantechhub.net/privacy/</w:t>
+      </w:r>
+      <w:r>
+        <w:rPr>
+          <w:rFonts w:ascii="Calibri" w:hAnsi="Calibri" w:eastAsia="Calibri"/>
+          <w:b w:val="0"/>
+          <w:color w:val="1B4332"/>
+          <w:sz w:val="22"/>
+        </w:rPr>
+        <w:t xml:space="preserve"> redirect to that URL. TLS is valid. There is no login wall.</w:t>
+      </w:r>
+    </w:p>
+    <w:p>
+      <w:r>
+        <w:rPr>
+          <w:rFonts w:ascii="Calibri" w:hAnsi="Calibri" w:eastAsia="Calibri"/>
+          <w:b w:val="0"/>
+          <w:color w:val="1B4332"/>
+          <w:sz w:val="22"/>
+        </w:rPr>
+        <w:t xml:space="preserve">The organization website stays </w:t>
+      </w:r>
+      <w:r>
+        <w:rPr>
+          <w:rFonts w:ascii="Calibri" w:hAnsi="Calibri" w:eastAsia="Calibri"/>
+          <w:b w:val="0"/>
+          <w:color w:val="1B4332"/>
+          <w:sz w:val="22"/>
+        </w:rPr>
+        <w:t>https://cleantechhub.net</w:t>
+      </w:r>
+      <w:r>
+        <w:rPr>
+          <w:rFonts w:ascii="Calibri" w:hAnsi="Calibri" w:eastAsia="Calibri"/>
+          <w:b w:val="0"/>
+          <w:color w:val="1B4332"/>
+          <w:sz w:val="22"/>
+        </w:rPr>
+        <w:t>. Do not paste the jobs host into the website field.</w:t>
+      </w:r>
+    </w:p>
+    <w:p>
+      <w:r>
+        <w:rPr>
+          <w:rFonts w:ascii="Calibri" w:hAnsi="Calibri" w:eastAsia="Calibri"/>
+          <w:b w:val="0"/>
+          <w:color w:val="1B4332"/>
+          <w:sz w:val="22"/>
+        </w:rPr>
+        <w:t xml:space="preserve">The page was published on the VPS. The file and the redirect are noted in </w:t>
+      </w:r>
+      <w:r>
+        <w:rPr>
+          <w:rFonts w:ascii="Calibri" w:hAnsi="Calibri" w:eastAsia="Calibri"/>
+          <w:b w:val="0"/>
+          <w:color w:val="1B4332"/>
+          <w:sz w:val="22"/>
+        </w:rPr>
+        <w:t>artifacts/jobs-privacidad-deploy.md</w:t>
+      </w:r>
+      <w:r>
+        <w:rPr>
+          <w:rFonts w:ascii="Calibri" w:hAnsi="Calibri" w:eastAsia="Calibri"/>
+          <w:b w:val="0"/>
+          <w:color w:val="1B4332"/>
+          <w:sz w:val="22"/>
+        </w:rPr>
+        <w:t xml:space="preserve">. A later jobs-board </w:t>
+      </w:r>
+      <w:r>
+        <w:rPr>
+          <w:rFonts w:ascii="Calibri" w:hAnsi="Calibri" w:eastAsia="Calibri"/>
+          <w:b w:val="0"/>
+          <w:color w:val="1B4332"/>
+          <w:sz w:val="22"/>
+        </w:rPr>
+        <w:t>rsync --delete</w:t>
+      </w:r>
+      <w:r>
+        <w:rPr>
+          <w:rFonts w:ascii="Calibri" w:hAnsi="Calibri" w:eastAsia="Calibri"/>
+          <w:b w:val="0"/>
+          <w:color w:val="1B4332"/>
+          <w:sz w:val="22"/>
+        </w:rPr>
+        <w:t xml:space="preserve"> can remove the page unless the jobs build source includes it.</w:t>
+      </w:r>
+    </w:p>
+    <w:p>
+      <w:r>
+        <w:rPr>
+          <w:rFonts w:ascii="Calibri" w:hAnsi="Calibri" w:eastAsia="Calibri"/>
+          <w:b w:val="0"/>
+          <w:color w:val="1B4332"/>
+          <w:sz w:val="22"/>
+        </w:rPr>
+        <w:t xml:space="preserve">The </w:t>
+      </w:r>
+      <w:r>
+        <w:rPr>
+          <w:rFonts w:ascii="Calibri" w:hAnsi="Calibri" w:eastAsia="Calibri"/>
+          <w:b w:val="0"/>
+          <w:color w:val="1B4332"/>
+          <w:sz w:val="22"/>
+        </w:rPr>
+        <w:t>/diagnostico</w:t>
+      </w:r>
+      <w:r>
+        <w:rPr>
+          <w:rFonts w:ascii="Calibri" w:hAnsi="Calibri" w:eastAsia="Calibri"/>
+          <w:b w:val="0"/>
+          <w:color w:val="1B4332"/>
+          <w:sz w:val="22"/>
+        </w:rPr>
+        <w:t xml:space="preserve"> green-finance checkbox is still an open item. It was not changed. Fixing it needs WordPress admin.</w:t>
+      </w:r>
+    </w:p>
+    <w:p>
+      <w:r>
+        <w:rPr>
+          <w:rFonts w:ascii="Calibri" w:hAnsi="Calibri" w:eastAsia="Calibri"/>
+          <w:b w:val="0"/>
+          <w:color w:val="1B4332"/>
+          <w:sz w:val="22"/>
+        </w:rPr>
+        <w:t>Do not paste the Google Drive policy PDF into the privacy-policy field. That file is not a page on cleantechhub.net.</w:t>
+      </w:r>
+    </w:p>
+    <w:p>
+      <w:r>
+        <w:rPr>
+          <w:rFonts w:ascii="Calibri" w:hAnsi="Calibri" w:eastAsia="Calibri"/>
+          <w:b w:val="0"/>
+          <w:color w:val="1B4332"/>
+          <w:sz w:val="22"/>
+        </w:rPr>
+        <w:t xml:space="preserve">The worker authorization PDF is also the wrong document. Do not use </w:t>
+      </w:r>
+      <w:r>
+        <w:rPr>
+          <w:rFonts w:ascii="Calibri" w:hAnsi="Calibri" w:eastAsia="Calibri"/>
+          <w:b w:val="0"/>
+          <w:color w:val="1B4332"/>
+          <w:sz w:val="22"/>
+        </w:rPr>
+        <w:t>https://cleantechhub.net/wp-content/uploads/2026/07/Autorizacion-Tratamiento-Datos-Trabajadores.pdf</w:t>
+      </w:r>
+      <w:r>
+        <w:rPr>
+          <w:rFonts w:ascii="Calibri" w:hAnsi="Calibri" w:eastAsia="Calibri"/>
+          <w:b w:val="0"/>
+          <w:color w:val="1B4332"/>
+          <w:sz w:val="22"/>
+        </w:rPr>
+        <w:t>. It is a consent form for workers and contractors. Its street line also disagrees with the website and with the data policy.</w:t>
+      </w:r>
+    </w:p>
+    <w:p>
+      <w:r>
+        <w:rPr>
+          <w:rFonts w:ascii="Calibri" w:hAnsi="Calibri" w:eastAsia="Calibri"/>
+          <w:b/>
+          <w:color w:val="2D6A4F"/>
+          <w:sz w:val="32"/>
+        </w:rPr>
+        <w:t>1. Paste-ready form answers</w:t>
+      </w:r>
+    </w:p>
+    <w:p>
+      <w:r>
+        <w:rPr>
+          <w:rFonts w:ascii="Calibri" w:hAnsi="Calibri" w:eastAsia="Calibri"/>
+          <w:b/>
+          <w:color w:val="2D6A4F"/>
+          <w:sz w:val="26"/>
+        </w:rPr>
+        <w:t>1.1 Which app</w:t>
+      </w:r>
+    </w:p>
+    <w:p>
+      <w:r>
+        <w:rPr>
+          <w:rFonts w:ascii="Calibri" w:hAnsi="Calibri" w:eastAsia="Calibri"/>
+          <w:b/>
+          <w:color w:val="1B4332"/>
+          <w:sz w:val="22"/>
+        </w:rPr>
+        <w:t>Paste if the new app is the one in front of you:</w:t>
+      </w:r>
+    </w:p>
+    <w:p>
+      <w:r>
+        <w:rPr>
+          <w:rFonts w:ascii="Calibri" w:hAnsi="Calibri" w:eastAsia="Calibri"/>
+          <w:b w:val="0"/>
+          <w:color w:val="1B4332"/>
+          <w:sz w:val="22"/>
+        </w:rPr>
+        <w:t>This request is for a new CleantechHUB developer app. Its only product is the Community Management API. The existing app is n8n-li CleantechHUB, Client ID 782xlcklyvbakg. That app already has Sign In with LinkedIn and member posting. Leave that app in place for personal-profile posting.</w:t>
+      </w:r>
+    </w:p>
+    <w:p>
+      <w:r>
+        <w:rPr>
+          <w:rFonts w:ascii="Calibri" w:hAnsi="Calibri" w:eastAsia="Calibri"/>
+          <w:b/>
+          <w:color w:val="1B4332"/>
+          <w:sz w:val="22"/>
+        </w:rPr>
+        <w:t>Why:</w:t>
+      </w:r>
+      <w:r>
+        <w:rPr>
+          <w:rFonts w:ascii="Calibri" w:hAnsi="Calibri" w:eastAsia="Calibri"/>
+          <w:b w:val="0"/>
+          <w:color w:val="1B4332"/>
+          <w:sz w:val="22"/>
+        </w:rPr>
+        <w:t xml:space="preserve"> Community Management must be the only product on the app. If Share, Sign In, or any other product is already on the app, Request access stays grayed out. Source: </w:t>
+      </w:r>
+      <w:r>
+        <w:rPr>
+          <w:rFonts w:ascii="Calibri" w:hAnsi="Calibri" w:eastAsia="Calibri"/>
+          <w:b w:val="0"/>
+          <w:color w:val="1B4332"/>
+          <w:sz w:val="22"/>
+        </w:rPr>
+        <w:t>LinkedIn API Partner Support (https://learn.microsoft.com/en-us/linkedin/shared/linkedin-api-partner-support-guide)</w:t>
+      </w:r>
+      <w:r>
+        <w:rPr>
+          <w:rFonts w:ascii="Calibri" w:hAnsi="Calibri" w:eastAsia="Calibri"/>
+          <w:b w:val="0"/>
+          <w:color w:val="1B4332"/>
+          <w:sz w:val="22"/>
+        </w:rPr>
+        <w:t>.</w:t>
+      </w:r>
+    </w:p>
+    <w:p>
+      <w:r>
+        <w:rPr>
+          <w:rFonts w:ascii="Calibri" w:hAnsi="Calibri" w:eastAsia="Calibri"/>
+          <w:b/>
+          <w:color w:val="2D6A4F"/>
+          <w:sz w:val="26"/>
+        </w:rPr>
+        <w:t>1.2 App name</w:t>
+      </w:r>
+    </w:p>
+    <w:p>
+      <w:r>
+        <w:rPr>
+          <w:rFonts w:ascii="Calibri" w:hAnsi="Calibri" w:eastAsia="Calibri"/>
+          <w:b/>
+          <w:color w:val="1B4332"/>
+          <w:sz w:val="22"/>
+        </w:rPr>
+        <w:t>Paste:</w:t>
+      </w:r>
+    </w:p>
+    <w:p>
+      <w:r>
+        <w:rPr>
+          <w:rFonts w:ascii="Calibri" w:hAnsi="Calibri" w:eastAsia="Calibri"/>
+          <w:b w:val="0"/>
+          <w:color w:val="1B4332"/>
+          <w:sz w:val="22"/>
+        </w:rPr>
+        <w:t>CleantechHUB n8n</w:t>
+      </w:r>
+    </w:p>
+    <w:p>
+      <w:r>
+        <w:rPr>
+          <w:rFonts w:ascii="Calibri" w:hAnsi="Calibri" w:eastAsia="Calibri"/>
+          <w:b/>
+          <w:color w:val="1B4332"/>
+          <w:sz w:val="22"/>
+        </w:rPr>
+        <w:t>Do not use</w:t>
+      </w:r>
+      <w:r>
+        <w:rPr>
+          <w:rFonts w:ascii="Calibri" w:hAnsi="Calibri" w:eastAsia="Calibri"/>
+          <w:b w:val="0"/>
+          <w:color w:val="1B4332"/>
+          <w:sz w:val="22"/>
+        </w:rPr>
+        <w:t xml:space="preserve"> a name that contains Linked, In, LinkedIn, Microsoft, or the abbreviation li. </w:t>
+      </w:r>
+      <w:r>
+        <w:rPr>
+          <w:rFonts w:ascii="Calibri" w:hAnsi="Calibri" w:eastAsia="Calibri"/>
+          <w:b/>
+          <w:color w:val="1B4332"/>
+          <w:sz w:val="22"/>
+        </w:rPr>
+        <w:t>Invalid App Name</w:t>
+      </w:r>
+      <w:r>
+        <w:rPr>
+          <w:rFonts w:ascii="Calibri" w:hAnsi="Calibri" w:eastAsia="Calibri"/>
+          <w:b w:val="0"/>
+          <w:color w:val="1B4332"/>
+          <w:sz w:val="22"/>
+        </w:rPr>
+        <w:t xml:space="preserve"> is a published rejection. The examples in the docs are “Linked” and “In”. The current name n8n-li contains “li”. The docs do not say whether reviewers treat those two letters as a portion of LinkedIn. Use the clean name on the new app so a rejection is not spent on the name.</w:t>
+      </w:r>
+    </w:p>
+    <w:p>
+      <w:r>
+        <w:rPr>
+          <w:rFonts w:ascii="Calibri" w:hAnsi="Calibri" w:eastAsia="Calibri"/>
+          <w:b/>
+          <w:color w:val="2D6A4F"/>
+          <w:sz w:val="26"/>
+        </w:rPr>
+        <w:t>1.3 Company and legal entity</w:t>
+      </w:r>
+    </w:p>
+    <w:p>
+      <w:r>
+        <w:rPr>
+          <w:rFonts w:ascii="Calibri" w:hAnsi="Calibri" w:eastAsia="Calibri"/>
+          <w:b/>
+          <w:color w:val="1B4332"/>
+          <w:sz w:val="22"/>
+        </w:rPr>
+        <w:t>Paste:</w:t>
+      </w:r>
+    </w:p>
+    <w:p>
+      <w:r>
+        <w:rPr>
+          <w:rFonts w:ascii="Calibri" w:hAnsi="Calibri" w:eastAsia="Calibri"/>
+          <w:b w:val="0"/>
+          <w:color w:val="1B4332"/>
+          <w:sz w:val="22"/>
+        </w:rPr>
+        <w:t>FUNDACIÓN CLEANTECH HUB</w:t>
+      </w:r>
+    </w:p>
+    <w:p>
+      <w:r>
+        <w:rPr>
+          <w:rFonts w:ascii="Calibri" w:hAnsi="Calibri" w:eastAsia="Calibri"/>
+          <w:b w:val="0"/>
+          <w:color w:val="1B4332"/>
+          <w:sz w:val="22"/>
+        </w:rPr>
+        <w:t>Entidad sin ánimo de lucro (ESAL), régimen tributario especial.</w:t>
+      </w:r>
+    </w:p>
+    <w:p>
+      <w:r>
+        <w:rPr>
+          <w:rFonts w:ascii="Calibri" w:hAnsi="Calibri" w:eastAsia="Calibri"/>
+          <w:b w:val="0"/>
+          <w:color w:val="1B4332"/>
+          <w:sz w:val="22"/>
+        </w:rPr>
+        <w:t>NIT (Número de Identificación Tributaria) 901.523.941-9.</w:t>
+      </w:r>
+    </w:p>
+    <w:p>
+      <w:r>
+        <w:rPr>
+          <w:rFonts w:ascii="Calibri" w:hAnsi="Calibri" w:eastAsia="Calibri"/>
+          <w:b w:val="0"/>
+          <w:color w:val="1B4332"/>
+          <w:sz w:val="22"/>
+        </w:rPr>
+        <w:t>Bogotá D.C., Colombia.</w:t>
+      </w:r>
+    </w:p>
+    <w:p>
+      <w:r>
+        <w:rPr>
+          <w:rFonts w:ascii="Calibri" w:hAnsi="Calibri" w:eastAsia="Calibri"/>
+          <w:b w:val="0"/>
+          <w:color w:val="1B4332"/>
+          <w:sz w:val="22"/>
+        </w:rPr>
+        <w:t>Legal representative: Gideon Blaauw, Representante Legal de la Fundación CleantechHUB.</w:t>
+      </w:r>
+    </w:p>
+    <w:p>
+      <w:r>
+        <w:rPr>
+          <w:rFonts w:ascii="Calibri" w:hAnsi="Calibri" w:eastAsia="Calibri"/>
+          <w:b w:val="0"/>
+          <w:color w:val="1B4332"/>
+          <w:sz w:val="22"/>
+        </w:rPr>
+        <w:t>Phone: +57 313 715 5965.</w:t>
+      </w:r>
+    </w:p>
+    <w:p>
+      <w:r>
+        <w:rPr>
+          <w:rFonts w:ascii="Calibri" w:hAnsi="Calibri" w:eastAsia="Calibri"/>
+          <w:b/>
+          <w:color w:val="1B4332"/>
+          <w:sz w:val="22"/>
+        </w:rPr>
+        <w:t>Where this comes from:</w:t>
+      </w:r>
+      <w:r>
+        <w:rPr>
+          <w:rFonts w:ascii="Calibri" w:hAnsi="Calibri" w:eastAsia="Calibri"/>
+          <w:b w:val="0"/>
+          <w:color w:val="1B4332"/>
+          <w:sz w:val="22"/>
+        </w:rPr>
+        <w:t xml:space="preserve"> Gideon confirmed this legal name, this non-profit form, and this tax number on 22 October 2026 for the public privacy policy. The NIT matches the public “Política y tratamiento de datos” PDF linked from </w:t>
+      </w:r>
+      <w:r>
+        <w:rPr>
+          <w:rFonts w:ascii="Calibri" w:hAnsi="Calibri" w:eastAsia="Calibri"/>
+          <w:b w:val="0"/>
+          <w:color w:val="1B4332"/>
+          <w:sz w:val="22"/>
+        </w:rPr>
+        <w:t>the governance page (https://cleantechhub.net/governance/)</w:t>
+      </w:r>
+      <w:r>
+        <w:rPr>
+          <w:rFonts w:ascii="Calibri" w:hAnsi="Calibri" w:eastAsia="Calibri"/>
+          <w:b w:val="0"/>
+          <w:color w:val="1B4332"/>
+          <w:sz w:val="22"/>
+        </w:rPr>
+        <w:t>. That page also says “Fundación”. The PDF contact block names Gideon Blaauw, cargo Representante legal.</w:t>
+      </w:r>
+    </w:p>
+    <w:p>
+      <w:r>
+        <w:rPr>
+          <w:rFonts w:ascii="Calibri" w:hAnsi="Calibri" w:eastAsia="Calibri"/>
+          <w:b/>
+          <w:color w:val="1B4332"/>
+          <w:sz w:val="22"/>
+        </w:rPr>
+        <w:t>Paste this name.</w:t>
+      </w:r>
+      <w:r>
+        <w:rPr>
+          <w:rFonts w:ascii="Calibri" w:hAnsi="Calibri" w:eastAsia="Calibri"/>
+          <w:b w:val="0"/>
+          <w:color w:val="1B4332"/>
+          <w:sz w:val="22"/>
+        </w:rPr>
+        <w:t xml:space="preserve"> Do not add a simplified-stock-company suffix. The 2022 PDF used a commercial company form. Do not copy that form into this field. A name that does not match the registry is a known cause of </w:t>
+      </w:r>
+      <w:r>
+        <w:rPr>
+          <w:rFonts w:ascii="Calibri" w:hAnsi="Calibri" w:eastAsia="Calibri"/>
+          <w:b/>
+          <w:color w:val="1B4332"/>
+          <w:sz w:val="22"/>
+        </w:rPr>
+        <w:t>Fail Organization Verification</w:t>
+      </w:r>
+      <w:r>
+        <w:rPr>
+          <w:rFonts w:ascii="Calibri" w:hAnsi="Calibri" w:eastAsia="Calibri"/>
+          <w:b w:val="0"/>
+          <w:color w:val="1B4332"/>
+          <w:sz w:val="22"/>
+        </w:rPr>
+        <w:t>.</w:t>
+      </w:r>
+    </w:p>
+    <w:p>
+      <w:r>
+        <w:rPr>
+          <w:rFonts w:ascii="Calibri" w:hAnsi="Calibri" w:eastAsia="Calibri"/>
+          <w:b/>
+          <w:color w:val="2D6A4F"/>
+          <w:sz w:val="26"/>
+        </w:rPr>
+        <w:t>1.4 Registered address</w:t>
+      </w:r>
+    </w:p>
+    <w:p>
+      <w:r>
+        <w:rPr>
+          <w:rFonts w:ascii="Calibri" w:hAnsi="Calibri" w:eastAsia="Calibri"/>
+          <w:b/>
+          <w:color w:val="1B4332"/>
+          <w:sz w:val="22"/>
+        </w:rPr>
+        <w:t>Paste:</w:t>
+      </w:r>
+    </w:p>
+    <w:p>
+      <w:r>
+        <w:rPr>
+          <w:rFonts w:ascii="Calibri" w:hAnsi="Calibri" w:eastAsia="Calibri"/>
+          <w:b w:val="0"/>
+          <w:color w:val="1B4332"/>
+          <w:sz w:val="22"/>
+        </w:rPr>
+        <w:t>Calle 90 No. 19-41 Of. 801, Bogotá D.C., Colombia.</w:t>
+      </w:r>
+    </w:p>
+    <w:p>
+      <w:r>
+        <w:rPr>
+          <w:rFonts w:ascii="Calibri" w:hAnsi="Calibri" w:eastAsia="Calibri"/>
+          <w:b/>
+          <w:color w:val="1B4332"/>
+          <w:sz w:val="22"/>
+        </w:rPr>
+        <w:t>Where this comes from:</w:t>
+      </w:r>
+      <w:r>
+        <w:rPr>
+          <w:rFonts w:ascii="Calibri" w:hAnsi="Calibri" w:eastAsia="Calibri"/>
+          <w:b w:val="0"/>
+          <w:color w:val="1B4332"/>
+          <w:sz w:val="22"/>
+        </w:rPr>
+        <w:t xml:space="preserve"> Gideon confirmed this address on 22 October 2026. It matches the public data policy (CALLE 90 No. 19-41 OF 801, Bogotá) and the site footer at </w:t>
+      </w:r>
+      <w:r>
+        <w:rPr>
+          <w:rFonts w:ascii="Calibri" w:hAnsi="Calibri" w:eastAsia="Calibri"/>
+          <w:b w:val="0"/>
+          <w:color w:val="1B4332"/>
+          <w:sz w:val="22"/>
+        </w:rPr>
+        <w:t>https://cleantechhub.net/</w:t>
+      </w:r>
+      <w:r>
+        <w:rPr>
+          <w:rFonts w:ascii="Calibri" w:hAnsi="Calibri" w:eastAsia="Calibri"/>
+          <w:b w:val="0"/>
+          <w:color w:val="1B4332"/>
+          <w:sz w:val="22"/>
+        </w:rPr>
+        <w:t>, which prints “Cll 90 #19 - 41 Office 801”.</w:t>
+      </w:r>
+    </w:p>
+    <w:p>
+      <w:r>
+        <w:rPr>
+          <w:rFonts w:ascii="Calibri" w:hAnsi="Calibri" w:eastAsia="Calibri"/>
+          <w:b w:val="0"/>
+          <w:color w:val="1B4332"/>
+          <w:sz w:val="22"/>
+        </w:rPr>
+        <w:t>Do not paste Calle 45 #9-42 from the worker authorization PDF.</w:t>
+      </w:r>
+    </w:p>
+    <w:p>
+      <w:r>
+        <w:rPr>
+          <w:rFonts w:ascii="Calibri" w:hAnsi="Calibri" w:eastAsia="Calibri"/>
+          <w:b/>
+          <w:color w:val="2D6A4F"/>
+          <w:sz w:val="26"/>
+        </w:rPr>
+        <w:t>1.5 Business email</w:t>
+      </w:r>
+    </w:p>
+    <w:p>
+      <w:r>
+        <w:rPr>
+          <w:rFonts w:ascii="Calibri" w:hAnsi="Calibri" w:eastAsia="Calibri"/>
+          <w:b/>
+          <w:color w:val="1B4332"/>
+          <w:sz w:val="22"/>
+        </w:rPr>
+        <w:t>Paste:</w:t>
+      </w:r>
+    </w:p>
+    <w:p>
+      <w:r>
+        <w:rPr>
+          <w:rFonts w:ascii="Calibri" w:hAnsi="Calibri" w:eastAsia="Calibri"/>
+          <w:b w:val="0"/>
+          <w:color w:val="1B4332"/>
+          <w:sz w:val="22"/>
+        </w:rPr>
+        <w:t>admin@cleantechhub.net</w:t>
+      </w:r>
+    </w:p>
+    <w:p>
+      <w:r>
+        <w:rPr>
+          <w:rFonts w:ascii="Calibri" w:hAnsi="Calibri" w:eastAsia="Calibri"/>
+          <w:b/>
+          <w:color w:val="1B4332"/>
+          <w:sz w:val="22"/>
+        </w:rPr>
+        <w:t>Where this comes from:</w:t>
+      </w:r>
+      <w:r>
+        <w:rPr>
+          <w:rFonts w:ascii="Calibri" w:hAnsi="Calibri" w:eastAsia="Calibri"/>
+          <w:b w:val="0"/>
+          <w:color w:val="1B4332"/>
+          <w:sz w:val="22"/>
+        </w:rPr>
+        <w:t xml:space="preserve"> Gideon set this as the public contact on 22 October 2026. It is the address in the privacy policy.</w:t>
+      </w:r>
+    </w:p>
+    <w:p>
+      <w:r>
+        <w:rPr>
+          <w:rFonts w:ascii="Calibri" w:hAnsi="Calibri" w:eastAsia="Calibri"/>
+          <w:b/>
+          <w:color w:val="1B4332"/>
+          <w:sz w:val="22"/>
+        </w:rPr>
+        <w:t>Rules from the docs:</w:t>
+      </w:r>
+      <w:r>
+        <w:rPr>
+          <w:rFonts w:ascii="Calibri" w:hAnsi="Calibri" w:eastAsia="Calibri"/>
+          <w:b w:val="0"/>
+          <w:color w:val="1B4332"/>
+          <w:sz w:val="22"/>
+        </w:rPr>
+        <w:t xml:space="preserve"> the address must be a business email. A personal mailbox will not pass. LinkedIn sends a verification message to this address. Check spam, junk, the social tab, and the promotions tab. He must be able to open admin@cleantechhub.net.</w:t>
+      </w:r>
+    </w:p>
+    <w:p>
+      <w:r>
+        <w:rPr>
+          <w:rFonts w:ascii="Calibri" w:hAnsi="Calibri" w:eastAsia="Calibri"/>
+          <w:b/>
+          <w:color w:val="2D6A4F"/>
+          <w:sz w:val="26"/>
+        </w:rPr>
+        <w:t>1.6 Website</w:t>
+      </w:r>
+    </w:p>
+    <w:p>
+      <w:r>
+        <w:rPr>
+          <w:rFonts w:ascii="Calibri" w:hAnsi="Calibri" w:eastAsia="Calibri"/>
+          <w:b/>
+          <w:color w:val="1B4332"/>
+          <w:sz w:val="22"/>
+        </w:rPr>
+        <w:t>Paste:</w:t>
+      </w:r>
+    </w:p>
+    <w:p>
+      <w:r>
+        <w:rPr>
+          <w:rFonts w:ascii="Calibri" w:hAnsi="Calibri" w:eastAsia="Calibri"/>
+          <w:b w:val="0"/>
+          <w:color w:val="1B4332"/>
+          <w:sz w:val="22"/>
+        </w:rPr>
+        <w:t>https://cleantechhub.net</w:t>
+      </w:r>
+    </w:p>
+    <w:p>
+      <w:r>
+        <w:rPr>
+          <w:rFonts w:ascii="Calibri" w:hAnsi="Calibri" w:eastAsia="Calibri"/>
+          <w:b w:val="0"/>
+          <w:color w:val="1B4332"/>
+          <w:sz w:val="22"/>
+        </w:rPr>
+        <w:t>The organization website and the domain must match this site. Review checks a verified organization website and domain.</w:t>
+      </w:r>
+    </w:p>
+    <w:p>
+      <w:r>
+        <w:rPr>
+          <w:rFonts w:ascii="Calibri" w:hAnsi="Calibri" w:eastAsia="Calibri"/>
+          <w:b/>
+          <w:color w:val="2D6A4F"/>
+          <w:sz w:val="26"/>
+        </w:rPr>
+        <w:t>1.7 Privacy policy URL</w:t>
+      </w:r>
+    </w:p>
+    <w:p>
+      <w:r>
+        <w:rPr>
+          <w:rFonts w:ascii="Calibri" w:hAnsi="Calibri" w:eastAsia="Calibri"/>
+          <w:b/>
+          <w:color w:val="1B4332"/>
+          <w:sz w:val="22"/>
+        </w:rPr>
+        <w:t>Paste (live):</w:t>
+      </w:r>
+    </w:p>
+    <w:p>
+      <w:r>
+        <w:rPr>
+          <w:rFonts w:ascii="Calibri" w:hAnsi="Calibri" w:eastAsia="Calibri"/>
+          <w:b w:val="0"/>
+          <w:color w:val="1B4332"/>
+          <w:sz w:val="22"/>
+        </w:rPr>
+        <w:t>https://jobs.cleantechhub.net/privacidad/</w:t>
+      </w:r>
+    </w:p>
+    <w:p>
+      <w:r>
+        <w:rPr>
+          <w:rFonts w:ascii="Calibri" w:hAnsi="Calibri" w:eastAsia="Calibri"/>
+          <w:b w:val="0"/>
+          <w:color w:val="1B4332"/>
+          <w:sz w:val="22"/>
+        </w:rPr>
+        <w:t xml:space="preserve">Checked on 22 October 2026. HTTP 200, no login, and the body is this privacy policy. </w:t>
+      </w:r>
+      <w:r>
+        <w:rPr>
+          <w:rFonts w:ascii="Calibri" w:hAnsi="Calibri" w:eastAsia="Calibri"/>
+          <w:b w:val="0"/>
+          <w:color w:val="1B4332"/>
+          <w:sz w:val="22"/>
+        </w:rPr>
+        <w:t>/privacy</w:t>
+      </w:r>
+      <w:r>
+        <w:rPr>
+          <w:rFonts w:ascii="Calibri" w:hAnsi="Calibri" w:eastAsia="Calibri"/>
+          <w:b w:val="0"/>
+          <w:color w:val="1B4332"/>
+          <w:sz w:val="22"/>
+        </w:rPr>
+        <w:t xml:space="preserve"> redirects there. The website field stays </w:t>
+      </w:r>
+      <w:r>
+        <w:rPr>
+          <w:rFonts w:ascii="Calibri" w:hAnsi="Calibri" w:eastAsia="Calibri"/>
+          <w:b w:val="0"/>
+          <w:color w:val="1B4332"/>
+          <w:sz w:val="22"/>
+        </w:rPr>
+        <w:t>https://cleantechhub.net</w:t>
+      </w:r>
+      <w:r>
+        <w:rPr>
+          <w:rFonts w:ascii="Calibri" w:hAnsi="Calibri" w:eastAsia="Calibri"/>
+          <w:b w:val="0"/>
+          <w:color w:val="1B4332"/>
+          <w:sz w:val="22"/>
+        </w:rPr>
+        <w:t>.</w:t>
+      </w:r>
+    </w:p>
+    <w:p>
+      <w:r>
+        <w:rPr>
+          <w:rFonts w:ascii="Calibri" w:hAnsi="Calibri" w:eastAsia="Calibri"/>
+          <w:b/>
+          <w:color w:val="2D6A4F"/>
+          <w:sz w:val="26"/>
+        </w:rPr>
+        <w:t>1.8 LinkedIn Page</w:t>
+      </w:r>
+    </w:p>
+    <w:p>
+      <w:r>
+        <w:rPr>
+          <w:rFonts w:ascii="Calibri" w:hAnsi="Calibri" w:eastAsia="Calibri"/>
+          <w:b/>
+          <w:color w:val="1B4332"/>
+          <w:sz w:val="22"/>
+        </w:rPr>
+        <w:t>Paste:</w:t>
+      </w:r>
+    </w:p>
+    <w:p>
+      <w:r>
+        <w:rPr>
+          <w:rFonts w:ascii="Calibri" w:hAnsi="Calibri" w:eastAsia="Calibri"/>
+          <w:b w:val="0"/>
+          <w:color w:val="1B4332"/>
+          <w:sz w:val="22"/>
+        </w:rPr>
+        <w:t>LinkedIn Page name: CleantechHUB.</w:t>
+      </w:r>
+    </w:p>
+    <w:p>
+      <w:r>
+        <w:rPr>
+          <w:rFonts w:ascii="Calibri" w:hAnsi="Calibri" w:eastAsia="Calibri"/>
+          <w:b w:val="0"/>
+          <w:color w:val="1B4332"/>
+          <w:sz w:val="22"/>
+        </w:rPr>
+        <w:t>LinkedIn Page URL: [GIDEON TO FILL].</w:t>
+      </w:r>
+    </w:p>
+    <w:p>
+      <w:r>
+        <w:rPr>
+          <w:rFonts w:ascii="Calibri" w:hAnsi="Calibri" w:eastAsia="Calibri"/>
+          <w:b w:val="0"/>
+          <w:color w:val="1B4332"/>
+          <w:sz w:val="22"/>
+        </w:rPr>
+        <w:t>Organization ID: [GIDEON TO FILL].</w:t>
+      </w:r>
+    </w:p>
+    <w:p>
+      <w:r>
+        <w:rPr>
+          <w:rFonts w:ascii="Calibri" w:hAnsi="Calibri" w:eastAsia="Calibri"/>
+          <w:b w:val="0"/>
+          <w:color w:val="1B4332"/>
+          <w:sz w:val="22"/>
+        </w:rPr>
+        <w:t xml:space="preserve">The public pages checked on cleantechhub.net do not print the company Page URL or the organization id. The Page must belong to the same organization as the legal entity. A Page for a different organization is </w:t>
+      </w:r>
+      <w:r>
+        <w:rPr>
+          <w:rFonts w:ascii="Calibri" w:hAnsi="Calibri" w:eastAsia="Calibri"/>
+          <w:b/>
+          <w:color w:val="1B4332"/>
+          <w:sz w:val="22"/>
+        </w:rPr>
+        <w:t>Invalid Company Page</w:t>
+      </w:r>
+      <w:r>
+        <w:rPr>
+          <w:rFonts w:ascii="Calibri" w:hAnsi="Calibri" w:eastAsia="Calibri"/>
+          <w:b w:val="0"/>
+          <w:color w:val="1B4332"/>
+          <w:sz w:val="22"/>
+        </w:rPr>
+        <w:t>.</w:t>
+      </w:r>
+    </w:p>
+    <w:p>
+      <w:r>
+        <w:rPr>
+          <w:rFonts w:ascii="Calibri" w:hAnsi="Calibri" w:eastAsia="Calibri"/>
+          <w:b/>
+          <w:color w:val="2D6A4F"/>
+          <w:sz w:val="26"/>
+        </w:rPr>
+        <w:t>1.9 Page admin</w:t>
+      </w:r>
+    </w:p>
+    <w:p>
+      <w:r>
+        <w:rPr>
+          <w:rFonts w:ascii="Calibri" w:hAnsi="Calibri" w:eastAsia="Calibri"/>
+          <w:b/>
+          <w:color w:val="1B4332"/>
+          <w:sz w:val="22"/>
+        </w:rPr>
+        <w:t>Paste:</w:t>
+      </w:r>
+    </w:p>
+    <w:p>
+      <w:r>
+        <w:rPr>
+          <w:rFonts w:ascii="Calibri" w:hAnsi="Calibri" w:eastAsia="Calibri"/>
+          <w:b w:val="0"/>
+          <w:color w:val="1B4332"/>
+          <w:sz w:val="22"/>
+        </w:rPr>
+        <w:t>Page super admin who will approve the app verification URL: [GIDEON TO FILL].</w:t>
+      </w:r>
+    </w:p>
+    <w:p>
+      <w:r>
+        <w:rPr>
+          <w:rFonts w:ascii="Calibri" w:hAnsi="Calibri" w:eastAsia="Calibri"/>
+          <w:b w:val="0"/>
+          <w:color w:val="1B4332"/>
+          <w:sz w:val="22"/>
+        </w:rPr>
+        <w:t>LinkedIn member who will sign in and grant the token: [GIDEON TO FILL].</w:t>
+      </w:r>
+    </w:p>
+    <w:p>
+      <w:r>
+        <w:rPr>
+          <w:rFonts w:ascii="Calibri" w:hAnsi="Calibri" w:eastAsia="Calibri"/>
+          <w:b w:val="0"/>
+          <w:color w:val="1B4332"/>
+          <w:sz w:val="22"/>
+        </w:rPr>
+        <w:t>That member’s company Page role: ADMINISTRATOR.</w:t>
+      </w:r>
+    </w:p>
+    <w:p>
+      <w:r>
+        <w:rPr>
+          <w:rFonts w:ascii="Calibri" w:hAnsi="Calibri" w:eastAsia="Calibri"/>
+          <w:b w:val="0"/>
+          <w:color w:val="1B4332"/>
+          <w:sz w:val="22"/>
+        </w:rPr>
+        <w:t xml:space="preserve">Verification is done by a Page super admin. Posting can be done by an ADMINISTRATOR, a DIRECT_SPONSORED_CONTENT_POSTER, or a CONTENT_ADMIN. Page analytics under </w:t>
+      </w:r>
+      <w:r>
+        <w:rPr>
+          <w:rFonts w:ascii="Calibri" w:hAnsi="Calibri" w:eastAsia="Calibri"/>
+          <w:b w:val="0"/>
+          <w:color w:val="1B4332"/>
+          <w:sz w:val="22"/>
+        </w:rPr>
+        <w:t>rw_organization_admin</w:t>
+      </w:r>
+      <w:r>
+        <w:rPr>
+          <w:rFonts w:ascii="Calibri" w:hAnsi="Calibri" w:eastAsia="Calibri"/>
+          <w:b w:val="0"/>
+          <w:color w:val="1B4332"/>
+          <w:sz w:val="22"/>
+        </w:rPr>
+        <w:t xml:space="preserve"> is limited to the ADMINISTRATOR role. Gideon is named as legal representative in the data policy. That sentence does not prove his LinkedIn Page role. </w:t>
+      </w:r>
+      <w:r>
+        <w:rPr>
+          <w:rFonts w:ascii="Calibri" w:hAnsi="Calibri" w:eastAsia="Calibri"/>
+          <w:b w:val="0"/>
+          <w:color w:val="1B4332"/>
+          <w:sz w:val="22"/>
+        </w:rPr>
+        <w:t>[GIDEON TO FILL]</w:t>
+      </w:r>
+      <w:r>
+        <w:rPr>
+          <w:rFonts w:ascii="Calibri" w:hAnsi="Calibri" w:eastAsia="Calibri"/>
+          <w:b w:val="0"/>
+          <w:color w:val="1B4332"/>
+          <w:sz w:val="22"/>
+        </w:rPr>
+        <w:t xml:space="preserve"> both names, even if they are Gideon.</w:t>
+      </w:r>
+    </w:p>
+    <w:p>
+      <w:r>
+        <w:rPr>
+          <w:rFonts w:ascii="Calibri" w:hAnsi="Calibri" w:eastAsia="Calibri"/>
+          <w:b w:val="0"/>
+          <w:color w:val="1B4332"/>
+          <w:sz w:val="22"/>
+        </w:rPr>
+        <w:t>The super admin has 30 days to open the verification URL. Approval is permanent. The app cannot later move to another Page.</w:t>
+      </w:r>
+    </w:p>
+    <w:p>
+      <w:r>
+        <w:rPr>
+          <w:rFonts w:ascii="Calibri" w:hAnsi="Calibri" w:eastAsia="Calibri"/>
+          <w:b/>
+          <w:color w:val="2D6A4F"/>
+          <w:sz w:val="26"/>
+        </w:rPr>
+        <w:t>1.10 Use case description</w:t>
+      </w:r>
+    </w:p>
+    <w:p>
+      <w:r>
+        <w:rPr>
+          <w:rFonts w:ascii="Calibri" w:hAnsi="Calibri" w:eastAsia="Calibri"/>
+          <w:b/>
+          <w:color w:val="1B4332"/>
+          <w:sz w:val="22"/>
+        </w:rPr>
+        <w:t>Paste:</w:t>
+      </w:r>
+    </w:p>
+    <w:p>
+      <w:r>
+        <w:rPr>
+          <w:rFonts w:ascii="Calibri" w:hAnsi="Calibri" w:eastAsia="Calibri"/>
+          <w:b w:val="0"/>
+          <w:color w:val="1B4332"/>
+          <w:sz w:val="22"/>
+        </w:rPr>
+        <w:t>CleantechHUB will use the Community Management API for its own LinkedIn Page only.</w:t>
+      </w:r>
+    </w:p>
+    <w:p>
+      <w:r>
+        <w:rPr>
+          <w:rFonts w:ascii="Calibri" w:hAnsi="Calibri" w:eastAsia="Calibri"/>
+          <w:b w:val="0"/>
+          <w:color w:val="1B4332"/>
+          <w:sz w:val="22"/>
+        </w:rPr>
+        <w:t>The use cases are Page Management and Page Analytics.</w:t>
+      </w:r>
+    </w:p>
+    <w:p>
+      <w:r>
+        <w:rPr>
+          <w:rFonts w:ascii="Calibri" w:hAnsi="Calibri" w:eastAsia="Calibri"/>
+          <w:b w:val="0"/>
+          <w:color w:val="1B4332"/>
+          <w:sz w:val="22"/>
+        </w:rPr>
+        <w:t>A private n8n workflow, run by CleantechHUB, will publish CleantechHUB jobs, program news, and newsletters as that Page.</w:t>
+      </w:r>
+    </w:p>
+    <w:p>
+      <w:r>
+        <w:rPr>
+          <w:rFonts w:ascii="Calibri" w:hAnsi="Calibri" w:eastAsia="Calibri"/>
+          <w:b w:val="0"/>
+          <w:color w:val="1B4332"/>
+          <w:sz w:val="22"/>
+        </w:rPr>
+        <w:t>The same workflow will read that Page’s own posts and comments.</w:t>
+      </w:r>
+    </w:p>
+    <w:p>
+      <w:r>
+        <w:rPr>
+          <w:rFonts w:ascii="Calibri" w:hAnsi="Calibri" w:eastAsia="Calibri"/>
+          <w:b w:val="0"/>
+          <w:color w:val="1B4332"/>
+          <w:sz w:val="22"/>
+        </w:rPr>
+        <w:t>It will read aggregate analytics for those posts. The counts are impressions, clicks, reactions, comments, shares, and engagement.</w:t>
+      </w:r>
+    </w:p>
+    <w:p>
+      <w:r>
+        <w:rPr>
+          <w:rFonts w:ascii="Calibri" w:hAnsi="Calibri" w:eastAsia="Calibri"/>
+          <w:b w:val="0"/>
+          <w:color w:val="1B4332"/>
+          <w:sz w:val="22"/>
+        </w:rPr>
+        <w:t>It will read aggregate follower counts and page view counts for that same Page.</w:t>
+      </w:r>
+    </w:p>
+    <w:p>
+      <w:r>
+        <w:rPr>
+          <w:rFonts w:ascii="Calibri" w:hAnsi="Calibri" w:eastAsia="Calibri"/>
+          <w:b w:val="0"/>
+          <w:color w:val="1B4332"/>
+          <w:sz w:val="22"/>
+        </w:rPr>
+        <w:t>The workflow serves no other organization.</w:t>
+      </w:r>
+    </w:p>
+    <w:p>
+      <w:r>
+        <w:rPr>
+          <w:rFonts w:ascii="Calibri" w:hAnsi="Calibri" w:eastAsia="Calibri"/>
+          <w:b w:val="0"/>
+          <w:color w:val="1B4332"/>
+          <w:sz w:val="22"/>
+        </w:rPr>
+        <w:t>It does not scrape member profiles.</w:t>
+      </w:r>
+    </w:p>
+    <w:p>
+      <w:r>
+        <w:rPr>
+          <w:rFonts w:ascii="Calibri" w:hAnsi="Calibri" w:eastAsia="Calibri"/>
+          <w:b w:val="0"/>
+          <w:color w:val="1B4332"/>
+          <w:sz w:val="22"/>
+        </w:rPr>
+        <w:t>It does not use LinkedIn data for ads, sales, recruiting, lead lists, or audience building.</w:t>
+      </w:r>
+    </w:p>
+    <w:p>
+      <w:r>
+        <w:rPr>
+          <w:rFonts w:ascii="Calibri" w:hAnsi="Calibri" w:eastAsia="Calibri"/>
+          <w:b w:val="0"/>
+          <w:color w:val="1B4332"/>
+          <w:sz w:val="22"/>
+        </w:rPr>
+        <w:t>It does not place a LinkedIn feed on cleantechhub.net or on an intranet.</w:t>
+      </w:r>
+    </w:p>
+    <w:p>
+      <w:r>
+        <w:rPr>
+          <w:rFonts w:ascii="Calibri" w:hAnsi="Calibri" w:eastAsia="Calibri"/>
+          <w:b w:val="0"/>
+          <w:color w:val="1B4332"/>
+          <w:sz w:val="22"/>
+        </w:rPr>
+        <w:t>It does not combine member data with a CRM (customer relationship management) system or any other database.</w:t>
+      </w:r>
+    </w:p>
+    <w:p>
+      <w:r>
+        <w:rPr>
+          <w:rFonts w:ascii="Calibri" w:hAnsi="Calibri" w:eastAsia="Calibri"/>
+          <w:b/>
+          <w:color w:val="2D6A4F"/>
+          <w:sz w:val="26"/>
+        </w:rPr>
+        <w:t>1.11 Company and product overview</w:t>
+      </w:r>
+    </w:p>
+    <w:p>
+      <w:r>
+        <w:rPr>
+          <w:rFonts w:ascii="Calibri" w:hAnsi="Calibri" w:eastAsia="Calibri"/>
+          <w:b/>
+          <w:color w:val="1B4332"/>
+          <w:sz w:val="22"/>
+        </w:rPr>
+        <w:t>Paste:</w:t>
+      </w:r>
+    </w:p>
+    <w:p>
+      <w:r>
+        <w:rPr>
+          <w:rFonts w:ascii="Calibri" w:hAnsi="Calibri" w:eastAsia="Calibri"/>
+          <w:b w:val="0"/>
+          <w:color w:val="1B4332"/>
+          <w:sz w:val="22"/>
+        </w:rPr>
+        <w:t>CleantechHUB is a climate innovation organization in Latin America. Its public site is https://cleantechhub.net.</w:t>
+      </w:r>
+    </w:p>
+    <w:p>
+      <w:r>
+        <w:rPr>
+          <w:rFonts w:ascii="Calibri" w:hAnsi="Calibri" w:eastAsia="Calibri"/>
+          <w:b w:val="0"/>
+          <w:color w:val="1B4332"/>
+          <w:sz w:val="22"/>
+        </w:rPr>
+        <w:t>This application is not sold to other companies. It is CleantechHUB’s own publishing workflow.</w:t>
+      </w:r>
+    </w:p>
+    <w:p>
+      <w:r>
+        <w:rPr>
+          <w:rFonts w:ascii="Calibri" w:hAnsi="Calibri" w:eastAsia="Calibri"/>
+          <w:b w:val="0"/>
+          <w:color w:val="1B4332"/>
+          <w:sz w:val="22"/>
+        </w:rPr>
+        <w:t>The workflow posts CleantechHUB content to the CleantechHUB Page, then reads that Page’s results.</w:t>
+      </w:r>
+    </w:p>
+    <w:p>
+      <w:r>
+        <w:rPr>
+          <w:rFonts w:ascii="Calibri" w:hAnsi="Calibri" w:eastAsia="Calibri"/>
+          <w:b w:val="0"/>
+          <w:color w:val="1B4332"/>
+          <w:sz w:val="22"/>
+        </w:rPr>
+        <w:t>No third-party Pages are connected. No ads account is connected.</w:t>
+      </w:r>
+    </w:p>
+    <w:p>
+      <w:r>
+        <w:rPr>
+          <w:rFonts w:ascii="Calibri" w:hAnsi="Calibri" w:eastAsia="Calibri"/>
+          <w:b/>
+          <w:color w:val="2D6A4F"/>
+          <w:sz w:val="26"/>
+        </w:rPr>
+        <w:t>1.12 How the data is used</w:t>
+      </w:r>
+    </w:p>
+    <w:p>
+      <w:r>
+        <w:rPr>
+          <w:rFonts w:ascii="Calibri" w:hAnsi="Calibri" w:eastAsia="Calibri"/>
+          <w:b/>
+          <w:color w:val="1B4332"/>
+          <w:sz w:val="22"/>
+        </w:rPr>
+        <w:t>Paste:</w:t>
+      </w:r>
+    </w:p>
+    <w:p>
+      <w:r>
+        <w:rPr>
+          <w:rFonts w:ascii="Calibri" w:hAnsi="Calibri" w:eastAsia="Calibri"/>
+          <w:b w:val="0"/>
+          <w:color w:val="1B4332"/>
+          <w:sz w:val="22"/>
+        </w:rPr>
+        <w:t>We use organization posts we created so the Page can show CleantechHUB jobs, programs, and newsletters.</w:t>
+      </w:r>
+    </w:p>
+    <w:p>
+      <w:r>
+        <w:rPr>
+          <w:rFonts w:ascii="Calibri" w:hAnsi="Calibri" w:eastAsia="Calibri"/>
+          <w:b w:val="0"/>
+          <w:color w:val="1B4332"/>
+          <w:sz w:val="22"/>
+        </w:rPr>
+        <w:t>We use our own post ids so the workflow can avoid duplicate posts and can fetch analytics for those posts.</w:t>
+      </w:r>
+    </w:p>
+    <w:p>
+      <w:r>
+        <w:rPr>
+          <w:rFonts w:ascii="Calibri" w:hAnsi="Calibri" w:eastAsia="Calibri"/>
+          <w:b w:val="0"/>
+          <w:color w:val="1B4332"/>
+          <w:sz w:val="22"/>
+        </w:rPr>
+        <w:t>We use aggregate Page analytics so CleantechHUB staff can see how our own posts performed. The figures are impressions, clicks, reactions, comments, shares, follower counts, and page views.</w:t>
+      </w:r>
+    </w:p>
+    <w:p>
+      <w:r>
+        <w:rPr>
+          <w:rFonts w:ascii="Calibri" w:hAnsi="Calibri" w:eastAsia="Calibri"/>
+          <w:b w:val="0"/>
+          <w:color w:val="1B4332"/>
+          <w:sz w:val="22"/>
+        </w:rPr>
+        <w:t>We display comments on our own posts only to CleantechHUB people who manage that Page.</w:t>
+      </w:r>
+    </w:p>
+    <w:p>
+      <w:r>
+        <w:rPr>
+          <w:rFonts w:ascii="Calibri" w:hAnsi="Calibri" w:eastAsia="Calibri"/>
+          <w:b w:val="0"/>
+          <w:color w:val="1B4332"/>
+          <w:sz w:val="22"/>
+        </w:rPr>
+        <w:t>We request only the member data required to show that a comment exists. We do not export member data. We do not build member profiles. We do not enrich any other database.</w:t>
+      </w:r>
+    </w:p>
+    <w:p>
+      <w:r>
+        <w:rPr>
+          <w:rFonts w:ascii="Calibri" w:hAnsi="Calibri" w:eastAsia="Calibri"/>
+          <w:b/>
+          <w:color w:val="2D6A4F"/>
+          <w:sz w:val="26"/>
+        </w:rPr>
+        <w:t>1.13 How the data is stored</w:t>
+      </w:r>
+    </w:p>
+    <w:p>
+      <w:r>
+        <w:rPr>
+          <w:rFonts w:ascii="Calibri" w:hAnsi="Calibri" w:eastAsia="Calibri"/>
+          <w:b/>
+          <w:color w:val="1B4332"/>
+          <w:sz w:val="22"/>
+        </w:rPr>
+        <w:t>Paste:</w:t>
+      </w:r>
+    </w:p>
+    <w:p>
+      <w:r>
+        <w:rPr>
+          <w:rFonts w:ascii="Calibri" w:hAnsi="Calibri" w:eastAsia="Calibri"/>
+          <w:b w:val="0"/>
+          <w:color w:val="1B4332"/>
+          <w:sz w:val="22"/>
+        </w:rPr>
+        <w:t>Data stays inside CleantechHUB’s own n8n workflow. OVH hosts that workflow in Germany, the same host and country as https://cleantechhub.net. OVH’s data processing terms cover that hosting. Deletion follows the periods below.</w:t>
+      </w:r>
+    </w:p>
+    <w:p>
+      <w:r>
+        <w:rPr>
+          <w:rFonts w:ascii="Calibri" w:hAnsi="Calibri" w:eastAsia="Calibri"/>
+          <w:b w:val="0"/>
+          <w:color w:val="1B4332"/>
+          <w:sz w:val="22"/>
+        </w:rPr>
+        <w:t>Storage follows the LinkedIn Marketing API data storage requirements.</w:t>
+      </w:r>
+    </w:p>
+    <w:p>
+      <w:r>
+        <w:rPr>
+          <w:rFonts w:ascii="Calibri" w:hAnsi="Calibri" w:eastAsia="Calibri"/>
+          <w:b w:val="0"/>
+          <w:color w:val="1B4332"/>
+          <w:sz w:val="22"/>
+        </w:rPr>
+        <w:t>Posts and other social activity by our own Page may be stored for up to six months, because the Page authenticates into this app. The shorter public cap, where the organization has not authenticated, is six weeks.</w:t>
+      </w:r>
+    </w:p>
+    <w:p>
+      <w:r>
+        <w:rPr>
+          <w:rFonts w:ascii="Calibri" w:hAnsi="Calibri" w:eastAsia="Calibri"/>
+          <w:b w:val="0"/>
+          <w:color w:val="1B4332"/>
+          <w:sz w:val="22"/>
+        </w:rPr>
+        <w:t>Aggregate Page admin and reporting data, with no individual member record, may be stored for up to one year. This includes follower counts and summaries of social actions.</w:t>
+      </w:r>
+    </w:p>
+    <w:p>
+      <w:r>
+        <w:rPr>
+          <w:rFonts w:ascii="Calibri" w:hAnsi="Calibri" w:eastAsia="Calibri"/>
+          <w:b w:val="0"/>
+          <w:color w:val="1B4332"/>
+          <w:sz w:val="22"/>
+        </w:rPr>
+        <w:t>Our Page’s name and logo URL may be stored for up to eight weeks while the Page is authenticated.</w:t>
+      </w:r>
+    </w:p>
+    <w:p>
+      <w:r>
+        <w:rPr>
+          <w:rFonts w:ascii="Calibri" w:hAnsi="Calibri" w:eastAsia="Calibri"/>
+          <w:b w:val="0"/>
+          <w:color w:val="1B4332"/>
+          <w:sz w:val="22"/>
+        </w:rPr>
+        <w:t>Ids for the organization, our posts, and social actions may be kept with no LinkedIn time cap.</w:t>
+      </w:r>
+    </w:p>
+    <w:p>
+      <w:r>
+        <w:rPr>
+          <w:rFonts w:ascii="Calibri" w:hAnsi="Calibri" w:eastAsia="Calibri"/>
+          <w:b w:val="0"/>
+          <w:color w:val="1B4332"/>
+          <w:sz w:val="22"/>
+        </w:rPr>
+        <w:t>The signed-in Page admin’s person id and basic profile may be kept with no LinkedIn time cap. We keep them only to hold that admin’s authorization.</w:t>
+      </w:r>
+    </w:p>
+    <w:p>
+      <w:r>
+        <w:rPr>
+          <w:rFonts w:ascii="Calibri" w:hAnsi="Calibri" w:eastAsia="Calibri"/>
+          <w:b w:val="0"/>
+          <w:color w:val="1B4332"/>
+          <w:sz w:val="22"/>
+        </w:rPr>
+        <w:t>Content of member comments, reactions, and other member social activity is kept for no more than 48 hours, then deleted.</w:t>
+      </w:r>
+    </w:p>
+    <w:p>
+      <w:r>
+        <w:rPr>
+          <w:rFonts w:ascii="Calibri" w:hAnsi="Calibri" w:eastAsia="Calibri"/>
+          <w:b w:val="0"/>
+          <w:color w:val="1B4332"/>
+          <w:sz w:val="22"/>
+        </w:rPr>
+        <w:t>Profile fields of members who did not sign in are cached for no more than 24 hours. Examples are a commenter’s name, photo, or headline. They are not stored.</w:t>
+      </w:r>
+    </w:p>
+    <w:p>
+      <w:r>
+        <w:rPr>
+          <w:rFonts w:ascii="Calibri" w:hAnsi="Calibri" w:eastAsia="Calibri"/>
+          <w:b w:val="0"/>
+          <w:color w:val="1B4332"/>
+          <w:sz w:val="22"/>
+        </w:rPr>
+        <w:t>We delete stored member data when the admin asks, and when LinkedIn asks. On termination of the Marketing API terms, member data is deleted immediately, except lead-form and Page-messaging data, which this app does not collect.</w:t>
+      </w:r>
+    </w:p>
+    <w:p>
+      <w:r>
+        <w:rPr>
+          <w:rFonts w:ascii="Calibri" w:hAnsi="Calibri" w:eastAsia="Calibri"/>
+          <w:b/>
+          <w:color w:val="2D6A4F"/>
+          <w:sz w:val="26"/>
+        </w:rPr>
+        <w:t>1.14 Scopes and why</w:t>
+      </w:r>
+    </w:p>
+    <w:p>
+      <w:r>
+        <w:rPr>
+          <w:rFonts w:ascii="Calibri" w:hAnsi="Calibri" w:eastAsia="Calibri"/>
+          <w:b w:val="0"/>
+          <w:color w:val="1B4332"/>
+          <w:sz w:val="22"/>
+        </w:rPr>
+        <w:t xml:space="preserve">Request the </w:t>
+      </w:r>
+      <w:r>
+        <w:rPr>
+          <w:rFonts w:ascii="Calibri" w:hAnsi="Calibri" w:eastAsia="Calibri"/>
+          <w:b/>
+          <w:color w:val="1B4332"/>
+          <w:sz w:val="22"/>
+        </w:rPr>
+        <w:t>Community Management API</w:t>
+      </w:r>
+      <w:r>
+        <w:rPr>
+          <w:rFonts w:ascii="Calibri" w:hAnsi="Calibri" w:eastAsia="Calibri"/>
+          <w:b w:val="0"/>
+          <w:color w:val="1B4332"/>
+          <w:sz w:val="22"/>
+        </w:rPr>
+        <w:t xml:space="preserve"> product. Approval grants a bundle of scopes to the app. In the OAuth (Open Authorization) consent call, ask only for the three scopes below. Marketing permissions are three-legged. A member must sign in. Client-credentials access is not available.</w:t>
+      </w:r>
+    </w:p>
+    <w:p>
+      <w:r>
+        <w:rPr>
+          <w:rFonts w:ascii="Calibri" w:hAnsi="Calibri" w:eastAsia="Calibri"/>
+          <w:b/>
+          <w:color w:val="1B4332"/>
+          <w:sz w:val="22"/>
+        </w:rPr>
+        <w:t>Paste:</w:t>
+      </w:r>
+    </w:p>
+    <w:p>
+      <w:r>
+        <w:rPr>
+          <w:rFonts w:ascii="Calibri" w:hAnsi="Calibri" w:eastAsia="Calibri"/>
+          <w:b w:val="0"/>
+          <w:color w:val="1B4332"/>
+          <w:sz w:val="22"/>
+        </w:rPr>
+        <w:t>We need three scopes, and we will request only these three in the member consent screen.</w:t>
+      </w:r>
+    </w:p>
+    <w:p>
+      <w:r>
+        <w:rPr>
+          <w:rFonts w:ascii="Calibri" w:hAnsi="Calibri" w:eastAsia="Calibri"/>
+          <w:b w:val="0"/>
+          <w:color w:val="1B4332"/>
+          <w:sz w:val="22"/>
+        </w:rPr>
+        <w:t>w_organization_social. This scope posts, comments, and likes as the organization. We use it to publish CleantechHUB jobs, programs, and newsletters as the Page. The signed-in member must be an ADMINISTRATOR, a DIRECT_SPONSORED_CONTENT_POSTER, or a CONTENT_ADMIN. Source: Posts API.</w:t>
+      </w:r>
+    </w:p>
+    <w:p>
+      <w:r>
+        <w:rPr>
+          <w:rFonts w:ascii="Calibri" w:hAnsi="Calibri" w:eastAsia="Calibri"/>
+          <w:b w:val="0"/>
+          <w:color w:val="1B4332"/>
+          <w:sz w:val="22"/>
+        </w:rPr>
+        <w:t>r_organization_social. This scope reads the organization’s posts, comments, and likes. We use it to read our own Page’s posts and comments. The same Page roles apply. Source: Posts API.</w:t>
+      </w:r>
+    </w:p>
+    <w:p>
+      <w:r>
+        <w:rPr>
+          <w:rFonts w:ascii="Calibri" w:hAnsi="Calibri" w:eastAsia="Calibri"/>
+          <w:b w:val="0"/>
+          <w:color w:val="1B4332"/>
+          <w:sz w:val="22"/>
+        </w:rPr>
+        <w:t>rw_organization_admin. This scope manages organization pages and retrieves reporting data. We use it for aggregate post analytics, follower statistics, and page statistics. The signed-in member must be an ADMINISTRATOR. Sources: Organization Share Statistics, Organization Follower Statistics, Organization Page Statistics, and Organization Lookup. Total follower count uses networkSizes on the Organization Lookup page, under this same permission.</w:t>
+      </w:r>
+    </w:p>
+    <w:p>
+      <w:r>
+        <w:rPr>
+          <w:rFonts w:ascii="Calibri" w:hAnsi="Calibri" w:eastAsia="Calibri"/>
+          <w:b w:val="0"/>
+          <w:color w:val="1B4332"/>
+          <w:sz w:val="22"/>
+        </w:rPr>
+        <w:t>We do not need r_organization_followers for analytics. The docs describe that scope as follower data so an organization can mention followers in posts. We will not mention followers. We will not request that scope.</w:t>
+      </w:r>
+    </w:p>
+    <w:p>
+      <w:r>
+        <w:rPr>
+          <w:rFonts w:ascii="Calibri" w:hAnsi="Calibri" w:eastAsia="Calibri"/>
+          <w:b w:val="0"/>
+          <w:color w:val="1B4332"/>
+          <w:sz w:val="22"/>
+        </w:rPr>
+        <w:t>We do not need r_organization_admin. That scope is listed on the Advertising API and the Lead Sync API. It is not in the Community Management permission list. Page analytics on Community Management uses rw_organization_admin. We are not applying for the Advertising API.</w:t>
+      </w:r>
+    </w:p>
+    <w:p>
+      <w:r>
+        <w:rPr>
+          <w:rFonts w:ascii="Calibri" w:hAnsi="Calibri" w:eastAsia="Calibri"/>
+          <w:b w:val="0"/>
+          <w:color w:val="1B4332"/>
+          <w:sz w:val="22"/>
+        </w:rPr>
+        <w:t>The Community Management product also makes other scopes available on the app. We will not request them in OAuth, and we will not call them.</w:t>
       </w:r>
     </w:p>
     <w:p>
@@ -290,16 +1846,7 @@
           <w:color w:val="1B4332"/>
           <w:sz w:val="22"/>
         </w:rPr>
-        <w:t>https://cleantechhub.net/politica-de-privacidad/</w:t>
-      </w:r>
-      <w:r>
-        <w:rPr>
-          <w:rFonts w:ascii="Calibri" w:hAnsi="Calibri" w:eastAsia="Calibri"/>
-          <w:b w:val="0"/>
-          <w:color w:val="1B4332"/>
-          <w:sz w:val="22"/>
-        </w:rPr>
-        <w:t xml:space="preserve"> returns 404. WordPress is not the publish path. There is no WordPress admin access.</w:t>
+        <w:t>r_1st_connections_size</w:t>
       </w:r>
     </w:p>
     <w:p>
@@ -313,34 +1860,7 @@
           <w:color w:val="1B4332"/>
           <w:sz w:val="22"/>
         </w:rPr>
-        <w:t>https://jobs.cleantechhub.net/privacidad/</w:t>
-      </w:r>
-      <w:r>
-        <w:rPr>
-          <w:rFonts w:ascii="Calibri" w:hAnsi="Calibri" w:eastAsia="Calibri"/>
-          <w:b w:val="0"/>
-          <w:color w:val="1B4332"/>
-          <w:sz w:val="22"/>
-        </w:rPr>
-        <w:t xml:space="preserve"> and </w:t>
-      </w:r>
-      <w:r>
-        <w:rPr>
-          <w:rFonts w:ascii="Calibri" w:hAnsi="Calibri" w:eastAsia="Calibri"/>
-          <w:b w:val="0"/>
-          <w:color w:val="1B4332"/>
-          <w:sz w:val="22"/>
-        </w:rPr>
-        <w:t>https://jobs.cleantechhub.net/privacy</w:t>
-      </w:r>
-      <w:r>
-        <w:rPr>
-          <w:rFonts w:ascii="Calibri" w:hAnsi="Calibri" w:eastAsia="Calibri"/>
-          <w:b w:val="0"/>
-          <w:color w:val="1B4332"/>
-          <w:sz w:val="22"/>
-        </w:rPr>
-        <w:t xml:space="preserve"> return 200, but the body is the jobs homepage, not this policy. Do not paste those URLs.</w:t>
+        <w:t>r_basicprofile</w:t>
       </w:r>
     </w:p>
     <w:p>
@@ -354,1496 +1874,7 @@
           <w:color w:val="1B4332"/>
           <w:sz w:val="22"/>
         </w:rPr>
-        <w:t>https://agents.cleantechhub.net/privacidad/</w:t>
-      </w:r>
-      <w:r>
-        <w:rPr>
-          <w:rFonts w:ascii="Calibri" w:hAnsi="Calibri" w:eastAsia="Calibri"/>
-          <w:b w:val="0"/>
-          <w:color w:val="1B4332"/>
-          <w:sz w:val="22"/>
-        </w:rPr>
-        <w:t xml:space="preserve"> and </w:t>
-      </w:r>
-      <w:r>
-        <w:rPr>
-          <w:rFonts w:ascii="Calibri" w:hAnsi="Calibri" w:eastAsia="Calibri"/>
-          <w:b w:val="0"/>
-          <w:color w:val="1B4332"/>
-          <w:sz w:val="22"/>
-        </w:rPr>
-        <w:t>https://agents.cleantechhub.net/privacy</w:t>
-      </w:r>
-      <w:r>
-        <w:rPr>
-          <w:rFonts w:ascii="Calibri" w:hAnsi="Calibri" w:eastAsia="Calibri"/>
-          <w:b w:val="0"/>
-          <w:color w:val="1B4332"/>
-          <w:sz w:val="22"/>
-        </w:rPr>
-        <w:t xml:space="preserve"> return 200 with an empty body. Do not paste those URLs.</w:t>
-      </w:r>
-    </w:p>
-    <w:p>
-      <w:r>
-        <w:rPr>
-          <w:rFonts w:ascii="Calibri" w:hAnsi="Calibri" w:eastAsia="Calibri"/>
-          <w:b w:val="0"/>
-          <w:color w:val="1B4332"/>
-          <w:sz w:val="22"/>
-        </w:rPr>
-        <w:t xml:space="preserve">The approved draft is </w:t>
-      </w:r>
-      <w:r>
-        <w:rPr>
-          <w:rFonts w:ascii="Calibri" w:hAnsi="Calibri" w:eastAsia="Calibri"/>
-          <w:b w:val="0"/>
-          <w:color w:val="1B4332"/>
-          <w:sz w:val="22"/>
-        </w:rPr>
-        <w:t>artifacts/cleantechhub-privacy-policy.html</w:t>
-      </w:r>
-      <w:r>
-        <w:rPr>
-          <w:rFonts w:ascii="Calibri" w:hAnsi="Calibri" w:eastAsia="Calibri"/>
-          <w:b w:val="0"/>
-          <w:color w:val="1B4332"/>
-          <w:sz w:val="22"/>
-        </w:rPr>
-        <w:t xml:space="preserve">. It was not deployed. Both candidate hostnames resolve to the OVH VPS </w:t>
-      </w:r>
-      <w:r>
-        <w:rPr>
-          <w:rFonts w:ascii="Calibri" w:hAnsi="Calibri" w:eastAsia="Calibri"/>
-          <w:b w:val="0"/>
-          <w:color w:val="1B4332"/>
-          <w:sz w:val="22"/>
-        </w:rPr>
-        <w:t>51.195.45.77</w:t>
-      </w:r>
-      <w:r>
-        <w:rPr>
-          <w:rFonts w:ascii="Calibri" w:hAnsi="Calibri" w:eastAsia="Calibri"/>
-          <w:b w:val="0"/>
-          <w:color w:val="1B4332"/>
-          <w:sz w:val="22"/>
-        </w:rPr>
-        <w:t xml:space="preserve"> and answer with Caddy. Writing a file there needs a secret from Infisical. This environment has no Infisical CLI, no Infisical identity variables, and no Infisical config file. Vercel is connected, but neither hostname points at Vercel, and a new DNS record was not allowed.</w:t>
-      </w:r>
-    </w:p>
-    <w:p>
-      <w:r>
-        <w:rPr>
-          <w:rFonts w:ascii="Calibri" w:hAnsi="Calibri" w:eastAsia="Calibri"/>
-          <w:b w:val="0"/>
-          <w:color w:val="1B4332"/>
-          <w:sz w:val="22"/>
-        </w:rPr>
-        <w:t xml:space="preserve">The </w:t>
-      </w:r>
-      <w:r>
-        <w:rPr>
-          <w:rFonts w:ascii="Calibri" w:hAnsi="Calibri" w:eastAsia="Calibri"/>
-          <w:b w:val="0"/>
-          <w:color w:val="1B4332"/>
-          <w:sz w:val="22"/>
-        </w:rPr>
-        <w:t>/diagnostico</w:t>
-      </w:r>
-      <w:r>
-        <w:rPr>
-          <w:rFonts w:ascii="Calibri" w:hAnsi="Calibri" w:eastAsia="Calibri"/>
-          <w:b w:val="0"/>
-          <w:color w:val="1B4332"/>
-          <w:sz w:val="22"/>
-        </w:rPr>
-        <w:t xml:space="preserve"> green-finance checkbox is still an open item. A fresh fetch of </w:t>
-      </w:r>
-      <w:r>
-        <w:rPr>
-          <w:rFonts w:ascii="Calibri" w:hAnsi="Calibri" w:eastAsia="Calibri"/>
-          <w:b w:val="0"/>
-          <w:color w:val="1B4332"/>
-          <w:sz w:val="22"/>
-        </w:rPr>
-        <w:t>https://cleantechhub.net/diagnostico/</w:t>
-      </w:r>
-      <w:r>
-        <w:rPr>
-          <w:rFonts w:ascii="Calibri" w:hAnsi="Calibri" w:eastAsia="Calibri"/>
-          <w:b w:val="0"/>
-          <w:color w:val="1B4332"/>
-          <w:sz w:val="22"/>
-        </w:rPr>
-        <w:t xml:space="preserve"> still contains </w:t>
-      </w:r>
-      <w:r>
-        <w:rPr>
-          <w:rFonts w:ascii="Calibri" w:hAnsi="Calibri" w:eastAsia="Calibri"/>
-          <w:b w:val="0"/>
-          <w:color w:val="1B4332"/>
-          <w:sz w:val="22"/>
-        </w:rPr>
-        <w:t>&lt;input type="checkbox" id="newsletter-consent" checked&gt;</w:t>
-      </w:r>
-      <w:r>
-        <w:rPr>
-          <w:rFonts w:ascii="Calibri" w:hAnsi="Calibri" w:eastAsia="Calibri"/>
-          <w:b w:val="0"/>
-          <w:color w:val="1B4332"/>
-          <w:sz w:val="22"/>
-        </w:rPr>
-        <w:t>. It was not changed. Fixing it needs WordPress admin, which is not available.</w:t>
-      </w:r>
-    </w:p>
-    <w:p>
-      <w:r>
-        <w:rPr>
-          <w:rFonts w:ascii="Calibri" w:hAnsi="Calibri" w:eastAsia="Calibri"/>
-          <w:b w:val="0"/>
-          <w:color w:val="1B4332"/>
-          <w:sz w:val="22"/>
-        </w:rPr>
-        <w:t>Do not paste the Google Drive policy PDF into the privacy-policy field. That file is not a page on cleantechhub.net.</w:t>
-      </w:r>
-    </w:p>
-    <w:p>
-      <w:r>
-        <w:rPr>
-          <w:rFonts w:ascii="Calibri" w:hAnsi="Calibri" w:eastAsia="Calibri"/>
-          <w:b w:val="0"/>
-          <w:color w:val="1B4332"/>
-          <w:sz w:val="22"/>
-        </w:rPr>
-        <w:t xml:space="preserve">The worker authorization PDF is also the wrong document. Do not use </w:t>
-      </w:r>
-      <w:r>
-        <w:rPr>
-          <w:rFonts w:ascii="Calibri" w:hAnsi="Calibri" w:eastAsia="Calibri"/>
-          <w:b w:val="0"/>
-          <w:color w:val="1B4332"/>
-          <w:sz w:val="22"/>
-        </w:rPr>
-        <w:t>https://cleantechhub.net/wp-content/uploads/2026/07/Autorizacion-Tratamiento-Datos-Trabajadores.pdf</w:t>
-      </w:r>
-      <w:r>
-        <w:rPr>
-          <w:rFonts w:ascii="Calibri" w:hAnsi="Calibri" w:eastAsia="Calibri"/>
-          <w:b w:val="0"/>
-          <w:color w:val="1B4332"/>
-          <w:sz w:val="22"/>
-        </w:rPr>
-        <w:t>. It is a consent form for workers and contractors. Its street line also disagrees with the website and with the data policy.</w:t>
-      </w:r>
-    </w:p>
-    <w:p>
-      <w:r>
-        <w:rPr>
-          <w:rFonts w:ascii="Calibri" w:hAnsi="Calibri" w:eastAsia="Calibri"/>
-          <w:b/>
-          <w:color w:val="2D6A4F"/>
-          <w:sz w:val="32"/>
-        </w:rPr>
-        <w:t>1. Paste-ready form answers</w:t>
-      </w:r>
-    </w:p>
-    <w:p>
-      <w:r>
-        <w:rPr>
-          <w:rFonts w:ascii="Calibri" w:hAnsi="Calibri" w:eastAsia="Calibri"/>
-          <w:b/>
-          <w:color w:val="2D6A4F"/>
-          <w:sz w:val="26"/>
-        </w:rPr>
-        <w:t>1.1 Which app</w:t>
-      </w:r>
-    </w:p>
-    <w:p>
-      <w:r>
-        <w:rPr>
-          <w:rFonts w:ascii="Calibri" w:hAnsi="Calibri" w:eastAsia="Calibri"/>
-          <w:b/>
-          <w:color w:val="1B4332"/>
-          <w:sz w:val="22"/>
-        </w:rPr>
-        <w:t>Paste if the new app is the one in front of you:</w:t>
-      </w:r>
-    </w:p>
-    <w:p>
-      <w:r>
-        <w:rPr>
-          <w:rFonts w:ascii="Calibri" w:hAnsi="Calibri" w:eastAsia="Calibri"/>
-          <w:b w:val="0"/>
-          <w:color w:val="1B4332"/>
-          <w:sz w:val="22"/>
-        </w:rPr>
-        <w:t>This request is for a new CleantechHUB developer app. Its only product is the Community Management API. The existing app is n8n-li CleantechHUB, Client ID 782xlcklyvbakg. That app already has Sign In with LinkedIn and member posting. Leave that app in place for personal-profile posting.</w:t>
-      </w:r>
-    </w:p>
-    <w:p>
-      <w:r>
-        <w:rPr>
-          <w:rFonts w:ascii="Calibri" w:hAnsi="Calibri" w:eastAsia="Calibri"/>
-          <w:b/>
-          <w:color w:val="1B4332"/>
-          <w:sz w:val="22"/>
-        </w:rPr>
-        <w:t>Why:</w:t>
-      </w:r>
-      <w:r>
-        <w:rPr>
-          <w:rFonts w:ascii="Calibri" w:hAnsi="Calibri" w:eastAsia="Calibri"/>
-          <w:b w:val="0"/>
-          <w:color w:val="1B4332"/>
-          <w:sz w:val="22"/>
-        </w:rPr>
-        <w:t xml:space="preserve"> Community Management must be the only product on the app. If Share, Sign In, or any other product is already on the app, Request access stays grayed out. Source: </w:t>
-      </w:r>
-      <w:r>
-        <w:rPr>
-          <w:rFonts w:ascii="Calibri" w:hAnsi="Calibri" w:eastAsia="Calibri"/>
-          <w:b w:val="0"/>
-          <w:color w:val="1B4332"/>
-          <w:sz w:val="22"/>
-        </w:rPr>
-        <w:t>LinkedIn API Partner Support (https://learn.microsoft.com/en-us/linkedin/shared/linkedin-api-partner-support-guide)</w:t>
-      </w:r>
-      <w:r>
-        <w:rPr>
-          <w:rFonts w:ascii="Calibri" w:hAnsi="Calibri" w:eastAsia="Calibri"/>
-          <w:b w:val="0"/>
-          <w:color w:val="1B4332"/>
-          <w:sz w:val="22"/>
-        </w:rPr>
-        <w:t>.</w:t>
-      </w:r>
-    </w:p>
-    <w:p>
-      <w:r>
-        <w:rPr>
-          <w:rFonts w:ascii="Calibri" w:hAnsi="Calibri" w:eastAsia="Calibri"/>
-          <w:b/>
-          <w:color w:val="2D6A4F"/>
-          <w:sz w:val="26"/>
-        </w:rPr>
-        <w:t>1.2 App name</w:t>
-      </w:r>
-    </w:p>
-    <w:p>
-      <w:r>
-        <w:rPr>
-          <w:rFonts w:ascii="Calibri" w:hAnsi="Calibri" w:eastAsia="Calibri"/>
-          <w:b/>
-          <w:color w:val="1B4332"/>
-          <w:sz w:val="22"/>
-        </w:rPr>
-        <w:t>Paste:</w:t>
-      </w:r>
-    </w:p>
-    <w:p>
-      <w:r>
-        <w:rPr>
-          <w:rFonts w:ascii="Calibri" w:hAnsi="Calibri" w:eastAsia="Calibri"/>
-          <w:b w:val="0"/>
-          <w:color w:val="1B4332"/>
-          <w:sz w:val="22"/>
-        </w:rPr>
-        <w:t>CleantechHUB n8n</w:t>
-      </w:r>
-    </w:p>
-    <w:p>
-      <w:r>
-        <w:rPr>
-          <w:rFonts w:ascii="Calibri" w:hAnsi="Calibri" w:eastAsia="Calibri"/>
-          <w:b/>
-          <w:color w:val="1B4332"/>
-          <w:sz w:val="22"/>
-        </w:rPr>
-        <w:t>Do not use</w:t>
-      </w:r>
-      <w:r>
-        <w:rPr>
-          <w:rFonts w:ascii="Calibri" w:hAnsi="Calibri" w:eastAsia="Calibri"/>
-          <w:b w:val="0"/>
-          <w:color w:val="1B4332"/>
-          <w:sz w:val="22"/>
-        </w:rPr>
-        <w:t xml:space="preserve"> a name that contains Linked, In, LinkedIn, Microsoft, or the abbreviation li. </w:t>
-      </w:r>
-      <w:r>
-        <w:rPr>
-          <w:rFonts w:ascii="Calibri" w:hAnsi="Calibri" w:eastAsia="Calibri"/>
-          <w:b/>
-          <w:color w:val="1B4332"/>
-          <w:sz w:val="22"/>
-        </w:rPr>
-        <w:t>Invalid App Name</w:t>
-      </w:r>
-      <w:r>
-        <w:rPr>
-          <w:rFonts w:ascii="Calibri" w:hAnsi="Calibri" w:eastAsia="Calibri"/>
-          <w:b w:val="0"/>
-          <w:color w:val="1B4332"/>
-          <w:sz w:val="22"/>
-        </w:rPr>
-        <w:t xml:space="preserve"> is a published rejection. The examples in the docs are “Linked” and “In”. The current name n8n-li contains “li”. The docs do not say whether reviewers treat those two letters as a portion of LinkedIn. Use the clean name on the new app so a rejection is not spent on the name.</w:t>
-      </w:r>
-    </w:p>
-    <w:p>
-      <w:r>
-        <w:rPr>
-          <w:rFonts w:ascii="Calibri" w:hAnsi="Calibri" w:eastAsia="Calibri"/>
-          <w:b/>
-          <w:color w:val="2D6A4F"/>
-          <w:sz w:val="26"/>
-        </w:rPr>
-        <w:t>1.3 Company and legal entity</w:t>
-      </w:r>
-    </w:p>
-    <w:p>
-      <w:r>
-        <w:rPr>
-          <w:rFonts w:ascii="Calibri" w:hAnsi="Calibri" w:eastAsia="Calibri"/>
-          <w:b/>
-          <w:color w:val="1B4332"/>
-          <w:sz w:val="22"/>
-        </w:rPr>
-        <w:t>Paste:</w:t>
-      </w:r>
-    </w:p>
-    <w:p>
-      <w:r>
-        <w:rPr>
-          <w:rFonts w:ascii="Calibri" w:hAnsi="Calibri" w:eastAsia="Calibri"/>
-          <w:b w:val="0"/>
-          <w:color w:val="1B4332"/>
-          <w:sz w:val="22"/>
-        </w:rPr>
-        <w:t>FUNDACIÓN CLEANTECH HUB</w:t>
-      </w:r>
-    </w:p>
-    <w:p>
-      <w:r>
-        <w:rPr>
-          <w:rFonts w:ascii="Calibri" w:hAnsi="Calibri" w:eastAsia="Calibri"/>
-          <w:b w:val="0"/>
-          <w:color w:val="1B4332"/>
-          <w:sz w:val="22"/>
-        </w:rPr>
-        <w:t>Entidad sin ánimo de lucro (ESAL), régimen tributario especial.</w:t>
-      </w:r>
-    </w:p>
-    <w:p>
-      <w:r>
-        <w:rPr>
-          <w:rFonts w:ascii="Calibri" w:hAnsi="Calibri" w:eastAsia="Calibri"/>
-          <w:b w:val="0"/>
-          <w:color w:val="1B4332"/>
-          <w:sz w:val="22"/>
-        </w:rPr>
-        <w:t>NIT (Número de Identificación Tributaria) 901.523.941-9.</w:t>
-      </w:r>
-    </w:p>
-    <w:p>
-      <w:r>
-        <w:rPr>
-          <w:rFonts w:ascii="Calibri" w:hAnsi="Calibri" w:eastAsia="Calibri"/>
-          <w:b w:val="0"/>
-          <w:color w:val="1B4332"/>
-          <w:sz w:val="22"/>
-        </w:rPr>
-        <w:t>Bogotá D.C., Colombia.</w:t>
-      </w:r>
-    </w:p>
-    <w:p>
-      <w:r>
-        <w:rPr>
-          <w:rFonts w:ascii="Calibri" w:hAnsi="Calibri" w:eastAsia="Calibri"/>
-          <w:b w:val="0"/>
-          <w:color w:val="1B4332"/>
-          <w:sz w:val="22"/>
-        </w:rPr>
-        <w:t>Legal representative: Gideon Blaauw, Representante Legal de la Fundación CleantechHUB.</w:t>
-      </w:r>
-    </w:p>
-    <w:p>
-      <w:r>
-        <w:rPr>
-          <w:rFonts w:ascii="Calibri" w:hAnsi="Calibri" w:eastAsia="Calibri"/>
-          <w:b w:val="0"/>
-          <w:color w:val="1B4332"/>
-          <w:sz w:val="22"/>
-        </w:rPr>
-        <w:t>Phone: +57 313 715 5965.</w:t>
-      </w:r>
-    </w:p>
-    <w:p>
-      <w:r>
-        <w:rPr>
-          <w:rFonts w:ascii="Calibri" w:hAnsi="Calibri" w:eastAsia="Calibri"/>
-          <w:b/>
-          <w:color w:val="1B4332"/>
-          <w:sz w:val="22"/>
-        </w:rPr>
-        <w:t>Where this comes from:</w:t>
-      </w:r>
-      <w:r>
-        <w:rPr>
-          <w:rFonts w:ascii="Calibri" w:hAnsi="Calibri" w:eastAsia="Calibri"/>
-          <w:b w:val="0"/>
-          <w:color w:val="1B4332"/>
-          <w:sz w:val="22"/>
-        </w:rPr>
-        <w:t xml:space="preserve"> Gideon confirmed this legal name, this non-profit form, and this tax number on 22 October 2026 for the public privacy policy. The NIT matches the public “Política y tratamiento de datos” PDF linked from </w:t>
-      </w:r>
-      <w:r>
-        <w:rPr>
-          <w:rFonts w:ascii="Calibri" w:hAnsi="Calibri" w:eastAsia="Calibri"/>
-          <w:b w:val="0"/>
-          <w:color w:val="1B4332"/>
-          <w:sz w:val="22"/>
-        </w:rPr>
-        <w:t>the governance page (https://cleantechhub.net/governance/)</w:t>
-      </w:r>
-      <w:r>
-        <w:rPr>
-          <w:rFonts w:ascii="Calibri" w:hAnsi="Calibri" w:eastAsia="Calibri"/>
-          <w:b w:val="0"/>
-          <w:color w:val="1B4332"/>
-          <w:sz w:val="22"/>
-        </w:rPr>
-        <w:t>. That page also says “Fundación”. The PDF contact block names Gideon Blaauw, cargo Representante legal.</w:t>
-      </w:r>
-    </w:p>
-    <w:p>
-      <w:r>
-        <w:rPr>
-          <w:rFonts w:ascii="Calibri" w:hAnsi="Calibri" w:eastAsia="Calibri"/>
-          <w:b/>
-          <w:color w:val="1B4332"/>
-          <w:sz w:val="22"/>
-        </w:rPr>
-        <w:t>Paste this name.</w:t>
-      </w:r>
-      <w:r>
-        <w:rPr>
-          <w:rFonts w:ascii="Calibri" w:hAnsi="Calibri" w:eastAsia="Calibri"/>
-          <w:b w:val="0"/>
-          <w:color w:val="1B4332"/>
-          <w:sz w:val="22"/>
-        </w:rPr>
-        <w:t xml:space="preserve"> Do not add a simplified-stock-company suffix. The 2022 PDF used a commercial company form. Do not copy that form into this field. A name that does not match the registry is a known cause of </w:t>
-      </w:r>
-      <w:r>
-        <w:rPr>
-          <w:rFonts w:ascii="Calibri" w:hAnsi="Calibri" w:eastAsia="Calibri"/>
-          <w:b/>
-          <w:color w:val="1B4332"/>
-          <w:sz w:val="22"/>
-        </w:rPr>
-        <w:t>Fail Organization Verification</w:t>
-      </w:r>
-      <w:r>
-        <w:rPr>
-          <w:rFonts w:ascii="Calibri" w:hAnsi="Calibri" w:eastAsia="Calibri"/>
-          <w:b w:val="0"/>
-          <w:color w:val="1B4332"/>
-          <w:sz w:val="22"/>
-        </w:rPr>
-        <w:t>.</w:t>
-      </w:r>
-    </w:p>
-    <w:p>
-      <w:r>
-        <w:rPr>
-          <w:rFonts w:ascii="Calibri" w:hAnsi="Calibri" w:eastAsia="Calibri"/>
-          <w:b/>
-          <w:color w:val="2D6A4F"/>
-          <w:sz w:val="26"/>
-        </w:rPr>
-        <w:t>1.4 Registered address</w:t>
-      </w:r>
-    </w:p>
-    <w:p>
-      <w:r>
-        <w:rPr>
-          <w:rFonts w:ascii="Calibri" w:hAnsi="Calibri" w:eastAsia="Calibri"/>
-          <w:b/>
-          <w:color w:val="1B4332"/>
-          <w:sz w:val="22"/>
-        </w:rPr>
-        <w:t>Paste:</w:t>
-      </w:r>
-    </w:p>
-    <w:p>
-      <w:r>
-        <w:rPr>
-          <w:rFonts w:ascii="Calibri" w:hAnsi="Calibri" w:eastAsia="Calibri"/>
-          <w:b w:val="0"/>
-          <w:color w:val="1B4332"/>
-          <w:sz w:val="22"/>
-        </w:rPr>
-        <w:t>Calle 90 No. 19-41 Of. 801, Bogotá D.C., Colombia.</w:t>
-      </w:r>
-    </w:p>
-    <w:p>
-      <w:r>
-        <w:rPr>
-          <w:rFonts w:ascii="Calibri" w:hAnsi="Calibri" w:eastAsia="Calibri"/>
-          <w:b/>
-          <w:color w:val="1B4332"/>
-          <w:sz w:val="22"/>
-        </w:rPr>
-        <w:t>Where this comes from:</w:t>
-      </w:r>
-      <w:r>
-        <w:rPr>
-          <w:rFonts w:ascii="Calibri" w:hAnsi="Calibri" w:eastAsia="Calibri"/>
-          <w:b w:val="0"/>
-          <w:color w:val="1B4332"/>
-          <w:sz w:val="22"/>
-        </w:rPr>
-        <w:t xml:space="preserve"> Gideon confirmed this address on 22 October 2026. It matches the public data policy (CALLE 90 No. 19-41 OF 801, Bogotá) and the site footer at </w:t>
-      </w:r>
-      <w:r>
-        <w:rPr>
-          <w:rFonts w:ascii="Calibri" w:hAnsi="Calibri" w:eastAsia="Calibri"/>
-          <w:b w:val="0"/>
-          <w:color w:val="1B4332"/>
-          <w:sz w:val="22"/>
-        </w:rPr>
-        <w:t>https://cleantechhub.net/</w:t>
-      </w:r>
-      <w:r>
-        <w:rPr>
-          <w:rFonts w:ascii="Calibri" w:hAnsi="Calibri" w:eastAsia="Calibri"/>
-          <w:b w:val="0"/>
-          <w:color w:val="1B4332"/>
-          <w:sz w:val="22"/>
-        </w:rPr>
-        <w:t>, which prints “Cll 90 #19 - 41 Office 801”.</w:t>
-      </w:r>
-    </w:p>
-    <w:p>
-      <w:r>
-        <w:rPr>
-          <w:rFonts w:ascii="Calibri" w:hAnsi="Calibri" w:eastAsia="Calibri"/>
-          <w:b w:val="0"/>
-          <w:color w:val="1B4332"/>
-          <w:sz w:val="22"/>
-        </w:rPr>
-        <w:t>Do not paste Calle 45 #9-42 from the worker authorization PDF.</w:t>
-      </w:r>
-    </w:p>
-    <w:p>
-      <w:r>
-        <w:rPr>
-          <w:rFonts w:ascii="Calibri" w:hAnsi="Calibri" w:eastAsia="Calibri"/>
-          <w:b/>
-          <w:color w:val="2D6A4F"/>
-          <w:sz w:val="26"/>
-        </w:rPr>
-        <w:t>1.5 Business email</w:t>
-      </w:r>
-    </w:p>
-    <w:p>
-      <w:r>
-        <w:rPr>
-          <w:rFonts w:ascii="Calibri" w:hAnsi="Calibri" w:eastAsia="Calibri"/>
-          <w:b/>
-          <w:color w:val="1B4332"/>
-          <w:sz w:val="22"/>
-        </w:rPr>
-        <w:t>Paste:</w:t>
-      </w:r>
-    </w:p>
-    <w:p>
-      <w:r>
-        <w:rPr>
-          <w:rFonts w:ascii="Calibri" w:hAnsi="Calibri" w:eastAsia="Calibri"/>
-          <w:b w:val="0"/>
-          <w:color w:val="1B4332"/>
-          <w:sz w:val="22"/>
-        </w:rPr>
-        <w:t>admin@cleantechhub.net</w:t>
-      </w:r>
-    </w:p>
-    <w:p>
-      <w:r>
-        <w:rPr>
-          <w:rFonts w:ascii="Calibri" w:hAnsi="Calibri" w:eastAsia="Calibri"/>
-          <w:b/>
-          <w:color w:val="1B4332"/>
-          <w:sz w:val="22"/>
-        </w:rPr>
-        <w:t>Where this comes from:</w:t>
-      </w:r>
-      <w:r>
-        <w:rPr>
-          <w:rFonts w:ascii="Calibri" w:hAnsi="Calibri" w:eastAsia="Calibri"/>
-          <w:b w:val="0"/>
-          <w:color w:val="1B4332"/>
-          <w:sz w:val="22"/>
-        </w:rPr>
-        <w:t xml:space="preserve"> Gideon set this as the public contact on 22 October 2026. It is the address in the privacy policy.</w:t>
-      </w:r>
-    </w:p>
-    <w:p>
-      <w:r>
-        <w:rPr>
-          <w:rFonts w:ascii="Calibri" w:hAnsi="Calibri" w:eastAsia="Calibri"/>
-          <w:b/>
-          <w:color w:val="1B4332"/>
-          <w:sz w:val="22"/>
-        </w:rPr>
-        <w:t>Rules from the docs:</w:t>
-      </w:r>
-      <w:r>
-        <w:rPr>
-          <w:rFonts w:ascii="Calibri" w:hAnsi="Calibri" w:eastAsia="Calibri"/>
-          <w:b w:val="0"/>
-          <w:color w:val="1B4332"/>
-          <w:sz w:val="22"/>
-        </w:rPr>
-        <w:t xml:space="preserve"> the address must be a business email. A personal mailbox will not pass. LinkedIn sends a verification message to this address. Check spam, junk, the social tab, and the promotions tab. He must be able to open admin@cleantechhub.net.</w:t>
-      </w:r>
-    </w:p>
-    <w:p>
-      <w:r>
-        <w:rPr>
-          <w:rFonts w:ascii="Calibri" w:hAnsi="Calibri" w:eastAsia="Calibri"/>
-          <w:b/>
-          <w:color w:val="2D6A4F"/>
-          <w:sz w:val="26"/>
-        </w:rPr>
-        <w:t>1.6 Website</w:t>
-      </w:r>
-    </w:p>
-    <w:p>
-      <w:r>
-        <w:rPr>
-          <w:rFonts w:ascii="Calibri" w:hAnsi="Calibri" w:eastAsia="Calibri"/>
-          <w:b/>
-          <w:color w:val="1B4332"/>
-          <w:sz w:val="22"/>
-        </w:rPr>
-        <w:t>Paste:</w:t>
-      </w:r>
-    </w:p>
-    <w:p>
-      <w:r>
-        <w:rPr>
-          <w:rFonts w:ascii="Calibri" w:hAnsi="Calibri" w:eastAsia="Calibri"/>
-          <w:b w:val="0"/>
-          <w:color w:val="1B4332"/>
-          <w:sz w:val="22"/>
-        </w:rPr>
-        <w:t>https://cleantechhub.net</w:t>
-      </w:r>
-    </w:p>
-    <w:p>
-      <w:r>
-        <w:rPr>
-          <w:rFonts w:ascii="Calibri" w:hAnsi="Calibri" w:eastAsia="Calibri"/>
-          <w:b w:val="0"/>
-          <w:color w:val="1B4332"/>
-          <w:sz w:val="22"/>
-        </w:rPr>
-        <w:t>The organization website and the domain must match this site. Review checks a verified organization website and domain.</w:t>
-      </w:r>
-    </w:p>
-    <w:p>
-      <w:r>
-        <w:rPr>
-          <w:rFonts w:ascii="Calibri" w:hAnsi="Calibri" w:eastAsia="Calibri"/>
-          <w:b/>
-          <w:color w:val="2D6A4F"/>
-          <w:sz w:val="26"/>
-        </w:rPr>
-        <w:t>1.7 Privacy policy URL</w:t>
-      </w:r>
-    </w:p>
-    <w:p>
-      <w:r>
-        <w:rPr>
-          <w:rFonts w:ascii="Calibri" w:hAnsi="Calibri" w:eastAsia="Calibri"/>
-          <w:b/>
-          <w:color w:val="1B4332"/>
-          <w:sz w:val="22"/>
-        </w:rPr>
-        <w:t>Status: not live. Do not paste a URL yet.</w:t>
-      </w:r>
-    </w:p>
-    <w:p>
-      <w:r>
-        <w:rPr>
-          <w:rFonts w:ascii="Calibri" w:hAnsi="Calibri" w:eastAsia="Calibri"/>
-          <w:b w:val="0"/>
-          <w:color w:val="1B4332"/>
-          <w:sz w:val="22"/>
-        </w:rPr>
-        <w:t xml:space="preserve">The approved page is </w:t>
-      </w:r>
-      <w:r>
-        <w:rPr>
-          <w:rFonts w:ascii="Calibri" w:hAnsi="Calibri" w:eastAsia="Calibri"/>
-          <w:b w:val="0"/>
-          <w:color w:val="1B4332"/>
-          <w:sz w:val="22"/>
-        </w:rPr>
-        <w:t>artifacts/cleantechhub-privacy-policy.html</w:t>
-      </w:r>
-      <w:r>
-        <w:rPr>
-          <w:rFonts w:ascii="Calibri" w:hAnsi="Calibri" w:eastAsia="Calibri"/>
-          <w:b w:val="0"/>
-          <w:color w:val="1B4332"/>
-          <w:sz w:val="22"/>
-        </w:rPr>
-        <w:t>. It is not on a public URL. See the stop notice. Paste the URL only after it returns 200 without a login and the body is this policy.</w:t>
-      </w:r>
-    </w:p>
-    <w:p>
-      <w:r>
-        <w:rPr>
-          <w:rFonts w:ascii="Calibri" w:hAnsi="Calibri" w:eastAsia="Calibri"/>
-          <w:b/>
-          <w:color w:val="2D6A4F"/>
-          <w:sz w:val="26"/>
-        </w:rPr>
-        <w:t>1.8 LinkedIn Page</w:t>
-      </w:r>
-    </w:p>
-    <w:p>
-      <w:r>
-        <w:rPr>
-          <w:rFonts w:ascii="Calibri" w:hAnsi="Calibri" w:eastAsia="Calibri"/>
-          <w:b/>
-          <w:color w:val="1B4332"/>
-          <w:sz w:val="22"/>
-        </w:rPr>
-        <w:t>Paste:</w:t>
-      </w:r>
-    </w:p>
-    <w:p>
-      <w:r>
-        <w:rPr>
-          <w:rFonts w:ascii="Calibri" w:hAnsi="Calibri" w:eastAsia="Calibri"/>
-          <w:b w:val="0"/>
-          <w:color w:val="1B4332"/>
-          <w:sz w:val="22"/>
-        </w:rPr>
-        <w:t>LinkedIn Page name: CleantechHUB.</w:t>
-      </w:r>
-    </w:p>
-    <w:p>
-      <w:r>
-        <w:rPr>
-          <w:rFonts w:ascii="Calibri" w:hAnsi="Calibri" w:eastAsia="Calibri"/>
-          <w:b w:val="0"/>
-          <w:color w:val="1B4332"/>
-          <w:sz w:val="22"/>
-        </w:rPr>
-        <w:t>LinkedIn Page URL: [GIDEON TO FILL].</w:t>
-      </w:r>
-    </w:p>
-    <w:p>
-      <w:r>
-        <w:rPr>
-          <w:rFonts w:ascii="Calibri" w:hAnsi="Calibri" w:eastAsia="Calibri"/>
-          <w:b w:val="0"/>
-          <w:color w:val="1B4332"/>
-          <w:sz w:val="22"/>
-        </w:rPr>
-        <w:t>Organization ID: [GIDEON TO FILL].</w:t>
-      </w:r>
-    </w:p>
-    <w:p>
-      <w:r>
-        <w:rPr>
-          <w:rFonts w:ascii="Calibri" w:hAnsi="Calibri" w:eastAsia="Calibri"/>
-          <w:b w:val="0"/>
-          <w:color w:val="1B4332"/>
-          <w:sz w:val="22"/>
-        </w:rPr>
-        <w:t xml:space="preserve">The public pages checked on cleantechhub.net do not print the company Page URL or the organization id. The Page must belong to the same organization as the legal entity. A Page for a different organization is </w:t>
-      </w:r>
-      <w:r>
-        <w:rPr>
-          <w:rFonts w:ascii="Calibri" w:hAnsi="Calibri" w:eastAsia="Calibri"/>
-          <w:b/>
-          <w:color w:val="1B4332"/>
-          <w:sz w:val="22"/>
-        </w:rPr>
-        <w:t>Invalid Company Page</w:t>
-      </w:r>
-      <w:r>
-        <w:rPr>
-          <w:rFonts w:ascii="Calibri" w:hAnsi="Calibri" w:eastAsia="Calibri"/>
-          <w:b w:val="0"/>
-          <w:color w:val="1B4332"/>
-          <w:sz w:val="22"/>
-        </w:rPr>
-        <w:t>.</w:t>
-      </w:r>
-    </w:p>
-    <w:p>
-      <w:r>
-        <w:rPr>
-          <w:rFonts w:ascii="Calibri" w:hAnsi="Calibri" w:eastAsia="Calibri"/>
-          <w:b/>
-          <w:color w:val="2D6A4F"/>
-          <w:sz w:val="26"/>
-        </w:rPr>
-        <w:t>1.9 Page admin</w:t>
-      </w:r>
-    </w:p>
-    <w:p>
-      <w:r>
-        <w:rPr>
-          <w:rFonts w:ascii="Calibri" w:hAnsi="Calibri" w:eastAsia="Calibri"/>
-          <w:b/>
-          <w:color w:val="1B4332"/>
-          <w:sz w:val="22"/>
-        </w:rPr>
-        <w:t>Paste:</w:t>
-      </w:r>
-    </w:p>
-    <w:p>
-      <w:r>
-        <w:rPr>
-          <w:rFonts w:ascii="Calibri" w:hAnsi="Calibri" w:eastAsia="Calibri"/>
-          <w:b w:val="0"/>
-          <w:color w:val="1B4332"/>
-          <w:sz w:val="22"/>
-        </w:rPr>
-        <w:t>Page super admin who will approve the app verification URL: [GIDEON TO FILL].</w:t>
-      </w:r>
-    </w:p>
-    <w:p>
-      <w:r>
-        <w:rPr>
-          <w:rFonts w:ascii="Calibri" w:hAnsi="Calibri" w:eastAsia="Calibri"/>
-          <w:b w:val="0"/>
-          <w:color w:val="1B4332"/>
-          <w:sz w:val="22"/>
-        </w:rPr>
-        <w:t>LinkedIn member who will sign in and grant the token: [GIDEON TO FILL].</w:t>
-      </w:r>
-    </w:p>
-    <w:p>
-      <w:r>
-        <w:rPr>
-          <w:rFonts w:ascii="Calibri" w:hAnsi="Calibri" w:eastAsia="Calibri"/>
-          <w:b w:val="0"/>
-          <w:color w:val="1B4332"/>
-          <w:sz w:val="22"/>
-        </w:rPr>
-        <w:t>That member’s company Page role: ADMINISTRATOR.</w:t>
-      </w:r>
-    </w:p>
-    <w:p>
-      <w:r>
-        <w:rPr>
-          <w:rFonts w:ascii="Calibri" w:hAnsi="Calibri" w:eastAsia="Calibri"/>
-          <w:b w:val="0"/>
-          <w:color w:val="1B4332"/>
-          <w:sz w:val="22"/>
-        </w:rPr>
-        <w:t xml:space="preserve">Verification is done by a Page super admin. Posting can be done by an ADMINISTRATOR, a DIRECT_SPONSORED_CONTENT_POSTER, or a CONTENT_ADMIN. Page analytics under </w:t>
-      </w:r>
-      <w:r>
-        <w:rPr>
-          <w:rFonts w:ascii="Calibri" w:hAnsi="Calibri" w:eastAsia="Calibri"/>
-          <w:b w:val="0"/>
-          <w:color w:val="1B4332"/>
-          <w:sz w:val="22"/>
-        </w:rPr>
-        <w:t>rw_organization_admin</w:t>
-      </w:r>
-      <w:r>
-        <w:rPr>
-          <w:rFonts w:ascii="Calibri" w:hAnsi="Calibri" w:eastAsia="Calibri"/>
-          <w:b w:val="0"/>
-          <w:color w:val="1B4332"/>
-          <w:sz w:val="22"/>
-        </w:rPr>
-        <w:t xml:space="preserve"> is limited to the ADMINISTRATOR role. Gideon is named as legal representative in the data policy. That sentence does not prove his LinkedIn Page role. </w:t>
-      </w:r>
-      <w:r>
-        <w:rPr>
-          <w:rFonts w:ascii="Calibri" w:hAnsi="Calibri" w:eastAsia="Calibri"/>
-          <w:b w:val="0"/>
-          <w:color w:val="1B4332"/>
-          <w:sz w:val="22"/>
-        </w:rPr>
-        <w:t>[GIDEON TO FILL]</w:t>
-      </w:r>
-      <w:r>
-        <w:rPr>
-          <w:rFonts w:ascii="Calibri" w:hAnsi="Calibri" w:eastAsia="Calibri"/>
-          <w:b w:val="0"/>
-          <w:color w:val="1B4332"/>
-          <w:sz w:val="22"/>
-        </w:rPr>
-        <w:t xml:space="preserve"> both names, even if they are Gideon.</w:t>
-      </w:r>
-    </w:p>
-    <w:p>
-      <w:r>
-        <w:rPr>
-          <w:rFonts w:ascii="Calibri" w:hAnsi="Calibri" w:eastAsia="Calibri"/>
-          <w:b w:val="0"/>
-          <w:color w:val="1B4332"/>
-          <w:sz w:val="22"/>
-        </w:rPr>
-        <w:t>The super admin has 30 days to open the verification URL. Approval is permanent. The app cannot later move to another Page.</w:t>
-      </w:r>
-    </w:p>
-    <w:p>
-      <w:r>
-        <w:rPr>
-          <w:rFonts w:ascii="Calibri" w:hAnsi="Calibri" w:eastAsia="Calibri"/>
-          <w:b/>
-          <w:color w:val="2D6A4F"/>
-          <w:sz w:val="26"/>
-        </w:rPr>
-        <w:t>1.10 Use case description</w:t>
-      </w:r>
-    </w:p>
-    <w:p>
-      <w:r>
-        <w:rPr>
-          <w:rFonts w:ascii="Calibri" w:hAnsi="Calibri" w:eastAsia="Calibri"/>
-          <w:b/>
-          <w:color w:val="1B4332"/>
-          <w:sz w:val="22"/>
-        </w:rPr>
-        <w:t>Paste:</w:t>
-      </w:r>
-    </w:p>
-    <w:p>
-      <w:r>
-        <w:rPr>
-          <w:rFonts w:ascii="Calibri" w:hAnsi="Calibri" w:eastAsia="Calibri"/>
-          <w:b w:val="0"/>
-          <w:color w:val="1B4332"/>
-          <w:sz w:val="22"/>
-        </w:rPr>
-        <w:t>CleantechHUB will use the Community Management API for its own LinkedIn Page only.</w:t>
-      </w:r>
-    </w:p>
-    <w:p>
-      <w:r>
-        <w:rPr>
-          <w:rFonts w:ascii="Calibri" w:hAnsi="Calibri" w:eastAsia="Calibri"/>
-          <w:b w:val="0"/>
-          <w:color w:val="1B4332"/>
-          <w:sz w:val="22"/>
-        </w:rPr>
-        <w:t>The use cases are Page Management and Page Analytics.</w:t>
-      </w:r>
-    </w:p>
-    <w:p>
-      <w:r>
-        <w:rPr>
-          <w:rFonts w:ascii="Calibri" w:hAnsi="Calibri" w:eastAsia="Calibri"/>
-          <w:b w:val="0"/>
-          <w:color w:val="1B4332"/>
-          <w:sz w:val="22"/>
-        </w:rPr>
-        <w:t>A private n8n workflow, run by CleantechHUB, will publish CleantechHUB jobs, program news, and newsletters as that Page.</w:t>
-      </w:r>
-    </w:p>
-    <w:p>
-      <w:r>
-        <w:rPr>
-          <w:rFonts w:ascii="Calibri" w:hAnsi="Calibri" w:eastAsia="Calibri"/>
-          <w:b w:val="0"/>
-          <w:color w:val="1B4332"/>
-          <w:sz w:val="22"/>
-        </w:rPr>
-        <w:t>The same workflow will read that Page’s own posts and comments.</w:t>
-      </w:r>
-    </w:p>
-    <w:p>
-      <w:r>
-        <w:rPr>
-          <w:rFonts w:ascii="Calibri" w:hAnsi="Calibri" w:eastAsia="Calibri"/>
-          <w:b w:val="0"/>
-          <w:color w:val="1B4332"/>
-          <w:sz w:val="22"/>
-        </w:rPr>
-        <w:t>It will read aggregate analytics for those posts. The counts are impressions, clicks, reactions, comments, shares, and engagement.</w:t>
-      </w:r>
-    </w:p>
-    <w:p>
-      <w:r>
-        <w:rPr>
-          <w:rFonts w:ascii="Calibri" w:hAnsi="Calibri" w:eastAsia="Calibri"/>
-          <w:b w:val="0"/>
-          <w:color w:val="1B4332"/>
-          <w:sz w:val="22"/>
-        </w:rPr>
-        <w:t>It will read aggregate follower counts and page view counts for that same Page.</w:t>
-      </w:r>
-    </w:p>
-    <w:p>
-      <w:r>
-        <w:rPr>
-          <w:rFonts w:ascii="Calibri" w:hAnsi="Calibri" w:eastAsia="Calibri"/>
-          <w:b w:val="0"/>
-          <w:color w:val="1B4332"/>
-          <w:sz w:val="22"/>
-        </w:rPr>
-        <w:t>The workflow serves no other organization.</w:t>
-      </w:r>
-    </w:p>
-    <w:p>
-      <w:r>
-        <w:rPr>
-          <w:rFonts w:ascii="Calibri" w:hAnsi="Calibri" w:eastAsia="Calibri"/>
-          <w:b w:val="0"/>
-          <w:color w:val="1B4332"/>
-          <w:sz w:val="22"/>
-        </w:rPr>
-        <w:t>It does not scrape member profiles.</w:t>
-      </w:r>
-    </w:p>
-    <w:p>
-      <w:r>
-        <w:rPr>
-          <w:rFonts w:ascii="Calibri" w:hAnsi="Calibri" w:eastAsia="Calibri"/>
-          <w:b w:val="0"/>
-          <w:color w:val="1B4332"/>
-          <w:sz w:val="22"/>
-        </w:rPr>
-        <w:t>It does not use LinkedIn data for ads, sales, recruiting, lead lists, or audience building.</w:t>
-      </w:r>
-    </w:p>
-    <w:p>
-      <w:r>
-        <w:rPr>
-          <w:rFonts w:ascii="Calibri" w:hAnsi="Calibri" w:eastAsia="Calibri"/>
-          <w:b w:val="0"/>
-          <w:color w:val="1B4332"/>
-          <w:sz w:val="22"/>
-        </w:rPr>
-        <w:t>It does not place a LinkedIn feed on cleantechhub.net or on an intranet.</w:t>
-      </w:r>
-    </w:p>
-    <w:p>
-      <w:r>
-        <w:rPr>
-          <w:rFonts w:ascii="Calibri" w:hAnsi="Calibri" w:eastAsia="Calibri"/>
-          <w:b w:val="0"/>
-          <w:color w:val="1B4332"/>
-          <w:sz w:val="22"/>
-        </w:rPr>
-        <w:t>It does not combine member data with a CRM (customer relationship management) system or any other database.</w:t>
-      </w:r>
-    </w:p>
-    <w:p>
-      <w:r>
-        <w:rPr>
-          <w:rFonts w:ascii="Calibri" w:hAnsi="Calibri" w:eastAsia="Calibri"/>
-          <w:b/>
-          <w:color w:val="2D6A4F"/>
-          <w:sz w:val="26"/>
-        </w:rPr>
-        <w:t>1.11 Company and product overview</w:t>
-      </w:r>
-    </w:p>
-    <w:p>
-      <w:r>
-        <w:rPr>
-          <w:rFonts w:ascii="Calibri" w:hAnsi="Calibri" w:eastAsia="Calibri"/>
-          <w:b/>
-          <w:color w:val="1B4332"/>
-          <w:sz w:val="22"/>
-        </w:rPr>
-        <w:t>Paste:</w:t>
-      </w:r>
-    </w:p>
-    <w:p>
-      <w:r>
-        <w:rPr>
-          <w:rFonts w:ascii="Calibri" w:hAnsi="Calibri" w:eastAsia="Calibri"/>
-          <w:b w:val="0"/>
-          <w:color w:val="1B4332"/>
-          <w:sz w:val="22"/>
-        </w:rPr>
-        <w:t>CleantechHUB is a climate innovation organization in Latin America. Its public site is https://cleantechhub.net.</w:t>
-      </w:r>
-    </w:p>
-    <w:p>
-      <w:r>
-        <w:rPr>
-          <w:rFonts w:ascii="Calibri" w:hAnsi="Calibri" w:eastAsia="Calibri"/>
-          <w:b w:val="0"/>
-          <w:color w:val="1B4332"/>
-          <w:sz w:val="22"/>
-        </w:rPr>
-        <w:t>This application is not sold to other companies. It is CleantechHUB’s own publishing workflow.</w:t>
-      </w:r>
-    </w:p>
-    <w:p>
-      <w:r>
-        <w:rPr>
-          <w:rFonts w:ascii="Calibri" w:hAnsi="Calibri" w:eastAsia="Calibri"/>
-          <w:b w:val="0"/>
-          <w:color w:val="1B4332"/>
-          <w:sz w:val="22"/>
-        </w:rPr>
-        <w:t>The workflow posts CleantechHUB content to the CleantechHUB Page, then reads that Page’s results.</w:t>
-      </w:r>
-    </w:p>
-    <w:p>
-      <w:r>
-        <w:rPr>
-          <w:rFonts w:ascii="Calibri" w:hAnsi="Calibri" w:eastAsia="Calibri"/>
-          <w:b w:val="0"/>
-          <w:color w:val="1B4332"/>
-          <w:sz w:val="22"/>
-        </w:rPr>
-        <w:t>No third-party Pages are connected. No ads account is connected.</w:t>
-      </w:r>
-    </w:p>
-    <w:p>
-      <w:r>
-        <w:rPr>
-          <w:rFonts w:ascii="Calibri" w:hAnsi="Calibri" w:eastAsia="Calibri"/>
-          <w:b/>
-          <w:color w:val="2D6A4F"/>
-          <w:sz w:val="26"/>
-        </w:rPr>
-        <w:t>1.12 How the data is used</w:t>
-      </w:r>
-    </w:p>
-    <w:p>
-      <w:r>
-        <w:rPr>
-          <w:rFonts w:ascii="Calibri" w:hAnsi="Calibri" w:eastAsia="Calibri"/>
-          <w:b/>
-          <w:color w:val="1B4332"/>
-          <w:sz w:val="22"/>
-        </w:rPr>
-        <w:t>Paste:</w:t>
-      </w:r>
-    </w:p>
-    <w:p>
-      <w:r>
-        <w:rPr>
-          <w:rFonts w:ascii="Calibri" w:hAnsi="Calibri" w:eastAsia="Calibri"/>
-          <w:b w:val="0"/>
-          <w:color w:val="1B4332"/>
-          <w:sz w:val="22"/>
-        </w:rPr>
-        <w:t>We use organization posts we created so the Page can show CleantechHUB jobs, programs, and newsletters.</w:t>
-      </w:r>
-    </w:p>
-    <w:p>
-      <w:r>
-        <w:rPr>
-          <w:rFonts w:ascii="Calibri" w:hAnsi="Calibri" w:eastAsia="Calibri"/>
-          <w:b w:val="0"/>
-          <w:color w:val="1B4332"/>
-          <w:sz w:val="22"/>
-        </w:rPr>
-        <w:t>We use our own post ids so the workflow can avoid duplicate posts and can fetch analytics for those posts.</w:t>
-      </w:r>
-    </w:p>
-    <w:p>
-      <w:r>
-        <w:rPr>
-          <w:rFonts w:ascii="Calibri" w:hAnsi="Calibri" w:eastAsia="Calibri"/>
-          <w:b w:val="0"/>
-          <w:color w:val="1B4332"/>
-          <w:sz w:val="22"/>
-        </w:rPr>
-        <w:t>We use aggregate Page analytics so CleantechHUB staff can see how our own posts performed. The figures are impressions, clicks, reactions, comments, shares, follower counts, and page views.</w:t>
-      </w:r>
-    </w:p>
-    <w:p>
-      <w:r>
-        <w:rPr>
-          <w:rFonts w:ascii="Calibri" w:hAnsi="Calibri" w:eastAsia="Calibri"/>
-          <w:b w:val="0"/>
-          <w:color w:val="1B4332"/>
-          <w:sz w:val="22"/>
-        </w:rPr>
-        <w:t>We display comments on our own posts only to CleantechHUB people who manage that Page.</w:t>
-      </w:r>
-    </w:p>
-    <w:p>
-      <w:r>
-        <w:rPr>
-          <w:rFonts w:ascii="Calibri" w:hAnsi="Calibri" w:eastAsia="Calibri"/>
-          <w:b w:val="0"/>
-          <w:color w:val="1B4332"/>
-          <w:sz w:val="22"/>
-        </w:rPr>
-        <w:t>We request only the member data required to show that a comment exists. We do not export member data. We do not build member profiles. We do not enrich any other database.</w:t>
-      </w:r>
-    </w:p>
-    <w:p>
-      <w:r>
-        <w:rPr>
-          <w:rFonts w:ascii="Calibri" w:hAnsi="Calibri" w:eastAsia="Calibri"/>
-          <w:b/>
-          <w:color w:val="2D6A4F"/>
-          <w:sz w:val="26"/>
-        </w:rPr>
-        <w:t>1.13 How the data is stored</w:t>
-      </w:r>
-    </w:p>
-    <w:p>
-      <w:r>
-        <w:rPr>
-          <w:rFonts w:ascii="Calibri" w:hAnsi="Calibri" w:eastAsia="Calibri"/>
-          <w:b/>
-          <w:color w:val="1B4332"/>
-          <w:sz w:val="22"/>
-        </w:rPr>
-        <w:t>Paste:</w:t>
-      </w:r>
-    </w:p>
-    <w:p>
-      <w:r>
-        <w:rPr>
-          <w:rFonts w:ascii="Calibri" w:hAnsi="Calibri" w:eastAsia="Calibri"/>
-          <w:b w:val="0"/>
-          <w:color w:val="1B4332"/>
-          <w:sz w:val="22"/>
-        </w:rPr>
-        <w:t>Data stays inside CleantechHUB’s own n8n workflow. OVH hosts that workflow in Germany, the same host and country as https://cleantechhub.net. OVH’s data processing terms cover that hosting. Deletion follows the periods below.</w:t>
-      </w:r>
-    </w:p>
-    <w:p>
-      <w:r>
-        <w:rPr>
-          <w:rFonts w:ascii="Calibri" w:hAnsi="Calibri" w:eastAsia="Calibri"/>
-          <w:b w:val="0"/>
-          <w:color w:val="1B4332"/>
-          <w:sz w:val="22"/>
-        </w:rPr>
-        <w:t>Storage follows the LinkedIn Marketing API data storage requirements.</w:t>
-      </w:r>
-    </w:p>
-    <w:p>
-      <w:r>
-        <w:rPr>
-          <w:rFonts w:ascii="Calibri" w:hAnsi="Calibri" w:eastAsia="Calibri"/>
-          <w:b w:val="0"/>
-          <w:color w:val="1B4332"/>
-          <w:sz w:val="22"/>
-        </w:rPr>
-        <w:t>Posts and other social activity by our own Page may be stored for up to six months, because the Page authenticates into this app. The shorter public cap, where the organization has not authenticated, is six weeks.</w:t>
-      </w:r>
-    </w:p>
-    <w:p>
-      <w:r>
-        <w:rPr>
-          <w:rFonts w:ascii="Calibri" w:hAnsi="Calibri" w:eastAsia="Calibri"/>
-          <w:b w:val="0"/>
-          <w:color w:val="1B4332"/>
-          <w:sz w:val="22"/>
-        </w:rPr>
-        <w:t>Aggregate Page admin and reporting data, with no individual member record, may be stored for up to one year. This includes follower counts and summaries of social actions.</w:t>
-      </w:r>
-    </w:p>
-    <w:p>
-      <w:r>
-        <w:rPr>
-          <w:rFonts w:ascii="Calibri" w:hAnsi="Calibri" w:eastAsia="Calibri"/>
-          <w:b w:val="0"/>
-          <w:color w:val="1B4332"/>
-          <w:sz w:val="22"/>
-        </w:rPr>
-        <w:t>Our Page’s name and logo URL may be stored for up to eight weeks while the Page is authenticated.</w:t>
-      </w:r>
-    </w:p>
-    <w:p>
-      <w:r>
-        <w:rPr>
-          <w:rFonts w:ascii="Calibri" w:hAnsi="Calibri" w:eastAsia="Calibri"/>
-          <w:b w:val="0"/>
-          <w:color w:val="1B4332"/>
-          <w:sz w:val="22"/>
-        </w:rPr>
-        <w:t>Ids for the organization, our posts, and social actions may be kept with no LinkedIn time cap.</w:t>
-      </w:r>
-    </w:p>
-    <w:p>
-      <w:r>
-        <w:rPr>
-          <w:rFonts w:ascii="Calibri" w:hAnsi="Calibri" w:eastAsia="Calibri"/>
-          <w:b w:val="0"/>
-          <w:color w:val="1B4332"/>
-          <w:sz w:val="22"/>
-        </w:rPr>
-        <w:t>The signed-in Page admin’s person id and basic profile may be kept with no LinkedIn time cap. We keep them only to hold that admin’s authorization.</w:t>
-      </w:r>
-    </w:p>
-    <w:p>
-      <w:r>
-        <w:rPr>
-          <w:rFonts w:ascii="Calibri" w:hAnsi="Calibri" w:eastAsia="Calibri"/>
-          <w:b w:val="0"/>
-          <w:color w:val="1B4332"/>
-          <w:sz w:val="22"/>
-        </w:rPr>
-        <w:t>Content of member comments, reactions, and other member social activity is kept for no more than 48 hours, then deleted.</w:t>
-      </w:r>
-    </w:p>
-    <w:p>
-      <w:r>
-        <w:rPr>
-          <w:rFonts w:ascii="Calibri" w:hAnsi="Calibri" w:eastAsia="Calibri"/>
-          <w:b w:val="0"/>
-          <w:color w:val="1B4332"/>
-          <w:sz w:val="22"/>
-        </w:rPr>
-        <w:t>Profile fields of members who did not sign in are cached for no more than 24 hours. Examples are a commenter’s name, photo, or headline. They are not stored.</w:t>
-      </w:r>
-    </w:p>
-    <w:p>
-      <w:r>
-        <w:rPr>
-          <w:rFonts w:ascii="Calibri" w:hAnsi="Calibri" w:eastAsia="Calibri"/>
-          <w:b w:val="0"/>
-          <w:color w:val="1B4332"/>
-          <w:sz w:val="22"/>
-        </w:rPr>
-        <w:t>We delete stored member data when the admin asks, and when LinkedIn asks. On termination of the Marketing API terms, member data is deleted immediately, except lead-form and Page-messaging data, which this app does not collect.</w:t>
-      </w:r>
-    </w:p>
-    <w:p>
-      <w:r>
-        <w:rPr>
-          <w:rFonts w:ascii="Calibri" w:hAnsi="Calibri" w:eastAsia="Calibri"/>
-          <w:b/>
-          <w:color w:val="2D6A4F"/>
-          <w:sz w:val="26"/>
-        </w:rPr>
-        <w:t>1.14 Scopes and why</w:t>
-      </w:r>
-    </w:p>
-    <w:p>
-      <w:r>
-        <w:rPr>
-          <w:rFonts w:ascii="Calibri" w:hAnsi="Calibri" w:eastAsia="Calibri"/>
-          <w:b w:val="0"/>
-          <w:color w:val="1B4332"/>
-          <w:sz w:val="22"/>
-        </w:rPr>
-        <w:t xml:space="preserve">Request the </w:t>
-      </w:r>
-      <w:r>
-        <w:rPr>
-          <w:rFonts w:ascii="Calibri" w:hAnsi="Calibri" w:eastAsia="Calibri"/>
-          <w:b/>
-          <w:color w:val="1B4332"/>
-          <w:sz w:val="22"/>
-        </w:rPr>
-        <w:t>Community Management API</w:t>
-      </w:r>
-      <w:r>
-        <w:rPr>
-          <w:rFonts w:ascii="Calibri" w:hAnsi="Calibri" w:eastAsia="Calibri"/>
-          <w:b w:val="0"/>
-          <w:color w:val="1B4332"/>
-          <w:sz w:val="22"/>
-        </w:rPr>
-        <w:t xml:space="preserve"> product. Approval grants a bundle of scopes to the app. In the OAuth (Open Authorization) consent call, ask only for the three scopes below. Marketing permissions are three-legged. A member must sign in. Client-credentials access is not available.</w:t>
-      </w:r>
-    </w:p>
-    <w:p>
-      <w:r>
-        <w:rPr>
-          <w:rFonts w:ascii="Calibri" w:hAnsi="Calibri" w:eastAsia="Calibri"/>
-          <w:b/>
-          <w:color w:val="1B4332"/>
-          <w:sz w:val="22"/>
-        </w:rPr>
-        <w:t>Paste:</w:t>
-      </w:r>
-    </w:p>
-    <w:p>
-      <w:r>
-        <w:rPr>
-          <w:rFonts w:ascii="Calibri" w:hAnsi="Calibri" w:eastAsia="Calibri"/>
-          <w:b w:val="0"/>
-          <w:color w:val="1B4332"/>
-          <w:sz w:val="22"/>
-        </w:rPr>
-        <w:t>We need three scopes, and we will request only these three in the member consent screen.</w:t>
-      </w:r>
-    </w:p>
-    <w:p>
-      <w:r>
-        <w:rPr>
-          <w:rFonts w:ascii="Calibri" w:hAnsi="Calibri" w:eastAsia="Calibri"/>
-          <w:b w:val="0"/>
-          <w:color w:val="1B4332"/>
-          <w:sz w:val="22"/>
-        </w:rPr>
-        <w:t>w_organization_social. This scope posts, comments, and likes as the organization. We use it to publish CleantechHUB jobs, programs, and newsletters as the Page. The signed-in member must be an ADMINISTRATOR, a DIRECT_SPONSORED_CONTENT_POSTER, or a CONTENT_ADMIN. Source: Posts API.</w:t>
-      </w:r>
-    </w:p>
-    <w:p>
-      <w:r>
-        <w:rPr>
-          <w:rFonts w:ascii="Calibri" w:hAnsi="Calibri" w:eastAsia="Calibri"/>
-          <w:b w:val="0"/>
-          <w:color w:val="1B4332"/>
-          <w:sz w:val="22"/>
-        </w:rPr>
-        <w:t>r_organization_social. This scope reads the organization’s posts, comments, and likes. We use it to read our own Page’s posts and comments. The same Page roles apply. Source: Posts API.</w:t>
-      </w:r>
-    </w:p>
-    <w:p>
-      <w:r>
-        <w:rPr>
-          <w:rFonts w:ascii="Calibri" w:hAnsi="Calibri" w:eastAsia="Calibri"/>
-          <w:b w:val="0"/>
-          <w:color w:val="1B4332"/>
-          <w:sz w:val="22"/>
-        </w:rPr>
-        <w:t>rw_organization_admin. This scope manages organization pages and retrieves reporting data. We use it for aggregate post analytics, follower statistics, and page statistics. The signed-in member must be an ADMINISTRATOR. Sources: Organization Share Statistics, Organization Follower Statistics, Organization Page Statistics, and Organization Lookup. Total follower count uses networkSizes on the Organization Lookup page, under this same permission.</w:t>
-      </w:r>
-    </w:p>
-    <w:p>
-      <w:r>
-        <w:rPr>
-          <w:rFonts w:ascii="Calibri" w:hAnsi="Calibri" w:eastAsia="Calibri"/>
-          <w:b w:val="0"/>
-          <w:color w:val="1B4332"/>
-          <w:sz w:val="22"/>
-        </w:rPr>
-        <w:t>We do not need r_organization_followers for analytics. The docs describe that scope as follower data so an organization can mention followers in posts. We will not mention followers. We will not request that scope.</w:t>
-      </w:r>
-    </w:p>
-    <w:p>
-      <w:r>
-        <w:rPr>
-          <w:rFonts w:ascii="Calibri" w:hAnsi="Calibri" w:eastAsia="Calibri"/>
-          <w:b w:val="0"/>
-          <w:color w:val="1B4332"/>
-          <w:sz w:val="22"/>
-        </w:rPr>
-        <w:t>We do not need r_organization_admin. That scope is listed on the Advertising API and the Lead Sync API. It is not in the Community Management permission list. Page analytics on Community Management uses rw_organization_admin. We are not applying for the Advertising API.</w:t>
-      </w:r>
-    </w:p>
-    <w:p>
-      <w:r>
-        <w:rPr>
-          <w:rFonts w:ascii="Calibri" w:hAnsi="Calibri" w:eastAsia="Calibri"/>
-          <w:b w:val="0"/>
-          <w:color w:val="1B4332"/>
-          <w:sz w:val="22"/>
-        </w:rPr>
-        <w:t>The Community Management product also makes other scopes available on the app. We will not request them in OAuth, and we will not call them.</w:t>
+        <w:t>r_organization_social_feed</w:t>
       </w:r>
     </w:p>
     <w:p>
@@ -1857,7 +1888,7 @@
           <w:color w:val="1B4332"/>
           <w:sz w:val="22"/>
         </w:rPr>
-        <w:t>r_1st_connections_size</w:t>
+        <w:t>w_member_social</w:t>
       </w:r>
     </w:p>
     <w:p>
@@ -1871,7 +1902,7 @@
           <w:color w:val="1B4332"/>
           <w:sz w:val="22"/>
         </w:rPr>
-        <w:t>r_basicprofile</w:t>
+        <w:t>w_member_social_feed</w:t>
       </w:r>
     </w:p>
     <w:p>
@@ -1885,7 +1916,7 @@
           <w:color w:val="1B4332"/>
           <w:sz w:val="22"/>
         </w:rPr>
-        <w:t>r_organization_social_feed</w:t>
+        <w:t>w_organization_social_feed</w:t>
       </w:r>
     </w:p>
     <w:p>
@@ -1899,7 +1930,7 @@
           <w:color w:val="1B4332"/>
           <w:sz w:val="22"/>
         </w:rPr>
-        <w:t>w_member_social</w:t>
+        <w:t>r_member_profileAnalytics</w:t>
       </w:r>
     </w:p>
     <w:p>
@@ -1913,48 +1944,6 @@
           <w:color w:val="1B4332"/>
           <w:sz w:val="22"/>
         </w:rPr>
-        <w:t>w_member_social_feed</w:t>
-      </w:r>
-    </w:p>
-    <w:p>
-      <w:pPr>
-        <w:pStyle w:val="ListBullet"/>
-      </w:pPr>
-      <w:r>
-        <w:rPr>
-          <w:rFonts w:ascii="Calibri" w:hAnsi="Calibri" w:eastAsia="Calibri"/>
-          <w:b w:val="0"/>
-          <w:color w:val="1B4332"/>
-          <w:sz w:val="22"/>
-        </w:rPr>
-        <w:t>w_organization_social_feed</w:t>
-      </w:r>
-    </w:p>
-    <w:p>
-      <w:pPr>
-        <w:pStyle w:val="ListBullet"/>
-      </w:pPr>
-      <w:r>
-        <w:rPr>
-          <w:rFonts w:ascii="Calibri" w:hAnsi="Calibri" w:eastAsia="Calibri"/>
-          <w:b w:val="0"/>
-          <w:color w:val="1B4332"/>
-          <w:sz w:val="22"/>
-        </w:rPr>
-        <w:t>r_member_profileAnalytics</w:t>
-      </w:r>
-    </w:p>
-    <w:p>
-      <w:pPr>
-        <w:pStyle w:val="ListBullet"/>
-      </w:pPr>
-      <w:r>
-        <w:rPr>
-          <w:rFonts w:ascii="Calibri" w:hAnsi="Calibri" w:eastAsia="Calibri"/>
-          <w:b w:val="0"/>
-          <w:color w:val="1B4332"/>
-          <w:sz w:val="22"/>
-        </w:rPr>
         <w:t>r_member_postAnalytics</w:t>
       </w:r>
     </w:p>
@@ -2557,7 +2546,43 @@
           <w:color w:val="1B4332"/>
           <w:sz w:val="22"/>
         </w:rPr>
-        <w:t xml:space="preserve"> Not live. See the stop notice. Do not submit while the only responses are a WordPress 404, the jobs homepage, or an empty agents response.</w:t>
+        <w:t xml:space="preserve"> Live at </w:t>
+      </w:r>
+      <w:r>
+        <w:rPr>
+          <w:rFonts w:ascii="Calibri" w:hAnsi="Calibri" w:eastAsia="Calibri"/>
+          <w:b w:val="0"/>
+          <w:color w:val="1B4332"/>
+          <w:sz w:val="22"/>
+        </w:rPr>
+        <w:t>https://jobs.cleantechhub.net/privacidad/</w:t>
+      </w:r>
+      <w:r>
+        <w:rPr>
+          <w:rFonts w:ascii="Calibri" w:hAnsi="Calibri" w:eastAsia="Calibri"/>
+          <w:b w:val="0"/>
+          <w:color w:val="1B4332"/>
+          <w:sz w:val="22"/>
+        </w:rPr>
+        <w:t xml:space="preserve">. The website field stays </w:t>
+      </w:r>
+      <w:r>
+        <w:rPr>
+          <w:rFonts w:ascii="Calibri" w:hAnsi="Calibri" w:eastAsia="Calibri"/>
+          <w:b w:val="0"/>
+          <w:color w:val="1B4332"/>
+          <w:sz w:val="22"/>
+        </w:rPr>
+        <w:t>https://cleantechhub.net</w:t>
+      </w:r>
+      <w:r>
+        <w:rPr>
+          <w:rFonts w:ascii="Calibri" w:hAnsi="Calibri" w:eastAsia="Calibri"/>
+          <w:b w:val="0"/>
+          <w:color w:val="1B4332"/>
+          <w:sz w:val="22"/>
+        </w:rPr>
+        <w:t>.</w:t>
       </w:r>
     </w:p>
     <w:p>
@@ -4975,7 +5000,7 @@
           <w:color w:val="1B4332"/>
           <w:sz w:val="22"/>
         </w:rPr>
-        <w:t>Already filled, so no longer blank: legal name FUNDACIÓN CLEANTECH HUB (ESAL), NIT 901.523.941-9, Calle 90 No. 19-41 Of. 801, Bogotá D.C., admin@cleantechhub.net, +57 313 715 5965, and website https://cleantechhub.net. n8n host country is Germany, on OVH. The privacy URL is not filled, because no page is live.</w:t>
+        <w:t>Already filled, so no longer blank: legal name FUNDACIÓN CLEANTECH HUB (ESAL), NIT 901.523.941-9, Calle 90 No. 19-41 Of. 801, Bogotá D.C., admin@cleantechhub.net, +57 313 715 5965, website https://cleantechhub.net, and privacy URL https://jobs.cleantechhub.net/privacidad/ (live). n8n host country is Germany, on OVH.</w:t>
       </w:r>
     </w:p>
     <w:p>
@@ -5026,7 +5051,7 @@
           <w:color w:val="1B4332"/>
           <w:sz w:val="22"/>
         </w:rPr>
-        <w:t>Do these on Gideon’s own device. Do not submit until the privacy URL returns 200 without a login and the body is this policy.</w:t>
+        <w:t>Do these on Gideon’s own device.</w:t>
       </w:r>
     </w:p>
     <w:p>
@@ -5037,97 +5062,25 @@
           <w:color w:val="1B4332"/>
           <w:sz w:val="22"/>
         </w:rPr>
-        <w:t>1. Publish the approved HTML on an existing host (</w:t>
-      </w:r>
-      <w:r>
-        <w:rPr>
-          <w:rFonts w:ascii="Calibri" w:hAnsi="Calibri" w:eastAsia="Calibri"/>
-          <w:b w:val="0"/>
-          <w:color w:val="1B4332"/>
-          <w:sz w:val="22"/>
-        </w:rPr>
-        <w:t>jobs.cleantechhub.net</w:t>
-      </w:r>
-      <w:r>
-        <w:rPr>
-          <w:rFonts w:ascii="Calibri" w:hAnsi="Calibri" w:eastAsia="Calibri"/>
-          <w:b w:val="0"/>
-          <w:color w:val="1B4332"/>
-          <w:sz w:val="22"/>
-        </w:rPr>
-        <w:t xml:space="preserve"> or </w:t>
-      </w:r>
-      <w:r>
-        <w:rPr>
-          <w:rFonts w:ascii="Calibri" w:hAnsi="Calibri" w:eastAsia="Calibri"/>
-          <w:b w:val="0"/>
-          <w:color w:val="1B4332"/>
-          <w:sz w:val="22"/>
-        </w:rPr>
-        <w:t>agents.cleantechhub.net</w:t>
-      </w:r>
-      <w:r>
-        <w:rPr>
-          <w:rFonts w:ascii="Calibri" w:hAnsi="Calibri" w:eastAsia="Calibri"/>
-          <w:b w:val="0"/>
-          <w:color w:val="1B4332"/>
-          <w:sz w:val="22"/>
-        </w:rPr>
-        <w:t xml:space="preserve">) at </w:t>
-      </w:r>
-      <w:r>
-        <w:rPr>
-          <w:rFonts w:ascii="Calibri" w:hAnsi="Calibri" w:eastAsia="Calibri"/>
-          <w:b w:val="0"/>
-          <w:color w:val="1B4332"/>
-          <w:sz w:val="22"/>
-        </w:rPr>
-        <w:t>/privacidad/</w:t>
-      </w:r>
-      <w:r>
-        <w:rPr>
-          <w:rFonts w:ascii="Calibri" w:hAnsi="Calibri" w:eastAsia="Calibri"/>
-          <w:b w:val="0"/>
-          <w:color w:val="1B4332"/>
-          <w:sz w:val="22"/>
-        </w:rPr>
-        <w:t xml:space="preserve">, with </w:t>
-      </w:r>
-      <w:r>
-        <w:rPr>
-          <w:rFonts w:ascii="Calibri" w:hAnsi="Calibri" w:eastAsia="Calibri"/>
-          <w:b w:val="0"/>
-          <w:color w:val="1B4332"/>
-          <w:sz w:val="22"/>
-        </w:rPr>
-        <w:t>/privacy</w:t>
-      </w:r>
-      <w:r>
-        <w:rPr>
-          <w:rFonts w:ascii="Calibri" w:hAnsi="Calibri" w:eastAsia="Calibri"/>
-          <w:b w:val="0"/>
-          <w:color w:val="1B4332"/>
-          <w:sz w:val="22"/>
-        </w:rPr>
-        <w:t xml:space="preserve"> redirecting there. That publish did not happen from this run. It needs an Infisical secret that can write to the Caddy host </w:t>
-      </w:r>
-      <w:r>
-        <w:rPr>
-          <w:rFonts w:ascii="Calibri" w:hAnsi="Calibri" w:eastAsia="Calibri"/>
-          <w:b w:val="0"/>
-          <w:color w:val="1B4332"/>
-          <w:sz w:val="22"/>
-        </w:rPr>
-        <w:t>51.195.45.77</w:t>
-      </w:r>
-      <w:r>
-        <w:rPr>
-          <w:rFonts w:ascii="Calibri" w:hAnsi="Calibri" w:eastAsia="Calibri"/>
-          <w:b w:val="0"/>
-          <w:color w:val="1B4332"/>
-          <w:sz w:val="22"/>
-        </w:rPr>
-        <w:t>. Set the effective date on the day it actually goes live.</w:t>
+        <w:t xml:space="preserve">1. Open </w:t>
+      </w:r>
+      <w:r>
+        <w:rPr>
+          <w:rFonts w:ascii="Calibri" w:hAnsi="Calibri" w:eastAsia="Calibri"/>
+          <w:b w:val="0"/>
+          <w:color w:val="1B4332"/>
+          <w:sz w:val="22"/>
+        </w:rPr>
+        <w:t>https://jobs.cleantechhub.net/privacidad/</w:t>
+      </w:r>
+      <w:r>
+        <w:rPr>
+          <w:rFonts w:ascii="Calibri" w:hAnsi="Calibri" w:eastAsia="Calibri"/>
+          <w:b w:val="0"/>
+          <w:color w:val="1B4332"/>
+          <w:sz w:val="22"/>
+        </w:rPr>
+        <w:t xml:space="preserve"> in a private window. Confirm HTTP 200 and that the date reads 22 October 2026. This was checked on 22 October 2026.</w:t>
       </w:r>
     </w:p>
     <w:p>
@@ -5138,7 +5091,7 @@
           <w:color w:val="1B4332"/>
           <w:sz w:val="22"/>
         </w:rPr>
-        <w:t>2. Open the live URL in a private window. Confirm HTTP 200, valid TLS, and no login wall.</w:t>
+        <w:t>2. Open https://www.linkedin.com/developers/apps and sign in with Gideon’s own LinkedIn account.</w:t>
       </w:r>
     </w:p>
     <w:p>
@@ -5149,7 +5102,61 @@
           <w:color w:val="1B4332"/>
           <w:sz w:val="22"/>
         </w:rPr>
-        <w:t>3. Open https://www.linkedin.com/developers/apps and sign in with Gideon’s own LinkedIn account.</w:t>
+        <w:t xml:space="preserve">3. Create the app </w:t>
+      </w:r>
+      <w:r>
+        <w:rPr>
+          <w:rFonts w:ascii="Calibri" w:hAnsi="Calibri" w:eastAsia="Calibri"/>
+          <w:b/>
+          <w:color w:val="1B4332"/>
+          <w:sz w:val="22"/>
+        </w:rPr>
+        <w:t>CleantechHUB n8n</w:t>
+      </w:r>
+      <w:r>
+        <w:rPr>
+          <w:rFonts w:ascii="Calibri" w:hAnsi="Calibri" w:eastAsia="Calibri"/>
+          <w:b w:val="0"/>
+          <w:color w:val="1B4332"/>
+          <w:sz w:val="22"/>
+        </w:rPr>
+        <w:t xml:space="preserve">. Select the CleantechHUB Page. Paste </w:t>
+      </w:r>
+      <w:r>
+        <w:rPr>
+          <w:rFonts w:ascii="Calibri" w:hAnsi="Calibri" w:eastAsia="Calibri"/>
+          <w:b w:val="0"/>
+          <w:color w:val="1B4332"/>
+          <w:sz w:val="22"/>
+        </w:rPr>
+        <w:t>https://jobs.cleantechhub.net/privacidad/</w:t>
+      </w:r>
+      <w:r>
+        <w:rPr>
+          <w:rFonts w:ascii="Calibri" w:hAnsi="Calibri" w:eastAsia="Calibri"/>
+          <w:b w:val="0"/>
+          <w:color w:val="1B4332"/>
+          <w:sz w:val="22"/>
+        </w:rPr>
+        <w:t xml:space="preserve">. The website field stays </w:t>
+      </w:r>
+      <w:r>
+        <w:rPr>
+          <w:rFonts w:ascii="Calibri" w:hAnsi="Calibri" w:eastAsia="Calibri"/>
+          <w:b w:val="0"/>
+          <w:color w:val="1B4332"/>
+          <w:sz w:val="22"/>
+        </w:rPr>
+        <w:t>https://cleantechhub.net</w:t>
+      </w:r>
+      <w:r>
+        <w:rPr>
+          <w:rFonts w:ascii="Calibri" w:hAnsi="Calibri" w:eastAsia="Calibri"/>
+          <w:b w:val="0"/>
+          <w:color w:val="1B4332"/>
+          <w:sz w:val="22"/>
+        </w:rPr>
+        <w:t>. Add no other product.</w:t>
       </w:r>
     </w:p>
     <w:p>
@@ -5160,25 +5167,7 @@
           <w:color w:val="1B4332"/>
           <w:sz w:val="22"/>
         </w:rPr>
-        <w:t xml:space="preserve">4. Create the app </w:t>
-      </w:r>
-      <w:r>
-        <w:rPr>
-          <w:rFonts w:ascii="Calibri" w:hAnsi="Calibri" w:eastAsia="Calibri"/>
-          <w:b/>
-          <w:color w:val="1B4332"/>
-          <w:sz w:val="22"/>
-        </w:rPr>
-        <w:t>CleantechHUB n8n</w:t>
-      </w:r>
-      <w:r>
-        <w:rPr>
-          <w:rFonts w:ascii="Calibri" w:hAnsi="Calibri" w:eastAsia="Calibri"/>
-          <w:b w:val="0"/>
-          <w:color w:val="1B4332"/>
-          <w:sz w:val="22"/>
-        </w:rPr>
-        <w:t>. Select the CleantechHUB Page. Paste the live privacy URL. Add no other product.</w:t>
+        <w:t>4. Settings → Verify → Generate URL → send it to the Page super admin. The super admin approves within 30 days.</w:t>
       </w:r>
     </w:p>
     <w:p>
@@ -5189,7 +5178,7 @@
           <w:color w:val="1B4332"/>
           <w:sz w:val="22"/>
         </w:rPr>
-        <w:t>5. Settings → Verify → Generate URL → send it to the Page super admin. The super admin approves within 30 days.</w:t>
+        <w:t>5. Products → Request access for the Community Management API. Paste section 1. Use admin@cleantechhub.net. Fill only the blanks in section 7.</w:t>
       </w:r>
     </w:p>
     <w:p>
@@ -5200,7 +5189,7 @@
           <w:color w:val="1B4332"/>
           <w:sz w:val="22"/>
         </w:rPr>
-        <w:t>6. Products → Request access for the Community Management API. Paste section 1. Use admin@cleantechhub.net. Fill only the blanks in section 7.</w:t>
+        <w:t>6. Finish the survey within 21 days. Watch Access Form Review, then Identity Vetting.</w:t>
       </w:r>
     </w:p>
     <w:p>
@@ -5211,18 +5200,7 @@
           <w:color w:val="1B4332"/>
           <w:sz w:val="22"/>
         </w:rPr>
-        <w:t>7. Finish the survey within 21 days. Watch Access Form Review, then Identity Vetting.</w:t>
-      </w:r>
-    </w:p>
-    <w:p>
-      <w:r>
-        <w:rPr>
-          <w:rFonts w:ascii="Calibri" w:hAnsi="Calibri" w:eastAsia="Calibri"/>
-          <w:b w:val="0"/>
-          <w:color w:val="1B4332"/>
-          <w:sz w:val="22"/>
-        </w:rPr>
-        <w:t>8. After Development approval, build within 12 months, then apply for Standard tier with the screencast in section 1.17.</w:t>
+        <w:t>7. After Development approval, build within 12 months, then apply for Standard tier with the screencast in section 1.17.</w:t>
       </w:r>
     </w:p>
     <w:p>

</xml_diff>